<commit_message>
Elaborados script en R hasta sección 8.1 de Árboles
</commit_message>
<xml_diff>
--- a/bookdown/Observaciones de Bernardo 17-6-19.docx
+++ b/bookdown/Observaciones de Bernardo 17-6-19.docx
@@ -4813,86 +4813,6 @@
         <w:pStyle w:val="NormalWeb"/>
         <w:shd w:val="clear" w:color="auto" w:fill="FFFFFF"/>
         <w:spacing w:before="0" w:beforeAutospacing="0" w:after="204" w:afterAutospacing="0"/>
-        <w:rPr>
-          <w:rFonts w:ascii="Helvetica" w:hAnsi="Helvetica" w:cs="Helvetica"/>
-          <w:color w:val="333333"/>
-          <w:spacing w:val="3"/>
-          <w:shd w:val="clear" w:color="auto" w:fill="FFFFFF"/>
-        </w:rPr>
-      </w:pPr>
-      <w:r>
-        <w:rPr>
-          <w:rFonts w:ascii="Helvetica" w:hAnsi="Helvetica" w:cs="Helvetica"/>
-          <w:color w:val="333333"/>
-          <w:spacing w:val="3"/>
-          <w:highlight w:val="cyan"/>
-          <w:shd w:val="clear" w:color="auto" w:fill="FFFFFF"/>
-        </w:rPr>
-        <w:t>Visual: Para identificar outliers de manera visual en </w:t>
-      </w:r>
-      <w:r>
-        <w:rPr>
-          <w:rStyle w:val="nfasis"/>
-          <w:rFonts w:ascii="Helvetica" w:hAnsi="Helvetica" w:cs="Helvetica"/>
-          <w:color w:val="333333"/>
-          <w:spacing w:val="3"/>
-          <w:highlight w:val="cyan"/>
-          <w:shd w:val="clear" w:color="auto" w:fill="FFFFFF"/>
-        </w:rPr>
-        <w:t>Python</w:t>
-      </w:r>
-      <w:r>
-        <w:rPr>
-          <w:rFonts w:ascii="Helvetica" w:hAnsi="Helvetica" w:cs="Helvetica"/>
-          <w:color w:val="333333"/>
-          <w:spacing w:val="3"/>
-          <w:highlight w:val="cyan"/>
-          <w:shd w:val="clear" w:color="auto" w:fill="FFFFFF"/>
-        </w:rPr>
-        <w:t> haremos uso de la librería </w:t>
-      </w:r>
-      <w:proofErr w:type="spellStart"/>
-      <w:r>
-        <w:rPr>
-          <w:rStyle w:val="nfasis"/>
-          <w:rFonts w:ascii="Helvetica" w:hAnsi="Helvetica" w:cs="Helvetica"/>
-          <w:color w:val="333333"/>
-          <w:spacing w:val="3"/>
-          <w:highlight w:val="cyan"/>
-          <w:shd w:val="clear" w:color="auto" w:fill="FFFFFF"/>
-        </w:rPr>
-        <w:t>Matplotlib</w:t>
-      </w:r>
-      <w:proofErr w:type="spellEnd"/>
-      <w:r>
-        <w:rPr>
-          <w:rFonts w:ascii="Helvetica" w:hAnsi="Helvetica" w:cs="Helvetica"/>
-          <w:color w:val="333333"/>
-          <w:spacing w:val="3"/>
-          <w:highlight w:val="cyan"/>
-          <w:shd w:val="clear" w:color="auto" w:fill="FFFFFF"/>
-        </w:rPr>
-        <w:t>, la cual nos brinda un sinfín de herramientas para poder llevar a cabo nuestros objetivos. Al igual que en la sección anterior usaremos el conjunto de datos Data con tres variables</w:t>
-      </w:r>
-    </w:p>
-    <w:p>
-      <w:pPr>
-        <w:pStyle w:val="NormalWeb"/>
-        <w:shd w:val="clear" w:color="auto" w:fill="FFFFFF"/>
-        <w:spacing w:before="0" w:beforeAutospacing="0" w:after="204" w:afterAutospacing="0"/>
-        <w:rPr>
-          <w:rFonts w:ascii="Helvetica" w:hAnsi="Helvetica" w:cs="Helvetica"/>
-          <w:color w:val="333333"/>
-          <w:spacing w:val="3"/>
-          <w:shd w:val="clear" w:color="auto" w:fill="FFFFFF"/>
-        </w:rPr>
-      </w:pPr>
-    </w:p>
-    <w:p>
-      <w:pPr>
-        <w:pStyle w:val="NormalWeb"/>
-        <w:shd w:val="clear" w:color="auto" w:fill="FFFFFF"/>
-        <w:spacing w:before="0" w:beforeAutospacing="0" w:after="204" w:afterAutospacing="0"/>
       </w:pPr>
     </w:p>
     <w:p>
@@ -5823,19 +5743,7 @@
           <w:szCs w:val="24"/>
           <w:lang w:eastAsia="es-VE"/>
         </w:rPr>
-        <w:t xml:space="preserve"> que </w:t>
-      </w:r>
-      <w:r>
-        <w:rPr>
-          <w:rFonts w:ascii="Helvetica" w:eastAsia="Times New Roman" w:hAnsi="Helvetica" w:cs="Helvetica"/>
-          <w:color w:val="333333"/>
-          <w:spacing w:val="3"/>
-          <w:sz w:val="24"/>
-          <w:szCs w:val="24"/>
-          <w:lang w:eastAsia="es-VE"/>
-        </w:rPr>
-        <w:lastRenderedPageBreak/>
-        <w:t>contiene los parámetros que necesita la función, en nuestro caso el punto de referencia, el cual es la media por columnas y la inversa de la matriz de covarianza.</w:t>
+        <w:t xml:space="preserve"> que contiene los parámetros que necesita la función, en nuestro caso el punto de referencia, el cual es la media por columnas y la inversa de la matriz de covarianza.</w:t>
       </w:r>
     </w:p>
     <w:p>
@@ -5890,191 +5798,6 @@
         </w:rPr>
         <w:t> Regresión Lineal</w:t>
       </w:r>
-    </w:p>
-    <w:p>
-      <w:pPr>
-        <w:pStyle w:val="NormalWeb"/>
-        <w:shd w:val="clear" w:color="auto" w:fill="FFFFFF"/>
-        <w:spacing w:before="0" w:beforeAutospacing="0" w:after="204" w:afterAutospacing="0"/>
-      </w:pPr>
-    </w:p>
-    <w:p>
-      <w:pPr>
-        <w:pStyle w:val="NormalWeb"/>
-        <w:shd w:val="clear" w:color="auto" w:fill="FFFFFF"/>
-        <w:spacing w:before="0" w:beforeAutospacing="0" w:after="204" w:afterAutospacing="0"/>
-      </w:pPr>
-    </w:p>
-    <w:p>
-      <w:pPr>
-        <w:pStyle w:val="NormalWeb"/>
-        <w:shd w:val="clear" w:color="auto" w:fill="FFFFFF"/>
-        <w:spacing w:before="0" w:beforeAutospacing="0" w:after="204" w:afterAutospacing="0"/>
-      </w:pPr>
-      <w:r>
-        <w:rPr>
-          <w:rFonts w:ascii="Helvetica" w:hAnsi="Helvetica" w:cs="Helvetica"/>
-          <w:color w:val="333333"/>
-          <w:spacing w:val="3"/>
-          <w:highlight w:val="cyan"/>
-          <w:shd w:val="clear" w:color="auto" w:fill="FFFFFF"/>
-        </w:rPr>
-        <w:t>En general si tenemos una variable </w:t>
-      </w:r>
-      <w:r>
-        <w:rPr>
-          <w:rStyle w:val="mjx-char"/>
-          <w:rFonts w:ascii="MJXc-TeX-math-Iw" w:hAnsi="MJXc-TeX-math-Iw" w:cs="Helvetica"/>
-          <w:color w:val="333333"/>
-          <w:sz w:val="28"/>
-          <w:szCs w:val="28"/>
-          <w:highlight w:val="cyan"/>
-          <w:bdr w:val="none" w:sz="0" w:space="0" w:color="auto" w:frame="1"/>
-          <w:shd w:val="clear" w:color="auto" w:fill="FFFFFF"/>
-        </w:rPr>
-        <w:t>y</w:t>
-      </w:r>
-      <w:r>
-        <w:rPr>
-          <w:rFonts w:ascii="Helvetica" w:hAnsi="Helvetica" w:cs="Helvetica"/>
-          <w:color w:val="333333"/>
-          <w:spacing w:val="3"/>
-          <w:highlight w:val="cyan"/>
-          <w:shd w:val="clear" w:color="auto" w:fill="FFFFFF"/>
-        </w:rPr>
-        <w:t> dependiente y </w:t>
-      </w:r>
-      <w:r>
-        <w:rPr>
-          <w:rStyle w:val="mjx-char"/>
-          <w:rFonts w:ascii="MJXc-TeX-math-Iw" w:hAnsi="MJXc-TeX-math-Iw" w:cs="Helvetica"/>
-          <w:color w:val="333333"/>
-          <w:sz w:val="28"/>
-          <w:szCs w:val="28"/>
-          <w:highlight w:val="cyan"/>
-          <w:bdr w:val="none" w:sz="0" w:space="0" w:color="auto" w:frame="1"/>
-          <w:shd w:val="clear" w:color="auto" w:fill="FFFFFF"/>
-        </w:rPr>
-        <w:t>n</w:t>
-      </w:r>
-      <w:r>
-        <w:rPr>
-          <w:rFonts w:ascii="Helvetica" w:hAnsi="Helvetica" w:cs="Helvetica"/>
-          <w:color w:val="333333"/>
-          <w:spacing w:val="3"/>
-          <w:highlight w:val="cyan"/>
-          <w:shd w:val="clear" w:color="auto" w:fill="FFFFFF"/>
-        </w:rPr>
-        <w:t> variables independientes </w:t>
-      </w:r>
-      <w:r>
-        <w:rPr>
-          <w:rStyle w:val="mjx-char"/>
-          <w:rFonts w:ascii="MJXc-TeX-math-Iw" w:hAnsi="MJXc-TeX-math-Iw" w:cs="Helvetica"/>
-          <w:color w:val="333333"/>
-          <w:sz w:val="28"/>
-          <w:szCs w:val="28"/>
-          <w:highlight w:val="cyan"/>
-          <w:bdr w:val="none" w:sz="0" w:space="0" w:color="auto" w:frame="1"/>
-          <w:shd w:val="clear" w:color="auto" w:fill="FFFFFF"/>
-        </w:rPr>
-        <w:t>x</w:t>
-      </w:r>
-      <w:r>
-        <w:rPr>
-          <w:rStyle w:val="mjx-char"/>
-          <w:rFonts w:ascii="MJXc-TeX-main-Rw" w:hAnsi="MJXc-TeX-main-Rw" w:cs="Helvetica"/>
-          <w:color w:val="333333"/>
-          <w:sz w:val="20"/>
-          <w:szCs w:val="20"/>
-          <w:highlight w:val="cyan"/>
-          <w:bdr w:val="none" w:sz="0" w:space="0" w:color="auto" w:frame="1"/>
-          <w:shd w:val="clear" w:color="auto" w:fill="FFFFFF"/>
-        </w:rPr>
-        <w:t>1</w:t>
-      </w:r>
-      <w:proofErr w:type="gramStart"/>
-      <w:r>
-        <w:rPr>
-          <w:rStyle w:val="mjx-char"/>
-          <w:rFonts w:ascii="MJXc-TeX-main-Rw" w:hAnsi="MJXc-TeX-main-Rw" w:cs="Helvetica"/>
-          <w:color w:val="333333"/>
-          <w:sz w:val="28"/>
-          <w:szCs w:val="28"/>
-          <w:highlight w:val="cyan"/>
-          <w:bdr w:val="none" w:sz="0" w:space="0" w:color="auto" w:frame="1"/>
-          <w:shd w:val="clear" w:color="auto" w:fill="FFFFFF"/>
-        </w:rPr>
-        <w:t>,</w:t>
-      </w:r>
-      <w:r>
-        <w:rPr>
-          <w:rStyle w:val="mjx-char"/>
-          <w:rFonts w:ascii="MJXc-TeX-math-Iw" w:hAnsi="MJXc-TeX-math-Iw" w:cs="Helvetica"/>
-          <w:color w:val="333333"/>
-          <w:sz w:val="28"/>
-          <w:szCs w:val="28"/>
-          <w:highlight w:val="cyan"/>
-          <w:bdr w:val="none" w:sz="0" w:space="0" w:color="auto" w:frame="1"/>
-          <w:shd w:val="clear" w:color="auto" w:fill="FFFFFF"/>
-        </w:rPr>
-        <w:t>x</w:t>
-      </w:r>
-      <w:r>
-        <w:rPr>
-          <w:rStyle w:val="mjx-char"/>
-          <w:rFonts w:ascii="MJXc-TeX-main-Rw" w:hAnsi="MJXc-TeX-main-Rw" w:cs="Helvetica"/>
-          <w:color w:val="333333"/>
-          <w:sz w:val="20"/>
-          <w:szCs w:val="20"/>
-          <w:highlight w:val="cyan"/>
-          <w:bdr w:val="none" w:sz="0" w:space="0" w:color="auto" w:frame="1"/>
-          <w:shd w:val="clear" w:color="auto" w:fill="FFFFFF"/>
-        </w:rPr>
-        <w:t>2</w:t>
-      </w:r>
-      <w:proofErr w:type="gramEnd"/>
-      <w:r>
-        <w:rPr>
-          <w:rStyle w:val="mjx-char"/>
-          <w:rFonts w:ascii="MJXc-TeX-main-Rw" w:hAnsi="MJXc-TeX-main-Rw" w:cs="Helvetica"/>
-          <w:color w:val="333333"/>
-          <w:sz w:val="28"/>
-          <w:szCs w:val="28"/>
-          <w:highlight w:val="cyan"/>
-          <w:bdr w:val="none" w:sz="0" w:space="0" w:color="auto" w:frame="1"/>
-          <w:shd w:val="clear" w:color="auto" w:fill="FFFFFF"/>
-        </w:rPr>
-        <w:t>,...,</w:t>
-      </w:r>
-      <w:proofErr w:type="spellStart"/>
-      <w:r>
-        <w:rPr>
-          <w:rStyle w:val="mjx-char"/>
-          <w:rFonts w:ascii="MJXc-TeX-math-Iw" w:hAnsi="MJXc-TeX-math-Iw" w:cs="Helvetica"/>
-          <w:color w:val="333333"/>
-          <w:sz w:val="28"/>
-          <w:szCs w:val="28"/>
-          <w:highlight w:val="cyan"/>
-          <w:bdr w:val="none" w:sz="0" w:space="0" w:color="auto" w:frame="1"/>
-          <w:shd w:val="clear" w:color="auto" w:fill="FFFFFF"/>
-        </w:rPr>
-        <w:t>x</w:t>
-      </w:r>
-      <w:r>
-        <w:rPr>
-          <w:rStyle w:val="mjx-char"/>
-          <w:rFonts w:ascii="MJXc-TeX-math-Iw" w:hAnsi="MJXc-TeX-math-Iw" w:cs="Helvetica"/>
-          <w:color w:val="333333"/>
-          <w:sz w:val="20"/>
-          <w:szCs w:val="20"/>
-          <w:highlight w:val="cyan"/>
-          <w:bdr w:val="none" w:sz="0" w:space="0" w:color="auto" w:frame="1"/>
-          <w:shd w:val="clear" w:color="auto" w:fill="FFFFFF"/>
-        </w:rPr>
-        <w:t>n</w:t>
-      </w:r>
-      <w:proofErr w:type="spellEnd"/>
     </w:p>
     <w:p>
       <w:pPr>
@@ -6191,126 +5914,346 @@
     </w:p>
     <w:p>
       <w:pPr>
-        <w:pStyle w:val="NormalWeb"/>
-        <w:shd w:val="clear" w:color="auto" w:fill="FFFFFF"/>
-        <w:spacing w:before="0" w:beforeAutospacing="0" w:after="204" w:afterAutospacing="0"/>
-        <w:rPr>
-          <w:color w:val="5B9BD5" w:themeColor="accent1"/>
-          <w:lang w:val="en-US"/>
+        <w:shd w:val="clear" w:color="auto" w:fill="FFFFFF"/>
+        <w:tabs>
+          <w:tab w:val="left" w:pos="916"/>
+          <w:tab w:val="left" w:pos="1832"/>
+          <w:tab w:val="left" w:pos="2748"/>
+          <w:tab w:val="left" w:pos="3664"/>
+          <w:tab w:val="left" w:pos="4580"/>
+          <w:tab w:val="left" w:pos="5496"/>
+          <w:tab w:val="left" w:pos="6412"/>
+          <w:tab w:val="left" w:pos="7328"/>
+          <w:tab w:val="left" w:pos="8244"/>
+          <w:tab w:val="left" w:pos="9160"/>
+          <w:tab w:val="left" w:pos="10076"/>
+          <w:tab w:val="left" w:pos="10992"/>
+          <w:tab w:val="left" w:pos="11908"/>
+          <w:tab w:val="left" w:pos="12824"/>
+          <w:tab w:val="left" w:pos="13740"/>
+          <w:tab w:val="left" w:pos="14656"/>
+        </w:tabs>
+        <w:wordWrap w:val="0"/>
+        <w:spacing w:after="0" w:line="200" w:lineRule="atLeast"/>
+        <w:jc w:val="left"/>
+        <w:rPr>
+          <w:rFonts w:ascii="Lucida Console" w:eastAsia="Times New Roman" w:hAnsi="Lucida Console" w:cs="Courier New"/>
+          <w:color w:val="0000FF"/>
+          <w:sz w:val="20"/>
+          <w:szCs w:val="20"/>
+          <w:lang w:eastAsia="es-VE"/>
+        </w:rPr>
+      </w:pPr>
+      <w:r>
+        <w:rPr>
+          <w:rFonts w:ascii="Lucida Console" w:eastAsia="Times New Roman" w:hAnsi="Lucida Console" w:cs="Courier New"/>
+          <w:color w:val="0000FF"/>
+          <w:sz w:val="20"/>
+          <w:szCs w:val="20"/>
+          <w:lang w:eastAsia="es-VE"/>
+        </w:rPr>
+        <w:t xml:space="preserve">Cargamos la base de datos </w:t>
+      </w:r>
+      <w:proofErr w:type="spellStart"/>
+      <w:r>
+        <w:rPr>
+          <w:rFonts w:ascii="Lucida Console" w:eastAsia="Times New Roman" w:hAnsi="Lucida Console" w:cs="Courier New"/>
+          <w:color w:val="0000FF"/>
+          <w:sz w:val="20"/>
+          <w:szCs w:val="20"/>
+          <w:lang w:eastAsia="es-VE"/>
+        </w:rPr>
+        <w:t>mtcars</w:t>
+      </w:r>
+      <w:proofErr w:type="spellEnd"/>
+    </w:p>
+    <w:p>
+      <w:pPr>
+        <w:shd w:val="clear" w:color="auto" w:fill="FFFFFF"/>
+        <w:tabs>
+          <w:tab w:val="left" w:pos="916"/>
+          <w:tab w:val="left" w:pos="1832"/>
+          <w:tab w:val="left" w:pos="2748"/>
+          <w:tab w:val="left" w:pos="3664"/>
+          <w:tab w:val="left" w:pos="4580"/>
+          <w:tab w:val="left" w:pos="5496"/>
+          <w:tab w:val="left" w:pos="6412"/>
+          <w:tab w:val="left" w:pos="7328"/>
+          <w:tab w:val="left" w:pos="8244"/>
+          <w:tab w:val="left" w:pos="9160"/>
+          <w:tab w:val="left" w:pos="10076"/>
+          <w:tab w:val="left" w:pos="10992"/>
+          <w:tab w:val="left" w:pos="11908"/>
+          <w:tab w:val="left" w:pos="12824"/>
+          <w:tab w:val="left" w:pos="13740"/>
+          <w:tab w:val="left" w:pos="14656"/>
+        </w:tabs>
+        <w:wordWrap w:val="0"/>
+        <w:spacing w:after="0" w:line="200" w:lineRule="atLeast"/>
+        <w:jc w:val="left"/>
+        <w:rPr>
+          <w:rFonts w:ascii="Lucida Console" w:eastAsia="Times New Roman" w:hAnsi="Lucida Console" w:cs="Courier New"/>
+          <w:color w:val="000000"/>
+          <w:sz w:val="20"/>
+          <w:szCs w:val="20"/>
+          <w:lang w:eastAsia="es-VE"/>
         </w:rPr>
       </w:pPr>
       <w:proofErr w:type="gramStart"/>
       <w:r>
         <w:rPr>
-          <w:color w:val="5B9BD5" w:themeColor="accent1"/>
-          <w:lang w:val="en-US"/>
-        </w:rPr>
-        <w:t>plot(</w:t>
+          <w:rFonts w:ascii="Lucida Console" w:eastAsia="Times New Roman" w:hAnsi="Lucida Console" w:cs="Courier New"/>
+          <w:color w:val="0000FF"/>
+          <w:sz w:val="20"/>
+          <w:szCs w:val="20"/>
+          <w:lang w:eastAsia="es-VE"/>
+        </w:rPr>
+        <w:t>data(</w:t>
       </w:r>
       <w:proofErr w:type="spellStart"/>
       <w:proofErr w:type="gramEnd"/>
       <w:r>
         <w:rPr>
-          <w:color w:val="5B9BD5" w:themeColor="accent1"/>
-          <w:lang w:val="en-US"/>
+          <w:rFonts w:ascii="Lucida Console" w:eastAsia="Times New Roman" w:hAnsi="Lucida Console" w:cs="Courier New"/>
+          <w:color w:val="0000FF"/>
+          <w:sz w:val="20"/>
+          <w:szCs w:val="20"/>
+          <w:lang w:eastAsia="es-VE"/>
+        </w:rPr>
+        <w:t>mtcars</w:t>
+      </w:r>
+      <w:proofErr w:type="spellEnd"/>
+      <w:r>
+        <w:rPr>
+          <w:rFonts w:ascii="Lucida Console" w:eastAsia="Times New Roman" w:hAnsi="Lucida Console" w:cs="Courier New"/>
+          <w:color w:val="0000FF"/>
+          <w:sz w:val="20"/>
+          <w:szCs w:val="20"/>
+          <w:lang w:eastAsia="es-VE"/>
+        </w:rPr>
+        <w:t>)</w:t>
+      </w:r>
+    </w:p>
+    <w:p>
+      <w:pPr>
+        <w:shd w:val="clear" w:color="auto" w:fill="FFFFFF"/>
+        <w:tabs>
+          <w:tab w:val="left" w:pos="916"/>
+          <w:tab w:val="left" w:pos="1832"/>
+          <w:tab w:val="left" w:pos="2748"/>
+          <w:tab w:val="left" w:pos="3664"/>
+          <w:tab w:val="left" w:pos="4580"/>
+          <w:tab w:val="left" w:pos="5496"/>
+          <w:tab w:val="left" w:pos="6412"/>
+          <w:tab w:val="left" w:pos="7328"/>
+          <w:tab w:val="left" w:pos="8244"/>
+          <w:tab w:val="left" w:pos="9160"/>
+          <w:tab w:val="left" w:pos="10076"/>
+          <w:tab w:val="left" w:pos="10992"/>
+          <w:tab w:val="left" w:pos="11908"/>
+          <w:tab w:val="left" w:pos="12824"/>
+          <w:tab w:val="left" w:pos="13740"/>
+          <w:tab w:val="left" w:pos="14656"/>
+        </w:tabs>
+        <w:wordWrap w:val="0"/>
+        <w:spacing w:after="0" w:line="200" w:lineRule="atLeast"/>
+        <w:jc w:val="left"/>
+        <w:rPr>
+          <w:rFonts w:ascii="Lucida Console" w:eastAsia="Times New Roman" w:hAnsi="Lucida Console" w:cs="Courier New"/>
+          <w:color w:val="0000FF"/>
+          <w:sz w:val="20"/>
+          <w:szCs w:val="20"/>
+          <w:lang w:eastAsia="es-VE"/>
+        </w:rPr>
+      </w:pPr>
+    </w:p>
+    <w:p>
+      <w:pPr>
+        <w:shd w:val="clear" w:color="auto" w:fill="FFFFFF"/>
+        <w:tabs>
+          <w:tab w:val="left" w:pos="916"/>
+          <w:tab w:val="left" w:pos="1832"/>
+          <w:tab w:val="left" w:pos="2748"/>
+          <w:tab w:val="left" w:pos="3664"/>
+          <w:tab w:val="left" w:pos="4580"/>
+          <w:tab w:val="left" w:pos="5496"/>
+          <w:tab w:val="left" w:pos="6412"/>
+          <w:tab w:val="left" w:pos="7328"/>
+          <w:tab w:val="left" w:pos="8244"/>
+          <w:tab w:val="left" w:pos="9160"/>
+          <w:tab w:val="left" w:pos="10076"/>
+          <w:tab w:val="left" w:pos="10992"/>
+          <w:tab w:val="left" w:pos="11908"/>
+          <w:tab w:val="left" w:pos="12824"/>
+          <w:tab w:val="left" w:pos="13740"/>
+          <w:tab w:val="left" w:pos="14656"/>
+        </w:tabs>
+        <w:wordWrap w:val="0"/>
+        <w:spacing w:after="0" w:line="200" w:lineRule="atLeast"/>
+        <w:jc w:val="left"/>
+        <w:rPr>
+          <w:rFonts w:ascii="Lucida Console" w:eastAsia="Times New Roman" w:hAnsi="Lucida Console" w:cs="Courier New"/>
+          <w:color w:val="000000"/>
+          <w:sz w:val="20"/>
+          <w:szCs w:val="20"/>
+          <w:lang w:eastAsia="es-VE"/>
+        </w:rPr>
+      </w:pPr>
+      <w:proofErr w:type="spellStart"/>
+      <w:proofErr w:type="gramStart"/>
+      <w:r>
+        <w:rPr>
+          <w:rFonts w:ascii="Lucida Console" w:eastAsia="Times New Roman" w:hAnsi="Lucida Console" w:cs="Courier New"/>
+          <w:color w:val="0000FF"/>
+          <w:sz w:val="20"/>
+          <w:szCs w:val="20"/>
+          <w:lang w:eastAsia="es-VE"/>
+        </w:rPr>
+        <w:t>plot</w:t>
+      </w:r>
+      <w:proofErr w:type="spellEnd"/>
+      <w:r>
+        <w:rPr>
+          <w:rFonts w:ascii="Lucida Console" w:eastAsia="Times New Roman" w:hAnsi="Lucida Console" w:cs="Courier New"/>
+          <w:color w:val="0000FF"/>
+          <w:sz w:val="20"/>
+          <w:szCs w:val="20"/>
+          <w:lang w:eastAsia="es-VE"/>
+        </w:rPr>
+        <w:t>(</w:t>
+      </w:r>
+      <w:proofErr w:type="spellStart"/>
+      <w:proofErr w:type="gramEnd"/>
+      <w:r>
+        <w:rPr>
+          <w:rFonts w:ascii="Lucida Console" w:eastAsia="Times New Roman" w:hAnsi="Lucida Console" w:cs="Courier New"/>
+          <w:color w:val="0000FF"/>
+          <w:sz w:val="20"/>
+          <w:szCs w:val="20"/>
+          <w:lang w:eastAsia="es-VE"/>
         </w:rPr>
         <w:t>mtcars$mpg</w:t>
       </w:r>
       <w:proofErr w:type="spellEnd"/>
       <w:r>
         <w:rPr>
-          <w:color w:val="5B9BD5" w:themeColor="accent1"/>
-          <w:lang w:val="en-US"/>
+          <w:rFonts w:ascii="Lucida Console" w:eastAsia="Times New Roman" w:hAnsi="Lucida Console" w:cs="Courier New"/>
+          <w:color w:val="0000FF"/>
+          <w:sz w:val="20"/>
+          <w:szCs w:val="20"/>
+          <w:lang w:eastAsia="es-VE"/>
         </w:rPr>
         <w:t xml:space="preserve">, </w:t>
       </w:r>
       <w:proofErr w:type="spellStart"/>
       <w:r>
         <w:rPr>
-          <w:color w:val="5B9BD5" w:themeColor="accent1"/>
-          <w:lang w:val="en-US"/>
+          <w:rFonts w:ascii="Lucida Console" w:eastAsia="Times New Roman" w:hAnsi="Lucida Console" w:cs="Courier New"/>
+          <w:color w:val="0000FF"/>
+          <w:sz w:val="20"/>
+          <w:szCs w:val="20"/>
+          <w:lang w:eastAsia="es-VE"/>
         </w:rPr>
         <w:t>mtcars$disp</w:t>
       </w:r>
       <w:proofErr w:type="spellEnd"/>
       <w:r>
         <w:rPr>
-          <w:color w:val="5B9BD5" w:themeColor="accent1"/>
-          <w:lang w:val="en-US"/>
+          <w:rFonts w:ascii="Lucida Console" w:eastAsia="Times New Roman" w:hAnsi="Lucida Console" w:cs="Courier New"/>
+          <w:color w:val="0000FF"/>
+          <w:sz w:val="20"/>
+          <w:szCs w:val="20"/>
+          <w:lang w:eastAsia="es-VE"/>
         </w:rPr>
         <w:t xml:space="preserve">, </w:t>
       </w:r>
       <w:proofErr w:type="spellStart"/>
       <w:r>
         <w:rPr>
-          <w:color w:val="5B9BD5" w:themeColor="accent1"/>
-          <w:lang w:val="en-US"/>
+          <w:rFonts w:ascii="Lucida Console" w:eastAsia="Times New Roman" w:hAnsi="Lucida Console" w:cs="Courier New"/>
+          <w:color w:val="0000FF"/>
+          <w:sz w:val="20"/>
+          <w:szCs w:val="20"/>
+          <w:lang w:eastAsia="es-VE"/>
         </w:rPr>
         <w:t>xlab</w:t>
       </w:r>
       <w:proofErr w:type="spellEnd"/>
       <w:r>
         <w:rPr>
-          <w:color w:val="5B9BD5" w:themeColor="accent1"/>
-          <w:lang w:val="en-US"/>
-        </w:rPr>
-        <w:t>=</w:t>
-      </w:r>
-      <w:r>
-        <w:rPr>
-          <w:lang w:val="en-US"/>
-        </w:rPr>
-        <w:t>"mpg"</w:t>
-      </w:r>
-      <w:r>
-        <w:rPr>
-          <w:color w:val="5B9BD5" w:themeColor="accent1"/>
-          <w:lang w:val="en-US"/>
-        </w:rPr>
-        <w:t xml:space="preserve">, </w:t>
-      </w:r>
-      <w:proofErr w:type="spellStart"/>
-      <w:r>
-        <w:rPr>
-          <w:color w:val="5B9BD5" w:themeColor="accent1"/>
-          <w:lang w:val="en-US"/>
+          <w:rFonts w:ascii="Lucida Console" w:eastAsia="Times New Roman" w:hAnsi="Lucida Console" w:cs="Courier New"/>
+          <w:color w:val="0000FF"/>
+          <w:sz w:val="20"/>
+          <w:szCs w:val="20"/>
+          <w:lang w:eastAsia="es-VE"/>
+        </w:rPr>
+        <w:t>="</w:t>
+      </w:r>
+      <w:proofErr w:type="spellStart"/>
+      <w:r>
+        <w:rPr>
+          <w:rFonts w:ascii="Lucida Console" w:eastAsia="Times New Roman" w:hAnsi="Lucida Console" w:cs="Courier New"/>
+          <w:color w:val="0000FF"/>
+          <w:sz w:val="20"/>
+          <w:szCs w:val="20"/>
+          <w:lang w:eastAsia="es-VE"/>
+        </w:rPr>
+        <w:t>mpg</w:t>
+      </w:r>
+      <w:proofErr w:type="spellEnd"/>
+      <w:r>
+        <w:rPr>
+          <w:rFonts w:ascii="Lucida Console" w:eastAsia="Times New Roman" w:hAnsi="Lucida Console" w:cs="Courier New"/>
+          <w:color w:val="0000FF"/>
+          <w:sz w:val="20"/>
+          <w:szCs w:val="20"/>
+          <w:lang w:eastAsia="es-VE"/>
+        </w:rPr>
+        <w:t xml:space="preserve">", </w:t>
+      </w:r>
+      <w:proofErr w:type="spellStart"/>
+      <w:r>
+        <w:rPr>
+          <w:rFonts w:ascii="Lucida Console" w:eastAsia="Times New Roman" w:hAnsi="Lucida Console" w:cs="Courier New"/>
+          <w:color w:val="0000FF"/>
+          <w:sz w:val="20"/>
+          <w:szCs w:val="20"/>
+          <w:lang w:eastAsia="es-VE"/>
         </w:rPr>
         <w:t>ylab</w:t>
       </w:r>
       <w:proofErr w:type="spellEnd"/>
       <w:r>
         <w:rPr>
-          <w:color w:val="5B9BD5" w:themeColor="accent1"/>
-          <w:lang w:val="en-US"/>
-        </w:rPr>
-        <w:t>=</w:t>
-      </w:r>
-      <w:r>
-        <w:rPr>
-          <w:lang w:val="en-US"/>
-        </w:rPr>
-        <w:t>"</w:t>
-      </w:r>
-      <w:proofErr w:type="spellStart"/>
-      <w:r>
-        <w:rPr>
-          <w:lang w:val="en-US"/>
+          <w:rFonts w:ascii="Lucida Console" w:eastAsia="Times New Roman" w:hAnsi="Lucida Console" w:cs="Courier New"/>
+          <w:color w:val="0000FF"/>
+          <w:sz w:val="20"/>
+          <w:szCs w:val="20"/>
+          <w:lang w:eastAsia="es-VE"/>
+        </w:rPr>
+        <w:t>="</w:t>
+      </w:r>
+      <w:proofErr w:type="spellStart"/>
+      <w:r>
+        <w:rPr>
+          <w:rFonts w:ascii="Lucida Console" w:eastAsia="Times New Roman" w:hAnsi="Lucida Console" w:cs="Courier New"/>
+          <w:color w:val="0000FF"/>
+          <w:sz w:val="20"/>
+          <w:szCs w:val="20"/>
+          <w:lang w:eastAsia="es-VE"/>
         </w:rPr>
         <w:t>disp</w:t>
       </w:r>
       <w:proofErr w:type="spellEnd"/>
       <w:r>
         <w:rPr>
-          <w:lang w:val="en-US"/>
-        </w:rPr>
-        <w:t>"</w:t>
-      </w:r>
-      <w:r>
-        <w:rPr>
-          <w:color w:val="5B9BD5" w:themeColor="accent1"/>
-          <w:lang w:val="en-US"/>
-        </w:rPr>
-        <w:t>)</w:t>
+          <w:rFonts w:ascii="Lucida Console" w:eastAsia="Times New Roman" w:hAnsi="Lucida Console" w:cs="Courier New"/>
+          <w:color w:val="0000FF"/>
+          <w:sz w:val="20"/>
+          <w:szCs w:val="20"/>
+          <w:lang w:eastAsia="es-VE"/>
+        </w:rPr>
+        <w:t>")</w:t>
       </w:r>
     </w:p>
     <w:p>
@@ -7199,10 +7142,83 @@
       <w:pPr>
         <w:rPr>
           <w:color w:val="000000" w:themeColor="text1"/>
-          <w:highlight w:val="yellow"/>
+          <w:highlight w:val="cyan"/>
           <w:lang w:val="en-US"/>
         </w:rPr>
       </w:pPr>
+      <w:r>
+        <w:rPr>
+          <w:color w:val="000000" w:themeColor="text1"/>
+          <w:highlight w:val="cyan"/>
+          <w:lang w:val="en-US"/>
+        </w:rPr>
+        <w:t>#</w:t>
+      </w:r>
+      <w:proofErr w:type="spellStart"/>
+      <w:r>
+        <w:rPr>
+          <w:color w:val="000000" w:themeColor="text1"/>
+          <w:highlight w:val="cyan"/>
+          <w:lang w:val="en-US"/>
+        </w:rPr>
+        <w:t>Visualizamos</w:t>
+      </w:r>
+      <w:proofErr w:type="spellEnd"/>
+      <w:r>
+        <w:rPr>
+          <w:color w:val="000000" w:themeColor="text1"/>
+          <w:highlight w:val="cyan"/>
+          <w:lang w:val="en-US"/>
+        </w:rPr>
+        <w:t xml:space="preserve"> el </w:t>
+      </w:r>
+      <w:proofErr w:type="spellStart"/>
+      <w:r>
+        <w:rPr>
+          <w:color w:val="000000" w:themeColor="text1"/>
+          <w:highlight w:val="cyan"/>
+          <w:lang w:val="en-US"/>
+        </w:rPr>
+        <w:t>cambio</w:t>
+      </w:r>
+      <w:proofErr w:type="spellEnd"/>
+    </w:p>
+    <w:p>
+      <w:pPr>
+        <w:rPr>
+          <w:color w:val="000000" w:themeColor="text1"/>
+          <w:highlight w:val="cyan"/>
+          <w:lang w:val="en-US"/>
+        </w:rPr>
+      </w:pPr>
+      <w:proofErr w:type="gramStart"/>
+      <w:r>
+        <w:rPr>
+          <w:color w:val="000000" w:themeColor="text1"/>
+          <w:highlight w:val="cyan"/>
+          <w:lang w:val="en-US"/>
+        </w:rPr>
+        <w:t>head(</w:t>
+      </w:r>
+      <w:proofErr w:type="spellStart"/>
+      <w:proofErr w:type="gramEnd"/>
+      <w:r>
+        <w:rPr>
+          <w:color w:val="000000" w:themeColor="text1"/>
+          <w:highlight w:val="cyan"/>
+          <w:lang w:val="en-US"/>
+        </w:rPr>
+        <w:t>df</w:t>
+      </w:r>
+      <w:proofErr w:type="spellEnd"/>
+      <w:r>
+        <w:rPr>
+          <w:color w:val="000000" w:themeColor="text1"/>
+          <w:highlight w:val="cyan"/>
+          <w:lang w:val="en-US"/>
+        </w:rPr>
+        <w:t>)</w:t>
+      </w:r>
     </w:p>
     <w:p>
       <w:pPr>
@@ -7370,140 +7386,124 @@
           <w:color w:val="000000" w:themeColor="text1"/>
           <w:sz w:val="24"/>
           <w:szCs w:val="24"/>
-          <w:highlight w:val="yellow"/>
+          <w:highlight w:val="cyan"/>
           <w:lang w:val="en-US" w:eastAsia="es-VE"/>
         </w:rPr>
       </w:pPr>
-    </w:p>
-    <w:p>
-      <w:pPr>
+      <w:r>
         <w:rPr>
           <w:color w:val="000000" w:themeColor="text1"/>
           <w:sz w:val="24"/>
           <w:szCs w:val="24"/>
-          <w:highlight w:val="yellow"/>
+          <w:highlight w:val="cyan"/>
           <w:lang w:val="en-US" w:eastAsia="es-VE"/>
         </w:rPr>
-      </w:pPr>
+        <w:t>#</w:t>
+      </w:r>
+      <w:proofErr w:type="spellStart"/>
       <w:r>
         <w:rPr>
           <w:color w:val="000000" w:themeColor="text1"/>
           <w:sz w:val="24"/>
           <w:szCs w:val="24"/>
-          <w:highlight w:val="yellow"/>
+          <w:highlight w:val="cyan"/>
           <w:lang w:val="en-US" w:eastAsia="es-VE"/>
         </w:rPr>
-        <w:t xml:space="preserve">### </w:t>
-      </w:r>
-      <w:proofErr w:type="spellStart"/>
+        <w:t>Visualizamos</w:t>
+      </w:r>
+      <w:proofErr w:type="spellEnd"/>
       <w:r>
         <w:rPr>
           <w:color w:val="000000" w:themeColor="text1"/>
           <w:sz w:val="24"/>
           <w:szCs w:val="24"/>
-          <w:highlight w:val="yellow"/>
+          <w:highlight w:val="cyan"/>
           <w:lang w:val="en-US" w:eastAsia="es-VE"/>
         </w:rPr>
-        <w:t>Transformación</w:t>
-      </w:r>
-      <w:proofErr w:type="spellEnd"/>
+        <w:t xml:space="preserve"> el </w:t>
+      </w:r>
+      <w:proofErr w:type="spellStart"/>
       <w:r>
         <w:rPr>
           <w:color w:val="000000" w:themeColor="text1"/>
           <w:sz w:val="24"/>
           <w:szCs w:val="24"/>
-          <w:highlight w:val="yellow"/>
+          <w:highlight w:val="cyan"/>
           <w:lang w:val="en-US" w:eastAsia="es-VE"/>
         </w:rPr>
-        <w:t xml:space="preserve"> 1/x</w:t>
-      </w:r>
-    </w:p>
-    <w:p>
-      <w:pPr>
+        <w:t>nuevo</w:t>
+      </w:r>
+      <w:proofErr w:type="spellEnd"/>
+      <w:r>
         <w:rPr>
           <w:color w:val="000000" w:themeColor="text1"/>
           <w:sz w:val="24"/>
           <w:szCs w:val="24"/>
-          <w:highlight w:val="yellow"/>
+          <w:highlight w:val="cyan"/>
           <w:lang w:val="en-US" w:eastAsia="es-VE"/>
         </w:rPr>
-      </w:pPr>
-      <w:proofErr w:type="spellStart"/>
-      <w:proofErr w:type="gramStart"/>
+        <w:t xml:space="preserve"> </w:t>
+      </w:r>
+      <w:proofErr w:type="spellStart"/>
       <w:r>
         <w:rPr>
           <w:color w:val="000000" w:themeColor="text1"/>
           <w:sz w:val="24"/>
           <w:szCs w:val="24"/>
-          <w:highlight w:val="yellow"/>
+          <w:highlight w:val="cyan"/>
           <w:lang w:val="en-US" w:eastAsia="es-VE"/>
         </w:rPr>
-        <w:t>df$</w:t>
-      </w:r>
-      <w:proofErr w:type="gramEnd"/>
-      <w:r>
+        <w:t>cambio</w:t>
+      </w:r>
+      <w:proofErr w:type="spellEnd"/>
+    </w:p>
+    <w:p>
+      <w:pPr>
         <w:rPr>
           <w:color w:val="000000" w:themeColor="text1"/>
           <w:sz w:val="24"/>
           <w:szCs w:val="24"/>
-          <w:highlight w:val="yellow"/>
+          <w:highlight w:val="cyan"/>
           <w:lang w:val="en-US" w:eastAsia="es-VE"/>
         </w:rPr>
-        <w:t>x</w:t>
-      </w:r>
-      <w:proofErr w:type="spellEnd"/>
+      </w:pPr>
+      <w:proofErr w:type="gramStart"/>
       <w:r>
         <w:rPr>
           <w:color w:val="000000" w:themeColor="text1"/>
           <w:sz w:val="24"/>
           <w:szCs w:val="24"/>
-          <w:highlight w:val="yellow"/>
+          <w:highlight w:val="cyan"/>
           <w:lang w:val="en-US" w:eastAsia="es-VE"/>
         </w:rPr>
-        <w:t>=1/</w:t>
-      </w:r>
-      <w:proofErr w:type="spellStart"/>
+        <w:t>head(</w:t>
+      </w:r>
+      <w:proofErr w:type="spellStart"/>
+      <w:proofErr w:type="gramEnd"/>
       <w:r>
         <w:rPr>
           <w:color w:val="000000" w:themeColor="text1"/>
           <w:sz w:val="24"/>
           <w:szCs w:val="24"/>
-          <w:highlight w:val="yellow"/>
+          <w:highlight w:val="cyan"/>
           <w:lang w:val="en-US" w:eastAsia="es-VE"/>
         </w:rPr>
-        <w:t>df$x</w:t>
-      </w:r>
-      <w:proofErr w:type="spellEnd"/>
-    </w:p>
-    <w:p>
-      <w:pPr>
-        <w:rPr>
-          <w:color w:val="000000" w:themeColor="text1"/>
-          <w:highlight w:val="yellow"/>
-          <w:lang w:val="en-US"/>
-        </w:rPr>
-      </w:pPr>
-    </w:p>
-    <w:p>
-      <w:pPr>
-        <w:rPr>
-          <w:color w:val="000000" w:themeColor="text1"/>
-          <w:highlight w:val="yellow"/>
-          <w:lang w:val="en-US"/>
-        </w:rPr>
-      </w:pPr>
+        <w:t>df</w:t>
+      </w:r>
+      <w:proofErr w:type="spellEnd"/>
       <w:r>
         <w:rPr>
           <w:color w:val="000000" w:themeColor="text1"/>
           <w:sz w:val="24"/>
           <w:szCs w:val="24"/>
-          <w:highlight w:val="yellow"/>
+          <w:highlight w:val="cyan"/>
           <w:lang w:val="en-US" w:eastAsia="es-VE"/>
         </w:rPr>
-        <w:t>###</w:t>
-      </w:r>
-      <w:proofErr w:type="spellStart"/>
-      <w:r>
+        <w:t>)</w:t>
+      </w:r>
+    </w:p>
+    <w:p>
+      <w:pPr>
         <w:rPr>
           <w:color w:val="000000" w:themeColor="text1"/>
           <w:sz w:val="24"/>
@@ -7511,9 +7511,7 @@
           <w:highlight w:val="yellow"/>
           <w:lang w:val="en-US" w:eastAsia="es-VE"/>
         </w:rPr>
-        <w:t>Transformación</w:t>
-      </w:r>
-      <w:proofErr w:type="spellEnd"/>
+      </w:pPr>
       <w:r>
         <w:rPr>
           <w:color w:val="000000" w:themeColor="text1"/>
@@ -7522,7 +7520,7 @@
           <w:highlight w:val="yellow"/>
           <w:lang w:val="en-US" w:eastAsia="es-VE"/>
         </w:rPr>
-        <w:t xml:space="preserve"> </w:t>
+        <w:t xml:space="preserve">### </w:t>
       </w:r>
       <w:proofErr w:type="spellStart"/>
       <w:r>
@@ -7533,7 +7531,7 @@
           <w:highlight w:val="yellow"/>
           <w:lang w:val="en-US" w:eastAsia="es-VE"/>
         </w:rPr>
-        <w:t>lg</w:t>
+        <w:t>Transformación</w:t>
       </w:r>
       <w:proofErr w:type="spellEnd"/>
       <w:r>
@@ -7544,19 +7542,11 @@
           <w:highlight w:val="yellow"/>
           <w:lang w:val="en-US" w:eastAsia="es-VE"/>
         </w:rPr>
-        <w:t>(x)</w:t>
-      </w:r>
-    </w:p>
-    <w:p>
-      <w:pPr>
-        <w:rPr>
-          <w:color w:val="000000" w:themeColor="text1"/>
-          <w:lang w:val="en-US"/>
-        </w:rPr>
-      </w:pPr>
-      <w:proofErr w:type="spellStart"/>
-      <w:proofErr w:type="gramStart"/>
-      <w:r>
+        <w:t xml:space="preserve"> 1/x</w:t>
+      </w:r>
+    </w:p>
+    <w:p>
+      <w:pPr>
         <w:rPr>
           <w:color w:val="000000" w:themeColor="text1"/>
           <w:sz w:val="24"/>
@@ -7564,10 +7554,9 @@
           <w:highlight w:val="yellow"/>
           <w:lang w:val="en-US" w:eastAsia="es-VE"/>
         </w:rPr>
-        <w:lastRenderedPageBreak/>
-        <w:t>df$</w:t>
-      </w:r>
-      <w:proofErr w:type="gramEnd"/>
+      </w:pPr>
+      <w:proofErr w:type="spellStart"/>
+      <w:proofErr w:type="gramStart"/>
       <w:r>
         <w:rPr>
           <w:color w:val="000000" w:themeColor="text1"/>
@@ -7576,9 +7565,9 @@
           <w:highlight w:val="yellow"/>
           <w:lang w:val="en-US" w:eastAsia="es-VE"/>
         </w:rPr>
-        <w:t>x</w:t>
-      </w:r>
-      <w:proofErr w:type="spellEnd"/>
+        <w:t>df$</w:t>
+      </w:r>
+      <w:proofErr w:type="gramEnd"/>
       <w:r>
         <w:rPr>
           <w:color w:val="000000" w:themeColor="text1"/>
@@ -7587,9 +7576,9 @@
           <w:highlight w:val="yellow"/>
           <w:lang w:val="en-US" w:eastAsia="es-VE"/>
         </w:rPr>
-        <w:t>=log(</w:t>
-      </w:r>
-      <w:proofErr w:type="spellStart"/>
+        <w:t>x</w:t>
+      </w:r>
+      <w:proofErr w:type="spellEnd"/>
       <w:r>
         <w:rPr>
           <w:color w:val="000000" w:themeColor="text1"/>
@@ -7598,9 +7587,9 @@
           <w:highlight w:val="yellow"/>
           <w:lang w:val="en-US" w:eastAsia="es-VE"/>
         </w:rPr>
-        <w:t>df$x</w:t>
-      </w:r>
-      <w:proofErr w:type="spellEnd"/>
+        <w:t>=1/</w:t>
+      </w:r>
+      <w:proofErr w:type="spellStart"/>
       <w:r>
         <w:rPr>
           <w:color w:val="000000" w:themeColor="text1"/>
@@ -7608,6 +7597,464 @@
           <w:szCs w:val="24"/>
           <w:highlight w:val="yellow"/>
           <w:lang w:val="en-US" w:eastAsia="es-VE"/>
+        </w:rPr>
+        <w:t>df$x</w:t>
+      </w:r>
+      <w:proofErr w:type="spellEnd"/>
+    </w:p>
+    <w:p>
+      <w:pPr>
+        <w:rPr>
+          <w:color w:val="000000" w:themeColor="text1"/>
+          <w:sz w:val="24"/>
+          <w:szCs w:val="24"/>
+          <w:highlight w:val="cyan"/>
+          <w:lang w:val="en-US" w:eastAsia="es-VE"/>
+        </w:rPr>
+      </w:pPr>
+      <w:r>
+        <w:rPr>
+          <w:color w:val="000000" w:themeColor="text1"/>
+          <w:sz w:val="24"/>
+          <w:szCs w:val="24"/>
+          <w:highlight w:val="cyan"/>
+          <w:lang w:val="en-US" w:eastAsia="es-VE"/>
+        </w:rPr>
+        <w:lastRenderedPageBreak/>
+        <w:t>#</w:t>
+      </w:r>
+      <w:proofErr w:type="spellStart"/>
+      <w:r>
+        <w:rPr>
+          <w:color w:val="000000" w:themeColor="text1"/>
+          <w:sz w:val="24"/>
+          <w:szCs w:val="24"/>
+          <w:highlight w:val="cyan"/>
+          <w:lang w:val="en-US" w:eastAsia="es-VE"/>
+        </w:rPr>
+        <w:t>Aplicando</w:t>
+      </w:r>
+      <w:proofErr w:type="spellEnd"/>
+      <w:r>
+        <w:rPr>
+          <w:color w:val="000000" w:themeColor="text1"/>
+          <w:sz w:val="24"/>
+          <w:szCs w:val="24"/>
+          <w:highlight w:val="cyan"/>
+          <w:lang w:val="en-US" w:eastAsia="es-VE"/>
+        </w:rPr>
+        <w:t xml:space="preserve"> </w:t>
+      </w:r>
+      <w:proofErr w:type="spellStart"/>
+      <w:r>
+        <w:rPr>
+          <w:color w:val="000000" w:themeColor="text1"/>
+          <w:sz w:val="24"/>
+          <w:szCs w:val="24"/>
+          <w:highlight w:val="cyan"/>
+          <w:lang w:val="en-US" w:eastAsia="es-VE"/>
+        </w:rPr>
+        <w:t>por</w:t>
+      </w:r>
+      <w:proofErr w:type="spellEnd"/>
+      <w:r>
+        <w:rPr>
+          <w:color w:val="000000" w:themeColor="text1"/>
+          <w:sz w:val="24"/>
+          <w:szCs w:val="24"/>
+          <w:highlight w:val="cyan"/>
+          <w:lang w:val="en-US" w:eastAsia="es-VE"/>
+        </w:rPr>
+        <w:t xml:space="preserve"> </w:t>
+      </w:r>
+      <w:proofErr w:type="spellStart"/>
+      <w:r>
+        <w:rPr>
+          <w:color w:val="000000" w:themeColor="text1"/>
+          <w:sz w:val="24"/>
+          <w:szCs w:val="24"/>
+          <w:highlight w:val="cyan"/>
+          <w:lang w:val="en-US" w:eastAsia="es-VE"/>
+        </w:rPr>
+        <w:t>segunda</w:t>
+      </w:r>
+      <w:proofErr w:type="spellEnd"/>
+      <w:r>
+        <w:rPr>
+          <w:color w:val="000000" w:themeColor="text1"/>
+          <w:sz w:val="24"/>
+          <w:szCs w:val="24"/>
+          <w:highlight w:val="cyan"/>
+          <w:lang w:val="en-US" w:eastAsia="es-VE"/>
+        </w:rPr>
+        <w:t xml:space="preserve"> </w:t>
+      </w:r>
+      <w:proofErr w:type="spellStart"/>
+      <w:r>
+        <w:rPr>
+          <w:color w:val="000000" w:themeColor="text1"/>
+          <w:sz w:val="24"/>
+          <w:szCs w:val="24"/>
+          <w:highlight w:val="cyan"/>
+          <w:lang w:val="en-US" w:eastAsia="es-VE"/>
+        </w:rPr>
+        <w:t>vez</w:t>
+      </w:r>
+      <w:proofErr w:type="spellEnd"/>
+      <w:r>
+        <w:rPr>
+          <w:color w:val="000000" w:themeColor="text1"/>
+          <w:sz w:val="24"/>
+          <w:szCs w:val="24"/>
+          <w:highlight w:val="cyan"/>
+          <w:lang w:val="en-US" w:eastAsia="es-VE"/>
+        </w:rPr>
+        <w:t xml:space="preserve"> la </w:t>
+      </w:r>
+      <w:proofErr w:type="spellStart"/>
+      <w:r>
+        <w:rPr>
+          <w:color w:val="000000" w:themeColor="text1"/>
+          <w:sz w:val="24"/>
+          <w:szCs w:val="24"/>
+          <w:highlight w:val="cyan"/>
+          <w:lang w:val="en-US" w:eastAsia="es-VE"/>
+        </w:rPr>
+        <w:t>Transformación</w:t>
+      </w:r>
+      <w:proofErr w:type="spellEnd"/>
+      <w:r>
+        <w:rPr>
+          <w:color w:val="000000" w:themeColor="text1"/>
+          <w:sz w:val="24"/>
+          <w:szCs w:val="24"/>
+          <w:highlight w:val="cyan"/>
+          <w:lang w:val="en-US" w:eastAsia="es-VE"/>
+        </w:rPr>
+        <w:t xml:space="preserve"> 1/x </w:t>
+      </w:r>
+      <w:proofErr w:type="spellStart"/>
+      <w:r>
+        <w:rPr>
+          <w:color w:val="000000" w:themeColor="text1"/>
+          <w:sz w:val="24"/>
+          <w:szCs w:val="24"/>
+          <w:highlight w:val="cyan"/>
+          <w:lang w:val="en-US" w:eastAsia="es-VE"/>
+        </w:rPr>
+        <w:t>recuperamos</w:t>
+      </w:r>
+      <w:proofErr w:type="spellEnd"/>
+      <w:r>
+        <w:rPr>
+          <w:color w:val="000000" w:themeColor="text1"/>
+          <w:sz w:val="24"/>
+          <w:szCs w:val="24"/>
+          <w:highlight w:val="cyan"/>
+          <w:lang w:val="en-US" w:eastAsia="es-VE"/>
+        </w:rPr>
+        <w:t xml:space="preserve"> </w:t>
+      </w:r>
+      <w:proofErr w:type="spellStart"/>
+      <w:r>
+        <w:rPr>
+          <w:color w:val="000000" w:themeColor="text1"/>
+          <w:sz w:val="24"/>
+          <w:szCs w:val="24"/>
+          <w:highlight w:val="cyan"/>
+          <w:lang w:val="en-US" w:eastAsia="es-VE"/>
+        </w:rPr>
+        <w:t>los</w:t>
+      </w:r>
+      <w:proofErr w:type="spellEnd"/>
+      <w:r>
+        <w:rPr>
+          <w:color w:val="000000" w:themeColor="text1"/>
+          <w:sz w:val="24"/>
+          <w:szCs w:val="24"/>
+          <w:highlight w:val="cyan"/>
+          <w:lang w:val="en-US" w:eastAsia="es-VE"/>
+        </w:rPr>
+        <w:t xml:space="preserve"> </w:t>
+      </w:r>
+      <w:proofErr w:type="spellStart"/>
+      <w:r>
+        <w:rPr>
+          <w:color w:val="000000" w:themeColor="text1"/>
+          <w:sz w:val="24"/>
+          <w:szCs w:val="24"/>
+          <w:highlight w:val="cyan"/>
+          <w:lang w:val="en-US" w:eastAsia="es-VE"/>
+        </w:rPr>
+        <w:t>datos</w:t>
+      </w:r>
+      <w:proofErr w:type="spellEnd"/>
+      <w:r>
+        <w:rPr>
+          <w:color w:val="000000" w:themeColor="text1"/>
+          <w:sz w:val="24"/>
+          <w:szCs w:val="24"/>
+          <w:highlight w:val="cyan"/>
+          <w:lang w:val="en-US" w:eastAsia="es-VE"/>
+        </w:rPr>
+        <w:t xml:space="preserve"> </w:t>
+      </w:r>
+      <w:proofErr w:type="spellStart"/>
+      <w:r>
+        <w:rPr>
+          <w:color w:val="000000" w:themeColor="text1"/>
+          <w:sz w:val="24"/>
+          <w:szCs w:val="24"/>
+          <w:highlight w:val="cyan"/>
+          <w:lang w:val="en-US" w:eastAsia="es-VE"/>
+        </w:rPr>
+        <w:t>originales</w:t>
+      </w:r>
+      <w:proofErr w:type="spellEnd"/>
+    </w:p>
+    <w:p>
+      <w:pPr>
+        <w:rPr>
+          <w:color w:val="000000" w:themeColor="text1"/>
+          <w:highlight w:val="yellow"/>
+          <w:lang w:val="en-US"/>
+        </w:rPr>
+      </w:pPr>
+    </w:p>
+    <w:p>
+      <w:pPr>
+        <w:rPr>
+          <w:color w:val="000000" w:themeColor="text1"/>
+          <w:highlight w:val="yellow"/>
+          <w:lang w:val="en-US"/>
+        </w:rPr>
+      </w:pPr>
+      <w:r>
+        <w:rPr>
+          <w:color w:val="000000" w:themeColor="text1"/>
+          <w:sz w:val="24"/>
+          <w:szCs w:val="24"/>
+          <w:highlight w:val="yellow"/>
+          <w:lang w:val="en-US" w:eastAsia="es-VE"/>
+        </w:rPr>
+        <w:t>###</w:t>
+      </w:r>
+      <w:proofErr w:type="spellStart"/>
+      <w:r>
+        <w:rPr>
+          <w:color w:val="000000" w:themeColor="text1"/>
+          <w:sz w:val="24"/>
+          <w:szCs w:val="24"/>
+          <w:highlight w:val="yellow"/>
+          <w:lang w:val="en-US" w:eastAsia="es-VE"/>
+        </w:rPr>
+        <w:t>Transformación</w:t>
+      </w:r>
+      <w:proofErr w:type="spellEnd"/>
+      <w:r>
+        <w:rPr>
+          <w:color w:val="000000" w:themeColor="text1"/>
+          <w:sz w:val="24"/>
+          <w:szCs w:val="24"/>
+          <w:highlight w:val="yellow"/>
+          <w:lang w:val="en-US" w:eastAsia="es-VE"/>
+        </w:rPr>
+        <w:t xml:space="preserve"> </w:t>
+      </w:r>
+      <w:proofErr w:type="spellStart"/>
+      <w:r>
+        <w:rPr>
+          <w:color w:val="000000" w:themeColor="text1"/>
+          <w:sz w:val="24"/>
+          <w:szCs w:val="24"/>
+          <w:highlight w:val="yellow"/>
+          <w:lang w:val="en-US" w:eastAsia="es-VE"/>
+        </w:rPr>
+        <w:t>lg</w:t>
+      </w:r>
+      <w:proofErr w:type="spellEnd"/>
+      <w:r>
+        <w:rPr>
+          <w:color w:val="000000" w:themeColor="text1"/>
+          <w:sz w:val="24"/>
+          <w:szCs w:val="24"/>
+          <w:highlight w:val="yellow"/>
+          <w:lang w:val="en-US" w:eastAsia="es-VE"/>
+        </w:rPr>
+        <w:t>(x)</w:t>
+      </w:r>
+    </w:p>
+    <w:p>
+      <w:pPr>
+        <w:rPr>
+          <w:color w:val="000000" w:themeColor="text1"/>
+          <w:sz w:val="24"/>
+          <w:szCs w:val="24"/>
+          <w:lang w:val="en-US" w:eastAsia="es-VE"/>
+        </w:rPr>
+      </w:pPr>
+      <w:proofErr w:type="spellStart"/>
+      <w:proofErr w:type="gramStart"/>
+      <w:r>
+        <w:rPr>
+          <w:color w:val="000000" w:themeColor="text1"/>
+          <w:sz w:val="24"/>
+          <w:szCs w:val="24"/>
+          <w:highlight w:val="yellow"/>
+          <w:lang w:val="en-US" w:eastAsia="es-VE"/>
+        </w:rPr>
+        <w:t>df$</w:t>
+      </w:r>
+      <w:proofErr w:type="gramEnd"/>
+      <w:r>
+        <w:rPr>
+          <w:color w:val="000000" w:themeColor="text1"/>
+          <w:sz w:val="24"/>
+          <w:szCs w:val="24"/>
+          <w:highlight w:val="yellow"/>
+          <w:lang w:val="en-US" w:eastAsia="es-VE"/>
+        </w:rPr>
+        <w:t>x</w:t>
+      </w:r>
+      <w:proofErr w:type="spellEnd"/>
+      <w:r>
+        <w:rPr>
+          <w:color w:val="000000" w:themeColor="text1"/>
+          <w:sz w:val="24"/>
+          <w:szCs w:val="24"/>
+          <w:highlight w:val="yellow"/>
+          <w:lang w:val="en-US" w:eastAsia="es-VE"/>
+        </w:rPr>
+        <w:t>=log(</w:t>
+      </w:r>
+      <w:proofErr w:type="spellStart"/>
+      <w:r>
+        <w:rPr>
+          <w:color w:val="000000" w:themeColor="text1"/>
+          <w:sz w:val="24"/>
+          <w:szCs w:val="24"/>
+          <w:highlight w:val="yellow"/>
+          <w:lang w:val="en-US" w:eastAsia="es-VE"/>
+        </w:rPr>
+        <w:t>df$x</w:t>
+      </w:r>
+      <w:proofErr w:type="spellEnd"/>
+      <w:r>
+        <w:rPr>
+          <w:color w:val="000000" w:themeColor="text1"/>
+          <w:sz w:val="24"/>
+          <w:szCs w:val="24"/>
+          <w:highlight w:val="yellow"/>
+          <w:lang w:val="en-US" w:eastAsia="es-VE"/>
+        </w:rPr>
+        <w:t>)</w:t>
+      </w:r>
+    </w:p>
+    <w:p>
+      <w:pPr>
+        <w:rPr>
+          <w:color w:val="000000" w:themeColor="text1"/>
+          <w:sz w:val="24"/>
+          <w:szCs w:val="24"/>
+          <w:lang w:val="en-US" w:eastAsia="es-VE"/>
+        </w:rPr>
+      </w:pPr>
+    </w:p>
+    <w:p>
+      <w:pPr>
+        <w:rPr>
+          <w:color w:val="000000" w:themeColor="text1"/>
+          <w:highlight w:val="cyan"/>
+          <w:lang w:val="en-US"/>
+        </w:rPr>
+      </w:pPr>
+      <w:r>
+        <w:rPr>
+          <w:color w:val="000000" w:themeColor="text1"/>
+          <w:highlight w:val="cyan"/>
+          <w:lang w:val="en-US"/>
+        </w:rPr>
+        <w:t>#</w:t>
+      </w:r>
+      <w:proofErr w:type="spellStart"/>
+      <w:r>
+        <w:rPr>
+          <w:color w:val="000000" w:themeColor="text1"/>
+          <w:highlight w:val="cyan"/>
+          <w:lang w:val="en-US"/>
+        </w:rPr>
+        <w:t>Visualizamos</w:t>
+      </w:r>
+      <w:proofErr w:type="spellEnd"/>
+      <w:r>
+        <w:rPr>
+          <w:color w:val="000000" w:themeColor="text1"/>
+          <w:highlight w:val="cyan"/>
+          <w:lang w:val="en-US"/>
+        </w:rPr>
+        <w:t xml:space="preserve"> el </w:t>
+      </w:r>
+      <w:proofErr w:type="spellStart"/>
+      <w:r>
+        <w:rPr>
+          <w:color w:val="000000" w:themeColor="text1"/>
+          <w:highlight w:val="cyan"/>
+          <w:lang w:val="en-US"/>
+        </w:rPr>
+        <w:t>último</w:t>
+      </w:r>
+      <w:proofErr w:type="spellEnd"/>
+      <w:r>
+        <w:rPr>
+          <w:color w:val="000000" w:themeColor="text1"/>
+          <w:highlight w:val="cyan"/>
+          <w:lang w:val="en-US"/>
+        </w:rPr>
+        <w:t xml:space="preserve"> </w:t>
+      </w:r>
+      <w:proofErr w:type="spellStart"/>
+      <w:r>
+        <w:rPr>
+          <w:color w:val="000000" w:themeColor="text1"/>
+          <w:highlight w:val="cyan"/>
+          <w:lang w:val="en-US"/>
+        </w:rPr>
+        <w:t>cambio</w:t>
+      </w:r>
+      <w:proofErr w:type="spellEnd"/>
+    </w:p>
+    <w:p>
+      <w:pPr>
+        <w:rPr>
+          <w:color w:val="000000" w:themeColor="text1"/>
+          <w:lang w:val="en-US"/>
+        </w:rPr>
+      </w:pPr>
+      <w:proofErr w:type="gramStart"/>
+      <w:r>
+        <w:rPr>
+          <w:color w:val="000000" w:themeColor="text1"/>
+          <w:highlight w:val="cyan"/>
+          <w:lang w:val="en-US"/>
+        </w:rPr>
+        <w:t>head(</w:t>
+      </w:r>
+      <w:proofErr w:type="spellStart"/>
+      <w:proofErr w:type="gramEnd"/>
+      <w:r>
+        <w:rPr>
+          <w:color w:val="000000" w:themeColor="text1"/>
+          <w:highlight w:val="cyan"/>
+          <w:lang w:val="en-US"/>
+        </w:rPr>
+        <w:t>df</w:t>
+      </w:r>
+      <w:proofErr w:type="spellEnd"/>
+      <w:r>
+        <w:rPr>
+          <w:color w:val="000000" w:themeColor="text1"/>
+          <w:highlight w:val="cyan"/>
+          <w:lang w:val="en-US"/>
         </w:rPr>
         <w:t>)</w:t>
       </w:r>
@@ -7694,7 +8141,6 @@
           <w:rFonts w:ascii="Helvetica" w:hAnsi="Helvetica" w:cs="Helvetica"/>
           <w:color w:val="333333"/>
           <w:spacing w:val="3"/>
-          <w:highlight w:val="cyan"/>
           <w:shd w:val="clear" w:color="auto" w:fill="FFFFFF"/>
         </w:rPr>
         <w:t>Supongamos que tenemos el conjunto de datos llamados </w:t>
@@ -7706,7 +8152,6 @@
           <w:rFonts w:ascii="Helvetica" w:hAnsi="Helvetica" w:cs="Helvetica"/>
           <w:color w:val="333333"/>
           <w:spacing w:val="3"/>
-          <w:highlight w:val="cyan"/>
           <w:shd w:val="clear" w:color="auto" w:fill="FFFFFF"/>
         </w:rPr>
         <w:t>mtcars</w:t>
@@ -7717,7 +8162,6 @@
           <w:rFonts w:ascii="Helvetica" w:hAnsi="Helvetica" w:cs="Helvetica"/>
           <w:color w:val="333333"/>
           <w:spacing w:val="3"/>
-          <w:highlight w:val="cyan"/>
           <w:shd w:val="clear" w:color="auto" w:fill="FFFFFF"/>
         </w:rPr>
         <w:t> la variable </w:t>
@@ -7729,7 +8173,6 @@
           <w:rFonts w:ascii="Helvetica" w:hAnsi="Helvetica" w:cs="Helvetica"/>
           <w:color w:val="333333"/>
           <w:spacing w:val="3"/>
-          <w:highlight w:val="cyan"/>
           <w:shd w:val="clear" w:color="auto" w:fill="FFFFFF"/>
         </w:rPr>
         <w:t>mpg</w:t>
@@ -7740,7 +8183,6 @@
           <w:rFonts w:ascii="Helvetica" w:hAnsi="Helvetica" w:cs="Helvetica"/>
           <w:color w:val="333333"/>
           <w:spacing w:val="3"/>
-          <w:highlight w:val="cyan"/>
           <w:shd w:val="clear" w:color="auto" w:fill="FFFFFF"/>
         </w:rPr>
         <w:t> la cual deseamos eliminar. Para ello usamos el siguiente código, en el cual el símbolo </w:t>
@@ -7750,7 +8192,6 @@
           <w:rFonts w:ascii="Helvetica" w:hAnsi="Helvetica" w:cs="Helvetica"/>
           <w:color w:val="333333"/>
           <w:spacing w:val="3"/>
-          <w:highlight w:val="cyan"/>
           <w:shd w:val="clear" w:color="auto" w:fill="FFFFFF"/>
         </w:rPr>
         <w:t>“</w:t>
@@ -7762,7 +8203,6 @@
           <w:rFonts w:ascii="Helvetica" w:hAnsi="Helvetica" w:cs="Helvetica"/>
           <w:color w:val="333333"/>
           <w:spacing w:val="3"/>
-          <w:highlight w:val="cyan"/>
           <w:shd w:val="clear" w:color="auto" w:fill="FFFFFF"/>
         </w:rPr>
         <w:t>!</w:t>
@@ -7773,7 +8213,6 @@
           <w:rFonts w:ascii="Helvetica" w:hAnsi="Helvetica" w:cs="Helvetica"/>
           <w:color w:val="333333"/>
           <w:spacing w:val="3"/>
-          <w:highlight w:val="cyan"/>
           <w:shd w:val="clear" w:color="auto" w:fill="FFFFFF"/>
         </w:rPr>
         <w:t> </w:t>
@@ -7783,7 +8222,6 @@
           <w:rFonts w:ascii="Helvetica" w:hAnsi="Helvetica" w:cs="Helvetica"/>
           <w:color w:val="333333"/>
           <w:spacing w:val="3"/>
-          <w:highlight w:val="cyan"/>
           <w:shd w:val="clear" w:color="auto" w:fill="FFFFFF"/>
         </w:rPr>
         <w:t xml:space="preserve">“ </w:t>
@@ -7793,7 +8231,6 @@
           <w:rFonts w:ascii="Helvetica" w:hAnsi="Helvetica" w:cs="Helvetica"/>
           <w:color w:val="333333"/>
           <w:spacing w:val="3"/>
-          <w:highlight w:val="cyan"/>
           <w:shd w:val="clear" w:color="auto" w:fill="FFFFFF"/>
         </w:rPr>
         <w:t>es el indicador para eliminar dicha variable.</w:t>
@@ -8091,6 +8528,169 @@
           <w:lang w:val="en-US"/>
         </w:rPr>
       </w:pPr>
+      <w:r>
+        <w:rPr>
+          <w:lang w:val="en-US"/>
+        </w:rPr>
+        <w:t xml:space="preserve">Para </w:t>
+      </w:r>
+      <w:proofErr w:type="spellStart"/>
+      <w:r>
+        <w:rPr>
+          <w:lang w:val="en-US"/>
+        </w:rPr>
+        <w:t>recuperar</w:t>
+      </w:r>
+      <w:proofErr w:type="spellEnd"/>
+      <w:r>
+        <w:rPr>
+          <w:lang w:val="en-US"/>
+        </w:rPr>
+        <w:t xml:space="preserve"> </w:t>
+      </w:r>
+      <w:proofErr w:type="spellStart"/>
+      <w:r>
+        <w:rPr>
+          <w:lang w:val="en-US"/>
+        </w:rPr>
+        <w:t>los</w:t>
+      </w:r>
+      <w:proofErr w:type="spellEnd"/>
+      <w:r>
+        <w:rPr>
+          <w:lang w:val="en-US"/>
+        </w:rPr>
+        <w:t xml:space="preserve"> </w:t>
+      </w:r>
+      <w:proofErr w:type="spellStart"/>
+      <w:r>
+        <w:rPr>
+          <w:lang w:val="en-US"/>
+        </w:rPr>
+        <w:t>datos</w:t>
+      </w:r>
+      <w:proofErr w:type="spellEnd"/>
+      <w:r>
+        <w:rPr>
+          <w:lang w:val="en-US"/>
+        </w:rPr>
+        <w:t xml:space="preserve"> con la </w:t>
+      </w:r>
+      <w:proofErr w:type="spellStart"/>
+      <w:r>
+        <w:rPr>
+          <w:lang w:val="en-US"/>
+        </w:rPr>
+        <w:t>columna</w:t>
+      </w:r>
+      <w:proofErr w:type="spellEnd"/>
+      <w:r>
+        <w:rPr>
+          <w:lang w:val="en-US"/>
+        </w:rPr>
+        <w:t xml:space="preserve"> </w:t>
+      </w:r>
+      <w:proofErr w:type="spellStart"/>
+      <w:r>
+        <w:rPr>
+          <w:lang w:val="en-US"/>
+        </w:rPr>
+        <w:t>eliminada</w:t>
+      </w:r>
+      <w:proofErr w:type="spellEnd"/>
+      <w:r>
+        <w:rPr>
+          <w:lang w:val="en-US"/>
+        </w:rPr>
+        <w:t xml:space="preserve"> solo </w:t>
+      </w:r>
+      <w:proofErr w:type="spellStart"/>
+      <w:r>
+        <w:rPr>
+          <w:lang w:val="en-US"/>
+        </w:rPr>
+        <w:t>cargamos</w:t>
+      </w:r>
+      <w:proofErr w:type="spellEnd"/>
+      <w:r>
+        <w:rPr>
+          <w:lang w:val="en-US"/>
+        </w:rPr>
+        <w:t xml:space="preserve"> </w:t>
+      </w:r>
+      <w:proofErr w:type="spellStart"/>
+      <w:r>
+        <w:rPr>
+          <w:lang w:val="en-US"/>
+        </w:rPr>
+        <w:t>nuevamente</w:t>
+      </w:r>
+      <w:proofErr w:type="spellEnd"/>
+    </w:p>
+    <w:p>
+      <w:pPr>
+        <w:pStyle w:val="Ttulo3"/>
+        <w:shd w:val="clear" w:color="auto" w:fill="FFFFFF"/>
+        <w:spacing w:before="306" w:after="204"/>
+        <w:rPr>
+          <w:lang w:val="en-US"/>
+        </w:rPr>
+      </w:pPr>
+      <w:proofErr w:type="gramStart"/>
+      <w:r>
+        <w:rPr>
+          <w:lang w:val="en-US"/>
+        </w:rPr>
+        <w:t>data(</w:t>
+      </w:r>
+      <w:proofErr w:type="spellStart"/>
+      <w:proofErr w:type="gramEnd"/>
+      <w:r>
+        <w:rPr>
+          <w:lang w:val="en-US"/>
+        </w:rPr>
+        <w:t>mtcars</w:t>
+      </w:r>
+      <w:proofErr w:type="spellEnd"/>
+      <w:r>
+        <w:rPr>
+          <w:lang w:val="en-US"/>
+        </w:rPr>
+        <w:t>)</w:t>
+      </w:r>
+    </w:p>
+    <w:p>
+      <w:pPr>
+        <w:pStyle w:val="Ttulo3"/>
+        <w:shd w:val="clear" w:color="auto" w:fill="FFFFFF"/>
+        <w:spacing w:before="306" w:after="204"/>
+        <w:rPr>
+          <w:color w:val="000000" w:themeColor="text1"/>
+          <w:lang w:val="en-US"/>
+        </w:rPr>
+      </w:pPr>
+      <w:proofErr w:type="gramStart"/>
+      <w:r>
+        <w:rPr>
+          <w:lang w:val="en-US"/>
+        </w:rPr>
+        <w:t>head(</w:t>
+      </w:r>
+      <w:proofErr w:type="spellStart"/>
+      <w:proofErr w:type="gramEnd"/>
+      <w:r>
+        <w:rPr>
+          <w:lang w:val="en-US"/>
+        </w:rPr>
+        <w:t>mtcars</w:t>
+      </w:r>
+      <w:proofErr w:type="spellEnd"/>
+      <w:r>
+        <w:rPr>
+          <w:lang w:val="en-US"/>
+        </w:rPr>
+        <w:t>)</w:t>
+      </w:r>
     </w:p>
     <w:p>
       <w:pPr>
@@ -8787,6 +9387,37 @@
           <w:color w:val="000000"/>
         </w:rPr>
       </w:pPr>
+      <w:r>
+        <w:rPr>
+          <w:rFonts w:ascii="Lucida Console" w:hAnsi="Lucida Console"/>
+          <w:color w:val="000000"/>
+        </w:rPr>
+        <w:t># O también</w:t>
+      </w:r>
+    </w:p>
+    <w:p>
+      <w:pPr>
+        <w:pStyle w:val="HTMLconformatoprevio"/>
+        <w:shd w:val="clear" w:color="auto" w:fill="FFFFFF"/>
+        <w:wordWrap w:val="0"/>
+        <w:spacing w:line="240" w:lineRule="atLeast"/>
+        <w:rPr>
+          <w:rFonts w:ascii="Lucida Console" w:hAnsi="Lucida Console"/>
+          <w:color w:val="000000"/>
+        </w:rPr>
+      </w:pPr>
+    </w:p>
+    <w:p>
+      <w:pPr>
+        <w:pStyle w:val="HTMLconformatoprevio"/>
+        <w:shd w:val="clear" w:color="auto" w:fill="FFFFFF"/>
+        <w:wordWrap w:val="0"/>
+        <w:spacing w:line="240" w:lineRule="atLeast"/>
+        <w:rPr>
+          <w:rFonts w:ascii="Lucida Console" w:hAnsi="Lucida Console"/>
+          <w:color w:val="000000"/>
+        </w:rPr>
+      </w:pPr>
     </w:p>
     <w:p>
       <w:pPr>
@@ -9297,6 +9928,7 @@
           <w:rFonts w:ascii="Lucida Console" w:hAnsi="Lucida Console"/>
           <w:color w:val="0000FF"/>
         </w:rPr>
+        <w:lastRenderedPageBreak/>
         <w:t xml:space="preserve">      1.8560        0.6508        0.7091       -0.5565  </w:t>
       </w:r>
     </w:p>
@@ -9326,7 +9958,6 @@
           <w:spacing w:val="3"/>
           <w:shd w:val="clear" w:color="auto" w:fill="FFFFFF"/>
         </w:rPr>
-        <w:lastRenderedPageBreak/>
         <w:t>En esta imagen se nos proporciona el valor que se introdujo en el modelo y los coeficientes de la regresión. Si queremos los datos del modelo usamos la función </w:t>
       </w:r>
       <w:proofErr w:type="spellStart"/>
@@ -10937,6 +11568,45 @@
     </w:p>
     <w:p>
       <w:pPr>
+        <w:keepNext/>
+        <w:shd w:val="clear" w:color="auto" w:fill="FFFFFF"/>
+        <w:spacing w:before="306" w:after="204" w:line="240" w:lineRule="auto"/>
+        <w:jc w:val="left"/>
+        <w:outlineLvl w:val="1"/>
+        <w:rPr>
+          <w:rFonts w:ascii="Helvetica Neue" w:eastAsia="Times New Roman" w:hAnsi="Helvetica Neue" w:cs="Times New Roman"/>
+          <w:color w:val="000000" w:themeColor="text1"/>
+          <w:spacing w:val="3"/>
+          <w:sz w:val="42"/>
+          <w:szCs w:val="42"/>
+          <w:lang w:eastAsia="es-VE"/>
+        </w:rPr>
+      </w:pPr>
+      <w:r>
+        <w:rPr>
+          <w:rFonts w:ascii="Helvetica Neue" w:eastAsia="Times New Roman" w:hAnsi="Helvetica Neue" w:cs="Times New Roman"/>
+          <w:color w:val="000000" w:themeColor="text1"/>
+          <w:spacing w:val="3"/>
+          <w:sz w:val="42"/>
+          <w:szCs w:val="42"/>
+          <w:lang w:eastAsia="es-VE"/>
+        </w:rPr>
+        <w:t>4.7 </w:t>
+      </w:r>
+      <w:r>
+        <w:rPr>
+          <w:rFonts w:ascii="Helvetica Neue" w:eastAsia="Times New Roman" w:hAnsi="Helvetica Neue" w:cs="Times New Roman"/>
+          <w:color w:val="000000" w:themeColor="text1"/>
+          <w:spacing w:val="3"/>
+          <w:sz w:val="42"/>
+          <w:szCs w:val="42"/>
+          <w:lang w:eastAsia="es-VE"/>
+        </w:rPr>
+        <w:t>Realizando predicciones con nuestro modelo.</w:t>
+      </w:r>
+    </w:p>
+    <w:p>
+      <w:pPr>
         <w:pStyle w:val="NormalWeb"/>
         <w:shd w:val="clear" w:color="auto" w:fill="FFFFFF"/>
         <w:spacing w:before="0" w:beforeAutospacing="0" w:after="204" w:afterAutospacing="0"/>
@@ -11227,9 +11897,20 @@
         <w:rPr>
           <w:rStyle w:val="gnkrckgcmrb"/>
           <w:rFonts w:ascii="Lucida Console" w:hAnsi="Lucida Console"/>
-          <w:color w:val="0000FF"/>
-        </w:rPr>
-      </w:pPr>
+          <w:color w:val="000000" w:themeColor="text1"/>
+        </w:rPr>
+      </w:pPr>
+      <w:proofErr w:type="gramStart"/>
+      <w:r>
+        <w:rPr>
+          <w:rStyle w:val="gnkrckgcmrb"/>
+          <w:rFonts w:ascii="Lucida Console" w:hAnsi="Lucida Console"/>
+          <w:color w:val="000000" w:themeColor="text1"/>
+          <w:highlight w:val="cyan"/>
+        </w:rPr>
+        <w:t>predicciones</w:t>
+      </w:r>
+      <w:proofErr w:type="gramEnd"/>
     </w:p>
     <w:p>
       <w:pPr>
@@ -11254,6 +11935,7 @@
           <w:szCs w:val="42"/>
           <w:lang w:eastAsia="es-VE"/>
         </w:rPr>
+        <w:lastRenderedPageBreak/>
         <w:t>5.3 Detectar correlación entre variables categóricas</w:t>
       </w:r>
     </w:p>
@@ -11296,7 +11978,6 @@
           <w:spacing w:val="3"/>
           <w:shd w:val="clear" w:color="auto" w:fill="FFFFFF"/>
         </w:rPr>
-        <w:lastRenderedPageBreak/>
         <w:t>En la siguiente imagen se muestra una tabla de contingencia, a la cual le aplicaremos la prueba </w:t>
       </w:r>
       <w:proofErr w:type="spellStart"/>
@@ -12310,6 +12991,46 @@
     </w:p>
     <w:p>
       <w:pPr>
+        <w:keepNext/>
+        <w:shd w:val="clear" w:color="auto" w:fill="FFFFFF"/>
+        <w:spacing w:before="306" w:after="204" w:line="240" w:lineRule="auto"/>
+        <w:jc w:val="left"/>
+        <w:outlineLvl w:val="1"/>
+        <w:rPr>
+          <w:rFonts w:ascii="Helvetica Neue" w:eastAsia="Times New Roman" w:hAnsi="Helvetica Neue" w:cs="Times New Roman"/>
+          <w:color w:val="333333"/>
+          <w:spacing w:val="3"/>
+          <w:sz w:val="42"/>
+          <w:szCs w:val="42"/>
+          <w:lang w:eastAsia="es-VE"/>
+        </w:rPr>
+      </w:pPr>
+      <w:r>
+        <w:rPr>
+          <w:rFonts w:ascii="Helvetica Neue" w:eastAsia="Times New Roman" w:hAnsi="Helvetica Neue" w:cs="Times New Roman"/>
+          <w:color w:val="333333"/>
+          <w:spacing w:val="3"/>
+          <w:sz w:val="42"/>
+          <w:szCs w:val="42"/>
+          <w:lang w:eastAsia="es-VE"/>
+        </w:rPr>
+        <w:lastRenderedPageBreak/>
+        <w:t>5.4 </w:t>
+      </w:r>
+      <w:r>
+        <w:rPr>
+          <w:rFonts w:ascii="Helvetica Neue" w:eastAsia="Times New Roman" w:hAnsi="Helvetica Neue" w:cs="Times New Roman"/>
+          <w:color w:val="333333"/>
+          <w:spacing w:val="3"/>
+          <w:sz w:val="42"/>
+          <w:szCs w:val="42"/>
+          <w:lang w:eastAsia="es-VE"/>
+        </w:rPr>
+        <w:t>Detectar correlación entre variables categóricas y variables cuantitativas.</w:t>
+      </w:r>
+    </w:p>
+    <w:p>
+      <w:pPr>
         <w:pStyle w:val="HTMLconformatoprevio"/>
         <w:shd w:val="clear" w:color="auto" w:fill="FFFFFF"/>
         <w:wordWrap w:val="0"/>
@@ -12897,6 +13618,7 @@
           <w:color w:val="000000"/>
           <w:sz w:val="20"/>
           <w:szCs w:val="20"/>
+          <w:bdr w:val="none" w:sz="0" w:space="0" w:color="auto" w:frame="1"/>
           <w:lang w:eastAsia="es-VE"/>
         </w:rPr>
       </w:pPr>
@@ -12911,6 +13633,38 @@
         </w:rPr>
         <w:t xml:space="preserve"> </w:t>
       </w:r>
+    </w:p>
+    <w:p>
+      <w:pPr>
+        <w:shd w:val="clear" w:color="auto" w:fill="FFFFFF"/>
+        <w:tabs>
+          <w:tab w:val="left" w:pos="916"/>
+          <w:tab w:val="left" w:pos="1832"/>
+          <w:tab w:val="left" w:pos="2748"/>
+          <w:tab w:val="left" w:pos="3664"/>
+          <w:tab w:val="left" w:pos="4580"/>
+          <w:tab w:val="left" w:pos="5496"/>
+          <w:tab w:val="left" w:pos="6412"/>
+          <w:tab w:val="left" w:pos="7328"/>
+          <w:tab w:val="left" w:pos="8244"/>
+          <w:tab w:val="left" w:pos="9160"/>
+          <w:tab w:val="left" w:pos="10076"/>
+          <w:tab w:val="left" w:pos="10992"/>
+          <w:tab w:val="left" w:pos="11908"/>
+          <w:tab w:val="left" w:pos="12824"/>
+          <w:tab w:val="left" w:pos="13740"/>
+          <w:tab w:val="left" w:pos="14656"/>
+        </w:tabs>
+        <w:wordWrap w:val="0"/>
+        <w:spacing w:after="0" w:line="240" w:lineRule="atLeast"/>
+        <w:rPr>
+          <w:rFonts w:ascii="Lucida Console" w:eastAsia="Times New Roman" w:hAnsi="Lucida Console" w:cs="Courier New"/>
+          <w:color w:val="000000"/>
+          <w:sz w:val="20"/>
+          <w:szCs w:val="20"/>
+          <w:lang w:eastAsia="es-VE"/>
+        </w:rPr>
+      </w:pPr>
     </w:p>
     <w:p>
       <w:pPr>
@@ -13436,6 +14190,95 @@
         <w:shd w:val="clear" w:color="auto" w:fill="FFFFFF"/>
         <w:spacing w:before="306" w:after="204"/>
         <w:rPr>
+          <w:rStyle w:val="header-section-number"/>
+          <w:rFonts w:ascii="Helvetica" w:hAnsi="Helvetica" w:cs="Helvetica"/>
+          <w:b/>
+          <w:bCs/>
+          <w:color w:val="333333"/>
+          <w:spacing w:val="3"/>
+          <w:sz w:val="36"/>
+          <w:szCs w:val="36"/>
+        </w:rPr>
+      </w:pPr>
+    </w:p>
+    <w:p>
+      <w:pPr>
+        <w:pStyle w:val="Ttulo2"/>
+        <w:keepNext/>
+        <w:shd w:val="clear" w:color="auto" w:fill="FFFFFF"/>
+        <w:spacing w:before="306" w:beforeAutospacing="0" w:after="204" w:afterAutospacing="0"/>
+        <w:rPr>
+          <w:rFonts w:ascii="Helvetica Neue" w:hAnsi="Helvetica Neue"/>
+          <w:b w:val="0"/>
+          <w:bCs w:val="0"/>
+          <w:color w:val="333333"/>
+          <w:spacing w:val="3"/>
+          <w:sz w:val="42"/>
+          <w:szCs w:val="42"/>
+        </w:rPr>
+      </w:pPr>
+      <w:r>
+        <w:rPr>
+          <w:rStyle w:val="header-section-number"/>
+          <w:rFonts w:ascii="Helvetica Neue" w:hAnsi="Helvetica Neue"/>
+          <w:b w:val="0"/>
+          <w:bCs w:val="0"/>
+          <w:color w:val="333333"/>
+          <w:spacing w:val="3"/>
+          <w:sz w:val="42"/>
+          <w:szCs w:val="42"/>
+        </w:rPr>
+        <w:t>5.5</w:t>
+      </w:r>
+      <w:r>
+        <w:rPr>
+          <w:rStyle w:val="apple-converted-space"/>
+          <w:rFonts w:ascii="Helvetica Neue" w:hAnsi="Helvetica Neue"/>
+          <w:b w:val="0"/>
+          <w:bCs w:val="0"/>
+          <w:color w:val="333333"/>
+          <w:spacing w:val="3"/>
+          <w:sz w:val="42"/>
+          <w:szCs w:val="42"/>
+        </w:rPr>
+        <w:t> </w:t>
+      </w:r>
+      <w:r>
+        <w:rPr>
+          <w:rFonts w:ascii="Helvetica Neue" w:hAnsi="Helvetica Neue"/>
+          <w:b w:val="0"/>
+          <w:bCs w:val="0"/>
+          <w:color w:val="333333"/>
+          <w:spacing w:val="3"/>
+          <w:sz w:val="42"/>
+          <w:szCs w:val="42"/>
+        </w:rPr>
+        <w:t>Codificando variables categóricas.</w:t>
+      </w:r>
+    </w:p>
+    <w:p>
+      <w:pPr>
+        <w:pStyle w:val="Ttulo3"/>
+        <w:shd w:val="clear" w:color="auto" w:fill="FFFFFF"/>
+        <w:spacing w:before="306" w:after="204"/>
+        <w:rPr>
+          <w:rStyle w:val="header-section-number"/>
+          <w:rFonts w:ascii="Helvetica" w:hAnsi="Helvetica" w:cs="Helvetica"/>
+          <w:b/>
+          <w:bCs/>
+          <w:color w:val="333333"/>
+          <w:spacing w:val="3"/>
+          <w:sz w:val="36"/>
+          <w:szCs w:val="36"/>
+        </w:rPr>
+      </w:pPr>
+    </w:p>
+    <w:p>
+      <w:pPr>
+        <w:pStyle w:val="Ttulo3"/>
+        <w:shd w:val="clear" w:color="auto" w:fill="FFFFFF"/>
+        <w:spacing w:before="306" w:after="204"/>
+        <w:rPr>
           <w:rFonts w:ascii="Helvetica" w:hAnsi="Helvetica" w:cs="Helvetica"/>
           <w:color w:val="333333"/>
           <w:spacing w:val="3"/>
@@ -14014,7 +14857,6 @@
           <w:spacing w:val="3"/>
           <w:shd w:val="clear" w:color="auto" w:fill="FFFFFF"/>
         </w:rPr>
-        <w:lastRenderedPageBreak/>
         <w:t>Y obtenemos como resultado:</w:t>
       </w:r>
     </w:p>
@@ -14341,18 +15183,77 @@
     </w:p>
     <w:p>
       <w:pPr>
+        <w:pStyle w:val="Ttulo2"/>
+        <w:keepNext/>
+        <w:shd w:val="clear" w:color="auto" w:fill="FFFFFF"/>
+        <w:spacing w:before="306" w:beforeAutospacing="0" w:after="204" w:afterAutospacing="0"/>
+        <w:rPr>
+          <w:rFonts w:ascii="Helvetica Neue" w:hAnsi="Helvetica Neue"/>
+          <w:b w:val="0"/>
+          <w:bCs w:val="0"/>
+          <w:color w:val="333333"/>
+          <w:spacing w:val="3"/>
+          <w:sz w:val="42"/>
+          <w:szCs w:val="42"/>
+        </w:rPr>
+      </w:pPr>
+      <w:r>
+        <w:rPr>
+          <w:rStyle w:val="header-section-number"/>
+          <w:rFonts w:ascii="Helvetica Neue" w:hAnsi="Helvetica Neue"/>
+          <w:b w:val="0"/>
+          <w:bCs w:val="0"/>
+          <w:color w:val="333333"/>
+          <w:spacing w:val="3"/>
+          <w:sz w:val="42"/>
+          <w:szCs w:val="42"/>
+        </w:rPr>
+        <w:lastRenderedPageBreak/>
+        <w:t>5.6</w:t>
+      </w:r>
+      <w:r>
+        <w:rPr>
+          <w:rStyle w:val="apple-converted-space"/>
+          <w:rFonts w:ascii="Helvetica Neue" w:hAnsi="Helvetica Neue"/>
+          <w:b w:val="0"/>
+          <w:bCs w:val="0"/>
+          <w:color w:val="333333"/>
+          <w:spacing w:val="3"/>
+          <w:sz w:val="42"/>
+          <w:szCs w:val="42"/>
+        </w:rPr>
+        <w:t> </w:t>
+      </w:r>
+      <w:r>
+        <w:rPr>
+          <w:rFonts w:ascii="Helvetica Neue" w:hAnsi="Helvetica Neue"/>
+          <w:b w:val="0"/>
+          <w:bCs w:val="0"/>
+          <w:color w:val="333333"/>
+          <w:spacing w:val="3"/>
+          <w:sz w:val="42"/>
+          <w:szCs w:val="42"/>
+        </w:rPr>
+        <w:t>Aplicando e</w:t>
+      </w:r>
+      <w:r>
+        <w:rPr>
+          <w:rFonts w:ascii="Helvetica Neue" w:hAnsi="Helvetica Neue"/>
+          <w:b w:val="0"/>
+          <w:bCs w:val="0"/>
+          <w:color w:val="333333"/>
+          <w:spacing w:val="3"/>
+          <w:sz w:val="42"/>
+          <w:szCs w:val="42"/>
+        </w:rPr>
+        <w:t>l modelo de regresión logística</w:t>
+      </w:r>
+    </w:p>
+    <w:p>
+      <w:pPr>
         <w:pStyle w:val="Ttulo3"/>
         <w:shd w:val="clear" w:color="auto" w:fill="FFFFFF"/>
         <w:spacing w:before="306" w:after="204"/>
-        <w:rPr>
-          <w:rFonts w:ascii="Helvetica" w:hAnsi="Helvetica" w:cs="Helvetica"/>
-          <w:color w:val="333333"/>
-          <w:spacing w:val="3"/>
-          <w:sz w:val="36"/>
-          <w:szCs w:val="36"/>
-        </w:rPr>
-      </w:pPr>
-      <w:r>
         <w:rPr>
           <w:rStyle w:val="header-section-number"/>
           <w:rFonts w:ascii="Helvetica" w:hAnsi="Helvetica" w:cs="Helvetica"/>
@@ -14363,10 +15264,24 @@
           <w:sz w:val="36"/>
           <w:szCs w:val="36"/>
         </w:rPr>
-        <w:t>5.6.1</w:t>
-      </w:r>
-      <w:r>
-        <w:rPr>
+      </w:pPr>
+    </w:p>
+    <w:p>
+      <w:pPr>
+        <w:pStyle w:val="Ttulo3"/>
+        <w:shd w:val="clear" w:color="auto" w:fill="FFFFFF"/>
+        <w:spacing w:before="306" w:after="204"/>
+        <w:rPr>
+          <w:rFonts w:ascii="Helvetica" w:hAnsi="Helvetica" w:cs="Helvetica"/>
+          <w:color w:val="333333"/>
+          <w:spacing w:val="3"/>
+          <w:sz w:val="36"/>
+          <w:szCs w:val="36"/>
+        </w:rPr>
+      </w:pPr>
+      <w:r>
+        <w:rPr>
+          <w:rStyle w:val="header-section-number"/>
           <w:rFonts w:ascii="Helvetica" w:hAnsi="Helvetica" w:cs="Helvetica"/>
           <w:b/>
           <w:bCs/>
@@ -14375,7 +15290,19 @@
           <w:sz w:val="36"/>
           <w:szCs w:val="36"/>
         </w:rPr>
-        <w:t> Modelo logístico en R.</w:t>
+        <w:t>5.6.1</w:t>
+      </w:r>
+      <w:r>
+        <w:rPr>
+          <w:rFonts w:ascii="Helvetica" w:hAnsi="Helvetica" w:cs="Helvetica"/>
+          <w:b/>
+          <w:bCs/>
+          <w:color w:val="333333"/>
+          <w:spacing w:val="3"/>
+          <w:sz w:val="36"/>
+          <w:szCs w:val="36"/>
+        </w:rPr>
+        <w:t> Modelo logístico en R</w:t>
       </w:r>
     </w:p>
     <w:p>
@@ -14768,7 +15695,6 @@
           <w:highlight w:val="cyan"/>
           <w:shd w:val="clear" w:color="auto" w:fill="FFFFFF"/>
         </w:rPr>
-        <w:lastRenderedPageBreak/>
         <w:t xml:space="preserve">Si queremos crear un modelo logístico </w:t>
       </w:r>
       <w:r>
@@ -15034,6 +15960,7 @@
           <w:highlight w:val="yellow"/>
           <w:lang w:eastAsia="es-VE"/>
         </w:rPr>
+        <w:lastRenderedPageBreak/>
         <w:t>modelo_logistico</w:t>
       </w:r>
       <w:proofErr w:type="spellEnd"/>
@@ -16591,618 +17518,6 @@
     </w:p>
     <w:p>
       <w:pPr>
-        <w:pStyle w:val="HTMLconformatoprevio"/>
-        <w:shd w:val="clear" w:color="auto" w:fill="FFFFFF"/>
-        <w:wordWrap w:val="0"/>
-        <w:spacing w:line="240" w:lineRule="atLeast"/>
-        <w:rPr>
-          <w:rFonts w:ascii="Helvetica" w:hAnsi="Helvetica" w:cs="Helvetica"/>
-          <w:color w:val="333333"/>
-          <w:spacing w:val="3"/>
-          <w:shd w:val="clear" w:color="auto" w:fill="FFFFFF"/>
-        </w:rPr>
-      </w:pPr>
-      <w:r>
-        <w:rPr>
-          <w:rFonts w:ascii="Helvetica" w:hAnsi="Helvetica" w:cs="Helvetica"/>
-          <w:color w:val="333333"/>
-          <w:spacing w:val="3"/>
-          <w:shd w:val="clear" w:color="auto" w:fill="FFFFFF"/>
-        </w:rPr>
-        <w:t>A continuación presentamos el código para realizar la predicción:</w:t>
-      </w:r>
-    </w:p>
-    <w:p>
-      <w:pPr>
-        <w:pStyle w:val="HTMLconformatoprevio"/>
-        <w:shd w:val="clear" w:color="auto" w:fill="FFFFFF"/>
-        <w:wordWrap w:val="0"/>
-        <w:spacing w:line="240" w:lineRule="atLeast"/>
-        <w:rPr>
-          <w:rFonts w:ascii="Lucida Console" w:hAnsi="Lucida Console"/>
-          <w:color w:val="0070C0"/>
-        </w:rPr>
-      </w:pPr>
-    </w:p>
-    <w:p>
-      <w:pPr>
-        <w:pStyle w:val="HTMLconformatoprevio"/>
-        <w:shd w:val="clear" w:color="auto" w:fill="FFFFFF"/>
-        <w:wordWrap w:val="0"/>
-        <w:spacing w:line="240" w:lineRule="atLeast"/>
-        <w:rPr>
-          <w:rStyle w:val="gnkrckgcmrb"/>
-          <w:rFonts w:ascii="Lucida Console" w:hAnsi="Lucida Console"/>
-          <w:color w:val="0070C0"/>
-        </w:rPr>
-      </w:pPr>
-      <w:r>
-        <w:rPr>
-          <w:noProof/>
-        </w:rPr>
-        <w:drawing>
-          <wp:inline distT="0" distB="0" distL="0" distR="0" wp14:anchorId="315A76C7" wp14:editId="37D6ADAE">
-            <wp:extent cx="5612130" cy="427329"/>
-            <wp:effectExtent l="0" t="0" r="0" b="0"/>
-            <wp:docPr id="30" name="Imagen 30" descr="C:\Users\Bernardo\Documents\Machine-Learning-Basico\docs\images\log14.png"/>
-            <wp:cNvGraphicFramePr>
-              <a:graphicFrameLocks xmlns:a="http://schemas.openxmlformats.org/drawingml/2006/main" noChangeAspect="1"/>
-            </wp:cNvGraphicFramePr>
-            <a:graphic xmlns:a="http://schemas.openxmlformats.org/drawingml/2006/main">
-              <a:graphicData uri="http://schemas.openxmlformats.org/drawingml/2006/picture">
-                <pic:pic xmlns:pic="http://schemas.openxmlformats.org/drawingml/2006/picture">
-                  <pic:nvPicPr>
-                    <pic:cNvPr id="0" name="Picture 2" descr="C:\Users\Bernardo\Documents\Machine-Learning-Basico\docs\images\log14.png"/>
-                    <pic:cNvPicPr>
-                      <a:picLocks noChangeAspect="1" noChangeArrowheads="1"/>
-                    </pic:cNvPicPr>
-                  </pic:nvPicPr>
-                  <pic:blipFill>
-                    <a:blip r:embed="rId34" cstate="print">
-                      <a:extLst>
-                        <a:ext uri="{28A0092B-C50C-407E-A947-70E740481C1C}">
-                          <a14:useLocalDpi xmlns:a14="http://schemas.microsoft.com/office/drawing/2010/main" val="0"/>
-                        </a:ext>
-                      </a:extLst>
-                    </a:blip>
-                    <a:srcRect/>
-                    <a:stretch>
-                      <a:fillRect/>
-                    </a:stretch>
-                  </pic:blipFill>
-                  <pic:spPr bwMode="auto">
-                    <a:xfrm>
-                      <a:off x="0" y="0"/>
-                      <a:ext cx="5612130" cy="427329"/>
-                    </a:xfrm>
-                    <a:prstGeom prst="rect">
-                      <a:avLst/>
-                    </a:prstGeom>
-                    <a:noFill/>
-                    <a:ln>
-                      <a:noFill/>
-                    </a:ln>
-                  </pic:spPr>
-                </pic:pic>
-              </a:graphicData>
-            </a:graphic>
-          </wp:inline>
-        </w:drawing>
-      </w:r>
-    </w:p>
-    <w:p>
-      <w:pPr>
-        <w:shd w:val="clear" w:color="auto" w:fill="FFFFFF"/>
-        <w:tabs>
-          <w:tab w:val="left" w:pos="916"/>
-          <w:tab w:val="left" w:pos="1832"/>
-          <w:tab w:val="left" w:pos="2748"/>
-          <w:tab w:val="left" w:pos="3664"/>
-          <w:tab w:val="left" w:pos="4580"/>
-          <w:tab w:val="left" w:pos="5496"/>
-          <w:tab w:val="left" w:pos="6412"/>
-          <w:tab w:val="left" w:pos="7328"/>
-          <w:tab w:val="left" w:pos="8244"/>
-          <w:tab w:val="left" w:pos="9160"/>
-          <w:tab w:val="left" w:pos="10076"/>
-          <w:tab w:val="left" w:pos="10992"/>
-          <w:tab w:val="left" w:pos="11908"/>
-          <w:tab w:val="left" w:pos="12824"/>
-          <w:tab w:val="left" w:pos="13740"/>
-          <w:tab w:val="left" w:pos="14656"/>
-        </w:tabs>
-        <w:wordWrap w:val="0"/>
-        <w:spacing w:after="0" w:line="240" w:lineRule="atLeast"/>
-        <w:rPr>
-          <w:rStyle w:val="gnkrckgcmrb"/>
-          <w:rFonts w:ascii="Lucida Console" w:hAnsi="Lucida Console"/>
-          <w:highlight w:val="yellow"/>
-        </w:rPr>
-      </w:pPr>
-      <w:r>
-        <w:rPr>
-          <w:rStyle w:val="gnkrckgcmrb"/>
-          <w:rFonts w:ascii="Lucida Console" w:hAnsi="Lucida Console"/>
-          <w:highlight w:val="yellow"/>
-        </w:rPr>
-        <w:t xml:space="preserve">El código no funciona </w:t>
-      </w:r>
-      <w:r>
-        <w:rPr>
-          <w:rFonts w:ascii="Lucida Console" w:eastAsia="Times New Roman" w:hAnsi="Lucida Console" w:cs="Courier New"/>
-          <w:sz w:val="20"/>
-          <w:szCs w:val="20"/>
-          <w:highlight w:val="yellow"/>
-          <w:lang w:eastAsia="es-VE"/>
-        </w:rPr>
-        <w:t>(h</w:t>
-      </w:r>
-      <w:r>
-        <w:rPr>
-          <w:rFonts w:ascii="Lucida Console" w:eastAsia="Times New Roman" w:hAnsi="Lucida Console" w:cs="Courier New"/>
-          <w:sz w:val="20"/>
-          <w:szCs w:val="20"/>
-          <w:highlight w:val="yellow"/>
-          <w:lang w:eastAsia="es-VE"/>
-        </w:rPr>
-        <w:t>ay que definir los nuevos datos (</w:t>
-      </w:r>
-      <w:proofErr w:type="spellStart"/>
-      <w:r>
-        <w:rPr>
-          <w:rFonts w:ascii="Lucida Console" w:eastAsia="Times New Roman" w:hAnsi="Lucida Console" w:cs="Courier New"/>
-          <w:sz w:val="20"/>
-          <w:szCs w:val="20"/>
-          <w:highlight w:val="yellow"/>
-          <w:lang w:eastAsia="es-VE"/>
-        </w:rPr>
-        <w:t>newdata</w:t>
-      </w:r>
-      <w:proofErr w:type="spellEnd"/>
-      <w:r>
-        <w:rPr>
-          <w:rFonts w:ascii="Lucida Console" w:eastAsia="Times New Roman" w:hAnsi="Lucida Console" w:cs="Courier New"/>
-          <w:sz w:val="20"/>
-          <w:szCs w:val="20"/>
-          <w:highlight w:val="yellow"/>
-          <w:lang w:eastAsia="es-VE"/>
-        </w:rPr>
-        <w:t xml:space="preserve">) para los cuales se usará el modelo para </w:t>
-      </w:r>
-      <w:r>
-        <w:rPr>
-          <w:rFonts w:ascii="Lucida Console" w:eastAsia="Times New Roman" w:hAnsi="Lucida Console" w:cs="Courier New"/>
-          <w:sz w:val="20"/>
-          <w:szCs w:val="20"/>
-          <w:highlight w:val="yellow"/>
-          <w:lang w:eastAsia="es-VE"/>
-        </w:rPr>
-        <w:t xml:space="preserve">predecir) y </w:t>
-      </w:r>
-      <w:r>
-        <w:rPr>
-          <w:rStyle w:val="gnkrckgcmrb"/>
-          <w:rFonts w:ascii="Lucida Console" w:hAnsi="Lucida Console"/>
-          <w:highlight w:val="yellow"/>
-        </w:rPr>
-        <w:t xml:space="preserve">sale </w:t>
-      </w:r>
-      <w:r>
-        <w:rPr>
-          <w:rStyle w:val="gnkrckgcmrb"/>
-          <w:rFonts w:ascii="Lucida Console" w:hAnsi="Lucida Console"/>
-          <w:highlight w:val="yellow"/>
-        </w:rPr>
-        <w:t>el siguiente mensaje de error:</w:t>
-      </w:r>
-    </w:p>
-    <w:p>
-      <w:pPr>
-        <w:pStyle w:val="HTMLconformatoprevio"/>
-        <w:shd w:val="clear" w:color="auto" w:fill="FFFFFF"/>
-        <w:wordWrap w:val="0"/>
-        <w:spacing w:line="240" w:lineRule="atLeast"/>
-        <w:rPr>
-          <w:rStyle w:val="gnkrckgcmrb"/>
-          <w:rFonts w:ascii="Lucida Console" w:hAnsi="Lucida Console"/>
-          <w:highlight w:val="yellow"/>
-        </w:rPr>
-      </w:pPr>
-      <w:r>
-        <w:rPr>
-          <w:rStyle w:val="gnkrckgcmrb"/>
-          <w:rFonts w:ascii="Lucida Console" w:hAnsi="Lucida Console"/>
-          <w:highlight w:val="yellow"/>
-        </w:rPr>
-        <w:t xml:space="preserve"> </w:t>
-      </w:r>
-    </w:p>
-    <w:p>
-      <w:pPr>
-        <w:shd w:val="clear" w:color="auto" w:fill="FFFFFF"/>
-        <w:tabs>
-          <w:tab w:val="left" w:pos="916"/>
-          <w:tab w:val="left" w:pos="1832"/>
-          <w:tab w:val="left" w:pos="2748"/>
-          <w:tab w:val="left" w:pos="3664"/>
-          <w:tab w:val="left" w:pos="4580"/>
-          <w:tab w:val="left" w:pos="5496"/>
-          <w:tab w:val="left" w:pos="6412"/>
-          <w:tab w:val="left" w:pos="7328"/>
-          <w:tab w:val="left" w:pos="8244"/>
-          <w:tab w:val="left" w:pos="9160"/>
-          <w:tab w:val="left" w:pos="10076"/>
-          <w:tab w:val="left" w:pos="10992"/>
-          <w:tab w:val="left" w:pos="11908"/>
-          <w:tab w:val="left" w:pos="12824"/>
-          <w:tab w:val="left" w:pos="13740"/>
-          <w:tab w:val="left" w:pos="14656"/>
-        </w:tabs>
-        <w:wordWrap w:val="0"/>
-        <w:spacing w:after="0" w:line="240" w:lineRule="atLeast"/>
-        <w:rPr>
-          <w:rFonts w:ascii="Lucida Console" w:eastAsia="Times New Roman" w:hAnsi="Lucida Console" w:cs="Courier New"/>
-          <w:sz w:val="20"/>
-          <w:szCs w:val="20"/>
-          <w:highlight w:val="yellow"/>
-          <w:lang w:eastAsia="es-VE"/>
-        </w:rPr>
-      </w:pPr>
-      <w:r>
-        <w:rPr>
-          <w:rFonts w:ascii="Lucida Console" w:eastAsia="Times New Roman" w:hAnsi="Lucida Console" w:cs="Courier New"/>
-          <w:sz w:val="20"/>
-          <w:szCs w:val="20"/>
-          <w:highlight w:val="yellow"/>
-          <w:lang w:eastAsia="es-VE"/>
-        </w:rPr>
-        <w:t xml:space="preserve">Error in </w:t>
-      </w:r>
-      <w:proofErr w:type="spellStart"/>
-      <w:proofErr w:type="gramStart"/>
-      <w:r>
-        <w:rPr>
-          <w:rFonts w:ascii="Lucida Console" w:eastAsia="Times New Roman" w:hAnsi="Lucida Console" w:cs="Courier New"/>
-          <w:sz w:val="20"/>
-          <w:szCs w:val="20"/>
-          <w:highlight w:val="yellow"/>
-          <w:lang w:eastAsia="es-VE"/>
-        </w:rPr>
-        <w:t>predict.lm</w:t>
-      </w:r>
-      <w:proofErr w:type="spellEnd"/>
-      <w:r>
-        <w:rPr>
-          <w:rFonts w:ascii="Lucida Console" w:eastAsia="Times New Roman" w:hAnsi="Lucida Console" w:cs="Courier New"/>
-          <w:sz w:val="20"/>
-          <w:szCs w:val="20"/>
-          <w:highlight w:val="yellow"/>
-          <w:lang w:eastAsia="es-VE"/>
-        </w:rPr>
-        <w:t>(</w:t>
-      </w:r>
-      <w:proofErr w:type="spellStart"/>
-      <w:proofErr w:type="gramEnd"/>
-      <w:r>
-        <w:rPr>
-          <w:rFonts w:ascii="Lucida Console" w:eastAsia="Times New Roman" w:hAnsi="Lucida Console" w:cs="Courier New"/>
-          <w:sz w:val="20"/>
-          <w:szCs w:val="20"/>
-          <w:highlight w:val="yellow"/>
-          <w:lang w:eastAsia="es-VE"/>
-        </w:rPr>
-        <w:t>object</w:t>
-      </w:r>
-      <w:proofErr w:type="spellEnd"/>
-      <w:r>
-        <w:rPr>
-          <w:rFonts w:ascii="Lucida Console" w:eastAsia="Times New Roman" w:hAnsi="Lucida Console" w:cs="Courier New"/>
-          <w:sz w:val="20"/>
-          <w:szCs w:val="20"/>
-          <w:highlight w:val="yellow"/>
-          <w:lang w:eastAsia="es-VE"/>
-        </w:rPr>
-        <w:t xml:space="preserve">, </w:t>
-      </w:r>
-      <w:proofErr w:type="spellStart"/>
-      <w:r>
-        <w:rPr>
-          <w:rFonts w:ascii="Lucida Console" w:eastAsia="Times New Roman" w:hAnsi="Lucida Console" w:cs="Courier New"/>
-          <w:sz w:val="20"/>
-          <w:szCs w:val="20"/>
-          <w:highlight w:val="yellow"/>
-          <w:lang w:eastAsia="es-VE"/>
-        </w:rPr>
-        <w:t>newdata</w:t>
-      </w:r>
-      <w:proofErr w:type="spellEnd"/>
-      <w:r>
-        <w:rPr>
-          <w:rFonts w:ascii="Lucida Console" w:eastAsia="Times New Roman" w:hAnsi="Lucida Console" w:cs="Courier New"/>
-          <w:sz w:val="20"/>
-          <w:szCs w:val="20"/>
-          <w:highlight w:val="yellow"/>
-          <w:lang w:eastAsia="es-VE"/>
-        </w:rPr>
-        <w:t xml:space="preserve">, </w:t>
-      </w:r>
-      <w:proofErr w:type="spellStart"/>
-      <w:r>
-        <w:rPr>
-          <w:rFonts w:ascii="Lucida Console" w:eastAsia="Times New Roman" w:hAnsi="Lucida Console" w:cs="Courier New"/>
-          <w:sz w:val="20"/>
-          <w:szCs w:val="20"/>
-          <w:highlight w:val="yellow"/>
-          <w:lang w:eastAsia="es-VE"/>
-        </w:rPr>
-        <w:t>se.fit</w:t>
-      </w:r>
-      <w:proofErr w:type="spellEnd"/>
-      <w:r>
-        <w:rPr>
-          <w:rFonts w:ascii="Lucida Console" w:eastAsia="Times New Roman" w:hAnsi="Lucida Console" w:cs="Courier New"/>
-          <w:sz w:val="20"/>
-          <w:szCs w:val="20"/>
-          <w:highlight w:val="yellow"/>
-          <w:lang w:eastAsia="es-VE"/>
-        </w:rPr>
-        <w:t xml:space="preserve">, </w:t>
-      </w:r>
-      <w:proofErr w:type="spellStart"/>
-      <w:r>
-        <w:rPr>
-          <w:rFonts w:ascii="Lucida Console" w:eastAsia="Times New Roman" w:hAnsi="Lucida Console" w:cs="Courier New"/>
-          <w:sz w:val="20"/>
-          <w:szCs w:val="20"/>
-          <w:highlight w:val="yellow"/>
-          <w:lang w:eastAsia="es-VE"/>
-        </w:rPr>
-        <w:t>scale</w:t>
-      </w:r>
-      <w:proofErr w:type="spellEnd"/>
-      <w:r>
-        <w:rPr>
-          <w:rFonts w:ascii="Lucida Console" w:eastAsia="Times New Roman" w:hAnsi="Lucida Console" w:cs="Courier New"/>
-          <w:sz w:val="20"/>
-          <w:szCs w:val="20"/>
-          <w:highlight w:val="yellow"/>
-          <w:lang w:eastAsia="es-VE"/>
-        </w:rPr>
-        <w:t xml:space="preserve"> = 1, </w:t>
-      </w:r>
-      <w:proofErr w:type="spellStart"/>
-      <w:r>
-        <w:rPr>
-          <w:rFonts w:ascii="Lucida Console" w:eastAsia="Times New Roman" w:hAnsi="Lucida Console" w:cs="Courier New"/>
-          <w:sz w:val="20"/>
-          <w:szCs w:val="20"/>
-          <w:highlight w:val="yellow"/>
-          <w:lang w:eastAsia="es-VE"/>
-        </w:rPr>
-        <w:t>type</w:t>
-      </w:r>
-      <w:proofErr w:type="spellEnd"/>
-      <w:r>
-        <w:rPr>
-          <w:rFonts w:ascii="Lucida Console" w:eastAsia="Times New Roman" w:hAnsi="Lucida Console" w:cs="Courier New"/>
-          <w:sz w:val="20"/>
-          <w:szCs w:val="20"/>
-          <w:highlight w:val="yellow"/>
-          <w:lang w:eastAsia="es-VE"/>
-        </w:rPr>
-        <w:t xml:space="preserve"> = </w:t>
-      </w:r>
-      <w:proofErr w:type="spellStart"/>
-      <w:r>
-        <w:rPr>
-          <w:rFonts w:ascii="Lucida Console" w:eastAsia="Times New Roman" w:hAnsi="Lucida Console" w:cs="Courier New"/>
-          <w:sz w:val="20"/>
-          <w:szCs w:val="20"/>
-          <w:highlight w:val="yellow"/>
-          <w:lang w:eastAsia="es-VE"/>
-        </w:rPr>
-        <w:t>ifelse</w:t>
-      </w:r>
-      <w:proofErr w:type="spellEnd"/>
-      <w:r>
-        <w:rPr>
-          <w:rFonts w:ascii="Lucida Console" w:eastAsia="Times New Roman" w:hAnsi="Lucida Console" w:cs="Courier New"/>
-          <w:sz w:val="20"/>
-          <w:szCs w:val="20"/>
-          <w:highlight w:val="yellow"/>
-          <w:lang w:eastAsia="es-VE"/>
-        </w:rPr>
-        <w:t>(</w:t>
-      </w:r>
-      <w:proofErr w:type="spellStart"/>
-      <w:r>
-        <w:rPr>
-          <w:rFonts w:ascii="Lucida Console" w:eastAsia="Times New Roman" w:hAnsi="Lucida Console" w:cs="Courier New"/>
-          <w:sz w:val="20"/>
-          <w:szCs w:val="20"/>
-          <w:highlight w:val="yellow"/>
-          <w:lang w:eastAsia="es-VE"/>
-        </w:rPr>
-        <w:t>type</w:t>
-      </w:r>
-      <w:proofErr w:type="spellEnd"/>
-      <w:r>
-        <w:rPr>
-          <w:rFonts w:ascii="Lucida Console" w:eastAsia="Times New Roman" w:hAnsi="Lucida Console" w:cs="Courier New"/>
-          <w:sz w:val="20"/>
-          <w:szCs w:val="20"/>
-          <w:highlight w:val="yellow"/>
-          <w:lang w:eastAsia="es-VE"/>
-        </w:rPr>
-        <w:t xml:space="preserve"> ==  : </w:t>
-      </w:r>
-    </w:p>
-    <w:p>
-      <w:pPr>
-        <w:shd w:val="clear" w:color="auto" w:fill="FFFFFF"/>
-        <w:tabs>
-          <w:tab w:val="left" w:pos="916"/>
-          <w:tab w:val="left" w:pos="1832"/>
-          <w:tab w:val="left" w:pos="2748"/>
-          <w:tab w:val="left" w:pos="3664"/>
-          <w:tab w:val="left" w:pos="4580"/>
-          <w:tab w:val="left" w:pos="5496"/>
-          <w:tab w:val="left" w:pos="6412"/>
-          <w:tab w:val="left" w:pos="7328"/>
-          <w:tab w:val="left" w:pos="8244"/>
-          <w:tab w:val="left" w:pos="9160"/>
-          <w:tab w:val="left" w:pos="10076"/>
-          <w:tab w:val="left" w:pos="10992"/>
-          <w:tab w:val="left" w:pos="11908"/>
-          <w:tab w:val="left" w:pos="12824"/>
-          <w:tab w:val="left" w:pos="13740"/>
-          <w:tab w:val="left" w:pos="14656"/>
-        </w:tabs>
-        <w:wordWrap w:val="0"/>
-        <w:spacing w:after="0" w:line="240" w:lineRule="atLeast"/>
-        <w:rPr>
-          <w:rFonts w:ascii="Lucida Console" w:eastAsia="Times New Roman" w:hAnsi="Lucida Console" w:cs="Courier New"/>
-          <w:sz w:val="20"/>
-          <w:szCs w:val="20"/>
-          <w:lang w:eastAsia="es-VE"/>
-        </w:rPr>
-      </w:pPr>
-      <w:r>
-        <w:rPr>
-          <w:rFonts w:ascii="Lucida Console" w:eastAsia="Times New Roman" w:hAnsi="Lucida Console" w:cs="Courier New"/>
-          <w:sz w:val="20"/>
-          <w:szCs w:val="20"/>
-          <w:highlight w:val="yellow"/>
-          <w:lang w:eastAsia="es-VE"/>
-        </w:rPr>
-        <w:t xml:space="preserve">  </w:t>
-      </w:r>
-      <w:proofErr w:type="spellStart"/>
-      <w:proofErr w:type="gramStart"/>
-      <w:r>
-        <w:rPr>
-          <w:rFonts w:ascii="Lucida Console" w:eastAsia="Times New Roman" w:hAnsi="Lucida Console" w:cs="Courier New"/>
-          <w:sz w:val="20"/>
-          <w:szCs w:val="20"/>
-          <w:highlight w:val="yellow"/>
-          <w:lang w:eastAsia="es-VE"/>
-        </w:rPr>
-        <w:t>object</w:t>
-      </w:r>
-      <w:proofErr w:type="spellEnd"/>
-      <w:proofErr w:type="gramEnd"/>
-      <w:r>
-        <w:rPr>
-          <w:rFonts w:ascii="Lucida Console" w:eastAsia="Times New Roman" w:hAnsi="Lucida Console" w:cs="Courier New"/>
-          <w:sz w:val="20"/>
-          <w:szCs w:val="20"/>
-          <w:highlight w:val="yellow"/>
-          <w:lang w:eastAsia="es-VE"/>
-        </w:rPr>
-        <w:t xml:space="preserve"> '</w:t>
-      </w:r>
-      <w:proofErr w:type="spellStart"/>
-      <w:r>
-        <w:rPr>
-          <w:rFonts w:ascii="Lucida Console" w:eastAsia="Times New Roman" w:hAnsi="Lucida Console" w:cs="Courier New"/>
-          <w:sz w:val="20"/>
-          <w:szCs w:val="20"/>
-          <w:highlight w:val="yellow"/>
-          <w:lang w:eastAsia="es-VE"/>
-        </w:rPr>
-        <w:t>observacion</w:t>
-      </w:r>
-      <w:proofErr w:type="spellEnd"/>
-      <w:r>
-        <w:rPr>
-          <w:rFonts w:ascii="Lucida Console" w:eastAsia="Times New Roman" w:hAnsi="Lucida Console" w:cs="Courier New"/>
-          <w:sz w:val="20"/>
-          <w:szCs w:val="20"/>
-          <w:highlight w:val="yellow"/>
-          <w:lang w:eastAsia="es-VE"/>
-        </w:rPr>
-        <w:t xml:space="preserve">' </w:t>
-      </w:r>
-      <w:proofErr w:type="spellStart"/>
-      <w:r>
-        <w:rPr>
-          <w:rFonts w:ascii="Lucida Console" w:eastAsia="Times New Roman" w:hAnsi="Lucida Console" w:cs="Courier New"/>
-          <w:sz w:val="20"/>
-          <w:szCs w:val="20"/>
-          <w:highlight w:val="yellow"/>
-          <w:lang w:eastAsia="es-VE"/>
-        </w:rPr>
-        <w:t>not</w:t>
-      </w:r>
-      <w:proofErr w:type="spellEnd"/>
-      <w:r>
-        <w:rPr>
-          <w:rFonts w:ascii="Lucida Console" w:eastAsia="Times New Roman" w:hAnsi="Lucida Console" w:cs="Courier New"/>
-          <w:sz w:val="20"/>
-          <w:szCs w:val="20"/>
-          <w:highlight w:val="yellow"/>
-          <w:lang w:eastAsia="es-VE"/>
-        </w:rPr>
-        <w:t xml:space="preserve"> </w:t>
-      </w:r>
-      <w:proofErr w:type="spellStart"/>
-      <w:r>
-        <w:rPr>
-          <w:rFonts w:ascii="Lucida Console" w:eastAsia="Times New Roman" w:hAnsi="Lucida Console" w:cs="Courier New"/>
-          <w:sz w:val="20"/>
-          <w:szCs w:val="20"/>
-          <w:highlight w:val="yellow"/>
-          <w:lang w:eastAsia="es-VE"/>
-        </w:rPr>
-        <w:t>found</w:t>
-      </w:r>
-      <w:proofErr w:type="spellEnd"/>
-    </w:p>
-    <w:p>
-      <w:pPr>
-        <w:shd w:val="clear" w:color="auto" w:fill="FFFFFF"/>
-        <w:tabs>
-          <w:tab w:val="left" w:pos="916"/>
-          <w:tab w:val="left" w:pos="1832"/>
-          <w:tab w:val="left" w:pos="2748"/>
-          <w:tab w:val="left" w:pos="3664"/>
-          <w:tab w:val="left" w:pos="4580"/>
-          <w:tab w:val="left" w:pos="5496"/>
-          <w:tab w:val="left" w:pos="6412"/>
-          <w:tab w:val="left" w:pos="7328"/>
-          <w:tab w:val="left" w:pos="8244"/>
-          <w:tab w:val="left" w:pos="9160"/>
-          <w:tab w:val="left" w:pos="10076"/>
-          <w:tab w:val="left" w:pos="10992"/>
-          <w:tab w:val="left" w:pos="11908"/>
-          <w:tab w:val="left" w:pos="12824"/>
-          <w:tab w:val="left" w:pos="13740"/>
-          <w:tab w:val="left" w:pos="14656"/>
-        </w:tabs>
-        <w:wordWrap w:val="0"/>
-        <w:spacing w:after="0" w:line="240" w:lineRule="atLeast"/>
-        <w:rPr>
-          <w:rFonts w:ascii="Lucida Console" w:eastAsia="Times New Roman" w:hAnsi="Lucida Console" w:cs="Courier New"/>
-          <w:sz w:val="20"/>
-          <w:szCs w:val="20"/>
-          <w:lang w:eastAsia="es-VE"/>
-        </w:rPr>
-      </w:pPr>
-    </w:p>
-    <w:p>
-      <w:pPr>
-        <w:pStyle w:val="HTMLconformatoprevio"/>
-        <w:shd w:val="clear" w:color="auto" w:fill="FFFFFF"/>
-        <w:wordWrap w:val="0"/>
-        <w:spacing w:line="240" w:lineRule="atLeast"/>
-        <w:rPr>
-          <w:rStyle w:val="gnkrckgcmrb"/>
-          <w:rFonts w:ascii="Lucida Console" w:hAnsi="Lucida Console"/>
-        </w:rPr>
-      </w:pPr>
-    </w:p>
-    <w:p>
-      <w:pPr>
         <w:pStyle w:val="Ttulo3"/>
         <w:shd w:val="clear" w:color="auto" w:fill="FFFFFF"/>
         <w:spacing w:before="306" w:after="204"/>
@@ -17308,7 +17623,7 @@
                     </pic:cNvPicPr>
                   </pic:nvPicPr>
                   <pic:blipFill>
-                    <a:blip r:embed="rId35" cstate="print">
+                    <a:blip r:embed="rId34" cstate="print">
                       <a:extLst>
                         <a:ext uri="{28A0092B-C50C-407E-A947-70E740481C1C}">
                           <a14:useLocalDpi xmlns:a14="http://schemas.microsoft.com/office/drawing/2010/main" val="0"/>
@@ -17361,10 +17676,8 @@
       </w:pPr>
       <w:r>
         <w:rPr>
-          <w:highlight w:val="cyan"/>
           <w:shd w:val="clear" w:color="auto" w:fill="FFFFFF"/>
         </w:rPr>
-        <w:lastRenderedPageBreak/>
         <w:t>Veremos el método llamado </w:t>
       </w:r>
       <w:r>
@@ -17373,14 +17686,12 @@
           <w:rFonts w:ascii="Helvetica" w:hAnsi="Helvetica" w:cs="Helvetica"/>
           <w:color w:val="333333"/>
           <w:spacing w:val="3"/>
-          <w:highlight w:val="cyan"/>
           <w:shd w:val="clear" w:color="auto" w:fill="FFFFFF"/>
         </w:rPr>
         <w:t>K</w:t>
       </w:r>
       <w:r>
         <w:rPr>
-          <w:highlight w:val="cyan"/>
           <w:shd w:val="clear" w:color="auto" w:fill="FFFFFF"/>
         </w:rPr>
         <w:t>-medias que en resumidas palabras agrupa un número de clústeres pre-definidos a partir de los valores medios de cada clúster. Usaremos el conjunto de datos </w:t>
@@ -17391,42 +17702,36 @@
           <w:rFonts w:ascii="Helvetica" w:hAnsi="Helvetica" w:cs="Helvetica"/>
           <w:color w:val="333333"/>
           <w:spacing w:val="3"/>
-          <w:highlight w:val="cyan"/>
           <w:shd w:val="clear" w:color="auto" w:fill="FFFFFF"/>
         </w:rPr>
         <w:t>iris</w:t>
       </w:r>
       <w:r>
         <w:rPr>
-          <w:highlight w:val="cyan"/>
           <w:shd w:val="clear" w:color="auto" w:fill="FFFFFF"/>
         </w:rPr>
         <w:t xml:space="preserve"> con información sobre tres </w:t>
       </w:r>
       <w:r>
         <w:rPr>
-          <w:highlight w:val="cyan"/>
           <w:shd w:val="clear" w:color="auto" w:fill="FFFFFF"/>
         </w:rPr>
         <w:t>variedades morfológicas</w:t>
       </w:r>
       <w:r>
         <w:rPr>
-          <w:highlight w:val="cyan"/>
           <w:shd w:val="clear" w:color="auto" w:fill="FFFFFF"/>
         </w:rPr>
         <w:t xml:space="preserve"> de</w:t>
       </w:r>
       <w:r>
         <w:rPr>
-          <w:highlight w:val="cyan"/>
           <w:shd w:val="clear" w:color="auto" w:fill="FFFFFF"/>
         </w:rPr>
         <w:t xml:space="preserve"> la especie iris</w:t>
       </w:r>
       <w:r>
         <w:rPr>
-          <w:highlight w:val="cyan"/>
           <w:shd w:val="clear" w:color="auto" w:fill="FFFFFF"/>
         </w:rPr>
         <w:t>, el cual viene por defecto en </w:t>
@@ -17437,14 +17742,12 @@
           <w:rFonts w:ascii="Helvetica" w:hAnsi="Helvetica" w:cs="Helvetica"/>
           <w:color w:val="333333"/>
           <w:spacing w:val="3"/>
-          <w:highlight w:val="cyan"/>
           <w:shd w:val="clear" w:color="auto" w:fill="FFFFFF"/>
         </w:rPr>
         <w:t>R</w:t>
       </w:r>
       <w:r>
         <w:rPr>
-          <w:highlight w:val="cyan"/>
           <w:shd w:val="clear" w:color="auto" w:fill="FFFFFF"/>
         </w:rPr>
         <w:t>, también la función </w:t>
@@ -17457,7 +17760,6 @@
           <w:rFonts w:ascii="Helvetica" w:hAnsi="Helvetica" w:cs="Helvetica"/>
           <w:color w:val="333333"/>
           <w:spacing w:val="3"/>
-          <w:highlight w:val="cyan"/>
           <w:shd w:val="clear" w:color="auto" w:fill="FFFFFF"/>
         </w:rPr>
         <w:t>kmeans</w:t>
@@ -17469,7 +17771,6 @@
           <w:rFonts w:ascii="Helvetica" w:hAnsi="Helvetica" w:cs="Helvetica"/>
           <w:color w:val="333333"/>
           <w:spacing w:val="3"/>
-          <w:highlight w:val="cyan"/>
           <w:shd w:val="clear" w:color="auto" w:fill="FFFFFF"/>
         </w:rPr>
         <w:t>(</w:t>
@@ -17481,14 +17782,12 @@
           <w:rFonts w:ascii="Helvetica" w:hAnsi="Helvetica" w:cs="Helvetica"/>
           <w:color w:val="333333"/>
           <w:spacing w:val="3"/>
-          <w:highlight w:val="cyan"/>
           <w:shd w:val="clear" w:color="auto" w:fill="FFFFFF"/>
         </w:rPr>
         <w:t>)</w:t>
       </w:r>
       <w:r>
         <w:rPr>
-          <w:highlight w:val="cyan"/>
           <w:shd w:val="clear" w:color="auto" w:fill="FFFFFF"/>
         </w:rPr>
         <w:t> la cual requiere dos parámetros: el conjunto de datos y el número de clústeres a crear.</w:t>
@@ -17583,7 +17882,7 @@
                     </pic:cNvPicPr>
                   </pic:nvPicPr>
                   <pic:blipFill>
-                    <a:blip r:embed="rId36" cstate="print">
+                    <a:blip r:embed="rId35" cstate="print">
                       <a:extLst>
                         <a:ext uri="{28A0092B-C50C-407E-A947-70E740481C1C}">
                           <a14:useLocalDpi xmlns:a14="http://schemas.microsoft.com/office/drawing/2010/main" val="0"/>
@@ -17653,6 +17952,7 @@
           <w:rFonts w:ascii="Lucida Console" w:hAnsi="Lucida Console"/>
           <w:color w:val="0070C0"/>
         </w:rPr>
+        <w:lastRenderedPageBreak/>
         <w:t>mydata</w:t>
       </w:r>
       <w:proofErr w:type="spellEnd"/>
@@ -18223,7 +18523,6 @@
           <w:rFonts w:ascii="Lucida Console" w:eastAsia="Times New Roman" w:hAnsi="Lucida Console" w:cs="Courier New"/>
           <w:sz w:val="20"/>
           <w:szCs w:val="20"/>
-          <w:highlight w:val="cyan"/>
           <w:lang w:eastAsia="es-VE"/>
         </w:rPr>
         <w:t>Reemplazar la siguiente imagen</w:t>
@@ -18298,7 +18597,6 @@
           <w:highlight w:val="cyan"/>
           <w:lang w:eastAsia="es-VE"/>
         </w:rPr>
-        <w:lastRenderedPageBreak/>
         <w:drawing>
           <wp:inline distT="0" distB="0" distL="0" distR="0" wp14:anchorId="0B85C59A" wp14:editId="164D920C">
             <wp:extent cx="5612130" cy="4778252"/>
@@ -18317,7 +18615,7 @@
                     </pic:cNvPicPr>
                   </pic:nvPicPr>
                   <pic:blipFill>
-                    <a:blip r:embed="rId37">
+                    <a:blip r:embed="rId36">
                       <a:extLst>
                         <a:ext uri="{28A0092B-C50C-407E-A947-70E740481C1C}">
                           <a14:useLocalDpi xmlns:a14="http://schemas.microsoft.com/office/drawing/2010/main" val="0"/>
@@ -18426,7 +18724,6 @@
           <w:rFonts w:ascii="Lucida Console" w:eastAsia="Times New Roman" w:hAnsi="Lucida Console" w:cs="Courier New"/>
           <w:sz w:val="20"/>
           <w:szCs w:val="20"/>
-          <w:highlight w:val="cyan"/>
           <w:lang w:eastAsia="es-VE"/>
         </w:rPr>
         <w:t>Por esta otra</w:t>
@@ -18468,8 +18765,9 @@
           <w:noProof/>
           <w:lang w:eastAsia="es-VE"/>
         </w:rPr>
+        <w:lastRenderedPageBreak/>
         <w:drawing>
-          <wp:inline distT="0" distB="0" distL="0" distR="0" wp14:anchorId="5172C243" wp14:editId="021BB75E">
+          <wp:inline distT="0" distB="0" distL="0" distR="0" wp14:anchorId="5172C243" wp14:editId="0D28554F">
             <wp:extent cx="4375507" cy="2729865"/>
             <wp:effectExtent l="19050" t="19050" r="25400" b="13335"/>
             <wp:docPr id="47" name="Imagen 47"/>
@@ -18484,7 +18782,7 @@
                     <pic:cNvPicPr/>
                   </pic:nvPicPr>
                   <pic:blipFill>
-                    <a:blip r:embed="rId38"/>
+                    <a:blip r:embed="rId37"/>
                     <a:stretch>
                       <a:fillRect/>
                     </a:stretch>
@@ -18502,7 +18800,7 @@
                     </a:solidFill>
                     <a:ln>
                       <a:solidFill>
-                        <a:srgbClr val="00B0F0"/>
+                        <a:schemeClr val="tx1"/>
                       </a:solidFill>
                     </a:ln>
                   </pic:spPr>
@@ -18688,7 +18986,7 @@
                     </pic:cNvPicPr>
                   </pic:nvPicPr>
                   <pic:blipFill>
-                    <a:blip r:embed="rId39" cstate="print">
+                    <a:blip r:embed="rId38" cstate="print">
                       <a:extLst>
                         <a:ext uri="{28A0092B-C50C-407E-A947-70E740481C1C}">
                           <a14:useLocalDpi xmlns:a14="http://schemas.microsoft.com/office/drawing/2010/main" val="0"/>
@@ -19023,6 +19321,7 @@
           <w:shd w:val="clear" w:color="auto" w:fill="FFFF00"/>
           <w:lang w:eastAsia="es-VE"/>
         </w:rPr>
+        <w:lastRenderedPageBreak/>
         <w:drawing>
           <wp:inline distT="0" distB="0" distL="0" distR="0" wp14:anchorId="5A2435A1" wp14:editId="1CE4AAF3">
             <wp:extent cx="5612130" cy="2901950"/>
@@ -19039,7 +19338,7 @@
                     <pic:cNvPicPr/>
                   </pic:nvPicPr>
                   <pic:blipFill>
-                    <a:blip r:embed="rId40"/>
+                    <a:blip r:embed="rId39"/>
                     <a:stretch>
                       <a:fillRect/>
                     </a:stretch>
@@ -19277,7 +19576,7 @@
                     </pic:cNvPicPr>
                   </pic:nvPicPr>
                   <pic:blipFill>
-                    <a:blip r:embed="rId41" cstate="print">
+                    <a:blip r:embed="rId40" cstate="print">
                       <a:extLst>
                         <a:ext uri="{28A0092B-C50C-407E-A947-70E740481C1C}">
                           <a14:useLocalDpi xmlns:a14="http://schemas.microsoft.com/office/drawing/2010/main" val="0"/>
@@ -19363,12 +19662,12 @@
         <w:spacing w:after="0" w:line="240" w:lineRule="atLeast"/>
         <w:jc w:val="left"/>
         <w:rPr>
-          <w:color w:val="5B9BD5" w:themeColor="accent1"/>
-        </w:rPr>
-      </w:pPr>
-      <w:r>
-        <w:rPr>
-          <w:color w:val="5B9BD5" w:themeColor="accent1"/>
+          <w:color w:val="000000" w:themeColor="text1"/>
+        </w:rPr>
+      </w:pPr>
+      <w:r>
+        <w:rPr>
+          <w:color w:val="000000" w:themeColor="text1"/>
         </w:rPr>
         <w:t>#Creando las distancias entre observaciones</w:t>
       </w:r>
@@ -19523,20 +19822,14 @@
         <w:spacing w:after="0" w:line="240" w:lineRule="atLeast"/>
         <w:jc w:val="left"/>
         <w:rPr>
-          <w:color w:val="5B9BD5" w:themeColor="accent1"/>
-        </w:rPr>
-      </w:pPr>
-      <w:r>
-        <w:rPr>
-          <w:color w:val="5B9BD5" w:themeColor="accent1"/>
-        </w:rPr>
-        <w:t>#</w:t>
-      </w:r>
-      <w:r>
-        <w:rPr>
-          <w:color w:val="5B9BD5" w:themeColor="accent1"/>
-        </w:rPr>
-        <w:t xml:space="preserve"> Análisis jerárquico</w:t>
+          <w:color w:val="000000" w:themeColor="text1"/>
+        </w:rPr>
+      </w:pPr>
+      <w:r>
+        <w:rPr>
+          <w:color w:val="000000" w:themeColor="text1"/>
+        </w:rPr>
+        <w:t># Análisis jerárquico</w:t>
       </w:r>
     </w:p>
     <w:p>
@@ -19687,7 +19980,7 @@
         <w:jc w:val="left"/>
         <w:rPr>
           <w:rFonts w:ascii="Lucida Console" w:eastAsia="Times New Roman" w:hAnsi="Lucida Console" w:cs="Courier New"/>
-          <w:color w:val="0000FF"/>
+          <w:color w:val="000000" w:themeColor="text1"/>
           <w:sz w:val="20"/>
           <w:szCs w:val="20"/>
           <w:lang w:eastAsia="es-VE"/>
@@ -19696,7 +19989,7 @@
       <w:r>
         <w:rPr>
           <w:rFonts w:ascii="Lucida Console" w:eastAsia="Times New Roman" w:hAnsi="Lucida Console" w:cs="Courier New"/>
-          <w:color w:val="0000FF"/>
+          <w:color w:val="000000" w:themeColor="text1"/>
           <w:sz w:val="20"/>
           <w:szCs w:val="20"/>
           <w:lang w:eastAsia="es-VE"/>
@@ -19947,7 +20240,7 @@
                     </pic:cNvPicPr>
                   </pic:nvPicPr>
                   <pic:blipFill>
-                    <a:blip r:embed="rId42" cstate="print">
+                    <a:blip r:embed="rId41" cstate="print">
                       <a:extLst>
                         <a:ext uri="{28A0092B-C50C-407E-A947-70E740481C1C}">
                           <a14:useLocalDpi xmlns:a14="http://schemas.microsoft.com/office/drawing/2010/main" val="0"/>
@@ -19983,50 +20276,113 @@
     <w:p>
       <w:pPr>
         <w:rPr>
+          <w:color w:val="000000" w:themeColor="text1"/>
+        </w:rPr>
+      </w:pPr>
+      <w:r>
+        <w:rPr>
+          <w:color w:val="000000" w:themeColor="text1"/>
+        </w:rPr>
+        <w:t>#Escogiendo el número de clústeres</w:t>
+      </w:r>
+    </w:p>
+    <w:p>
+      <w:pPr>
+        <w:rPr>
           <w:color w:val="5B9BD5" w:themeColor="accent1"/>
         </w:rPr>
       </w:pPr>
+      <w:proofErr w:type="gramStart"/>
       <w:r>
         <w:rPr>
           <w:color w:val="5B9BD5" w:themeColor="accent1"/>
         </w:rPr>
-        <w:t>#Escogiendo el número de clústeres</w:t>
-      </w:r>
-    </w:p>
-    <w:p>
-      <w:pPr>
+        <w:t>grupos</w:t>
+      </w:r>
+      <w:proofErr w:type="gramEnd"/>
+      <w:r>
         <w:rPr>
           <w:color w:val="5B9BD5" w:themeColor="accent1"/>
         </w:rPr>
-      </w:pPr>
+        <w:t>&lt;-</w:t>
+      </w:r>
+      <w:proofErr w:type="spellStart"/>
+      <w:r>
+        <w:rPr>
+          <w:color w:val="5B9BD5" w:themeColor="accent1"/>
+        </w:rPr>
+        <w:t>cutree</w:t>
+      </w:r>
+      <w:proofErr w:type="spellEnd"/>
+      <w:r>
+        <w:rPr>
+          <w:color w:val="5B9BD5" w:themeColor="accent1"/>
+        </w:rPr>
+        <w:t>(hc1,k=4)</w:t>
+      </w:r>
+    </w:p>
+    <w:p>
+      <w:pPr>
+        <w:rPr>
+          <w:color w:val="000000" w:themeColor="text1"/>
+        </w:rPr>
+      </w:pPr>
+      <w:r>
+        <w:rPr>
+          <w:color w:val="000000" w:themeColor="text1"/>
+        </w:rPr>
+        <w:t>#Observamos la distribución por grupos</w:t>
+      </w:r>
+    </w:p>
+    <w:p>
+      <w:pPr>
+        <w:rPr>
+          <w:color w:val="000000" w:themeColor="text1"/>
+        </w:rPr>
+      </w:pPr>
+      <w:proofErr w:type="spellStart"/>
       <w:proofErr w:type="gramStart"/>
       <w:r>
         <w:rPr>
+          <w:color w:val="000000" w:themeColor="text1"/>
+        </w:rPr>
+        <w:t>table</w:t>
+      </w:r>
+      <w:proofErr w:type="spellEnd"/>
+      <w:r>
+        <w:rPr>
+          <w:color w:val="000000" w:themeColor="text1"/>
+        </w:rPr>
+        <w:t>(</w:t>
+      </w:r>
+      <w:proofErr w:type="gramEnd"/>
+      <w:r>
+        <w:rPr>
+          <w:color w:val="000000" w:themeColor="text1"/>
+        </w:rPr>
+        <w:t>grupos)</w:t>
+      </w:r>
+    </w:p>
+    <w:p>
+      <w:pPr>
+        <w:rPr>
           <w:color w:val="5B9BD5" w:themeColor="accent1"/>
         </w:rPr>
-        <w:t>grupos</w:t>
-      </w:r>
-      <w:proofErr w:type="gramEnd"/>
-      <w:r>
+      </w:pPr>
+    </w:p>
+    <w:p>
+      <w:pPr>
         <w:rPr>
           <w:color w:val="5B9BD5" w:themeColor="accent1"/>
         </w:rPr>
-        <w:t>&lt;-</w:t>
-      </w:r>
-      <w:proofErr w:type="spellStart"/>
-      <w:r>
+      </w:pPr>
+    </w:p>
+    <w:p>
+      <w:pPr>
         <w:rPr>
           <w:color w:val="5B9BD5" w:themeColor="accent1"/>
         </w:rPr>
-        <w:t>cutree</w:t>
-      </w:r>
-      <w:proofErr w:type="spellEnd"/>
-      <w:r>
-        <w:rPr>
-          <w:color w:val="5B9BD5" w:themeColor="accent1"/>
-        </w:rPr>
-        <w:t>(hc1,k=4)</w:t>
-      </w:r>
+      </w:pPr>
       <w:r>
         <w:rPr>
           <w:color w:val="5B9BD5" w:themeColor="accent1"/>
@@ -20167,7 +20523,7 @@
                     </pic:cNvPicPr>
                   </pic:nvPicPr>
                   <pic:blipFill>
-                    <a:blip r:embed="rId43">
+                    <a:blip r:embed="rId42">
                       <a:extLst>
                         <a:ext uri="{28A0092B-C50C-407E-A947-70E740481C1C}">
                           <a14:useLocalDpi xmlns:a14="http://schemas.microsoft.com/office/drawing/2010/main" val="0"/>
@@ -20832,7 +21188,7 @@
                     </pic:cNvPicPr>
                   </pic:nvPicPr>
                   <pic:blipFill>
-                    <a:blip r:embed="rId44">
+                    <a:blip r:embed="rId43">
                       <a:extLst>
                         <a:ext uri="{28A0092B-C50C-407E-A947-70E740481C1C}">
                           <a14:useLocalDpi xmlns:a14="http://schemas.microsoft.com/office/drawing/2010/main" val="0"/>
@@ -21211,7 +21567,7 @@
                     </pic:cNvPicPr>
                   </pic:nvPicPr>
                   <pic:blipFill>
-                    <a:blip r:embed="rId45">
+                    <a:blip r:embed="rId44">
                       <a:extLst>
                         <a:ext uri="{28A0092B-C50C-407E-A947-70E740481C1C}">
                           <a14:useLocalDpi xmlns:a14="http://schemas.microsoft.com/office/drawing/2010/main" val="0"/>
@@ -21626,7 +21982,7 @@
                     </pic:cNvPicPr>
                   </pic:nvPicPr>
                   <pic:blipFill>
-                    <a:blip r:embed="rId46">
+                    <a:blip r:embed="rId45">
                       <a:extLst>
                         <a:ext uri="{28A0092B-C50C-407E-A947-70E740481C1C}">
                           <a14:useLocalDpi xmlns:a14="http://schemas.microsoft.com/office/drawing/2010/main" val="0"/>
@@ -22065,7 +22421,7 @@
                     </pic:cNvPicPr>
                   </pic:nvPicPr>
                   <pic:blipFill>
-                    <a:blip r:embed="rId47">
+                    <a:blip r:embed="rId46">
                       <a:extLst>
                         <a:ext uri="{28A0092B-C50C-407E-A947-70E740481C1C}">
                           <a14:useLocalDpi xmlns:a14="http://schemas.microsoft.com/office/drawing/2010/main" val="0"/>
@@ -23095,7 +23451,7 @@
                     </pic:cNvPicPr>
                   </pic:nvPicPr>
                   <pic:blipFill>
-                    <a:blip r:embed="rId48">
+                    <a:blip r:embed="rId47">
                       <a:extLst>
                         <a:ext uri="{28A0092B-C50C-407E-A947-70E740481C1C}">
                           <a14:useLocalDpi xmlns:a14="http://schemas.microsoft.com/office/drawing/2010/main" val="0"/>
@@ -23304,19 +23660,6 @@
         <w:lastRenderedPageBreak/>
         <w:t>Capítulo 8 Árboles de decisión y bosques aleatorios</w:t>
       </w:r>
-      <w:r>
-        <w:rPr>
-          <w:rFonts w:ascii="Helvetica" w:eastAsia="Times New Roman" w:hAnsi="Helvetica" w:cs="Helvetica"/>
-          <w:color w:val="333333"/>
-          <w:spacing w:val="3"/>
-          <w:kern w:val="36"/>
-          <w:sz w:val="48"/>
-          <w:szCs w:val="48"/>
-          <w:highlight w:val="yellow"/>
-          <w:lang w:eastAsia="es-VE"/>
-        </w:rPr>
-        <w:t>.</w:t>
-      </w:r>
     </w:p>
     <w:p>
       <w:pPr>
@@ -23362,11 +23705,13 @@
           <w:spacing w:val="3"/>
           <w:sz w:val="42"/>
           <w:szCs w:val="42"/>
-          <w:highlight w:val="yellow"/>
+          <w:highlight w:val="cyan"/>
           <w:lang w:eastAsia="es-VE"/>
         </w:rPr>
         <w:t>Árboles</w:t>
       </w:r>
+      <w:bookmarkStart w:id="0" w:name="_GoBack"/>
+      <w:bookmarkEnd w:id="0"/>
       <w:r>
         <w:rPr>
           <w:rFonts w:ascii="Helvetica" w:eastAsia="Times New Roman" w:hAnsi="Helvetica" w:cs="Helvetica"/>
@@ -23378,15 +23723,139 @@
         </w:rPr>
         <w:t xml:space="preserve"> de decisión</w:t>
       </w:r>
-      <w:r>
-        <w:rPr>
-          <w:rFonts w:ascii="Helvetica" w:eastAsia="Times New Roman" w:hAnsi="Helvetica" w:cs="Helvetica"/>
-          <w:color w:val="333333"/>
-          <w:spacing w:val="3"/>
-          <w:sz w:val="42"/>
-          <w:szCs w:val="42"/>
-          <w:highlight w:val="yellow"/>
-          <w:lang w:eastAsia="es-VE"/>
+    </w:p>
+    <w:p>
+      <w:pPr>
+        <w:rPr>
+          <w:rFonts w:ascii="Helvetica" w:hAnsi="Helvetica" w:cs="Helvetica"/>
+          <w:color w:val="333333"/>
+          <w:spacing w:val="3"/>
+          <w:shd w:val="clear" w:color="auto" w:fill="FFFFFF"/>
+        </w:rPr>
+      </w:pPr>
+      <w:r>
+        <w:rPr>
+          <w:rFonts w:ascii="Helvetica" w:hAnsi="Helvetica" w:cs="Helvetica"/>
+          <w:color w:val="333333"/>
+          <w:spacing w:val="3"/>
+          <w:shd w:val="clear" w:color="auto" w:fill="FFFFFF"/>
+        </w:rPr>
+        <w:t xml:space="preserve">Los árboles de decisión son una herramienta muy útil a la hora de elegir entre varias alternativas, cuando estas son escalonadas, es decir, que los resultados (positivos o negativos) dependen de una decisión tomada anteriormente. </w:t>
+      </w:r>
+      <w:r>
+        <w:rPr>
+          <w:rFonts w:ascii="Helvetica" w:hAnsi="Helvetica" w:cs="Helvetica"/>
+          <w:color w:val="333333"/>
+          <w:spacing w:val="3"/>
+          <w:shd w:val="clear" w:color="auto" w:fill="FFFFFF"/>
+        </w:rPr>
+        <w:t>Independiente</w:t>
+      </w:r>
+      <w:r>
+        <w:rPr>
+          <w:rFonts w:ascii="Helvetica" w:hAnsi="Helvetica" w:cs="Helvetica"/>
+          <w:color w:val="333333"/>
+          <w:spacing w:val="3"/>
+          <w:shd w:val="clear" w:color="auto" w:fill="FFFFFF"/>
+        </w:rPr>
+        <w:t>mente</w:t>
+      </w:r>
+      <w:r>
+        <w:rPr>
+          <w:rFonts w:ascii="Helvetica" w:hAnsi="Helvetica" w:cs="Helvetica"/>
+          <w:color w:val="333333"/>
+          <w:spacing w:val="3"/>
+          <w:shd w:val="clear" w:color="auto" w:fill="FFFFFF"/>
+        </w:rPr>
+        <w:t xml:space="preserve"> del área en que se</w:t>
+      </w:r>
+      <w:r>
+        <w:rPr>
+          <w:rFonts w:ascii="Helvetica" w:hAnsi="Helvetica" w:cs="Helvetica"/>
+          <w:color w:val="333333"/>
+          <w:spacing w:val="3"/>
+          <w:shd w:val="clear" w:color="auto" w:fill="FFFFFF"/>
+        </w:rPr>
+        <w:t>an utilizados</w:t>
+      </w:r>
+      <w:r>
+        <w:rPr>
+          <w:rFonts w:ascii="Helvetica" w:hAnsi="Helvetica" w:cs="Helvetica"/>
+          <w:color w:val="333333"/>
+          <w:spacing w:val="3"/>
+          <w:shd w:val="clear" w:color="auto" w:fill="FFFFFF"/>
+        </w:rPr>
+        <w:t xml:space="preserve">, </w:t>
+      </w:r>
+      <w:r>
+        <w:rPr>
+          <w:rFonts w:ascii="Helvetica" w:hAnsi="Helvetica" w:cs="Helvetica"/>
+          <w:color w:val="333333"/>
+          <w:spacing w:val="3"/>
+          <w:shd w:val="clear" w:color="auto" w:fill="FFFFFF"/>
+        </w:rPr>
+        <w:t xml:space="preserve">los árboles de decisión </w:t>
+      </w:r>
+      <w:r>
+        <w:rPr>
+          <w:rFonts w:ascii="Helvetica" w:hAnsi="Helvetica" w:cs="Helvetica"/>
+          <w:color w:val="333333"/>
+          <w:spacing w:val="3"/>
+          <w:shd w:val="clear" w:color="auto" w:fill="FFFFFF"/>
+        </w:rPr>
+        <w:t>facilita</w:t>
+      </w:r>
+      <w:r>
+        <w:rPr>
+          <w:rFonts w:ascii="Helvetica" w:hAnsi="Helvetica" w:cs="Helvetica"/>
+          <w:color w:val="333333"/>
+          <w:spacing w:val="3"/>
+          <w:shd w:val="clear" w:color="auto" w:fill="FFFFFF"/>
+        </w:rPr>
+        <w:t>n</w:t>
+      </w:r>
+      <w:r>
+        <w:rPr>
+          <w:rFonts w:ascii="Helvetica" w:hAnsi="Helvetica" w:cs="Helvetica"/>
+          <w:color w:val="333333"/>
+          <w:spacing w:val="3"/>
+          <w:shd w:val="clear" w:color="auto" w:fill="FFFFFF"/>
+        </w:rPr>
+        <w:t xml:space="preserve"> la visualización </w:t>
+      </w:r>
+      <w:r>
+        <w:rPr>
+          <w:rFonts w:ascii="Helvetica" w:hAnsi="Helvetica" w:cs="Helvetica"/>
+          <w:color w:val="333333"/>
+          <w:spacing w:val="3"/>
+          <w:shd w:val="clear" w:color="auto" w:fill="FFFFFF"/>
+        </w:rPr>
+        <w:t xml:space="preserve">y el análisis de las probabilidades de los resultados entre diferentes opciones, </w:t>
+      </w:r>
+      <w:r>
+        <w:rPr>
+          <w:rFonts w:ascii="Helvetica" w:hAnsi="Helvetica" w:cs="Helvetica"/>
+          <w:color w:val="333333"/>
+          <w:spacing w:val="3"/>
+          <w:shd w:val="clear" w:color="auto" w:fill="FFFFFF"/>
+        </w:rPr>
+        <w:t>mejor</w:t>
+      </w:r>
+      <w:r>
+        <w:rPr>
+          <w:rFonts w:ascii="Helvetica" w:hAnsi="Helvetica" w:cs="Helvetica"/>
+          <w:color w:val="333333"/>
+          <w:spacing w:val="3"/>
+          <w:shd w:val="clear" w:color="auto" w:fill="FFFFFF"/>
+        </w:rPr>
+        <w:t>ando la capacidad de las empresas e individuos para realizar una mejor elección</w:t>
+      </w:r>
+      <w:r>
+        <w:rPr>
+          <w:rFonts w:ascii="Helvetica" w:hAnsi="Helvetica" w:cs="Helvetica"/>
+          <w:color w:val="333333"/>
+          <w:spacing w:val="3"/>
+          <w:shd w:val="clear" w:color="auto" w:fill="FFFFFF"/>
         </w:rPr>
         <w:t>.</w:t>
       </w:r>
@@ -23400,6 +23869,13 @@
           <w:shd w:val="clear" w:color="auto" w:fill="FFFFFF"/>
         </w:rPr>
       </w:pPr>
+    </w:p>
+    <w:p>
+      <w:pPr>
+        <w:rPr>
+          <w:color w:val="5B9BD5" w:themeColor="accent1"/>
+        </w:rPr>
+      </w:pPr>
       <w:r>
         <w:rPr>
           <w:rFonts w:ascii="Helvetica" w:hAnsi="Helvetica" w:cs="Helvetica"/>
@@ -23407,190 +23883,31 @@
           <w:spacing w:val="3"/>
           <w:shd w:val="clear" w:color="auto" w:fill="FFFFFF"/>
         </w:rPr>
-        <w:t xml:space="preserve">Los árboles de decisión son una herramienta muy útil a la hora de elegir entre varias alternativas, cuando estas son escalonadas, es decir, que los resultados (positivos o negativos) dependen de una decisión tomada anteriormente. </w:t>
+        <w:t xml:space="preserve">Un árbol de decisión es, para quien va a tomar la decisión, un modelo esquemático de las alternativas disponibles y de las posibles consecuencias de cada una. </w:t>
       </w:r>
       <w:r>
         <w:rPr>
           <w:rFonts w:ascii="Helvetica" w:hAnsi="Helvetica" w:cs="Helvetica"/>
           <w:color w:val="333333"/>
           <w:spacing w:val="3"/>
-          <w:highlight w:val="yellow"/>
           <w:shd w:val="clear" w:color="auto" w:fill="FFFFFF"/>
         </w:rPr>
-        <w:t>Independiente</w:t>
+        <w:t>El nombre de la herramienta proviene de la forma que adopta el modelo</w:t>
       </w:r>
       <w:r>
         <w:rPr>
           <w:rFonts w:ascii="Helvetica" w:hAnsi="Helvetica" w:cs="Helvetica"/>
           <w:color w:val="333333"/>
           <w:spacing w:val="3"/>
-          <w:highlight w:val="yellow"/>
           <w:shd w:val="clear" w:color="auto" w:fill="FFFFFF"/>
         </w:rPr>
-        <w:t>mente</w:t>
+        <w:t>,</w:t>
       </w:r>
       <w:r>
         <w:rPr>
           <w:rFonts w:ascii="Helvetica" w:hAnsi="Helvetica" w:cs="Helvetica"/>
           <w:color w:val="333333"/>
           <w:spacing w:val="3"/>
-          <w:highlight w:val="yellow"/>
-          <w:shd w:val="clear" w:color="auto" w:fill="FFFFFF"/>
-        </w:rPr>
-        <w:t xml:space="preserve"> del área en que se</w:t>
-      </w:r>
-      <w:r>
-        <w:rPr>
-          <w:rFonts w:ascii="Helvetica" w:hAnsi="Helvetica" w:cs="Helvetica"/>
-          <w:color w:val="333333"/>
-          <w:spacing w:val="3"/>
-          <w:highlight w:val="yellow"/>
-          <w:shd w:val="clear" w:color="auto" w:fill="FFFFFF"/>
-        </w:rPr>
-        <w:t>an utilizados</w:t>
-      </w:r>
-      <w:r>
-        <w:rPr>
-          <w:rFonts w:ascii="Helvetica" w:hAnsi="Helvetica" w:cs="Helvetica"/>
-          <w:color w:val="333333"/>
-          <w:spacing w:val="3"/>
-          <w:highlight w:val="yellow"/>
-          <w:shd w:val="clear" w:color="auto" w:fill="FFFFFF"/>
-        </w:rPr>
-        <w:t xml:space="preserve">, </w:t>
-      </w:r>
-      <w:r>
-        <w:rPr>
-          <w:rFonts w:ascii="Helvetica" w:hAnsi="Helvetica" w:cs="Helvetica"/>
-          <w:color w:val="333333"/>
-          <w:spacing w:val="3"/>
-          <w:highlight w:val="yellow"/>
-          <w:shd w:val="clear" w:color="auto" w:fill="FFFFFF"/>
-        </w:rPr>
-        <w:t xml:space="preserve">los árboles de decisión </w:t>
-      </w:r>
-      <w:r>
-        <w:rPr>
-          <w:rFonts w:ascii="Helvetica" w:hAnsi="Helvetica" w:cs="Helvetica"/>
-          <w:color w:val="333333"/>
-          <w:spacing w:val="3"/>
-          <w:highlight w:val="yellow"/>
-          <w:shd w:val="clear" w:color="auto" w:fill="FFFFFF"/>
-        </w:rPr>
-        <w:t>facilita</w:t>
-      </w:r>
-      <w:r>
-        <w:rPr>
-          <w:rFonts w:ascii="Helvetica" w:hAnsi="Helvetica" w:cs="Helvetica"/>
-          <w:color w:val="333333"/>
-          <w:spacing w:val="3"/>
-          <w:highlight w:val="yellow"/>
-          <w:shd w:val="clear" w:color="auto" w:fill="FFFFFF"/>
-        </w:rPr>
-        <w:t>n</w:t>
-      </w:r>
-      <w:r>
-        <w:rPr>
-          <w:rFonts w:ascii="Helvetica" w:hAnsi="Helvetica" w:cs="Helvetica"/>
-          <w:color w:val="333333"/>
-          <w:spacing w:val="3"/>
-          <w:highlight w:val="yellow"/>
-          <w:shd w:val="clear" w:color="auto" w:fill="FFFFFF"/>
-        </w:rPr>
-        <w:t xml:space="preserve"> la visualización </w:t>
-      </w:r>
-      <w:r>
-        <w:rPr>
-          <w:rFonts w:ascii="Helvetica" w:hAnsi="Helvetica" w:cs="Helvetica"/>
-          <w:color w:val="333333"/>
-          <w:spacing w:val="3"/>
-          <w:highlight w:val="yellow"/>
-          <w:shd w:val="clear" w:color="auto" w:fill="FFFFFF"/>
-        </w:rPr>
-        <w:t xml:space="preserve">y el análisis de las probabilidades de los resultados entre diferentes opciones, </w:t>
-      </w:r>
-      <w:r>
-        <w:rPr>
-          <w:rFonts w:ascii="Helvetica" w:hAnsi="Helvetica" w:cs="Helvetica"/>
-          <w:color w:val="333333"/>
-          <w:spacing w:val="3"/>
-          <w:highlight w:val="yellow"/>
-          <w:shd w:val="clear" w:color="auto" w:fill="FFFFFF"/>
-        </w:rPr>
-        <w:t>mejor</w:t>
-      </w:r>
-      <w:r>
-        <w:rPr>
-          <w:rFonts w:ascii="Helvetica" w:hAnsi="Helvetica" w:cs="Helvetica"/>
-          <w:color w:val="333333"/>
-          <w:spacing w:val="3"/>
-          <w:highlight w:val="yellow"/>
-          <w:shd w:val="clear" w:color="auto" w:fill="FFFFFF"/>
-        </w:rPr>
-        <w:t>ando la capacidad de las empresas e individuos para realizar una mejor elección</w:t>
-      </w:r>
-      <w:r>
-        <w:rPr>
-          <w:rFonts w:ascii="Helvetica" w:hAnsi="Helvetica" w:cs="Helvetica"/>
-          <w:color w:val="333333"/>
-          <w:spacing w:val="3"/>
-          <w:highlight w:val="yellow"/>
-          <w:shd w:val="clear" w:color="auto" w:fill="FFFFFF"/>
-        </w:rPr>
-        <w:t>.</w:t>
-      </w:r>
-    </w:p>
-    <w:p>
-      <w:pPr>
-        <w:rPr>
-          <w:rFonts w:ascii="Helvetica" w:hAnsi="Helvetica" w:cs="Helvetica"/>
-          <w:color w:val="333333"/>
-          <w:spacing w:val="3"/>
-          <w:shd w:val="clear" w:color="auto" w:fill="FFFFFF"/>
-        </w:rPr>
-      </w:pPr>
-    </w:p>
-    <w:p>
-      <w:pPr>
-        <w:rPr>
-          <w:color w:val="5B9BD5" w:themeColor="accent1"/>
-        </w:rPr>
-      </w:pPr>
-      <w:r>
-        <w:rPr>
-          <w:rFonts w:ascii="Helvetica" w:hAnsi="Helvetica" w:cs="Helvetica"/>
-          <w:color w:val="333333"/>
-          <w:spacing w:val="3"/>
-          <w:shd w:val="clear" w:color="auto" w:fill="FFFFFF"/>
-        </w:rPr>
-        <w:t xml:space="preserve">Un árbol de decisión es, para quien va a tomar la decisión, un modelo esquemático de las alternativas disponibles y de las posibles consecuencias de cada una. </w:t>
-      </w:r>
-      <w:r>
-        <w:rPr>
-          <w:rFonts w:ascii="Helvetica" w:hAnsi="Helvetica" w:cs="Helvetica"/>
-          <w:color w:val="333333"/>
-          <w:spacing w:val="3"/>
-          <w:highlight w:val="yellow"/>
-          <w:shd w:val="clear" w:color="auto" w:fill="FFFFFF"/>
-        </w:rPr>
-        <w:t>El nombre de la herramienta proviene de la forma que adopta el modelo</w:t>
-      </w:r>
-      <w:r>
-        <w:rPr>
-          <w:rFonts w:ascii="Helvetica" w:hAnsi="Helvetica" w:cs="Helvetica"/>
-          <w:color w:val="333333"/>
-          <w:spacing w:val="3"/>
-          <w:highlight w:val="yellow"/>
-          <w:shd w:val="clear" w:color="auto" w:fill="FFFFFF"/>
-        </w:rPr>
-        <w:t>,</w:t>
-      </w:r>
-      <w:r>
-        <w:rPr>
-          <w:rFonts w:ascii="Helvetica" w:hAnsi="Helvetica" w:cs="Helvetica"/>
-          <w:color w:val="333333"/>
-          <w:spacing w:val="3"/>
-          <w:highlight w:val="yellow"/>
           <w:shd w:val="clear" w:color="auto" w:fill="FFFFFF"/>
         </w:rPr>
         <w:t xml:space="preserve"> el cual semeja un árbol. El modelo está conformado por múltiples nodos cuadrados que representan puntos de decisión. De estos puntos surgen ramas  (que deben leerse de izquierda a derecha), las cuales representan las distintas alternativas. Las ramas que provienen de los nodos circulares o causales representan los eventos. A continuación presentamos un ejemplo gráfico de un árbol de decisión:</w:t>
@@ -23645,7 +23962,45 @@
           <w:sz w:val="36"/>
           <w:szCs w:val="36"/>
         </w:rPr>
-        <w:t> Arboles de decisión en </w:t>
+        <w:t> </w:t>
+      </w:r>
+      <w:r>
+        <w:rPr>
+          <w:rFonts w:ascii="Helvetica" w:hAnsi="Helvetica" w:cs="Helvetica"/>
+          <w:b/>
+          <w:bCs/>
+          <w:color w:val="333333"/>
+          <w:spacing w:val="3"/>
+          <w:sz w:val="36"/>
+          <w:szCs w:val="36"/>
+          <w:highlight w:val="cyan"/>
+        </w:rPr>
+        <w:t>Á</w:t>
+      </w:r>
+      <w:r>
+        <w:rPr>
+          <w:rFonts w:ascii="Helvetica" w:hAnsi="Helvetica" w:cs="Helvetica"/>
+          <w:b/>
+          <w:bCs/>
+          <w:color w:val="333333"/>
+          <w:spacing w:val="3"/>
+          <w:sz w:val="36"/>
+          <w:szCs w:val="36"/>
+          <w:highlight w:val="cyan"/>
+        </w:rPr>
+        <w:t>rboles</w:t>
+      </w:r>
+      <w:r>
+        <w:rPr>
+          <w:rFonts w:ascii="Helvetica" w:hAnsi="Helvetica" w:cs="Helvetica"/>
+          <w:b/>
+          <w:bCs/>
+          <w:color w:val="333333"/>
+          <w:spacing w:val="3"/>
+          <w:sz w:val="36"/>
+          <w:szCs w:val="36"/>
+        </w:rPr>
+        <w:t xml:space="preserve"> de decisión en </w:t>
       </w:r>
       <w:r>
         <w:rPr>
@@ -23678,41 +24033,7 @@
           <w:color w:val="333333"/>
           <w:spacing w:val="3"/>
         </w:rPr>
-        <w:t xml:space="preserve">Para realizar la </w:t>
-      </w:r>
-      <w:r>
-        <w:rPr>
-          <w:rFonts w:ascii="Helvetica" w:hAnsi="Helvetica" w:cs="Helvetica"/>
-          <w:color w:val="333333"/>
-          <w:spacing w:val="3"/>
-          <w:highlight w:val="yellow"/>
-        </w:rPr>
-        <w:t>construcción</w:t>
-      </w:r>
-      <w:r>
-        <w:rPr>
-          <w:rFonts w:ascii="Helvetica" w:hAnsi="Helvetica" w:cs="Helvetica"/>
-          <w:color w:val="333333"/>
-          <w:spacing w:val="3"/>
-        </w:rPr>
-        <w:t xml:space="preserve"> de </w:t>
-      </w:r>
-      <w:r>
-        <w:rPr>
-          <w:rFonts w:ascii="Helvetica" w:hAnsi="Helvetica" w:cs="Helvetica"/>
-          <w:color w:val="333333"/>
-          <w:spacing w:val="3"/>
-          <w:highlight w:val="yellow"/>
-        </w:rPr>
-        <w:t>árboles</w:t>
-      </w:r>
-      <w:r>
-        <w:rPr>
-          <w:rFonts w:ascii="Helvetica" w:hAnsi="Helvetica" w:cs="Helvetica"/>
-          <w:color w:val="333333"/>
-          <w:spacing w:val="3"/>
-        </w:rPr>
-        <w:t xml:space="preserve"> de decisión usaremos la librería </w:t>
+        <w:t>Para realizar la construcción de árboles de decisión usaremos la librería </w:t>
       </w:r>
       <w:r>
         <w:rPr>
@@ -23756,7 +24077,6 @@
           <w:rFonts w:ascii="Helvetica" w:hAnsi="Helvetica" w:cs="Helvetica"/>
           <w:color w:val="333333"/>
           <w:spacing w:val="3"/>
-          <w:highlight w:val="yellow"/>
         </w:rPr>
         <w:t>con</w:t>
       </w:r>
@@ -23773,9 +24093,8 @@
           <w:rFonts w:ascii="Helvetica" w:hAnsi="Helvetica" w:cs="Helvetica"/>
           <w:color w:val="333333"/>
           <w:spacing w:val="3"/>
-          <w:highlight w:val="yellow"/>
-        </w:rPr>
-        <w:t>una</w:t>
+        </w:rPr>
+        <w:t xml:space="preserve">una </w:t>
       </w:r>
       <w:r>
         <w:rPr>
@@ -23783,6 +24102,14 @@
           <w:color w:val="333333"/>
           <w:spacing w:val="3"/>
         </w:rPr>
+        <w:t>sintaxis</w:t>
+      </w:r>
+      <w:r>
+        <w:rPr>
+          <w:rFonts w:ascii="Helvetica" w:hAnsi="Helvetica" w:cs="Helvetica"/>
+          <w:color w:val="333333"/>
+          <w:spacing w:val="3"/>
+        </w:rPr>
         <w:t xml:space="preserve"> </w:t>
       </w:r>
       <w:r>
@@ -23790,9 +24117,8 @@
           <w:rFonts w:ascii="Helvetica" w:hAnsi="Helvetica" w:cs="Helvetica"/>
           <w:color w:val="333333"/>
           <w:spacing w:val="3"/>
-          <w:highlight w:val="yellow"/>
-        </w:rPr>
-        <w:t>sintaxis</w:t>
+        </w:rPr>
+        <w:t xml:space="preserve"> similar a la de la regresión lineal, es decir, ingresamo</w:t>
       </w:r>
       <w:r>
         <w:rPr>
@@ -23800,6 +24126,14 @@
           <w:color w:val="333333"/>
           <w:spacing w:val="3"/>
         </w:rPr>
+        <w:t>s la variable a predecir seguida</w:t>
+      </w:r>
+      <w:r>
+        <w:rPr>
+          <w:rFonts w:ascii="Helvetica" w:hAnsi="Helvetica" w:cs="Helvetica"/>
+          <w:color w:val="333333"/>
+          <w:spacing w:val="3"/>
+        </w:rPr>
         <w:t xml:space="preserve"> </w:t>
       </w:r>
       <w:r>
@@ -23808,7 +24142,7 @@
           <w:color w:val="333333"/>
           <w:spacing w:val="3"/>
         </w:rPr>
-        <w:t xml:space="preserve"> similar a la de la regresión lineal, es decir, ingresamo</w:t>
+        <w:t>de las variables independientes. E</w:t>
       </w:r>
       <w:r>
         <w:rPr>
@@ -23816,16 +24150,15 @@
           <w:color w:val="333333"/>
           <w:spacing w:val="3"/>
         </w:rPr>
-        <w:t xml:space="preserve">s la variable a predecir </w:t>
+        <w:t xml:space="preserve">l segundo </w:t>
       </w:r>
       <w:r>
         <w:rPr>
           <w:rFonts w:ascii="Helvetica" w:hAnsi="Helvetica" w:cs="Helvetica"/>
           <w:color w:val="333333"/>
           <w:spacing w:val="3"/>
-          <w:highlight w:val="yellow"/>
-        </w:rPr>
-        <w:t>seguida</w:t>
+        </w:rPr>
+        <w:t>parámetro son los datos que se usará</w:t>
       </w:r>
       <w:r>
         <w:rPr>
@@ -23833,6 +24166,22 @@
           <w:color w:val="333333"/>
           <w:spacing w:val="3"/>
         </w:rPr>
+        <w:t>n</w:t>
+      </w:r>
+      <w:r>
+        <w:rPr>
+          <w:rFonts w:ascii="Helvetica" w:hAnsi="Helvetica" w:cs="Helvetica"/>
+          <w:color w:val="333333"/>
+          <w:spacing w:val="3"/>
+        </w:rPr>
+        <w:t>. A</w:t>
+      </w:r>
+      <w:r>
+        <w:rPr>
+          <w:rFonts w:ascii="Helvetica" w:hAnsi="Helvetica" w:cs="Helvetica"/>
+          <w:color w:val="333333"/>
+          <w:spacing w:val="3"/>
+        </w:rPr>
         <w:t xml:space="preserve"> </w:t>
       </w:r>
       <w:r>
@@ -23840,93 +24189,6 @@
           <w:rFonts w:ascii="Helvetica" w:hAnsi="Helvetica" w:cs="Helvetica"/>
           <w:color w:val="333333"/>
           <w:spacing w:val="3"/>
-        </w:rPr>
-        <w:t>de las variables independientes</w:t>
-      </w:r>
-      <w:r>
-        <w:rPr>
-          <w:rFonts w:ascii="Helvetica" w:hAnsi="Helvetica" w:cs="Helvetica"/>
-          <w:color w:val="333333"/>
-          <w:spacing w:val="3"/>
-          <w:highlight w:val="yellow"/>
-        </w:rPr>
-        <w:t>. E</w:t>
-      </w:r>
-      <w:r>
-        <w:rPr>
-          <w:rFonts w:ascii="Helvetica" w:hAnsi="Helvetica" w:cs="Helvetica"/>
-          <w:color w:val="333333"/>
-          <w:spacing w:val="3"/>
-          <w:highlight w:val="yellow"/>
-        </w:rPr>
-        <w:t>l</w:t>
-      </w:r>
-      <w:r>
-        <w:rPr>
-          <w:rFonts w:ascii="Helvetica" w:hAnsi="Helvetica" w:cs="Helvetica"/>
-          <w:color w:val="333333"/>
-          <w:spacing w:val="3"/>
-        </w:rPr>
-        <w:t xml:space="preserve"> segundo </w:t>
-      </w:r>
-      <w:r>
-        <w:rPr>
-          <w:rFonts w:ascii="Helvetica" w:hAnsi="Helvetica" w:cs="Helvetica"/>
-          <w:color w:val="333333"/>
-          <w:spacing w:val="3"/>
-          <w:highlight w:val="yellow"/>
-        </w:rPr>
-        <w:t>parámetro</w:t>
-      </w:r>
-      <w:r>
-        <w:rPr>
-          <w:rFonts w:ascii="Helvetica" w:hAnsi="Helvetica" w:cs="Helvetica"/>
-          <w:color w:val="333333"/>
-          <w:spacing w:val="3"/>
-        </w:rPr>
-        <w:t xml:space="preserve"> son los datos que se </w:t>
-      </w:r>
-      <w:r>
-        <w:rPr>
-          <w:rFonts w:ascii="Helvetica" w:hAnsi="Helvetica" w:cs="Helvetica"/>
-          <w:color w:val="333333"/>
-          <w:spacing w:val="3"/>
-          <w:highlight w:val="yellow"/>
-        </w:rPr>
-        <w:t>usará</w:t>
-      </w:r>
-      <w:r>
-        <w:rPr>
-          <w:rFonts w:ascii="Helvetica" w:hAnsi="Helvetica" w:cs="Helvetica"/>
-          <w:color w:val="333333"/>
-          <w:spacing w:val="3"/>
-          <w:highlight w:val="yellow"/>
-        </w:rPr>
-        <w:t>n</w:t>
-      </w:r>
-      <w:r>
-        <w:rPr>
-          <w:rFonts w:ascii="Helvetica" w:hAnsi="Helvetica" w:cs="Helvetica"/>
-          <w:color w:val="333333"/>
-          <w:spacing w:val="3"/>
-          <w:highlight w:val="yellow"/>
-        </w:rPr>
-        <w:t>. A</w:t>
-      </w:r>
-      <w:r>
-        <w:rPr>
-          <w:rFonts w:ascii="Helvetica" w:hAnsi="Helvetica" w:cs="Helvetica"/>
-          <w:color w:val="333333"/>
-          <w:spacing w:val="3"/>
-        </w:rPr>
-        <w:t xml:space="preserve"> </w:t>
-      </w:r>
-      <w:r>
-        <w:rPr>
-          <w:rFonts w:ascii="Helvetica" w:hAnsi="Helvetica" w:cs="Helvetica"/>
-          <w:color w:val="333333"/>
-          <w:spacing w:val="3"/>
-          <w:highlight w:val="yellow"/>
         </w:rPr>
         <w:t>continuación</w:t>
       </w:r>
@@ -23974,7 +24236,7 @@
                     </pic:cNvPicPr>
                   </pic:nvPicPr>
                   <pic:blipFill>
-                    <a:blip r:embed="rId49" cstate="print">
+                    <a:blip r:embed="rId48" cstate="print">
                       <a:extLst>
                         <a:ext uri="{28A0092B-C50C-407E-A947-70E740481C1C}">
                           <a14:useLocalDpi xmlns:a14="http://schemas.microsoft.com/office/drawing/2010/main" val="0"/>
@@ -24224,20 +24486,7 @@
         <w:rPr>
           <w:shd w:val="clear" w:color="auto" w:fill="FFFFFF"/>
         </w:rPr>
-        <w:t xml:space="preserve"> la cual necesita como argumentos el nombre del modelo y </w:t>
-      </w:r>
-      <w:r>
-        <w:rPr>
-          <w:highlight w:val="yellow"/>
-          <w:shd w:val="clear" w:color="auto" w:fill="FFFFFF"/>
-        </w:rPr>
-        <w:t>los datos</w:t>
-      </w:r>
-      <w:r>
-        <w:rPr>
-          <w:shd w:val="clear" w:color="auto" w:fill="FFFFFF"/>
-        </w:rPr>
-        <w:t xml:space="preserve"> a predecir, como en el siguiente ejemplo</w:t>
+        <w:t> la cual necesita como argumentos el nombre del modelo y los datos a predecir, como en el siguiente ejemplo</w:t>
       </w:r>
       <w:r>
         <w:rPr>
@@ -24289,7 +24538,7 @@
                     </pic:cNvPicPr>
                   </pic:nvPicPr>
                   <pic:blipFill>
-                    <a:blip r:embed="rId50">
+                    <a:blip r:embed="rId49">
                       <a:extLst>
                         <a:ext uri="{28A0092B-C50C-407E-A947-70E740481C1C}">
                           <a14:useLocalDpi xmlns:a14="http://schemas.microsoft.com/office/drawing/2010/main" val="0"/>
@@ -24324,34 +24573,34 @@
     <w:p>
       <w:pPr>
         <w:rPr>
-          <w:highlight w:val="yellow"/>
+          <w:highlight w:val="cyan"/>
           <w:shd w:val="clear" w:color="auto" w:fill="FFFFFF"/>
         </w:rPr>
       </w:pPr>
       <w:r>
         <w:rPr>
-          <w:highlight w:val="yellow"/>
+          <w:highlight w:val="cyan"/>
           <w:shd w:val="clear" w:color="auto" w:fill="FFFFFF"/>
         </w:rPr>
         <w:t xml:space="preserve">### </w:t>
       </w:r>
       <w:r>
         <w:rPr>
-          <w:highlight w:val="yellow"/>
+          <w:highlight w:val="cyan"/>
           <w:shd w:val="clear" w:color="auto" w:fill="FFFFFF"/>
         </w:rPr>
         <w:t>Construimos unos posibles</w:t>
       </w:r>
       <w:r>
         <w:rPr>
-          <w:highlight w:val="yellow"/>
+          <w:highlight w:val="cyan"/>
           <w:shd w:val="clear" w:color="auto" w:fill="FFFFFF"/>
         </w:rPr>
         <w:t xml:space="preserve"> datos </w:t>
       </w:r>
       <w:r>
         <w:rPr>
-          <w:highlight w:val="yellow"/>
+          <w:highlight w:val="cyan"/>
           <w:shd w:val="clear" w:color="auto" w:fill="FFFFFF"/>
         </w:rPr>
         <w:t xml:space="preserve">para predecir los resultados del modelo </w:t>
@@ -24359,7 +24608,7 @@
       <w:proofErr w:type="spellStart"/>
       <w:r>
         <w:rPr>
-          <w:highlight w:val="yellow"/>
+          <w:highlight w:val="cyan"/>
           <w:shd w:val="clear" w:color="auto" w:fill="FFFFFF"/>
         </w:rPr>
         <w:t>Arbol</w:t>
@@ -24367,7 +24616,7 @@
       <w:proofErr w:type="spellEnd"/>
       <w:r>
         <w:rPr>
-          <w:highlight w:val="yellow"/>
+          <w:highlight w:val="cyan"/>
           <w:shd w:val="clear" w:color="auto" w:fill="FFFFFF"/>
         </w:rPr>
         <w:t xml:space="preserve"> </w:t>
@@ -25360,7 +25609,7 @@
                     </pic:cNvPicPr>
                   </pic:nvPicPr>
                   <pic:blipFill>
-                    <a:blip r:embed="rId51" cstate="print">
+                    <a:blip r:embed="rId50" cstate="print">
                       <a:extLst>
                         <a:ext uri="{28A0092B-C50C-407E-A947-70E740481C1C}">
                           <a14:useLocalDpi xmlns:a14="http://schemas.microsoft.com/office/drawing/2010/main" val="0"/>
@@ -25997,7 +26246,7 @@
                     </pic:cNvPicPr>
                   </pic:nvPicPr>
                   <pic:blipFill>
-                    <a:blip r:embed="rId52">
+                    <a:blip r:embed="rId51">
                       <a:extLst>
                         <a:ext uri="{28A0092B-C50C-407E-A947-70E740481C1C}">
                           <a14:useLocalDpi xmlns:a14="http://schemas.microsoft.com/office/drawing/2010/main" val="0"/>
@@ -27288,7 +27537,7 @@
                     </pic:cNvPicPr>
                   </pic:nvPicPr>
                   <pic:blipFill>
-                    <a:blip r:embed="rId53">
+                    <a:blip r:embed="rId52">
                       <a:extLst>
                         <a:ext uri="{28A0092B-C50C-407E-A947-70E740481C1C}">
                           <a14:useLocalDpi xmlns:a14="http://schemas.microsoft.com/office/drawing/2010/main" val="0"/>
@@ -27408,7 +27657,6 @@
           <w:sz w:val="36"/>
         </w:rPr>
       </w:pPr>
-      <w:bookmarkStart w:id="0" w:name="_GoBack"/>
       <w:r>
         <w:rPr>
           <w:b/>
@@ -27418,7 +27666,6 @@
         <w:t>HASTA AQUÍ LLEGAMOS EN LA REVISIÓN DEL VIERNES 14 DE JUNIO DE 2019</w:t>
       </w:r>
     </w:p>
-    <w:bookmarkEnd w:id="0"/>
     <w:p>
       <w:pPr>
         <w:shd w:val="clear" w:color="auto" w:fill="FFFFFF"/>
@@ -35415,7 +35662,7 @@
 </file>
 
 <file path=customXml/itemProps1.xml><?xml version="1.0" encoding="utf-8"?>
-<ds:datastoreItem xmlns:ds="http://schemas.openxmlformats.org/officeDocument/2006/customXml" ds:itemID="{32110DD7-7F52-462D-99EE-F69DECF881B1}">
+<ds:datastoreItem xmlns:ds="http://schemas.openxmlformats.org/officeDocument/2006/customXml" ds:itemID="{71487A9C-6F5E-4965-84BA-87508F70AFE0}">
   <ds:schemaRefs>
     <ds:schemaRef ds:uri="http://schemas.openxmlformats.org/officeDocument/2006/bibliography"/>
   </ds:schemaRefs>

</xml_diff>

<commit_message>
Culminada revisión de scripts en R
</commit_message>
<xml_diff>
--- a/bookdown/Observaciones de Bernardo 17-6-19.docx
+++ b/bookdown/Observaciones de Bernardo 17-6-19.docx
@@ -163,6 +163,8 @@
           <w:lang w:eastAsia="es-VE"/>
         </w:rPr>
       </w:pPr>
+      <w:bookmarkStart w:id="0" w:name="_GoBack"/>
+      <w:bookmarkEnd w:id="0"/>
     </w:p>
     <w:p>
       <w:pPr>
@@ -23710,8 +23712,6 @@
         </w:rPr>
         <w:t>Árboles</w:t>
       </w:r>
-      <w:bookmarkStart w:id="0" w:name="_GoBack"/>
-      <w:bookmarkEnd w:id="0"/>
       <w:r>
         <w:rPr>
           <w:rFonts w:ascii="Helvetica" w:eastAsia="Times New Roman" w:hAnsi="Helvetica" w:cs="Helvetica"/>
@@ -25011,7 +25011,7 @@
         <w:jc w:val="left"/>
         <w:rPr>
           <w:rFonts w:ascii="Lucida Console" w:eastAsia="Times New Roman" w:hAnsi="Lucida Console" w:cs="Courier New"/>
-          <w:color w:val="0070C0"/>
+          <w:color w:val="000000" w:themeColor="text1"/>
           <w:sz w:val="20"/>
           <w:szCs w:val="20"/>
           <w:bdr w:val="none" w:sz="0" w:space="0" w:color="auto" w:frame="1"/>
@@ -25022,10 +25022,10 @@
       <w:r>
         <w:rPr>
           <w:rFonts w:ascii="Lucida Console" w:eastAsia="Times New Roman" w:hAnsi="Lucida Console" w:cs="Courier New"/>
-          <w:color w:val="0070C0"/>
+          <w:color w:val="000000" w:themeColor="text1"/>
           <w:sz w:val="20"/>
           <w:szCs w:val="20"/>
-          <w:highlight w:val="yellow"/>
+          <w:highlight w:val="cyan"/>
           <w:bdr w:val="none" w:sz="0" w:space="0" w:color="auto" w:frame="1"/>
           <w:lang w:eastAsia="es-VE"/>
         </w:rPr>
@@ -25035,10 +25035,10 @@
       <w:r>
         <w:rPr>
           <w:rFonts w:ascii="Lucida Console" w:eastAsia="Times New Roman" w:hAnsi="Lucida Console" w:cs="Courier New"/>
-          <w:color w:val="0070C0"/>
+          <w:color w:val="000000" w:themeColor="text1"/>
           <w:sz w:val="20"/>
           <w:szCs w:val="20"/>
-          <w:highlight w:val="yellow"/>
+          <w:highlight w:val="cyan"/>
           <w:bdr w:val="none" w:sz="0" w:space="0" w:color="auto" w:frame="1"/>
           <w:lang w:eastAsia="es-VE"/>
         </w:rPr>
@@ -25048,10 +25048,10 @@
       <w:r>
         <w:rPr>
           <w:rFonts w:ascii="Lucida Console" w:eastAsia="Times New Roman" w:hAnsi="Lucida Console" w:cs="Courier New"/>
-          <w:color w:val="0070C0"/>
+          <w:color w:val="000000" w:themeColor="text1"/>
           <w:sz w:val="20"/>
           <w:szCs w:val="20"/>
-          <w:highlight w:val="yellow"/>
+          <w:highlight w:val="cyan"/>
           <w:bdr w:val="none" w:sz="0" w:space="0" w:color="auto" w:frame="1"/>
           <w:lang w:eastAsia="es-VE"/>
         </w:rPr>
@@ -25061,10 +25061,10 @@
       <w:r>
         <w:rPr>
           <w:rFonts w:ascii="Lucida Console" w:eastAsia="Times New Roman" w:hAnsi="Lucida Console" w:cs="Courier New"/>
-          <w:color w:val="0070C0"/>
+          <w:color w:val="000000" w:themeColor="text1"/>
           <w:sz w:val="20"/>
           <w:szCs w:val="20"/>
-          <w:highlight w:val="yellow"/>
+          <w:highlight w:val="cyan"/>
           <w:bdr w:val="none" w:sz="0" w:space="0" w:color="auto" w:frame="1"/>
           <w:lang w:eastAsia="es-VE"/>
         </w:rPr>
@@ -25074,10 +25074,10 @@
       <w:r>
         <w:rPr>
           <w:rFonts w:ascii="Lucida Console" w:eastAsia="Times New Roman" w:hAnsi="Lucida Console" w:cs="Courier New"/>
-          <w:color w:val="0070C0"/>
+          <w:color w:val="000000" w:themeColor="text1"/>
           <w:sz w:val="20"/>
           <w:szCs w:val="20"/>
-          <w:highlight w:val="yellow"/>
+          <w:highlight w:val="cyan"/>
           <w:bdr w:val="none" w:sz="0" w:space="0" w:color="auto" w:frame="1"/>
           <w:lang w:eastAsia="es-VE"/>
         </w:rPr>
@@ -25087,10 +25087,10 @@
       <w:r>
         <w:rPr>
           <w:rFonts w:ascii="Lucida Console" w:eastAsia="Times New Roman" w:hAnsi="Lucida Console" w:cs="Courier New"/>
-          <w:color w:val="0070C0"/>
+          <w:color w:val="000000" w:themeColor="text1"/>
           <w:sz w:val="20"/>
           <w:szCs w:val="20"/>
-          <w:highlight w:val="yellow"/>
+          <w:highlight w:val="cyan"/>
           <w:bdr w:val="none" w:sz="0" w:space="0" w:color="auto" w:frame="1"/>
           <w:lang w:eastAsia="es-VE"/>
         </w:rPr>
@@ -25100,10 +25100,10 @@
       <w:r>
         <w:rPr>
           <w:rFonts w:ascii="Lucida Console" w:eastAsia="Times New Roman" w:hAnsi="Lucida Console" w:cs="Courier New"/>
-          <w:color w:val="0070C0"/>
+          <w:color w:val="000000" w:themeColor="text1"/>
           <w:sz w:val="20"/>
           <w:szCs w:val="20"/>
-          <w:highlight w:val="yellow"/>
+          <w:highlight w:val="cyan"/>
           <w:bdr w:val="none" w:sz="0" w:space="0" w:color="auto" w:frame="1"/>
           <w:lang w:eastAsia="es-VE"/>
         </w:rPr>
@@ -26029,6 +26029,7 @@
           <w:rFonts w:ascii="Helvetica Neue" w:hAnsi="Helvetica Neue"/>
           <w:color w:val="333333"/>
           <w:spacing w:val="3"/>
+          <w:highlight w:val="cyan"/>
           <w:shd w:val="clear" w:color="auto" w:fill="FFFFFF"/>
         </w:rPr>
         <w:t>Al realizar el </w:t>
@@ -26040,6 +26041,7 @@
           <w:rFonts w:ascii="Helvetica Neue" w:hAnsi="Helvetica Neue"/>
           <w:color w:val="333333"/>
           <w:spacing w:val="3"/>
+          <w:highlight w:val="cyan"/>
           <w:shd w:val="clear" w:color="auto" w:fill="FFFFFF"/>
         </w:rPr>
         <w:t>print</w:t>
@@ -26050,6 +26052,7 @@
           <w:rFonts w:ascii="Helvetica Neue" w:hAnsi="Helvetica Neue"/>
           <w:color w:val="333333"/>
           <w:spacing w:val="3"/>
+          <w:highlight w:val="cyan"/>
           <w:shd w:val="clear" w:color="auto" w:fill="FFFFFF"/>
         </w:rPr>
         <w:t> modelo obtenemos:</w:t>
@@ -26956,7 +26959,7 @@
           <w:bdr w:val="none" w:sz="0" w:space="0" w:color="auto" w:frame="1"/>
           <w:lang w:eastAsia="es-VE"/>
         </w:rPr>
-        <w:t>: 4%</w:t>
+        <w:t>: 4.67%</w:t>
       </w:r>
     </w:p>
     <w:p>
@@ -27349,7 +27352,7 @@
           <w:bdr w:val="none" w:sz="0" w:space="0" w:color="auto" w:frame="1"/>
           <w:lang w:eastAsia="es-VE"/>
         </w:rPr>
-        <w:t xml:space="preserve">       0          3        47        0.06</w:t>
+        <w:t xml:space="preserve">       0          4        46        0.08</w:t>
       </w:r>
     </w:p>
     <w:p>
@@ -27651,23 +27654,6 @@
     <w:p/>
     <w:p>
       <w:pPr>
-        <w:rPr>
-          <w:b/>
-          <w:color w:val="FF0000"/>
-          <w:sz w:val="36"/>
-        </w:rPr>
-      </w:pPr>
-      <w:r>
-        <w:rPr>
-          <w:b/>
-          <w:color w:val="FF0000"/>
-          <w:sz w:val="36"/>
-        </w:rPr>
-        <w:t>HASTA AQUÍ LLEGAMOS EN LA REVISIÓN DEL VIERNES 14 DE JUNIO DE 2019</w:t>
-      </w:r>
-    </w:p>
-    <w:p>
-      <w:pPr>
         <w:shd w:val="clear" w:color="auto" w:fill="FFFFFF"/>
         <w:spacing w:before="306" w:after="204" w:line="240" w:lineRule="auto"/>
         <w:jc w:val="left"/>
@@ -27681,6 +27667,22 @@
           <w:lang w:eastAsia="es-VE"/>
         </w:rPr>
       </w:pPr>
+    </w:p>
+    <w:p>
+      <w:pPr>
+        <w:shd w:val="clear" w:color="auto" w:fill="FFFFFF"/>
+        <w:spacing w:before="306" w:after="204" w:line="240" w:lineRule="auto"/>
+        <w:jc w:val="left"/>
+        <w:outlineLvl w:val="1"/>
+        <w:rPr>
+          <w:rFonts w:ascii="Helvetica Neue" w:eastAsia="Times New Roman" w:hAnsi="Helvetica Neue" w:cs="Times New Roman"/>
+          <w:color w:val="333333"/>
+          <w:spacing w:val="3"/>
+          <w:sz w:val="42"/>
+          <w:szCs w:val="42"/>
+          <w:lang w:eastAsia="es-VE"/>
+        </w:rPr>
+      </w:pPr>
       <w:r>
         <w:rPr>
           <w:rFonts w:ascii="Helvetica Neue" w:eastAsia="Times New Roman" w:hAnsi="Helvetica Neue" w:cs="Times New Roman"/>
@@ -27759,7 +27761,7 @@
           <w:rFonts w:ascii="Helvetica Neue" w:hAnsi="Helvetica Neue"/>
           <w:color w:val="333333"/>
           <w:spacing w:val="3"/>
-          <w:highlight w:val="yellow"/>
+          <w:highlight w:val="cyan"/>
           <w:shd w:val="clear" w:color="auto" w:fill="FFFFFF"/>
         </w:rPr>
         <w:t>Como los datos carecen de la variable </w:t>
@@ -27771,7 +27773,7 @@
           <w:rFonts w:ascii="Helvetica Neue" w:hAnsi="Helvetica Neue"/>
           <w:color w:val="333333"/>
           <w:spacing w:val="3"/>
-          <w:highlight w:val="yellow"/>
+          <w:highlight w:val="cyan"/>
           <w:shd w:val="clear" w:color="auto" w:fill="FFFFFF"/>
         </w:rPr>
         <w:t>species</w:t>
@@ -27782,39 +27784,29 @@
           <w:rFonts w:ascii="Helvetica Neue" w:hAnsi="Helvetica Neue"/>
           <w:color w:val="333333"/>
           <w:spacing w:val="3"/>
-          <w:highlight w:val="yellow"/>
+          <w:highlight w:val="cyan"/>
           <w:shd w:val="clear" w:color="auto" w:fill="FFFFFF"/>
         </w:rPr>
-        <w:t> la agregaremos</w:t>
-      </w:r>
-      <w:r>
+        <w:t> la agregaremos de la siguiente forma:</w:t>
+      </w:r>
+    </w:p>
+    <w:p>
+      <w:pPr>
         <w:rPr>
           <w:rFonts w:ascii="Helvetica Neue" w:hAnsi="Helvetica Neue"/>
           <w:color w:val="333333"/>
           <w:spacing w:val="3"/>
-          <w:highlight w:val="yellow"/>
           <w:shd w:val="clear" w:color="auto" w:fill="FFFFFF"/>
         </w:rPr>
-        <w:t xml:space="preserve"> de la siguiente forma:</w:t>
-      </w:r>
-    </w:p>
-    <w:p>
-      <w:pPr>
+      </w:pPr>
+    </w:p>
+    <w:p>
+      <w:r>
         <w:rPr>
           <w:rFonts w:ascii="Helvetica Neue" w:hAnsi="Helvetica Neue"/>
           <w:color w:val="333333"/>
           <w:spacing w:val="3"/>
-          <w:shd w:val="clear" w:color="auto" w:fill="FFFFFF"/>
-        </w:rPr>
-      </w:pPr>
-    </w:p>
-    <w:p>
-      <w:r>
-        <w:rPr>
-          <w:rFonts w:ascii="Helvetica Neue" w:hAnsi="Helvetica Neue"/>
-          <w:color w:val="333333"/>
-          <w:spacing w:val="3"/>
-          <w:highlight w:val="yellow"/>
+          <w:highlight w:val="cyan"/>
           <w:shd w:val="clear" w:color="auto" w:fill="FFFFFF"/>
         </w:rPr>
         <w:t>Antes de construir el modelo, aseguramos que la variable sea del tipo numérico con la función </w:t>
@@ -27827,7 +27819,7 @@
           <w:rFonts w:ascii="Helvetica Neue" w:hAnsi="Helvetica Neue"/>
           <w:color w:val="333333"/>
           <w:spacing w:val="3"/>
-          <w:highlight w:val="yellow"/>
+          <w:highlight w:val="cyan"/>
           <w:shd w:val="clear" w:color="auto" w:fill="FFFFFF"/>
         </w:rPr>
         <w:t>factorize</w:t>
@@ -27838,7 +27830,7 @@
           <w:rFonts w:ascii="Helvetica Neue" w:hAnsi="Helvetica Neue"/>
           <w:color w:val="333333"/>
           <w:spacing w:val="3"/>
-          <w:highlight w:val="yellow"/>
+          <w:highlight w:val="cyan"/>
           <w:shd w:val="clear" w:color="auto" w:fill="FFFFFF"/>
         </w:rPr>
         <w:t> :</w:t>
@@ -35662,7 +35654,7 @@
 </file>
 
 <file path=customXml/itemProps1.xml><?xml version="1.0" encoding="utf-8"?>
-<ds:datastoreItem xmlns:ds="http://schemas.openxmlformats.org/officeDocument/2006/customXml" ds:itemID="{71487A9C-6F5E-4965-84BA-87508F70AFE0}">
+<ds:datastoreItem xmlns:ds="http://schemas.openxmlformats.org/officeDocument/2006/customXml" ds:itemID="{5D4D2156-F113-4686-B13E-E0C183C6A976}">
   <ds:schemaRefs>
     <ds:schemaRef ds:uri="http://schemas.openxmlformats.org/officeDocument/2006/bibliography"/>
   </ds:schemaRefs>

</xml_diff>

<commit_message>
Culminada revisión de scripts en Python
</commit_message>
<xml_diff>
--- a/bookdown/Observaciones de Bernardo 17-6-19.docx
+++ b/bookdown/Observaciones de Bernardo 17-6-19.docx
@@ -423,6 +423,151 @@
           <w:lang w:eastAsia="es-VE"/>
         </w:rPr>
       </w:pPr>
+      <w:r>
+        <w:rPr>
+          <w:lang w:eastAsia="es-VE"/>
+        </w:rPr>
+        <w:t>Completar el código así</w:t>
+      </w:r>
+    </w:p>
+    <w:p>
+      <w:pPr>
+        <w:ind w:left="360"/>
+        <w:rPr>
+          <w:lang w:eastAsia="es-VE"/>
+        </w:rPr>
+      </w:pPr>
+      <w:proofErr w:type="spellStart"/>
+      <w:r>
+        <w:rPr>
+          <w:highlight w:val="yellow"/>
+          <w:lang w:eastAsia="es-VE"/>
+        </w:rPr>
+        <w:t>import</w:t>
+      </w:r>
+      <w:proofErr w:type="spellEnd"/>
+      <w:r>
+        <w:rPr>
+          <w:highlight w:val="yellow"/>
+          <w:lang w:eastAsia="es-VE"/>
+        </w:rPr>
+        <w:t xml:space="preserve"> </w:t>
+      </w:r>
+      <w:proofErr w:type="spellStart"/>
+      <w:r>
+        <w:rPr>
+          <w:highlight w:val="yellow"/>
+          <w:lang w:eastAsia="es-VE"/>
+        </w:rPr>
+        <w:t>numpy</w:t>
+      </w:r>
+      <w:proofErr w:type="spellEnd"/>
+    </w:p>
+    <w:p>
+      <w:pPr>
+        <w:ind w:left="360"/>
+        <w:rPr>
+          <w:lang w:eastAsia="es-VE"/>
+        </w:rPr>
+      </w:pPr>
+      <w:r>
+        <w:rPr>
+          <w:lang w:eastAsia="es-VE"/>
+        </w:rPr>
+        <w:t>g=</w:t>
+      </w:r>
+      <w:proofErr w:type="spellStart"/>
+      <w:r>
+        <w:rPr>
+          <w:lang w:eastAsia="es-VE"/>
+        </w:rPr>
+        <w:t>pandas.read_csv</w:t>
+      </w:r>
+      <w:proofErr w:type="spellEnd"/>
+      <w:r>
+        <w:rPr>
+          <w:lang w:eastAsia="es-VE"/>
+        </w:rPr>
+        <w:t>("train.</w:t>
+      </w:r>
+      <w:proofErr w:type="spellStart"/>
+      <w:r>
+        <w:rPr>
+          <w:lang w:eastAsia="es-VE"/>
+        </w:rPr>
+        <w:t>txt</w:t>
+      </w:r>
+      <w:proofErr w:type="spellEnd"/>
+      <w:r>
+        <w:rPr>
+          <w:lang w:eastAsia="es-VE"/>
+        </w:rPr>
+        <w:t>",</w:t>
+      </w:r>
+      <w:proofErr w:type="spellStart"/>
+      <w:r>
+        <w:rPr>
+          <w:lang w:eastAsia="es-VE"/>
+        </w:rPr>
+        <w:t>sep</w:t>
+      </w:r>
+      <w:proofErr w:type="spellEnd"/>
+      <w:r>
+        <w:rPr>
+          <w:lang w:eastAsia="es-VE"/>
+        </w:rPr>
+        <w:t>=",",</w:t>
+      </w:r>
+      <w:proofErr w:type="spellStart"/>
+      <w:r>
+        <w:rPr>
+          <w:lang w:eastAsia="es-VE"/>
+        </w:rPr>
+        <w:t>header</w:t>
+      </w:r>
+      <w:proofErr w:type="spellEnd"/>
+      <w:r>
+        <w:rPr>
+          <w:lang w:eastAsia="es-VE"/>
+        </w:rPr>
+        <w:t xml:space="preserve">=0,decimal=".", </w:t>
+      </w:r>
+      <w:proofErr w:type="spellStart"/>
+      <w:r>
+        <w:rPr>
+          <w:lang w:eastAsia="es-VE"/>
+        </w:rPr>
+        <w:t>index_col</w:t>
+      </w:r>
+      <w:proofErr w:type="spellEnd"/>
+      <w:r>
+        <w:rPr>
+          <w:lang w:eastAsia="es-VE"/>
+        </w:rPr>
+        <w:t>=0,dtype={"target":numpy.float64})</w:t>
+      </w:r>
+    </w:p>
+    <w:p>
+      <w:pPr>
+        <w:ind w:left="360"/>
+        <w:rPr>
+          <w:lang w:eastAsia="es-VE"/>
+        </w:rPr>
+      </w:pPr>
+      <w:proofErr w:type="spellStart"/>
+      <w:r>
+        <w:rPr>
+          <w:lang w:eastAsia="es-VE"/>
+        </w:rPr>
+        <w:t>g.head</w:t>
+      </w:r>
+      <w:proofErr w:type="spellEnd"/>
+      <w:r>
+        <w:rPr>
+          <w:lang w:eastAsia="es-VE"/>
+        </w:rPr>
+        <w:t>()</w:t>
+      </w:r>
     </w:p>
     <w:p>
       <w:pPr>
@@ -609,9 +754,9 @@
           <w:sz w:val="18"/>
           <w:shd w:val="clear" w:color="auto" w:fill="FFFFFF"/>
         </w:rPr>
-        <w:t>andas.read_</w:t>
-      </w:r>
-      <w:proofErr w:type="gramStart"/>
+        <w:t>andas.read_csv</w:t>
+      </w:r>
+      <w:proofErr w:type="spellEnd"/>
       <w:r>
         <w:rPr>
           <w:rFonts w:ascii="Helvetica" w:hAnsi="Helvetica" w:cs="Helvetica"/>
@@ -620,7 +765,18 @@
           <w:sz w:val="18"/>
           <w:shd w:val="clear" w:color="auto" w:fill="FFFFFF"/>
         </w:rPr>
-        <w:t>csv</w:t>
+        <w:t>(“train.</w:t>
+      </w:r>
+      <w:proofErr w:type="spellStart"/>
+      <w:r>
+        <w:rPr>
+          <w:rFonts w:ascii="Helvetica" w:hAnsi="Helvetica" w:cs="Helvetica"/>
+          <w:color w:val="333333"/>
+          <w:spacing w:val="3"/>
+          <w:sz w:val="18"/>
+          <w:shd w:val="clear" w:color="auto" w:fill="FFFFFF"/>
+        </w:rPr>
+        <w:t>txt</w:t>
       </w:r>
       <w:proofErr w:type="spellEnd"/>
       <w:r>
@@ -631,9 +787,9 @@
           <w:sz w:val="18"/>
           <w:shd w:val="clear" w:color="auto" w:fill="FFFFFF"/>
         </w:rPr>
-        <w:t>(</w:t>
-      </w:r>
-      <w:proofErr w:type="gramEnd"/>
+        <w:t>”,</w:t>
+      </w:r>
+      <w:proofErr w:type="spellStart"/>
       <w:r>
         <w:rPr>
           <w:rFonts w:ascii="Helvetica" w:hAnsi="Helvetica" w:cs="Helvetica"/>
@@ -642,7 +798,18 @@
           <w:sz w:val="18"/>
           <w:shd w:val="clear" w:color="auto" w:fill="FFFFFF"/>
         </w:rPr>
-        <w:t>“train.</w:t>
+        <w:t>sep</w:t>
+      </w:r>
+      <w:proofErr w:type="spellEnd"/>
+      <w:r>
+        <w:rPr>
+          <w:rFonts w:ascii="Helvetica" w:hAnsi="Helvetica" w:cs="Helvetica"/>
+          <w:color w:val="333333"/>
+          <w:spacing w:val="3"/>
+          <w:sz w:val="18"/>
+          <w:shd w:val="clear" w:color="auto" w:fill="FFFFFF"/>
+        </w:rPr>
+        <w:t>=”,”,</w:t>
       </w:r>
       <w:proofErr w:type="spellStart"/>
       <w:r>
@@ -653,7 +820,7 @@
           <w:sz w:val="18"/>
           <w:shd w:val="clear" w:color="auto" w:fill="FFFFFF"/>
         </w:rPr>
-        <w:t>txt</w:t>
+        <w:t>header</w:t>
       </w:r>
       <w:proofErr w:type="spellEnd"/>
       <w:r>
@@ -664,7 +831,7 @@
           <w:sz w:val="18"/>
           <w:shd w:val="clear" w:color="auto" w:fill="FFFFFF"/>
         </w:rPr>
-        <w:t>”,</w:t>
+        <w:t xml:space="preserve">=0,decimal=”.”, </w:t>
       </w:r>
       <w:proofErr w:type="spellStart"/>
       <w:r>
@@ -675,7 +842,7 @@
           <w:sz w:val="18"/>
           <w:shd w:val="clear" w:color="auto" w:fill="FFFFFF"/>
         </w:rPr>
-        <w:t>sep</w:t>
+        <w:t>index_col</w:t>
       </w:r>
       <w:proofErr w:type="spellEnd"/>
       <w:r>
@@ -686,65 +853,70 @@
           <w:sz w:val="18"/>
           <w:shd w:val="clear" w:color="auto" w:fill="FFFFFF"/>
         </w:rPr>
-        <w:t>=”,”,</w:t>
-      </w:r>
+        <w:t>=0,dtype={“target”:numpy</w:t>
+      </w:r>
+      <w:r>
+        <w:rPr>
+          <w:rFonts w:ascii="Helvetica" w:hAnsi="Helvetica" w:cs="Helvetica"/>
+          <w:color w:val="333333"/>
+          <w:spacing w:val="3"/>
+          <w:sz w:val="18"/>
+          <w:shd w:val="clear" w:color="auto" w:fill="FFFFFF"/>
+        </w:rPr>
+        <w:t>.float64})</w:t>
+      </w:r>
+    </w:p>
+    <w:p>
+      <w:pPr>
+        <w:rPr>
+          <w:rStyle w:val="nfasis"/>
+          <w:rFonts w:ascii="Helvetica Neue" w:hAnsi="Helvetica Neue"/>
+          <w:color w:val="333333"/>
+          <w:spacing w:val="3"/>
+          <w:shd w:val="clear" w:color="auto" w:fill="FFFFFF"/>
+        </w:rPr>
+      </w:pPr>
       <w:proofErr w:type="spellStart"/>
       <w:r>
         <w:rPr>
-          <w:rFonts w:ascii="Helvetica" w:hAnsi="Helvetica" w:cs="Helvetica"/>
-          <w:color w:val="333333"/>
-          <w:spacing w:val="3"/>
-          <w:sz w:val="18"/>
-          <w:shd w:val="clear" w:color="auto" w:fill="FFFFFF"/>
-        </w:rPr>
-        <w:t>header</w:t>
+          <w:rFonts w:ascii="Helvetica Neue" w:hAnsi="Helvetica Neue"/>
+          <w:color w:val="333333"/>
+          <w:spacing w:val="3"/>
+          <w:shd w:val="clear" w:color="auto" w:fill="FFFFFF"/>
+        </w:rPr>
+        <w:t>Missing</w:t>
       </w:r>
       <w:proofErr w:type="spellEnd"/>
       <w:r>
         <w:rPr>
-          <w:rFonts w:ascii="Helvetica" w:hAnsi="Helvetica" w:cs="Helvetica"/>
-          <w:color w:val="333333"/>
-          <w:spacing w:val="3"/>
-          <w:sz w:val="18"/>
-          <w:shd w:val="clear" w:color="auto" w:fill="FFFFFF"/>
-        </w:rPr>
-        <w:t xml:space="preserve">=0,decimal=”.”, </w:t>
+          <w:rFonts w:ascii="Helvetica Neue" w:hAnsi="Helvetica Neue"/>
+          <w:color w:val="333333"/>
+          <w:spacing w:val="3"/>
+          <w:shd w:val="clear" w:color="auto" w:fill="FFFFFF"/>
+        </w:rPr>
+        <w:t xml:space="preserve"> </w:t>
       </w:r>
       <w:proofErr w:type="spellStart"/>
       <w:r>
         <w:rPr>
-          <w:rFonts w:ascii="Helvetica" w:hAnsi="Helvetica" w:cs="Helvetica"/>
-          <w:color w:val="333333"/>
-          <w:spacing w:val="3"/>
-          <w:sz w:val="18"/>
-          <w:shd w:val="clear" w:color="auto" w:fill="FFFFFF"/>
-        </w:rPr>
-        <w:t>index_col</w:t>
+          <w:rFonts w:ascii="Helvetica Neue" w:hAnsi="Helvetica Neue"/>
+          <w:color w:val="333333"/>
+          <w:spacing w:val="3"/>
+          <w:shd w:val="clear" w:color="auto" w:fill="FFFFFF"/>
+        </w:rPr>
+        <w:t>values</w:t>
       </w:r>
       <w:proofErr w:type="spellEnd"/>
       <w:r>
         <w:rPr>
-          <w:rFonts w:ascii="Helvetica" w:hAnsi="Helvetica" w:cs="Helvetica"/>
-          <w:color w:val="333333"/>
-          <w:spacing w:val="3"/>
-          <w:sz w:val="18"/>
-          <w:shd w:val="clear" w:color="auto" w:fill="FFFFFF"/>
-        </w:rPr>
-        <w:t>=0,dtype={“target”:numpy</w:t>
-      </w:r>
-      <w:r>
-        <w:rPr>
-          <w:rFonts w:ascii="Helvetica" w:hAnsi="Helvetica" w:cs="Helvetica"/>
-          <w:color w:val="333333"/>
-          <w:spacing w:val="3"/>
-          <w:sz w:val="18"/>
-          <w:shd w:val="clear" w:color="auto" w:fill="FFFFFF"/>
-        </w:rPr>
-        <w:t>.float64})</w:t>
-      </w:r>
-    </w:p>
-    <w:p>
-      <w:pPr>
+          <w:rFonts w:ascii="Helvetica Neue" w:hAnsi="Helvetica Neue"/>
+          <w:color w:val="333333"/>
+          <w:spacing w:val="3"/>
+          <w:shd w:val="clear" w:color="auto" w:fill="FFFFFF"/>
+        </w:rPr>
+        <w:t xml:space="preserve"> en </w:t>
+      </w:r>
+      <w:r>
         <w:rPr>
           <w:rStyle w:val="nfasis"/>
           <w:rFonts w:ascii="Helvetica Neue" w:hAnsi="Helvetica Neue"/>
@@ -752,150 +924,89 @@
           <w:spacing w:val="3"/>
           <w:shd w:val="clear" w:color="auto" w:fill="FFFFFF"/>
         </w:rPr>
-      </w:pPr>
+        <w:t>Python</w:t>
+      </w:r>
+    </w:p>
+    <w:p>
+      <w:pPr>
+        <w:rPr>
+          <w:rStyle w:val="nfasis"/>
+          <w:rFonts w:ascii="Helvetica Neue" w:hAnsi="Helvetica Neue"/>
+          <w:color w:val="333333"/>
+          <w:spacing w:val="3"/>
+          <w:shd w:val="clear" w:color="auto" w:fill="FFFFFF"/>
+        </w:rPr>
+      </w:pPr>
+    </w:p>
+    <w:p>
+      <w:pPr>
+        <w:rPr>
+          <w:rStyle w:val="nfasis"/>
+          <w:rFonts w:ascii="Helvetica Neue" w:hAnsi="Helvetica Neue"/>
+          <w:color w:val="333333"/>
+          <w:spacing w:val="3"/>
+          <w:shd w:val="clear" w:color="auto" w:fill="FFFFFF"/>
+        </w:rPr>
+      </w:pPr>
+    </w:p>
+    <w:p>
+      <w:pPr>
+        <w:rPr>
+          <w:rFonts w:ascii="Helvetica Neue" w:hAnsi="Helvetica Neue"/>
+          <w:color w:val="333333"/>
+          <w:spacing w:val="3"/>
+          <w:shd w:val="clear" w:color="auto" w:fill="FFFFFF"/>
+        </w:rPr>
+      </w:pPr>
+      <w:r>
+        <w:rPr>
+          <w:rFonts w:ascii="Helvetica Neue" w:hAnsi="Helvetica Neue"/>
+          <w:color w:val="333333"/>
+          <w:spacing w:val="3"/>
+          <w:shd w:val="clear" w:color="auto" w:fill="FFFFFF"/>
+        </w:rPr>
+        <w:t>Ahora si decidimos eliminar los datos, realizar esto en </w:t>
+      </w:r>
+      <w:r>
+        <w:rPr>
+          <w:rStyle w:val="nfasis"/>
+          <w:rFonts w:ascii="Helvetica Neue" w:hAnsi="Helvetica Neue"/>
+          <w:color w:val="333333"/>
+          <w:spacing w:val="3"/>
+          <w:shd w:val="clear" w:color="auto" w:fill="FFFFFF"/>
+        </w:rPr>
+        <w:t>Python</w:t>
+      </w:r>
+      <w:r>
+        <w:rPr>
+          <w:rFonts w:ascii="Helvetica Neue" w:hAnsi="Helvetica Neue"/>
+          <w:color w:val="333333"/>
+          <w:spacing w:val="3"/>
+          <w:shd w:val="clear" w:color="auto" w:fill="FFFFFF"/>
+        </w:rPr>
+        <w:t> es sencillo. Primero calculamos el porcentaje de datos faltantes usando las funciones </w:t>
+      </w:r>
       <w:proofErr w:type="spellStart"/>
       <w:r>
         <w:rPr>
-          <w:rFonts w:ascii="Helvetica Neue" w:hAnsi="Helvetica Neue"/>
-          <w:color w:val="333333"/>
-          <w:spacing w:val="3"/>
-          <w:shd w:val="clear" w:color="auto" w:fill="FFFFFF"/>
-        </w:rPr>
-        <w:t>Missing</w:t>
+          <w:rStyle w:val="nfasis"/>
+          <w:rFonts w:ascii="Helvetica Neue" w:hAnsi="Helvetica Neue"/>
+          <w:color w:val="333333"/>
+          <w:spacing w:val="3"/>
+          <w:shd w:val="clear" w:color="auto" w:fill="FFFFFF"/>
+        </w:rPr>
+        <w:t>pandas.shape</w:t>
       </w:r>
       <w:proofErr w:type="spellEnd"/>
       <w:r>
         <w:rPr>
-          <w:rFonts w:ascii="Helvetica Neue" w:hAnsi="Helvetica Neue"/>
-          <w:color w:val="333333"/>
-          <w:spacing w:val="3"/>
-          <w:shd w:val="clear" w:color="auto" w:fill="FFFFFF"/>
-        </w:rPr>
-        <w:t xml:space="preserve"> </w:t>
-      </w:r>
-      <w:proofErr w:type="spellStart"/>
-      <w:r>
-        <w:rPr>
-          <w:rFonts w:ascii="Helvetica Neue" w:hAnsi="Helvetica Neue"/>
-          <w:color w:val="333333"/>
-          <w:spacing w:val="3"/>
-          <w:shd w:val="clear" w:color="auto" w:fill="FFFFFF"/>
-        </w:rPr>
-        <w:t>values</w:t>
-      </w:r>
-      <w:proofErr w:type="spellEnd"/>
-      <w:r>
-        <w:rPr>
-          <w:rFonts w:ascii="Helvetica Neue" w:hAnsi="Helvetica Neue"/>
-          <w:color w:val="333333"/>
-          <w:spacing w:val="3"/>
-          <w:shd w:val="clear" w:color="auto" w:fill="FFFFFF"/>
-        </w:rPr>
-        <w:t xml:space="preserve"> en </w:t>
-      </w:r>
-      <w:r>
-        <w:rPr>
           <w:rStyle w:val="nfasis"/>
           <w:rFonts w:ascii="Helvetica Neue" w:hAnsi="Helvetica Neue"/>
           <w:color w:val="333333"/>
           <w:spacing w:val="3"/>
           <w:shd w:val="clear" w:color="auto" w:fill="FFFFFF"/>
         </w:rPr>
-        <w:t>Python</w:t>
-      </w:r>
-    </w:p>
-    <w:p>
-      <w:pPr>
-        <w:rPr>
-          <w:rStyle w:val="nfasis"/>
-          <w:rFonts w:ascii="Helvetica Neue" w:hAnsi="Helvetica Neue"/>
-          <w:color w:val="333333"/>
-          <w:spacing w:val="3"/>
-          <w:shd w:val="clear" w:color="auto" w:fill="FFFFFF"/>
-        </w:rPr>
-      </w:pPr>
-    </w:p>
-    <w:p>
-      <w:pPr>
-        <w:rPr>
-          <w:rStyle w:val="nfasis"/>
-          <w:rFonts w:ascii="Helvetica Neue" w:hAnsi="Helvetica Neue"/>
-          <w:color w:val="333333"/>
-          <w:spacing w:val="3"/>
-          <w:shd w:val="clear" w:color="auto" w:fill="FFFFFF"/>
-        </w:rPr>
-      </w:pPr>
-    </w:p>
-    <w:p>
-      <w:pPr>
-        <w:rPr>
-          <w:rFonts w:ascii="Helvetica Neue" w:hAnsi="Helvetica Neue"/>
-          <w:color w:val="333333"/>
-          <w:spacing w:val="3"/>
-          <w:shd w:val="clear" w:color="auto" w:fill="FFFFFF"/>
-        </w:rPr>
-      </w:pPr>
-      <w:r>
-        <w:rPr>
-          <w:rFonts w:ascii="Helvetica Neue" w:hAnsi="Helvetica Neue"/>
-          <w:color w:val="333333"/>
-          <w:spacing w:val="3"/>
-          <w:shd w:val="clear" w:color="auto" w:fill="FFFFFF"/>
-        </w:rPr>
-        <w:t>Ahora si decidimos eliminar los datos, realizar esto en </w:t>
-      </w:r>
-      <w:r>
-        <w:rPr>
-          <w:rStyle w:val="nfasis"/>
-          <w:rFonts w:ascii="Helvetica Neue" w:hAnsi="Helvetica Neue"/>
-          <w:color w:val="333333"/>
-          <w:spacing w:val="3"/>
-          <w:shd w:val="clear" w:color="auto" w:fill="FFFFFF"/>
-        </w:rPr>
-        <w:t>Python</w:t>
-      </w:r>
-      <w:r>
-        <w:rPr>
-          <w:rFonts w:ascii="Helvetica Neue" w:hAnsi="Helvetica Neue"/>
-          <w:color w:val="333333"/>
-          <w:spacing w:val="3"/>
-          <w:shd w:val="clear" w:color="auto" w:fill="FFFFFF"/>
-        </w:rPr>
-        <w:t> es sencillo. Primero calculamos el porcentaje de datos faltantes usando las funciones </w:t>
-      </w:r>
-      <w:proofErr w:type="spellStart"/>
-      <w:proofErr w:type="gramStart"/>
-      <w:r>
-        <w:rPr>
-          <w:rStyle w:val="nfasis"/>
-          <w:rFonts w:ascii="Helvetica Neue" w:hAnsi="Helvetica Neue"/>
-          <w:color w:val="333333"/>
-          <w:spacing w:val="3"/>
-          <w:shd w:val="clear" w:color="auto" w:fill="FFFFFF"/>
-        </w:rPr>
-        <w:t>pandas.shape</w:t>
-      </w:r>
-      <w:proofErr w:type="spellEnd"/>
-      <w:r>
-        <w:rPr>
-          <w:rStyle w:val="nfasis"/>
-          <w:rFonts w:ascii="Helvetica Neue" w:hAnsi="Helvetica Neue"/>
-          <w:color w:val="333333"/>
-          <w:spacing w:val="3"/>
-          <w:shd w:val="clear" w:color="auto" w:fill="FFFFFF"/>
-        </w:rPr>
-        <w:t>(</w:t>
-      </w:r>
-      <w:proofErr w:type="gramEnd"/>
-      <w:r>
-        <w:rPr>
-          <w:rStyle w:val="nfasis"/>
-          <w:rFonts w:ascii="Helvetica Neue" w:hAnsi="Helvetica Neue"/>
-          <w:color w:val="333333"/>
-          <w:spacing w:val="3"/>
-          <w:shd w:val="clear" w:color="auto" w:fill="FFFFFF"/>
-        </w:rPr>
-        <w:t>)</w:t>
+        <w:t>()</w:t>
       </w:r>
       <w:r>
         <w:rPr>
@@ -1466,7 +1577,6 @@
         </w:rPr>
       </w:pPr>
       <w:proofErr w:type="spellStart"/>
-      <w:proofErr w:type="gramStart"/>
       <w:r>
         <w:rPr>
           <w:rFonts w:ascii="Helvetica" w:hAnsi="Helvetica" w:cs="Helvetica"/>
@@ -1486,18 +1596,7 @@
           <w:highlight w:val="yellow"/>
           <w:shd w:val="clear" w:color="auto" w:fill="FFFFFF"/>
         </w:rPr>
-        <w:t>(</w:t>
-      </w:r>
-      <w:proofErr w:type="gramEnd"/>
-      <w:r>
-        <w:rPr>
-          <w:rFonts w:ascii="Helvetica" w:hAnsi="Helvetica" w:cs="Helvetica"/>
-          <w:color w:val="333333"/>
-          <w:spacing w:val="3"/>
-          <w:highlight w:val="yellow"/>
-          <w:shd w:val="clear" w:color="auto" w:fill="FFFFFF"/>
-        </w:rPr>
-        <w:t>"Correlaciones Pearson.jpg")</w:t>
+        <w:t>("Correlaciones Pearson.jpg")</w:t>
       </w:r>
     </w:p>
     <w:p>
@@ -1595,7 +1694,6 @@
         </w:rPr>
       </w:pPr>
       <w:proofErr w:type="spellStart"/>
-      <w:proofErr w:type="gramStart"/>
       <w:r>
         <w:rPr>
           <w:rFonts w:ascii="Helvetica" w:hAnsi="Helvetica" w:cs="Helvetica"/>
@@ -1606,7 +1704,6 @@
         <w:t>import</w:t>
       </w:r>
       <w:proofErr w:type="spellEnd"/>
-      <w:proofErr w:type="gramEnd"/>
       <w:r>
         <w:rPr>
           <w:rFonts w:ascii="Helvetica" w:hAnsi="Helvetica" w:cs="Helvetica"/>
@@ -1658,7 +1755,6 @@
         </w:rPr>
       </w:pPr>
       <w:proofErr w:type="spellStart"/>
-      <w:proofErr w:type="gramStart"/>
       <w:r>
         <w:rPr>
           <w:rFonts w:ascii="Helvetica" w:hAnsi="Helvetica" w:cs="Helvetica"/>
@@ -1670,7 +1766,6 @@
         <w:t>import</w:t>
       </w:r>
       <w:proofErr w:type="spellEnd"/>
-      <w:proofErr w:type="gramEnd"/>
       <w:r>
         <w:rPr>
           <w:rFonts w:ascii="Helvetica" w:hAnsi="Helvetica" w:cs="Helvetica"/>
@@ -1854,7 +1949,7 @@
         <w:shd w:val="clear" w:color="auto" w:fill="FFFFFF"/>
         <w:spacing w:before="306" w:after="204"/>
         <w:rPr>
-          <w:rStyle w:val="nfasis"/>
+          <w:rStyle w:val="header-section-number"/>
           <w:rFonts w:ascii="Helvetica Neue" w:hAnsi="Helvetica Neue"/>
           <w:b/>
           <w:bCs/>
@@ -1864,633 +1959,75 @@
           <w:szCs w:val="36"/>
         </w:rPr>
       </w:pPr>
+    </w:p>
+    <w:p>
+      <w:pPr>
+        <w:pStyle w:val="Ttulo2"/>
+        <w:shd w:val="clear" w:color="auto" w:fill="FFFFFF"/>
+        <w:spacing w:before="306" w:beforeAutospacing="0" w:after="204" w:afterAutospacing="0"/>
+        <w:rPr>
+          <w:rFonts w:ascii="Helvetica Neue" w:hAnsi="Helvetica Neue"/>
+          <w:b w:val="0"/>
+          <w:bCs w:val="0"/>
+          <w:color w:val="333333"/>
+          <w:spacing w:val="3"/>
+          <w:sz w:val="42"/>
+          <w:szCs w:val="42"/>
+        </w:rPr>
+      </w:pPr>
       <w:r>
         <w:rPr>
           <w:rStyle w:val="header-section-number"/>
           <w:rFonts w:ascii="Helvetica Neue" w:hAnsi="Helvetica Neue"/>
-          <w:b/>
-          <w:bCs/>
-          <w:color w:val="333333"/>
-          <w:spacing w:val="3"/>
-          <w:sz w:val="36"/>
-          <w:szCs w:val="36"/>
-        </w:rPr>
-        <w:t>4.4.2</w:t>
-      </w:r>
-      <w:r>
-        <w:rPr>
-          <w:rFonts w:ascii="Helvetica Neue" w:hAnsi="Helvetica Neue"/>
-          <w:b/>
-          <w:bCs/>
-          <w:color w:val="333333"/>
-          <w:spacing w:val="3"/>
-          <w:sz w:val="36"/>
-          <w:szCs w:val="36"/>
-        </w:rPr>
-        <w:t> Eliminación de variables en </w:t>
-      </w:r>
-      <w:r>
-        <w:rPr>
-          <w:rStyle w:val="nfasis"/>
-          <w:rFonts w:ascii="Helvetica Neue" w:hAnsi="Helvetica Neue"/>
-          <w:b/>
-          <w:bCs/>
-          <w:color w:val="333333"/>
-          <w:spacing w:val="3"/>
-          <w:sz w:val="36"/>
-          <w:szCs w:val="36"/>
-        </w:rPr>
-        <w:t>Python</w:t>
-      </w:r>
-    </w:p>
-    <w:p/>
-    <w:p>
-      <w:r>
-        <w:t xml:space="preserve">Falta el código para incluir la subida de los datos </w:t>
-      </w:r>
-      <w:proofErr w:type="spellStart"/>
-      <w:r>
-        <w:t>mtcars</w:t>
-      </w:r>
-      <w:proofErr w:type="spellEnd"/>
-    </w:p>
-    <w:p>
-      <w:proofErr w:type="spellStart"/>
-      <w:proofErr w:type="gramStart"/>
-      <w:r>
-        <w:rPr>
-          <w:highlight w:val="yellow"/>
-        </w:rPr>
-        <w:t>mtcars</w:t>
-      </w:r>
-      <w:proofErr w:type="spellEnd"/>
-      <w:proofErr w:type="gramEnd"/>
-      <w:r>
-        <w:rPr>
-          <w:highlight w:val="yellow"/>
-        </w:rPr>
-        <w:t xml:space="preserve"> = </w:t>
-      </w:r>
-      <w:proofErr w:type="spellStart"/>
-      <w:r>
-        <w:rPr>
-          <w:highlight w:val="yellow"/>
-        </w:rPr>
-        <w:t>pandas.read_csv</w:t>
-      </w:r>
-      <w:proofErr w:type="spellEnd"/>
-      <w:r>
-        <w:rPr>
-          <w:highlight w:val="yellow"/>
-        </w:rPr>
-        <w:t>("mtcars.csv")</w:t>
-      </w:r>
-    </w:p>
-    <w:p>
-      <w:proofErr w:type="spellStart"/>
-      <w:proofErr w:type="gramStart"/>
-      <w:r>
-        <w:t>mtcars</w:t>
-      </w:r>
-      <w:proofErr w:type="spellEnd"/>
-      <w:proofErr w:type="gramEnd"/>
-      <w:r>
-        <w:t xml:space="preserve"> = </w:t>
-      </w:r>
-      <w:proofErr w:type="spellStart"/>
-      <w:r>
-        <w:t>mtcars.drop</w:t>
-      </w:r>
-      <w:proofErr w:type="spellEnd"/>
-      <w:r>
-        <w:t>("</w:t>
-      </w:r>
-      <w:proofErr w:type="spellStart"/>
-      <w:r>
-        <w:t>mpg</w:t>
-      </w:r>
-      <w:proofErr w:type="spellEnd"/>
-      <w:r>
-        <w:t>", axis=1)</w:t>
-      </w:r>
-    </w:p>
-    <w:p/>
+          <w:b w:val="0"/>
+          <w:bCs w:val="0"/>
+          <w:color w:val="333333"/>
+          <w:spacing w:val="3"/>
+          <w:sz w:val="42"/>
+          <w:szCs w:val="42"/>
+        </w:rPr>
+        <w:t>4.4</w:t>
+      </w:r>
+      <w:r>
+        <w:rPr>
+          <w:rFonts w:ascii="Helvetica Neue" w:hAnsi="Helvetica Neue"/>
+          <w:b w:val="0"/>
+          <w:bCs w:val="0"/>
+          <w:color w:val="333333"/>
+          <w:spacing w:val="3"/>
+          <w:sz w:val="42"/>
+          <w:szCs w:val="42"/>
+        </w:rPr>
+        <w:t xml:space="preserve"> Eliminación de las variables </w:t>
+      </w:r>
+      <w:r>
+        <w:rPr>
+          <w:rFonts w:ascii="Helvetica Neue" w:hAnsi="Helvetica Neue"/>
+          <w:b w:val="0"/>
+          <w:bCs w:val="0"/>
+          <w:color w:val="333333"/>
+          <w:spacing w:val="3"/>
+          <w:sz w:val="42"/>
+          <w:szCs w:val="42"/>
+          <w:highlight w:val="yellow"/>
+        </w:rPr>
+        <w:t>categóricas</w:t>
+      </w:r>
+    </w:p>
     <w:p>
       <w:pPr>
         <w:pStyle w:val="Ttulo3"/>
         <w:shd w:val="clear" w:color="auto" w:fill="FFFFFF"/>
         <w:spacing w:before="306" w:after="204"/>
         <w:rPr>
-          <w:rFonts w:ascii="Helvetica Neue" w:hAnsi="Helvetica Neue"/>
+          <w:rStyle w:val="header-section-number"/>
+          <w:rFonts w:ascii="Helvetica Neue" w:hAnsi="Helvetica Neue"/>
+          <w:b/>
+          <w:bCs/>
           <w:color w:val="333333"/>
           <w:spacing w:val="3"/>
           <w:sz w:val="36"/>
           <w:szCs w:val="36"/>
-        </w:rPr>
-      </w:pPr>
-      <w:r>
-        <w:rPr>
-          <w:rStyle w:val="header-section-number"/>
-          <w:rFonts w:ascii="Helvetica Neue" w:hAnsi="Helvetica Neue"/>
-          <w:b/>
-          <w:bCs/>
-          <w:color w:val="333333"/>
-          <w:spacing w:val="3"/>
-          <w:sz w:val="36"/>
-          <w:szCs w:val="36"/>
-          <w:highlight w:val="yellow"/>
-        </w:rPr>
-        <w:t>4.5.2</w:t>
-      </w:r>
-      <w:r>
-        <w:rPr>
-          <w:rFonts w:ascii="Helvetica Neue" w:hAnsi="Helvetica Neue"/>
-          <w:b/>
-          <w:bCs/>
-          <w:color w:val="333333"/>
-          <w:spacing w:val="3"/>
-          <w:sz w:val="36"/>
-          <w:szCs w:val="36"/>
-          <w:highlight w:val="yellow"/>
-        </w:rPr>
-        <w:t> Aplicando el modelo de regresión lineal en </w:t>
-      </w:r>
-      <w:r>
-        <w:rPr>
-          <w:rStyle w:val="nfasis"/>
-          <w:rFonts w:ascii="Helvetica Neue" w:hAnsi="Helvetica Neue"/>
-          <w:b/>
-          <w:bCs/>
-          <w:color w:val="333333"/>
-          <w:spacing w:val="3"/>
-          <w:sz w:val="36"/>
-          <w:szCs w:val="36"/>
-          <w:highlight w:val="yellow"/>
-        </w:rPr>
-        <w:t>Python</w:t>
-      </w:r>
-      <w:r>
-        <w:rPr>
-          <w:rFonts w:ascii="Helvetica Neue" w:hAnsi="Helvetica Neue"/>
-          <w:b/>
-          <w:bCs/>
-          <w:color w:val="333333"/>
-          <w:spacing w:val="3"/>
-          <w:sz w:val="36"/>
-          <w:szCs w:val="36"/>
-          <w:highlight w:val="yellow"/>
-        </w:rPr>
-        <w:t>:</w:t>
-      </w:r>
-    </w:p>
-    <w:p>
-      <w:r>
-        <w:t xml:space="preserve">Falta incluir código para subir los datos </w:t>
-      </w:r>
-      <w:proofErr w:type="spellStart"/>
-      <w:r>
-        <w:t>irisp</w:t>
-      </w:r>
-      <w:proofErr w:type="spellEnd"/>
-    </w:p>
-    <w:p>
-      <w:pPr>
-        <w:rPr>
-          <w:rFonts w:ascii="Helvetica" w:hAnsi="Helvetica" w:cs="Helvetica"/>
-          <w:color w:val="333333"/>
-          <w:spacing w:val="3"/>
-          <w:shd w:val="clear" w:color="auto" w:fill="FFFFFF"/>
-        </w:rPr>
-      </w:pPr>
-      <w:r>
-        <w:rPr>
-          <w:rFonts w:ascii="Helvetica" w:hAnsi="Helvetica" w:cs="Helvetica"/>
-          <w:color w:val="333333"/>
-          <w:spacing w:val="3"/>
-          <w:highlight w:val="yellow"/>
-          <w:shd w:val="clear" w:color="auto" w:fill="FFFFFF"/>
-        </w:rPr>
-        <w:t>Subimos la base de datos "</w:t>
-      </w:r>
-      <w:proofErr w:type="spellStart"/>
-      <w:r>
-        <w:rPr>
-          <w:rFonts w:ascii="Helvetica" w:hAnsi="Helvetica" w:cs="Helvetica"/>
-          <w:color w:val="333333"/>
-          <w:spacing w:val="3"/>
-          <w:highlight w:val="yellow"/>
-          <w:shd w:val="clear" w:color="auto" w:fill="FFFFFF"/>
-        </w:rPr>
-        <w:t>irisp</w:t>
-      </w:r>
-      <w:proofErr w:type="spellEnd"/>
-      <w:r>
-        <w:rPr>
-          <w:rFonts w:ascii="Helvetica" w:hAnsi="Helvetica" w:cs="Helvetica"/>
-          <w:color w:val="333333"/>
-          <w:spacing w:val="3"/>
-          <w:highlight w:val="yellow"/>
-          <w:shd w:val="clear" w:color="auto" w:fill="FFFFFF"/>
-        </w:rPr>
-        <w:t>"</w:t>
-      </w:r>
-    </w:p>
-    <w:p>
-      <w:pPr>
-        <w:rPr>
-          <w:rFonts w:ascii="Helvetica" w:hAnsi="Helvetica" w:cs="Helvetica"/>
-          <w:color w:val="333333"/>
-          <w:spacing w:val="3"/>
-          <w:shd w:val="clear" w:color="auto" w:fill="FFFFFF"/>
-        </w:rPr>
-      </w:pPr>
-      <w:proofErr w:type="spellStart"/>
-      <w:proofErr w:type="gramStart"/>
-      <w:r>
-        <w:rPr>
-          <w:rFonts w:ascii="Helvetica" w:hAnsi="Helvetica" w:cs="Helvetica"/>
-          <w:color w:val="333333"/>
-          <w:spacing w:val="3"/>
-          <w:highlight w:val="yellow"/>
-          <w:shd w:val="clear" w:color="auto" w:fill="FFFFFF"/>
-        </w:rPr>
-        <w:t>irisp</w:t>
-      </w:r>
-      <w:proofErr w:type="spellEnd"/>
-      <w:proofErr w:type="gramEnd"/>
-      <w:r>
-        <w:rPr>
-          <w:rFonts w:ascii="Helvetica" w:hAnsi="Helvetica" w:cs="Helvetica"/>
-          <w:color w:val="333333"/>
-          <w:spacing w:val="3"/>
-          <w:highlight w:val="yellow"/>
-          <w:shd w:val="clear" w:color="auto" w:fill="FFFFFF"/>
-        </w:rPr>
-        <w:t xml:space="preserve"> = </w:t>
-      </w:r>
-      <w:proofErr w:type="spellStart"/>
-      <w:r>
-        <w:rPr>
-          <w:rFonts w:ascii="Helvetica" w:hAnsi="Helvetica" w:cs="Helvetica"/>
-          <w:color w:val="333333"/>
-          <w:spacing w:val="3"/>
-          <w:highlight w:val="yellow"/>
-          <w:shd w:val="clear" w:color="auto" w:fill="FFFFFF"/>
-        </w:rPr>
-        <w:t>pandas.read_csv</w:t>
-      </w:r>
-      <w:proofErr w:type="spellEnd"/>
-      <w:r>
-        <w:rPr>
-          <w:rFonts w:ascii="Helvetica" w:hAnsi="Helvetica" w:cs="Helvetica"/>
-          <w:color w:val="333333"/>
-          <w:spacing w:val="3"/>
-          <w:highlight w:val="yellow"/>
-          <w:shd w:val="clear" w:color="auto" w:fill="FFFFFF"/>
-        </w:rPr>
-        <w:t>("irisp.</w:t>
-      </w:r>
-      <w:proofErr w:type="spellStart"/>
-      <w:r>
-        <w:rPr>
-          <w:rFonts w:ascii="Helvetica" w:hAnsi="Helvetica" w:cs="Helvetica"/>
-          <w:color w:val="333333"/>
-          <w:spacing w:val="3"/>
-          <w:highlight w:val="yellow"/>
-          <w:shd w:val="clear" w:color="auto" w:fill="FFFFFF"/>
-        </w:rPr>
-        <w:t>csv</w:t>
-      </w:r>
-      <w:proofErr w:type="spellEnd"/>
-      <w:r>
-        <w:rPr>
-          <w:rFonts w:ascii="Helvetica" w:hAnsi="Helvetica" w:cs="Helvetica"/>
-          <w:color w:val="333333"/>
-          <w:spacing w:val="3"/>
-          <w:highlight w:val="yellow"/>
-          <w:shd w:val="clear" w:color="auto" w:fill="FFFFFF"/>
-        </w:rPr>
-        <w:t>",</w:t>
-      </w:r>
-      <w:proofErr w:type="spellStart"/>
-      <w:r>
-        <w:rPr>
-          <w:rFonts w:ascii="Helvetica" w:hAnsi="Helvetica" w:cs="Helvetica"/>
-          <w:color w:val="333333"/>
-          <w:spacing w:val="3"/>
-          <w:highlight w:val="yellow"/>
-          <w:shd w:val="clear" w:color="auto" w:fill="FFFFFF"/>
-        </w:rPr>
-        <w:t>sep</w:t>
-      </w:r>
-      <w:proofErr w:type="spellEnd"/>
-      <w:r>
-        <w:rPr>
-          <w:rFonts w:ascii="Helvetica" w:hAnsi="Helvetica" w:cs="Helvetica"/>
-          <w:color w:val="333333"/>
-          <w:spacing w:val="3"/>
-          <w:highlight w:val="yellow"/>
-          <w:shd w:val="clear" w:color="auto" w:fill="FFFFFF"/>
-        </w:rPr>
-        <w:t>=";")</w:t>
-      </w:r>
-    </w:p>
-    <w:p>
-      <w:pPr>
-        <w:rPr>
-          <w:rFonts w:ascii="Helvetica" w:hAnsi="Helvetica" w:cs="Helvetica"/>
-          <w:color w:val="333333"/>
-          <w:spacing w:val="3"/>
-          <w:shd w:val="clear" w:color="auto" w:fill="FFFFFF"/>
-        </w:rPr>
-      </w:pPr>
-    </w:p>
-    <w:p>
-      <w:pPr>
-        <w:rPr>
-          <w:rFonts w:ascii="Helvetica" w:hAnsi="Helvetica" w:cs="Helvetica"/>
-          <w:color w:val="333333"/>
-          <w:spacing w:val="3"/>
-          <w:shd w:val="clear" w:color="auto" w:fill="FFFFFF"/>
-        </w:rPr>
-      </w:pPr>
-    </w:p>
-    <w:p>
-      <w:pPr>
-        <w:rPr>
-          <w:rFonts w:ascii="Helvetica" w:hAnsi="Helvetica" w:cs="Helvetica"/>
-          <w:color w:val="333333"/>
-          <w:spacing w:val="3"/>
-          <w:shd w:val="clear" w:color="auto" w:fill="FFFFFF"/>
-        </w:rPr>
-      </w:pPr>
-      <w:r>
-        <w:rPr>
-          <w:rFonts w:ascii="Helvetica" w:hAnsi="Helvetica" w:cs="Helvetica"/>
-          <w:color w:val="333333"/>
-          <w:spacing w:val="3"/>
-          <w:shd w:val="clear" w:color="auto" w:fill="FFFFFF"/>
-        </w:rPr>
-        <w:t>Incluir lo siguiente:</w:t>
-      </w:r>
-    </w:p>
-    <w:p>
-      <w:pPr>
-        <w:rPr>
-          <w:rFonts w:ascii="Helvetica" w:hAnsi="Helvetica" w:cs="Helvetica"/>
-          <w:color w:val="333333"/>
-          <w:spacing w:val="3"/>
-          <w:highlight w:val="yellow"/>
-          <w:shd w:val="clear" w:color="auto" w:fill="FFFFFF"/>
-        </w:rPr>
-      </w:pPr>
-      <w:r>
-        <w:rPr>
-          <w:rFonts w:ascii="Helvetica" w:hAnsi="Helvetica" w:cs="Helvetica"/>
-          <w:color w:val="333333"/>
-          <w:spacing w:val="3"/>
-          <w:highlight w:val="yellow"/>
-          <w:shd w:val="clear" w:color="auto" w:fill="FFFFFF"/>
-        </w:rPr>
-        <w:t>Importamos la librería "</w:t>
-      </w:r>
-      <w:proofErr w:type="spellStart"/>
-      <w:r>
-        <w:rPr>
-          <w:rFonts w:ascii="Helvetica" w:hAnsi="Helvetica" w:cs="Helvetica"/>
-          <w:color w:val="333333"/>
-          <w:spacing w:val="3"/>
-          <w:highlight w:val="yellow"/>
-          <w:shd w:val="clear" w:color="auto" w:fill="FFFFFF"/>
-        </w:rPr>
-        <w:t>statsmodels</w:t>
-      </w:r>
-      <w:proofErr w:type="spellEnd"/>
-      <w:r>
-        <w:rPr>
-          <w:rFonts w:ascii="Helvetica" w:hAnsi="Helvetica" w:cs="Helvetica"/>
-          <w:color w:val="333333"/>
-          <w:spacing w:val="3"/>
-          <w:highlight w:val="yellow"/>
-          <w:shd w:val="clear" w:color="auto" w:fill="FFFFFF"/>
-        </w:rPr>
-        <w:t>"</w:t>
-      </w:r>
-    </w:p>
-    <w:p>
-      <w:pPr>
-        <w:rPr>
-          <w:rFonts w:ascii="Helvetica" w:hAnsi="Helvetica" w:cs="Helvetica"/>
-          <w:color w:val="333333"/>
-          <w:spacing w:val="3"/>
-          <w:shd w:val="clear" w:color="auto" w:fill="FFFFFF"/>
-        </w:rPr>
-      </w:pPr>
-      <w:proofErr w:type="spellStart"/>
-      <w:proofErr w:type="gramStart"/>
-      <w:r>
-        <w:rPr>
-          <w:rFonts w:ascii="Helvetica" w:hAnsi="Helvetica" w:cs="Helvetica"/>
-          <w:color w:val="333333"/>
-          <w:spacing w:val="3"/>
-          <w:highlight w:val="yellow"/>
-          <w:shd w:val="clear" w:color="auto" w:fill="FFFFFF"/>
-        </w:rPr>
-        <w:t>import</w:t>
-      </w:r>
-      <w:proofErr w:type="spellEnd"/>
-      <w:proofErr w:type="gramEnd"/>
-      <w:r>
-        <w:rPr>
-          <w:rFonts w:ascii="Helvetica" w:hAnsi="Helvetica" w:cs="Helvetica"/>
-          <w:color w:val="333333"/>
-          <w:spacing w:val="3"/>
-          <w:highlight w:val="yellow"/>
-          <w:shd w:val="clear" w:color="auto" w:fill="FFFFFF"/>
-        </w:rPr>
-        <w:t xml:space="preserve"> </w:t>
-      </w:r>
-      <w:proofErr w:type="spellStart"/>
-      <w:r>
-        <w:rPr>
-          <w:rFonts w:ascii="Helvetica" w:hAnsi="Helvetica" w:cs="Helvetica"/>
-          <w:color w:val="333333"/>
-          <w:spacing w:val="3"/>
-          <w:highlight w:val="yellow"/>
-          <w:shd w:val="clear" w:color="auto" w:fill="FFFFFF"/>
-        </w:rPr>
-        <w:t>statsmodels.api</w:t>
-      </w:r>
-      <w:proofErr w:type="spellEnd"/>
-      <w:r>
-        <w:rPr>
-          <w:rFonts w:ascii="Helvetica" w:hAnsi="Helvetica" w:cs="Helvetica"/>
-          <w:color w:val="333333"/>
-          <w:spacing w:val="3"/>
-          <w:highlight w:val="yellow"/>
-          <w:shd w:val="clear" w:color="auto" w:fill="FFFFFF"/>
-        </w:rPr>
-        <w:t xml:space="preserve"> as </w:t>
-      </w:r>
-      <w:proofErr w:type="spellStart"/>
-      <w:r>
-        <w:rPr>
-          <w:rFonts w:ascii="Helvetica" w:hAnsi="Helvetica" w:cs="Helvetica"/>
-          <w:color w:val="333333"/>
-          <w:spacing w:val="3"/>
-          <w:highlight w:val="yellow"/>
-          <w:shd w:val="clear" w:color="auto" w:fill="FFFFFF"/>
-        </w:rPr>
-        <w:t>sm</w:t>
-      </w:r>
-      <w:proofErr w:type="spellEnd"/>
-    </w:p>
-    <w:p>
-      <w:pPr>
-        <w:rPr>
-          <w:rFonts w:ascii="Helvetica" w:hAnsi="Helvetica" w:cs="Helvetica"/>
-          <w:color w:val="333333"/>
-          <w:spacing w:val="3"/>
-          <w:shd w:val="clear" w:color="auto" w:fill="FFFFFF"/>
-        </w:rPr>
-      </w:pPr>
-    </w:p>
-    <w:p>
-      <w:pPr>
-        <w:rPr>
-          <w:rFonts w:ascii="Helvetica" w:hAnsi="Helvetica" w:cs="Helvetica"/>
-          <w:color w:val="333333"/>
-          <w:spacing w:val="3"/>
-          <w:shd w:val="clear" w:color="auto" w:fill="FFFFFF"/>
-        </w:rPr>
-      </w:pPr>
-    </w:p>
-    <w:p>
-      <w:pPr>
-        <w:rPr>
-          <w:rFonts w:ascii="Helvetica" w:hAnsi="Helvetica" w:cs="Helvetica"/>
-          <w:color w:val="333333"/>
-          <w:spacing w:val="3"/>
-          <w:shd w:val="clear" w:color="auto" w:fill="FFFFFF"/>
-        </w:rPr>
-      </w:pPr>
-      <w:r>
-        <w:rPr>
-          <w:rFonts w:ascii="Helvetica" w:hAnsi="Helvetica" w:cs="Helvetica"/>
-          <w:color w:val="333333"/>
-          <w:spacing w:val="3"/>
-          <w:shd w:val="clear" w:color="auto" w:fill="FFFFFF"/>
-        </w:rPr>
-        <w:t>Sustituir</w:t>
-      </w:r>
-    </w:p>
-    <w:p>
-      <w:pPr>
-        <w:rPr>
-          <w:rFonts w:ascii="Helvetica" w:hAnsi="Helvetica" w:cs="Helvetica"/>
-          <w:color w:val="333333"/>
-          <w:spacing w:val="3"/>
-          <w:shd w:val="clear" w:color="auto" w:fill="FFFFFF"/>
-        </w:rPr>
-      </w:pPr>
-      <w:r>
-        <w:rPr>
-          <w:rFonts w:ascii="Helvetica" w:hAnsi="Helvetica" w:cs="Helvetica"/>
-          <w:color w:val="333333"/>
-          <w:spacing w:val="3"/>
-          <w:highlight w:val="yellow"/>
-          <w:shd w:val="clear" w:color="auto" w:fill="FFFFFF"/>
-        </w:rPr>
-        <w:t xml:space="preserve">Seleccionamos </w:t>
-      </w:r>
-      <w:proofErr w:type="gramStart"/>
-      <w:r>
-        <w:rPr>
-          <w:rFonts w:ascii="Helvetica" w:hAnsi="Helvetica" w:cs="Helvetica"/>
-          <w:color w:val="333333"/>
-          <w:spacing w:val="3"/>
-          <w:highlight w:val="yellow"/>
-          <w:shd w:val="clear" w:color="auto" w:fill="FFFFFF"/>
-        </w:rPr>
-        <w:t>las variable</w:t>
-      </w:r>
-      <w:r>
-        <w:rPr>
-          <w:rFonts w:ascii="Helvetica" w:hAnsi="Helvetica" w:cs="Helvetica"/>
-          <w:color w:val="333333"/>
-          <w:spacing w:val="3"/>
-          <w:highlight w:val="yellow"/>
-          <w:shd w:val="clear" w:color="auto" w:fill="FFFFFF"/>
-        </w:rPr>
-        <w:t>s</w:t>
-      </w:r>
-      <w:r>
-        <w:rPr>
-          <w:rFonts w:ascii="Helvetica" w:hAnsi="Helvetica" w:cs="Helvetica"/>
-          <w:color w:val="333333"/>
-          <w:spacing w:val="3"/>
-          <w:highlight w:val="yellow"/>
-          <w:shd w:val="clear" w:color="auto" w:fill="FFFFFF"/>
-        </w:rPr>
-        <w:t xml:space="preserve"> dependiente e independientes</w:t>
-      </w:r>
-      <w:proofErr w:type="gramEnd"/>
-    </w:p>
-    <w:p>
-      <w:pPr>
-        <w:rPr>
-          <w:rFonts w:ascii="Helvetica" w:hAnsi="Helvetica" w:cs="Helvetica"/>
-          <w:color w:val="333333"/>
-          <w:spacing w:val="3"/>
-          <w:shd w:val="clear" w:color="auto" w:fill="FFFFFF"/>
-        </w:rPr>
-      </w:pPr>
-    </w:p>
-    <w:p>
-      <w:pPr>
-        <w:rPr>
-          <w:rFonts w:ascii="Helvetica" w:hAnsi="Helvetica" w:cs="Helvetica"/>
-          <w:color w:val="333333"/>
-          <w:spacing w:val="3"/>
-          <w:shd w:val="clear" w:color="auto" w:fill="FFFFFF"/>
-        </w:rPr>
-      </w:pPr>
-      <w:r>
-        <w:rPr>
-          <w:rFonts w:ascii="Helvetica" w:hAnsi="Helvetica" w:cs="Helvetica"/>
-          <w:color w:val="333333"/>
-          <w:spacing w:val="3"/>
-          <w:shd w:val="clear" w:color="auto" w:fill="FFFFFF"/>
-        </w:rPr>
-        <w:t xml:space="preserve">Agregamos el </w:t>
-      </w:r>
-      <w:r>
-        <w:rPr>
-          <w:rFonts w:ascii="Helvetica" w:hAnsi="Helvetica" w:cs="Helvetica"/>
-          <w:color w:val="333333"/>
-          <w:spacing w:val="3"/>
-          <w:highlight w:val="yellow"/>
-          <w:shd w:val="clear" w:color="auto" w:fill="FFFFFF"/>
-        </w:rPr>
-        <w:t>cálculo</w:t>
-      </w:r>
-      <w:r>
-        <w:rPr>
-          <w:rFonts w:ascii="Helvetica" w:hAnsi="Helvetica" w:cs="Helvetica"/>
-          <w:color w:val="333333"/>
-          <w:spacing w:val="3"/>
-          <w:shd w:val="clear" w:color="auto" w:fill="FFFFFF"/>
-        </w:rPr>
-        <w:t xml:space="preserve"> del intercept</w:t>
-      </w:r>
-    </w:p>
-    <w:p>
-      <w:pPr>
-        <w:rPr>
-          <w:rFonts w:ascii="Helvetica" w:hAnsi="Helvetica" w:cs="Helvetica"/>
-          <w:color w:val="333333"/>
-          <w:spacing w:val="3"/>
-          <w:shd w:val="clear" w:color="auto" w:fill="FFFFFF"/>
         </w:rPr>
       </w:pPr>
     </w:p>
@@ -2500,6 +2037,7 @@
         <w:shd w:val="clear" w:color="auto" w:fill="FFFFFF"/>
         <w:spacing w:before="306" w:after="204"/>
         <w:rPr>
+          <w:rStyle w:val="header-section-number"/>
           <w:rFonts w:ascii="Helvetica Neue" w:hAnsi="Helvetica Neue"/>
           <w:b/>
           <w:bCs/>
@@ -2509,9 +2047,14 @@
           <w:szCs w:val="36"/>
         </w:rPr>
       </w:pPr>
-      <w:r>
-        <w:rPr>
-          <w:rStyle w:val="header-section-number"/>
+    </w:p>
+    <w:p>
+      <w:pPr>
+        <w:pStyle w:val="Ttulo3"/>
+        <w:shd w:val="clear" w:color="auto" w:fill="FFFFFF"/>
+        <w:spacing w:before="306" w:after="204"/>
+        <w:rPr>
+          <w:rStyle w:val="nfasis"/>
           <w:rFonts w:ascii="Helvetica Neue" w:hAnsi="Helvetica Neue"/>
           <w:b/>
           <w:bCs/>
@@ -2519,13 +2062,11 @@
           <w:spacing w:val="3"/>
           <w:sz w:val="36"/>
           <w:szCs w:val="36"/>
-          <w:highlight w:val="yellow"/>
-        </w:rPr>
-        <w:lastRenderedPageBreak/>
-        <w:t>4.6.2</w:t>
-      </w:r>
-      <w:r>
-        <w:rPr>
+        </w:rPr>
+      </w:pPr>
+      <w:r>
+        <w:rPr>
+          <w:rStyle w:val="header-section-number"/>
           <w:rFonts w:ascii="Helvetica Neue" w:hAnsi="Helvetica Neue"/>
           <w:b/>
           <w:bCs/>
@@ -2533,14 +2074,11 @@
           <w:spacing w:val="3"/>
           <w:sz w:val="36"/>
           <w:szCs w:val="36"/>
-          <w:highlight w:val="yellow"/>
-        </w:rPr>
-        <w:t> Interpretar con </w:t>
-      </w:r>
-      <w:proofErr w:type="spellStart"/>
-      <w:r>
-        <w:rPr>
-          <w:rStyle w:val="nfasis"/>
+        </w:rPr>
+        <w:t>4.4.2</w:t>
+      </w:r>
+      <w:r>
+        <w:rPr>
           <w:rFonts w:ascii="Helvetica Neue" w:hAnsi="Helvetica Neue"/>
           <w:b/>
           <w:bCs/>
@@ -2548,13 +2086,12 @@
           <w:spacing w:val="3"/>
           <w:sz w:val="36"/>
           <w:szCs w:val="36"/>
-          <w:highlight w:val="yellow"/>
-        </w:rPr>
-        <w:t>summary</w:t>
-      </w:r>
-      <w:proofErr w:type="spellEnd"/>
-      <w:r>
-        <w:rPr>
+        </w:rPr>
+        <w:t> Eliminación de variables en </w:t>
+      </w:r>
+      <w:r>
+        <w:rPr>
+          <w:rStyle w:val="nfasis"/>
           <w:rFonts w:ascii="Helvetica Neue" w:hAnsi="Helvetica Neue"/>
           <w:b/>
           <w:bCs/>
@@ -2562,13 +2099,94 @@
           <w:spacing w:val="3"/>
           <w:sz w:val="36"/>
           <w:szCs w:val="36"/>
-          <w:highlight w:val="yellow"/>
-        </w:rPr>
-        <w:t> en </w:t>
-      </w:r>
-      <w:r>
-        <w:rPr>
-          <w:rStyle w:val="nfasis"/>
+        </w:rPr>
+        <w:t>Python</w:t>
+      </w:r>
+    </w:p>
+    <w:p/>
+    <w:p>
+      <w:r>
+        <w:t xml:space="preserve">Falta el código para incluir la subida de los datos </w:t>
+      </w:r>
+      <w:proofErr w:type="spellStart"/>
+      <w:r>
+        <w:t>mtcars</w:t>
+      </w:r>
+      <w:proofErr w:type="spellEnd"/>
+    </w:p>
+    <w:p>
+      <w:proofErr w:type="spellStart"/>
+      <w:r>
+        <w:rPr>
+          <w:highlight w:val="yellow"/>
+        </w:rPr>
+        <w:t>mtcars</w:t>
+      </w:r>
+      <w:proofErr w:type="spellEnd"/>
+      <w:r>
+        <w:rPr>
+          <w:highlight w:val="yellow"/>
+        </w:rPr>
+        <w:t xml:space="preserve"> = </w:t>
+      </w:r>
+      <w:proofErr w:type="spellStart"/>
+      <w:r>
+        <w:rPr>
+          <w:highlight w:val="yellow"/>
+        </w:rPr>
+        <w:t>pandas.read_csv</w:t>
+      </w:r>
+      <w:proofErr w:type="spellEnd"/>
+      <w:r>
+        <w:rPr>
+          <w:highlight w:val="yellow"/>
+        </w:rPr>
+        <w:t>("mtcars.csv")</w:t>
+      </w:r>
+    </w:p>
+    <w:p>
+      <w:proofErr w:type="spellStart"/>
+      <w:r>
+        <w:t>mtcars</w:t>
+      </w:r>
+      <w:proofErr w:type="spellEnd"/>
+      <w:r>
+        <w:t xml:space="preserve"> = </w:t>
+      </w:r>
+      <w:proofErr w:type="spellStart"/>
+      <w:r>
+        <w:t>mtcars.drop</w:t>
+      </w:r>
+      <w:proofErr w:type="spellEnd"/>
+      <w:r>
+        <w:t>("</w:t>
+      </w:r>
+      <w:proofErr w:type="spellStart"/>
+      <w:r>
+        <w:t>mpg</w:t>
+      </w:r>
+      <w:proofErr w:type="spellEnd"/>
+      <w:r>
+        <w:t>", axis=1)</w:t>
+      </w:r>
+    </w:p>
+    <w:p/>
+    <w:p>
+      <w:pPr>
+        <w:pStyle w:val="Ttulo3"/>
+        <w:shd w:val="clear" w:color="auto" w:fill="FFFFFF"/>
+        <w:spacing w:before="306" w:after="204"/>
+        <w:rPr>
+          <w:rFonts w:ascii="Helvetica Neue" w:hAnsi="Helvetica Neue"/>
+          <w:color w:val="333333"/>
+          <w:spacing w:val="3"/>
+          <w:sz w:val="36"/>
+          <w:szCs w:val="36"/>
+        </w:rPr>
+      </w:pPr>
+      <w:r>
+        <w:rPr>
+          <w:rStyle w:val="header-section-number"/>
           <w:rFonts w:ascii="Helvetica Neue" w:hAnsi="Helvetica Neue"/>
           <w:b/>
           <w:bCs/>
@@ -2578,7 +2196,7 @@
           <w:szCs w:val="36"/>
           <w:highlight w:val="yellow"/>
         </w:rPr>
-        <w:t>Python</w:t>
+        <w:t>4.5.2</w:t>
       </w:r>
       <w:r>
         <w:rPr>
@@ -2591,17 +2209,664 @@
           <w:szCs w:val="36"/>
           <w:highlight w:val="yellow"/>
         </w:rPr>
+        <w:t> Aplicando el modelo de regresión lineal en </w:t>
+      </w:r>
+      <w:r>
+        <w:rPr>
+          <w:rStyle w:val="nfasis"/>
+          <w:rFonts w:ascii="Helvetica Neue" w:hAnsi="Helvetica Neue"/>
+          <w:b/>
+          <w:bCs/>
+          <w:color w:val="333333"/>
+          <w:spacing w:val="3"/>
+          <w:sz w:val="36"/>
+          <w:szCs w:val="36"/>
+          <w:highlight w:val="yellow"/>
+        </w:rPr>
+        <w:t>Python</w:t>
+      </w:r>
+      <w:r>
+        <w:rPr>
+          <w:rFonts w:ascii="Helvetica Neue" w:hAnsi="Helvetica Neue"/>
+          <w:b/>
+          <w:bCs/>
+          <w:color w:val="333333"/>
+          <w:spacing w:val="3"/>
+          <w:sz w:val="36"/>
+          <w:szCs w:val="36"/>
+          <w:highlight w:val="yellow"/>
+        </w:rPr>
         <w:t>:</w:t>
       </w:r>
     </w:p>
     <w:p>
       <w:r>
+        <w:t xml:space="preserve">Falta incluir código para subir los datos </w:t>
+      </w:r>
+      <w:proofErr w:type="spellStart"/>
+      <w:r>
+        <w:t>irisp</w:t>
+      </w:r>
+      <w:proofErr w:type="spellEnd"/>
+    </w:p>
+    <w:p>
+      <w:pPr>
+        <w:rPr>
+          <w:rFonts w:ascii="Helvetica" w:hAnsi="Helvetica" w:cs="Helvetica"/>
+          <w:color w:val="333333"/>
+          <w:spacing w:val="3"/>
+          <w:shd w:val="clear" w:color="auto" w:fill="FFFFFF"/>
+        </w:rPr>
+      </w:pPr>
+      <w:r>
+        <w:rPr>
+          <w:rFonts w:ascii="Helvetica" w:hAnsi="Helvetica" w:cs="Helvetica"/>
+          <w:color w:val="333333"/>
+          <w:spacing w:val="3"/>
+          <w:highlight w:val="yellow"/>
+          <w:shd w:val="clear" w:color="auto" w:fill="FFFFFF"/>
+        </w:rPr>
+        <w:t>Subimos la base de datos "</w:t>
+      </w:r>
+      <w:proofErr w:type="spellStart"/>
+      <w:r>
+        <w:rPr>
+          <w:rFonts w:ascii="Helvetica" w:hAnsi="Helvetica" w:cs="Helvetica"/>
+          <w:color w:val="333333"/>
+          <w:spacing w:val="3"/>
+          <w:highlight w:val="yellow"/>
+          <w:shd w:val="clear" w:color="auto" w:fill="FFFFFF"/>
+        </w:rPr>
+        <w:t>irisp</w:t>
+      </w:r>
+      <w:proofErr w:type="spellEnd"/>
+      <w:r>
+        <w:rPr>
+          <w:rFonts w:ascii="Helvetica" w:hAnsi="Helvetica" w:cs="Helvetica"/>
+          <w:color w:val="333333"/>
+          <w:spacing w:val="3"/>
+          <w:highlight w:val="yellow"/>
+          <w:shd w:val="clear" w:color="auto" w:fill="FFFFFF"/>
+        </w:rPr>
+        <w:t>"</w:t>
+      </w:r>
+    </w:p>
+    <w:p>
+      <w:pPr>
+        <w:rPr>
+          <w:rFonts w:ascii="Helvetica" w:hAnsi="Helvetica" w:cs="Helvetica"/>
+          <w:color w:val="333333"/>
+          <w:spacing w:val="3"/>
+          <w:shd w:val="clear" w:color="auto" w:fill="FFFFFF"/>
+        </w:rPr>
+      </w:pPr>
+      <w:proofErr w:type="spellStart"/>
+      <w:r>
+        <w:rPr>
+          <w:rFonts w:ascii="Helvetica" w:hAnsi="Helvetica" w:cs="Helvetica"/>
+          <w:color w:val="333333"/>
+          <w:spacing w:val="3"/>
+          <w:highlight w:val="yellow"/>
+          <w:shd w:val="clear" w:color="auto" w:fill="FFFFFF"/>
+        </w:rPr>
+        <w:t>irisp</w:t>
+      </w:r>
+      <w:proofErr w:type="spellEnd"/>
+      <w:r>
+        <w:rPr>
+          <w:rFonts w:ascii="Helvetica" w:hAnsi="Helvetica" w:cs="Helvetica"/>
+          <w:color w:val="333333"/>
+          <w:spacing w:val="3"/>
+          <w:highlight w:val="yellow"/>
+          <w:shd w:val="clear" w:color="auto" w:fill="FFFFFF"/>
+        </w:rPr>
+        <w:t xml:space="preserve"> = </w:t>
+      </w:r>
+      <w:proofErr w:type="spellStart"/>
+      <w:r>
+        <w:rPr>
+          <w:rFonts w:ascii="Helvetica" w:hAnsi="Helvetica" w:cs="Helvetica"/>
+          <w:color w:val="333333"/>
+          <w:spacing w:val="3"/>
+          <w:highlight w:val="yellow"/>
+          <w:shd w:val="clear" w:color="auto" w:fill="FFFFFF"/>
+        </w:rPr>
+        <w:t>pandas.read_csv</w:t>
+      </w:r>
+      <w:proofErr w:type="spellEnd"/>
+      <w:r>
+        <w:rPr>
+          <w:rFonts w:ascii="Helvetica" w:hAnsi="Helvetica" w:cs="Helvetica"/>
+          <w:color w:val="333333"/>
+          <w:spacing w:val="3"/>
+          <w:highlight w:val="yellow"/>
+          <w:shd w:val="clear" w:color="auto" w:fill="FFFFFF"/>
+        </w:rPr>
+        <w:t>("irisp.</w:t>
+      </w:r>
+      <w:proofErr w:type="spellStart"/>
+      <w:r>
+        <w:rPr>
+          <w:rFonts w:ascii="Helvetica" w:hAnsi="Helvetica" w:cs="Helvetica"/>
+          <w:color w:val="333333"/>
+          <w:spacing w:val="3"/>
+          <w:highlight w:val="yellow"/>
+          <w:shd w:val="clear" w:color="auto" w:fill="FFFFFF"/>
+        </w:rPr>
+        <w:t>csv</w:t>
+      </w:r>
+      <w:proofErr w:type="spellEnd"/>
+      <w:r>
+        <w:rPr>
+          <w:rFonts w:ascii="Helvetica" w:hAnsi="Helvetica" w:cs="Helvetica"/>
+          <w:color w:val="333333"/>
+          <w:spacing w:val="3"/>
+          <w:highlight w:val="yellow"/>
+          <w:shd w:val="clear" w:color="auto" w:fill="FFFFFF"/>
+        </w:rPr>
+        <w:t>",</w:t>
+      </w:r>
+      <w:proofErr w:type="spellStart"/>
+      <w:r>
+        <w:rPr>
+          <w:rFonts w:ascii="Helvetica" w:hAnsi="Helvetica" w:cs="Helvetica"/>
+          <w:color w:val="333333"/>
+          <w:spacing w:val="3"/>
+          <w:highlight w:val="yellow"/>
+          <w:shd w:val="clear" w:color="auto" w:fill="FFFFFF"/>
+        </w:rPr>
+        <w:t>sep</w:t>
+      </w:r>
+      <w:proofErr w:type="spellEnd"/>
+      <w:r>
+        <w:rPr>
+          <w:rFonts w:ascii="Helvetica" w:hAnsi="Helvetica" w:cs="Helvetica"/>
+          <w:color w:val="333333"/>
+          <w:spacing w:val="3"/>
+          <w:highlight w:val="yellow"/>
+          <w:shd w:val="clear" w:color="auto" w:fill="FFFFFF"/>
+        </w:rPr>
+        <w:t>=";")</w:t>
+      </w:r>
+    </w:p>
+    <w:p>
+      <w:pPr>
+        <w:rPr>
+          <w:rFonts w:ascii="Helvetica" w:hAnsi="Helvetica" w:cs="Helvetica"/>
+          <w:color w:val="333333"/>
+          <w:spacing w:val="3"/>
+          <w:shd w:val="clear" w:color="auto" w:fill="FFFFFF"/>
+        </w:rPr>
+      </w:pPr>
+    </w:p>
+    <w:p>
+      <w:pPr>
+        <w:rPr>
+          <w:rFonts w:ascii="Helvetica" w:hAnsi="Helvetica" w:cs="Helvetica"/>
+          <w:color w:val="333333"/>
+          <w:spacing w:val="3"/>
+          <w:shd w:val="clear" w:color="auto" w:fill="FFFFFF"/>
+        </w:rPr>
+      </w:pPr>
+    </w:p>
+    <w:p>
+      <w:pPr>
+        <w:rPr>
+          <w:rFonts w:ascii="Helvetica" w:hAnsi="Helvetica" w:cs="Helvetica"/>
+          <w:color w:val="333333"/>
+          <w:spacing w:val="3"/>
+          <w:shd w:val="clear" w:color="auto" w:fill="FFFFFF"/>
+        </w:rPr>
+      </w:pPr>
+      <w:r>
+        <w:rPr>
+          <w:rFonts w:ascii="Helvetica" w:hAnsi="Helvetica" w:cs="Helvetica"/>
+          <w:color w:val="333333"/>
+          <w:spacing w:val="3"/>
+          <w:shd w:val="clear" w:color="auto" w:fill="FFFFFF"/>
+        </w:rPr>
+        <w:t>Incluir lo siguiente:</w:t>
+      </w:r>
+    </w:p>
+    <w:p>
+      <w:pPr>
+        <w:rPr>
+          <w:rFonts w:ascii="Helvetica" w:hAnsi="Helvetica" w:cs="Helvetica"/>
+          <w:color w:val="333333"/>
+          <w:spacing w:val="3"/>
+          <w:highlight w:val="yellow"/>
+          <w:shd w:val="clear" w:color="auto" w:fill="FFFFFF"/>
+        </w:rPr>
+      </w:pPr>
+      <w:r>
+        <w:rPr>
+          <w:rFonts w:ascii="Helvetica" w:hAnsi="Helvetica" w:cs="Helvetica"/>
+          <w:color w:val="333333"/>
+          <w:spacing w:val="3"/>
+          <w:highlight w:val="yellow"/>
+          <w:shd w:val="clear" w:color="auto" w:fill="FFFFFF"/>
+        </w:rPr>
+        <w:t>Importamos la librería "</w:t>
+      </w:r>
+      <w:proofErr w:type="spellStart"/>
+      <w:r>
+        <w:rPr>
+          <w:rFonts w:ascii="Helvetica" w:hAnsi="Helvetica" w:cs="Helvetica"/>
+          <w:color w:val="333333"/>
+          <w:spacing w:val="3"/>
+          <w:highlight w:val="yellow"/>
+          <w:shd w:val="clear" w:color="auto" w:fill="FFFFFF"/>
+        </w:rPr>
+        <w:t>statsmodels</w:t>
+      </w:r>
+      <w:proofErr w:type="spellEnd"/>
+      <w:r>
+        <w:rPr>
+          <w:rFonts w:ascii="Helvetica" w:hAnsi="Helvetica" w:cs="Helvetica"/>
+          <w:color w:val="333333"/>
+          <w:spacing w:val="3"/>
+          <w:highlight w:val="yellow"/>
+          <w:shd w:val="clear" w:color="auto" w:fill="FFFFFF"/>
+        </w:rPr>
+        <w:t>"</w:t>
+      </w:r>
+    </w:p>
+    <w:p>
+      <w:pPr>
+        <w:rPr>
+          <w:rFonts w:ascii="Helvetica" w:hAnsi="Helvetica" w:cs="Helvetica"/>
+          <w:color w:val="333333"/>
+          <w:spacing w:val="3"/>
+          <w:shd w:val="clear" w:color="auto" w:fill="FFFFFF"/>
+        </w:rPr>
+      </w:pPr>
+      <w:proofErr w:type="spellStart"/>
+      <w:r>
+        <w:rPr>
+          <w:rFonts w:ascii="Helvetica" w:hAnsi="Helvetica" w:cs="Helvetica"/>
+          <w:color w:val="333333"/>
+          <w:spacing w:val="3"/>
+          <w:highlight w:val="yellow"/>
+          <w:shd w:val="clear" w:color="auto" w:fill="FFFFFF"/>
+        </w:rPr>
+        <w:t>import</w:t>
+      </w:r>
+      <w:proofErr w:type="spellEnd"/>
+      <w:r>
+        <w:rPr>
+          <w:rFonts w:ascii="Helvetica" w:hAnsi="Helvetica" w:cs="Helvetica"/>
+          <w:color w:val="333333"/>
+          <w:spacing w:val="3"/>
+          <w:highlight w:val="yellow"/>
+          <w:shd w:val="clear" w:color="auto" w:fill="FFFFFF"/>
+        </w:rPr>
+        <w:t xml:space="preserve"> </w:t>
+      </w:r>
+      <w:proofErr w:type="spellStart"/>
+      <w:r>
+        <w:rPr>
+          <w:rFonts w:ascii="Helvetica" w:hAnsi="Helvetica" w:cs="Helvetica"/>
+          <w:color w:val="333333"/>
+          <w:spacing w:val="3"/>
+          <w:highlight w:val="yellow"/>
+          <w:shd w:val="clear" w:color="auto" w:fill="FFFFFF"/>
+        </w:rPr>
+        <w:t>statsmodels.api</w:t>
+      </w:r>
+      <w:proofErr w:type="spellEnd"/>
+      <w:r>
+        <w:rPr>
+          <w:rFonts w:ascii="Helvetica" w:hAnsi="Helvetica" w:cs="Helvetica"/>
+          <w:color w:val="333333"/>
+          <w:spacing w:val="3"/>
+          <w:highlight w:val="yellow"/>
+          <w:shd w:val="clear" w:color="auto" w:fill="FFFFFF"/>
+        </w:rPr>
+        <w:t xml:space="preserve"> as </w:t>
+      </w:r>
+      <w:proofErr w:type="spellStart"/>
+      <w:r>
+        <w:rPr>
+          <w:rFonts w:ascii="Helvetica" w:hAnsi="Helvetica" w:cs="Helvetica"/>
+          <w:color w:val="333333"/>
+          <w:spacing w:val="3"/>
+          <w:highlight w:val="yellow"/>
+          <w:shd w:val="clear" w:color="auto" w:fill="FFFFFF"/>
+        </w:rPr>
+        <w:t>sm</w:t>
+      </w:r>
+      <w:proofErr w:type="spellEnd"/>
+    </w:p>
+    <w:p>
+      <w:pPr>
+        <w:rPr>
+          <w:rFonts w:ascii="Helvetica" w:hAnsi="Helvetica" w:cs="Helvetica"/>
+          <w:color w:val="333333"/>
+          <w:spacing w:val="3"/>
+          <w:shd w:val="clear" w:color="auto" w:fill="FFFFFF"/>
+        </w:rPr>
+      </w:pPr>
+    </w:p>
+    <w:p>
+      <w:pPr>
+        <w:rPr>
+          <w:rFonts w:ascii="Helvetica" w:hAnsi="Helvetica" w:cs="Helvetica"/>
+          <w:color w:val="333333"/>
+          <w:spacing w:val="3"/>
+          <w:shd w:val="clear" w:color="auto" w:fill="FFFFFF"/>
+        </w:rPr>
+      </w:pPr>
+    </w:p>
+    <w:p>
+      <w:pPr>
+        <w:rPr>
+          <w:rFonts w:ascii="Helvetica" w:hAnsi="Helvetica" w:cs="Helvetica"/>
+          <w:color w:val="333333"/>
+          <w:spacing w:val="3"/>
+          <w:shd w:val="clear" w:color="auto" w:fill="FFFFFF"/>
+        </w:rPr>
+      </w:pPr>
+      <w:r>
+        <w:rPr>
+          <w:rFonts w:ascii="Helvetica" w:hAnsi="Helvetica" w:cs="Helvetica"/>
+          <w:color w:val="333333"/>
+          <w:spacing w:val="3"/>
+          <w:shd w:val="clear" w:color="auto" w:fill="FFFFFF"/>
+        </w:rPr>
+        <w:lastRenderedPageBreak/>
+        <w:t>Sustituir</w:t>
+      </w:r>
+    </w:p>
+    <w:p>
+      <w:pPr>
+        <w:rPr>
+          <w:rFonts w:ascii="Helvetica" w:hAnsi="Helvetica" w:cs="Helvetica"/>
+          <w:color w:val="333333"/>
+          <w:spacing w:val="3"/>
+          <w:shd w:val="clear" w:color="auto" w:fill="FFFFFF"/>
+        </w:rPr>
+      </w:pPr>
+      <w:r>
+        <w:rPr>
+          <w:rFonts w:ascii="Helvetica" w:hAnsi="Helvetica" w:cs="Helvetica"/>
+          <w:color w:val="333333"/>
+          <w:spacing w:val="3"/>
+          <w:highlight w:val="yellow"/>
+          <w:shd w:val="clear" w:color="auto" w:fill="FFFFFF"/>
+        </w:rPr>
+        <w:t>Seleccionamos las variable</w:t>
+      </w:r>
+      <w:r>
+        <w:rPr>
+          <w:rFonts w:ascii="Helvetica" w:hAnsi="Helvetica" w:cs="Helvetica"/>
+          <w:color w:val="333333"/>
+          <w:spacing w:val="3"/>
+          <w:highlight w:val="yellow"/>
+          <w:shd w:val="clear" w:color="auto" w:fill="FFFFFF"/>
+        </w:rPr>
+        <w:t>s</w:t>
+      </w:r>
+      <w:r>
+        <w:rPr>
+          <w:rFonts w:ascii="Helvetica" w:hAnsi="Helvetica" w:cs="Helvetica"/>
+          <w:color w:val="333333"/>
+          <w:spacing w:val="3"/>
+          <w:highlight w:val="yellow"/>
+          <w:shd w:val="clear" w:color="auto" w:fill="FFFFFF"/>
+        </w:rPr>
+        <w:t xml:space="preserve"> dependiente e independientes</w:t>
+      </w:r>
+    </w:p>
+    <w:p>
+      <w:pPr>
+        <w:rPr>
+          <w:rFonts w:ascii="Helvetica" w:hAnsi="Helvetica" w:cs="Helvetica"/>
+          <w:color w:val="333333"/>
+          <w:spacing w:val="3"/>
+          <w:shd w:val="clear" w:color="auto" w:fill="FFFFFF"/>
+        </w:rPr>
+      </w:pPr>
+    </w:p>
+    <w:p>
+      <w:pPr>
+        <w:rPr>
+          <w:rFonts w:ascii="Helvetica" w:hAnsi="Helvetica" w:cs="Helvetica"/>
+          <w:color w:val="333333"/>
+          <w:spacing w:val="3"/>
+          <w:shd w:val="clear" w:color="auto" w:fill="FFFFFF"/>
+        </w:rPr>
+      </w:pPr>
+      <w:r>
+        <w:rPr>
+          <w:rFonts w:ascii="Helvetica" w:hAnsi="Helvetica" w:cs="Helvetica"/>
+          <w:color w:val="333333"/>
+          <w:spacing w:val="3"/>
+          <w:shd w:val="clear" w:color="auto" w:fill="FFFFFF"/>
+        </w:rPr>
+        <w:t xml:space="preserve">Agregamos el </w:t>
+      </w:r>
+      <w:r>
+        <w:rPr>
+          <w:rFonts w:ascii="Helvetica" w:hAnsi="Helvetica" w:cs="Helvetica"/>
+          <w:color w:val="333333"/>
+          <w:spacing w:val="3"/>
+          <w:highlight w:val="yellow"/>
+          <w:shd w:val="clear" w:color="auto" w:fill="FFFFFF"/>
+        </w:rPr>
+        <w:t>cálculo</w:t>
+      </w:r>
+      <w:r>
+        <w:rPr>
+          <w:rFonts w:ascii="Helvetica" w:hAnsi="Helvetica" w:cs="Helvetica"/>
+          <w:color w:val="333333"/>
+          <w:spacing w:val="3"/>
+          <w:shd w:val="clear" w:color="auto" w:fill="FFFFFF"/>
+        </w:rPr>
+        <w:t xml:space="preserve"> del intercept</w:t>
+      </w:r>
+    </w:p>
+    <w:p>
+      <w:pPr>
+        <w:rPr>
+          <w:rFonts w:ascii="Helvetica" w:hAnsi="Helvetica" w:cs="Helvetica"/>
+          <w:color w:val="333333"/>
+          <w:spacing w:val="3"/>
+          <w:shd w:val="clear" w:color="auto" w:fill="FFFFFF"/>
+        </w:rPr>
+      </w:pPr>
+    </w:p>
+    <w:p>
+      <w:pPr>
+        <w:pStyle w:val="Ttulo2"/>
+        <w:shd w:val="clear" w:color="auto" w:fill="FFFFFF"/>
+        <w:spacing w:before="306" w:beforeAutospacing="0" w:after="204" w:afterAutospacing="0"/>
+        <w:rPr>
+          <w:rFonts w:ascii="Helvetica Neue" w:hAnsi="Helvetica Neue"/>
+          <w:b w:val="0"/>
+          <w:bCs w:val="0"/>
+          <w:color w:val="333333"/>
+          <w:spacing w:val="3"/>
+          <w:sz w:val="42"/>
+          <w:szCs w:val="42"/>
+        </w:rPr>
+      </w:pPr>
+      <w:r>
+        <w:rPr>
+          <w:rStyle w:val="header-section-number"/>
+          <w:rFonts w:ascii="Helvetica Neue" w:hAnsi="Helvetica Neue"/>
+          <w:b w:val="0"/>
+          <w:bCs w:val="0"/>
+          <w:color w:val="333333"/>
+          <w:spacing w:val="3"/>
+          <w:sz w:val="42"/>
+          <w:szCs w:val="42"/>
+        </w:rPr>
+        <w:t>4.6</w:t>
+      </w:r>
+      <w:r>
+        <w:rPr>
+          <w:rFonts w:ascii="Helvetica Neue" w:hAnsi="Helvetica Neue"/>
+          <w:b w:val="0"/>
+          <w:bCs w:val="0"/>
+          <w:color w:val="333333"/>
+          <w:spacing w:val="3"/>
+          <w:sz w:val="42"/>
+          <w:szCs w:val="42"/>
+        </w:rPr>
+        <w:t> </w:t>
+      </w:r>
+      <w:r>
+        <w:rPr>
+          <w:rFonts w:ascii="Helvetica Neue" w:hAnsi="Helvetica Neue"/>
+          <w:b w:val="0"/>
+          <w:bCs w:val="0"/>
+          <w:color w:val="333333"/>
+          <w:spacing w:val="3"/>
+          <w:sz w:val="42"/>
+          <w:szCs w:val="42"/>
+          <w:highlight w:val="yellow"/>
+        </w:rPr>
+        <w:t>Cómo</w:t>
+      </w:r>
+      <w:r>
+        <w:rPr>
+          <w:rFonts w:ascii="Helvetica Neue" w:hAnsi="Helvetica Neue"/>
+          <w:b w:val="0"/>
+          <w:bCs w:val="0"/>
+          <w:color w:val="333333"/>
+          <w:spacing w:val="3"/>
+          <w:sz w:val="42"/>
+          <w:szCs w:val="42"/>
+        </w:rPr>
+        <w:t xml:space="preserve"> interpretar los resultados del modelo</w:t>
+      </w:r>
+    </w:p>
+    <w:p>
+      <w:pPr>
+        <w:rPr>
+          <w:rFonts w:ascii="Helvetica" w:hAnsi="Helvetica" w:cs="Helvetica"/>
+          <w:color w:val="333333"/>
+          <w:spacing w:val="3"/>
+          <w:shd w:val="clear" w:color="auto" w:fill="FFFFFF"/>
+        </w:rPr>
+      </w:pPr>
+    </w:p>
+    <w:p>
+      <w:pPr>
+        <w:rPr>
+          <w:rFonts w:ascii="Helvetica" w:hAnsi="Helvetica" w:cs="Helvetica"/>
+          <w:color w:val="333333"/>
+          <w:spacing w:val="3"/>
+          <w:shd w:val="clear" w:color="auto" w:fill="FFFFFF"/>
+        </w:rPr>
+      </w:pPr>
+    </w:p>
+    <w:p>
+      <w:pPr>
+        <w:pStyle w:val="Ttulo3"/>
+        <w:shd w:val="clear" w:color="auto" w:fill="FFFFFF"/>
+        <w:spacing w:before="306" w:after="204"/>
+        <w:rPr>
+          <w:rFonts w:ascii="Helvetica Neue" w:hAnsi="Helvetica Neue"/>
+          <w:b/>
+          <w:bCs/>
+          <w:color w:val="333333"/>
+          <w:spacing w:val="3"/>
+          <w:sz w:val="36"/>
+          <w:szCs w:val="36"/>
+        </w:rPr>
+      </w:pPr>
+      <w:r>
+        <w:rPr>
+          <w:rStyle w:val="header-section-number"/>
+          <w:rFonts w:ascii="Helvetica Neue" w:hAnsi="Helvetica Neue"/>
+          <w:b/>
+          <w:bCs/>
+          <w:color w:val="333333"/>
+          <w:spacing w:val="3"/>
+          <w:sz w:val="36"/>
+          <w:szCs w:val="36"/>
+          <w:highlight w:val="yellow"/>
+        </w:rPr>
+        <w:t>4.6.2</w:t>
+      </w:r>
+      <w:r>
+        <w:rPr>
+          <w:rFonts w:ascii="Helvetica Neue" w:hAnsi="Helvetica Neue"/>
+          <w:b/>
+          <w:bCs/>
+          <w:color w:val="333333"/>
+          <w:spacing w:val="3"/>
+          <w:sz w:val="36"/>
+          <w:szCs w:val="36"/>
+          <w:highlight w:val="yellow"/>
+        </w:rPr>
+        <w:t> Interpretar con </w:t>
+      </w:r>
+      <w:proofErr w:type="spellStart"/>
+      <w:r>
+        <w:rPr>
+          <w:rStyle w:val="nfasis"/>
+          <w:rFonts w:ascii="Helvetica Neue" w:hAnsi="Helvetica Neue"/>
+          <w:b/>
+          <w:bCs/>
+          <w:color w:val="333333"/>
+          <w:spacing w:val="3"/>
+          <w:sz w:val="36"/>
+          <w:szCs w:val="36"/>
+          <w:highlight w:val="yellow"/>
+        </w:rPr>
+        <w:t>summary</w:t>
+      </w:r>
+      <w:proofErr w:type="spellEnd"/>
+      <w:r>
+        <w:rPr>
+          <w:rFonts w:ascii="Helvetica Neue" w:hAnsi="Helvetica Neue"/>
+          <w:b/>
+          <w:bCs/>
+          <w:color w:val="333333"/>
+          <w:spacing w:val="3"/>
+          <w:sz w:val="36"/>
+          <w:szCs w:val="36"/>
+          <w:highlight w:val="yellow"/>
+        </w:rPr>
+        <w:t> en </w:t>
+      </w:r>
+      <w:r>
+        <w:rPr>
+          <w:rStyle w:val="nfasis"/>
+          <w:rFonts w:ascii="Helvetica Neue" w:hAnsi="Helvetica Neue"/>
+          <w:b/>
+          <w:bCs/>
+          <w:color w:val="333333"/>
+          <w:spacing w:val="3"/>
+          <w:sz w:val="36"/>
+          <w:szCs w:val="36"/>
+          <w:highlight w:val="yellow"/>
+        </w:rPr>
+        <w:t>Python</w:t>
+      </w:r>
+      <w:r>
+        <w:rPr>
+          <w:rFonts w:ascii="Helvetica Neue" w:hAnsi="Helvetica Neue"/>
+          <w:b/>
+          <w:bCs/>
+          <w:color w:val="333333"/>
+          <w:spacing w:val="3"/>
+          <w:sz w:val="36"/>
+          <w:szCs w:val="36"/>
+          <w:highlight w:val="yellow"/>
+        </w:rPr>
+        <w:t>:</w:t>
+      </w:r>
+    </w:p>
+    <w:p>
+      <w:r>
         <w:t>Corregir código</w:t>
       </w:r>
     </w:p>
     <w:p>
       <w:proofErr w:type="spellStart"/>
-      <w:proofErr w:type="gramStart"/>
       <w:r>
         <w:rPr>
           <w:highlight w:val="yellow"/>
@@ -2616,7 +2881,6 @@
         <w:t>(</w:t>
       </w:r>
       <w:proofErr w:type="spellStart"/>
-      <w:proofErr w:type="gramEnd"/>
       <w:r>
         <w:rPr>
           <w:highlight w:val="yellow"/>
@@ -2826,7 +3090,6 @@
         </w:rPr>
       </w:pPr>
       <w:proofErr w:type="spellStart"/>
-      <w:proofErr w:type="gramStart"/>
       <w:r>
         <w:rPr>
           <w:rFonts w:ascii="Helvetica" w:hAnsi="Helvetica" w:cs="Helvetica"/>
@@ -2838,7 +3101,6 @@
         <w:t>import</w:t>
       </w:r>
       <w:proofErr w:type="spellEnd"/>
-      <w:proofErr w:type="gramEnd"/>
       <w:r>
         <w:rPr>
           <w:rFonts w:ascii="Helvetica" w:hAnsi="Helvetica" w:cs="Helvetica"/>
@@ -2904,7 +3166,6 @@
         </w:rPr>
       </w:pPr>
       <w:proofErr w:type="spellStart"/>
-      <w:proofErr w:type="gramStart"/>
       <w:r>
         <w:rPr>
           <w:rFonts w:ascii="Helvetica" w:hAnsi="Helvetica" w:cs="Helvetica"/>
@@ -2927,7 +3188,6 @@
         <w:t>=</w:t>
       </w:r>
       <w:proofErr w:type="spellStart"/>
-      <w:proofErr w:type="gramEnd"/>
       <w:r>
         <w:rPr>
           <w:rFonts w:ascii="Helvetica" w:hAnsi="Helvetica" w:cs="Helvetica"/>
@@ -2961,7 +3221,6 @@
         </w:rPr>
       </w:pPr>
       <w:proofErr w:type="spellStart"/>
-      <w:proofErr w:type="gramStart"/>
       <w:r>
         <w:rPr>
           <w:rFonts w:ascii="Helvetica" w:hAnsi="Helvetica" w:cs="Helvetica"/>
@@ -2973,7 +3232,6 @@
         <w:t>dummies</w:t>
       </w:r>
       <w:proofErr w:type="spellEnd"/>
-      <w:proofErr w:type="gramEnd"/>
       <w:r>
         <w:rPr>
           <w:rFonts w:ascii="Helvetica" w:hAnsi="Helvetica" w:cs="Helvetica"/>
@@ -3039,7 +3297,6 @@
         </w:rPr>
       </w:pPr>
       <w:proofErr w:type="spellStart"/>
-      <w:proofErr w:type="gramStart"/>
       <w:r>
         <w:rPr>
           <w:rFonts w:ascii="Helvetica" w:hAnsi="Helvetica" w:cs="Helvetica"/>
@@ -3051,7 +3308,6 @@
         <w:t>dummies</w:t>
       </w:r>
       <w:proofErr w:type="spellEnd"/>
-      <w:proofErr w:type="gramEnd"/>
     </w:p>
     <w:p>
       <w:pPr>
@@ -3175,6 +3431,7 @@
           <w:sz w:val="36"/>
           <w:szCs w:val="36"/>
         </w:rPr>
+        <w:lastRenderedPageBreak/>
         <w:t>6.6.1</w:t>
       </w:r>
       <w:r>
@@ -3220,7 +3477,6 @@
         <w:t xml:space="preserve"> = </w:t>
       </w:r>
       <w:proofErr w:type="spellStart"/>
-      <w:proofErr w:type="gramStart"/>
       <w:r>
         <w:rPr>
           <w:rFonts w:ascii="Helvetica" w:hAnsi="Helvetica" w:cs="Helvetica"/>
@@ -3238,30 +3494,129 @@
           <w:spacing w:val="3"/>
           <w:shd w:val="clear" w:color="auto" w:fill="FFFFFF"/>
         </w:rPr>
+        <w:t>(1, 20)</w:t>
+      </w:r>
+    </w:p>
+    <w:p>
+      <w:pPr>
+        <w:rPr>
+          <w:rFonts w:ascii="Helvetica" w:hAnsi="Helvetica" w:cs="Helvetica"/>
+          <w:color w:val="333333"/>
+          <w:spacing w:val="3"/>
+          <w:shd w:val="clear" w:color="auto" w:fill="FFFFFF"/>
+        </w:rPr>
+      </w:pPr>
+      <w:proofErr w:type="spellStart"/>
+      <w:r>
+        <w:rPr>
+          <w:rFonts w:ascii="Helvetica" w:hAnsi="Helvetica" w:cs="Helvetica"/>
+          <w:color w:val="333333"/>
+          <w:spacing w:val="3"/>
+          <w:shd w:val="clear" w:color="auto" w:fill="FFFFFF"/>
+        </w:rPr>
+        <w:t>kmeans</w:t>
+      </w:r>
+      <w:proofErr w:type="spellEnd"/>
+      <w:r>
+        <w:rPr>
+          <w:rFonts w:ascii="Helvetica" w:hAnsi="Helvetica" w:cs="Helvetica"/>
+          <w:color w:val="333333"/>
+          <w:spacing w:val="3"/>
+          <w:shd w:val="clear" w:color="auto" w:fill="FFFFFF"/>
+        </w:rPr>
+        <w:t xml:space="preserve"> = [</w:t>
+      </w:r>
+      <w:proofErr w:type="spellStart"/>
+      <w:r>
+        <w:rPr>
+          <w:rFonts w:ascii="Helvetica" w:hAnsi="Helvetica" w:cs="Helvetica"/>
+          <w:color w:val="333333"/>
+          <w:spacing w:val="3"/>
+          <w:shd w:val="clear" w:color="auto" w:fill="FFFFFF"/>
+        </w:rPr>
+        <w:t>KMeans</w:t>
+      </w:r>
+      <w:proofErr w:type="spellEnd"/>
+      <w:r>
+        <w:rPr>
+          <w:rFonts w:ascii="Helvetica" w:hAnsi="Helvetica" w:cs="Helvetica"/>
+          <w:color w:val="333333"/>
+          <w:spacing w:val="3"/>
+          <w:shd w:val="clear" w:color="auto" w:fill="FFFFFF"/>
+        </w:rPr>
         <w:t>(</w:t>
       </w:r>
-      <w:proofErr w:type="gramEnd"/>
-      <w:r>
-        <w:rPr>
-          <w:rFonts w:ascii="Helvetica" w:hAnsi="Helvetica" w:cs="Helvetica"/>
-          <w:color w:val="333333"/>
-          <w:spacing w:val="3"/>
-          <w:shd w:val="clear" w:color="auto" w:fill="FFFFFF"/>
-        </w:rPr>
-        <w:t>1, 20)</w:t>
-      </w:r>
-    </w:p>
-    <w:p>
-      <w:pPr>
-        <w:rPr>
-          <w:rFonts w:ascii="Helvetica" w:hAnsi="Helvetica" w:cs="Helvetica"/>
-          <w:color w:val="333333"/>
-          <w:spacing w:val="3"/>
-          <w:shd w:val="clear" w:color="auto" w:fill="FFFFFF"/>
-        </w:rPr>
-      </w:pPr>
       <w:proofErr w:type="spellStart"/>
-      <w:proofErr w:type="gramStart"/>
+      <w:r>
+        <w:rPr>
+          <w:rFonts w:ascii="Helvetica" w:hAnsi="Helvetica" w:cs="Helvetica"/>
+          <w:color w:val="333333"/>
+          <w:spacing w:val="3"/>
+          <w:shd w:val="clear" w:color="auto" w:fill="FFFFFF"/>
+        </w:rPr>
+        <w:t>n_clusters</w:t>
+      </w:r>
+      <w:proofErr w:type="spellEnd"/>
+      <w:r>
+        <w:rPr>
+          <w:rFonts w:ascii="Helvetica" w:hAnsi="Helvetica" w:cs="Helvetica"/>
+          <w:color w:val="333333"/>
+          <w:spacing w:val="3"/>
+          <w:shd w:val="clear" w:color="auto" w:fill="FFFFFF"/>
+        </w:rPr>
+        <w:t xml:space="preserve">=i) </w:t>
+      </w:r>
+      <w:proofErr w:type="spellStart"/>
+      <w:r>
+        <w:rPr>
+          <w:rFonts w:ascii="Helvetica" w:hAnsi="Helvetica" w:cs="Helvetica"/>
+          <w:color w:val="333333"/>
+          <w:spacing w:val="3"/>
+          <w:shd w:val="clear" w:color="auto" w:fill="FFFFFF"/>
+        </w:rPr>
+        <w:t>for</w:t>
+      </w:r>
+      <w:proofErr w:type="spellEnd"/>
+      <w:r>
+        <w:rPr>
+          <w:rFonts w:ascii="Helvetica" w:hAnsi="Helvetica" w:cs="Helvetica"/>
+          <w:color w:val="333333"/>
+          <w:spacing w:val="3"/>
+          <w:shd w:val="clear" w:color="auto" w:fill="FFFFFF"/>
+        </w:rPr>
+        <w:t xml:space="preserve"> i in </w:t>
+      </w:r>
+      <w:proofErr w:type="spellStart"/>
+      <w:r>
+        <w:rPr>
+          <w:rFonts w:ascii="Helvetica" w:hAnsi="Helvetica" w:cs="Helvetica"/>
+          <w:color w:val="333333"/>
+          <w:spacing w:val="3"/>
+          <w:shd w:val="clear" w:color="auto" w:fill="FFFFFF"/>
+        </w:rPr>
+        <w:t>Nc</w:t>
+      </w:r>
+      <w:proofErr w:type="spellEnd"/>
+      <w:r>
+        <w:rPr>
+          <w:rFonts w:ascii="Helvetica" w:hAnsi="Helvetica" w:cs="Helvetica"/>
+          <w:color w:val="333333"/>
+          <w:spacing w:val="3"/>
+          <w:shd w:val="clear" w:color="auto" w:fill="FFFFFF"/>
+        </w:rPr>
+        <w:t>]</w:t>
+      </w:r>
+    </w:p>
+    <w:p>
+      <w:pPr>
+        <w:rPr>
+          <w:rFonts w:ascii="Helvetica" w:hAnsi="Helvetica" w:cs="Helvetica"/>
+          <w:color w:val="333333"/>
+          <w:spacing w:val="3"/>
+          <w:shd w:val="clear" w:color="auto" w:fill="FFFFFF"/>
+        </w:rPr>
+      </w:pPr>
+      <w:proofErr w:type="spellStart"/>
       <w:r>
         <w:rPr>
           <w:rFonts w:ascii="Helvetica" w:hAnsi="Helvetica" w:cs="Helvetica"/>
@@ -3272,15 +3627,24 @@
         <w:t>kmeans</w:t>
       </w:r>
       <w:proofErr w:type="spellEnd"/>
-      <w:proofErr w:type="gramEnd"/>
-      <w:r>
-        <w:rPr>
-          <w:rFonts w:ascii="Helvetica" w:hAnsi="Helvetica" w:cs="Helvetica"/>
-          <w:color w:val="333333"/>
-          <w:spacing w:val="3"/>
-          <w:shd w:val="clear" w:color="auto" w:fill="FFFFFF"/>
-        </w:rPr>
-        <w:t xml:space="preserve"> = [</w:t>
+    </w:p>
+    <w:p>
+      <w:pPr>
+        <w:rPr>
+          <w:rFonts w:ascii="Helvetica" w:hAnsi="Helvetica" w:cs="Helvetica"/>
+          <w:color w:val="333333"/>
+          <w:spacing w:val="3"/>
+          <w:shd w:val="clear" w:color="auto" w:fill="FFFFFF"/>
+        </w:rPr>
+      </w:pPr>
+      <w:r>
+        <w:rPr>
+          <w:rFonts w:ascii="Helvetica" w:hAnsi="Helvetica" w:cs="Helvetica"/>
+          <w:color w:val="333333"/>
+          <w:spacing w:val="3"/>
+          <w:shd w:val="clear" w:color="auto" w:fill="FFFFFF"/>
+        </w:rPr>
+        <w:t>score = [</w:t>
       </w:r>
       <w:proofErr w:type="spellStart"/>
       <w:r>
@@ -3290,7 +3654,7 @@
           <w:spacing w:val="3"/>
           <w:shd w:val="clear" w:color="auto" w:fill="FFFFFF"/>
         </w:rPr>
-        <w:t>KMeans</w:t>
+        <w:t>kmeans</w:t>
       </w:r>
       <w:proofErr w:type="spellEnd"/>
       <w:r>
@@ -3300,6 +3664,66 @@
           <w:spacing w:val="3"/>
           <w:shd w:val="clear" w:color="auto" w:fill="FFFFFF"/>
         </w:rPr>
+        <w:t>[i].</w:t>
+      </w:r>
+      <w:proofErr w:type="spellStart"/>
+      <w:r>
+        <w:rPr>
+          <w:rFonts w:ascii="Helvetica" w:hAnsi="Helvetica" w:cs="Helvetica"/>
+          <w:color w:val="333333"/>
+          <w:spacing w:val="3"/>
+          <w:shd w:val="clear" w:color="auto" w:fill="FFFFFF"/>
+        </w:rPr>
+        <w:t>fit</w:t>
+      </w:r>
+      <w:proofErr w:type="spellEnd"/>
+      <w:r>
+        <w:rPr>
+          <w:rFonts w:ascii="Helvetica" w:hAnsi="Helvetica" w:cs="Helvetica"/>
+          <w:color w:val="333333"/>
+          <w:spacing w:val="3"/>
+          <w:shd w:val="clear" w:color="auto" w:fill="FFFFFF"/>
+        </w:rPr>
+        <w:t xml:space="preserve">(datos).score(datos) </w:t>
+      </w:r>
+      <w:proofErr w:type="spellStart"/>
+      <w:r>
+        <w:rPr>
+          <w:rFonts w:ascii="Helvetica" w:hAnsi="Helvetica" w:cs="Helvetica"/>
+          <w:color w:val="333333"/>
+          <w:spacing w:val="3"/>
+          <w:shd w:val="clear" w:color="auto" w:fill="FFFFFF"/>
+        </w:rPr>
+        <w:t>for</w:t>
+      </w:r>
+      <w:proofErr w:type="spellEnd"/>
+      <w:r>
+        <w:rPr>
+          <w:rFonts w:ascii="Helvetica" w:hAnsi="Helvetica" w:cs="Helvetica"/>
+          <w:color w:val="333333"/>
+          <w:spacing w:val="3"/>
+          <w:shd w:val="clear" w:color="auto" w:fill="FFFFFF"/>
+        </w:rPr>
+        <w:t xml:space="preserve"> i in </w:t>
+      </w:r>
+      <w:proofErr w:type="spellStart"/>
+      <w:r>
+        <w:rPr>
+          <w:rFonts w:ascii="Helvetica" w:hAnsi="Helvetica" w:cs="Helvetica"/>
+          <w:color w:val="333333"/>
+          <w:spacing w:val="3"/>
+          <w:shd w:val="clear" w:color="auto" w:fill="FFFFFF"/>
+        </w:rPr>
+        <w:t>range</w:t>
+      </w:r>
+      <w:proofErr w:type="spellEnd"/>
+      <w:r>
+        <w:rPr>
+          <w:rFonts w:ascii="Helvetica" w:hAnsi="Helvetica" w:cs="Helvetica"/>
+          <w:color w:val="333333"/>
+          <w:spacing w:val="3"/>
+          <w:shd w:val="clear" w:color="auto" w:fill="FFFFFF"/>
+        </w:rPr>
         <w:t>(</w:t>
       </w:r>
       <w:proofErr w:type="spellStart"/>
@@ -3310,7 +3734,7 @@
           <w:spacing w:val="3"/>
           <w:shd w:val="clear" w:color="auto" w:fill="FFFFFF"/>
         </w:rPr>
-        <w:t>n_clusters</w:t>
+        <w:t>len</w:t>
       </w:r>
       <w:proofErr w:type="spellEnd"/>
       <w:r>
@@ -3320,7 +3744,7 @@
           <w:spacing w:val="3"/>
           <w:shd w:val="clear" w:color="auto" w:fill="FFFFFF"/>
         </w:rPr>
-        <w:t xml:space="preserve">=i) </w:t>
+        <w:t>(</w:t>
       </w:r>
       <w:proofErr w:type="spellStart"/>
       <w:r>
@@ -3330,7 +3754,7 @@
           <w:spacing w:val="3"/>
           <w:shd w:val="clear" w:color="auto" w:fill="FFFFFF"/>
         </w:rPr>
-        <w:t>for</w:t>
+        <w:t>kmeans</w:t>
       </w:r>
       <w:proofErr w:type="spellEnd"/>
       <w:r>
@@ -3340,8 +3764,37 @@
           <w:spacing w:val="3"/>
           <w:shd w:val="clear" w:color="auto" w:fill="FFFFFF"/>
         </w:rPr>
-        <w:t xml:space="preserve"> i in </w:t>
-      </w:r>
+        <w:t>))]</w:t>
+      </w:r>
+    </w:p>
+    <w:p>
+      <w:pPr>
+        <w:rPr>
+          <w:rFonts w:ascii="Helvetica" w:hAnsi="Helvetica" w:cs="Helvetica"/>
+          <w:color w:val="333333"/>
+          <w:spacing w:val="3"/>
+          <w:shd w:val="clear" w:color="auto" w:fill="FFFFFF"/>
+        </w:rPr>
+      </w:pPr>
+      <w:r>
+        <w:rPr>
+          <w:rFonts w:ascii="Helvetica" w:hAnsi="Helvetica" w:cs="Helvetica"/>
+          <w:color w:val="333333"/>
+          <w:spacing w:val="3"/>
+          <w:shd w:val="clear" w:color="auto" w:fill="FFFFFF"/>
+        </w:rPr>
+        <w:t>score</w:t>
+      </w:r>
+    </w:p>
+    <w:p>
+      <w:pPr>
+        <w:rPr>
+          <w:rFonts w:ascii="Helvetica" w:hAnsi="Helvetica" w:cs="Helvetica"/>
+          <w:color w:val="333333"/>
+          <w:spacing w:val="3"/>
+          <w:shd w:val="clear" w:color="auto" w:fill="FFFFFF"/>
+        </w:rPr>
+      </w:pPr>
       <w:proofErr w:type="spellStart"/>
       <w:r>
         <w:rPr>
@@ -3350,7 +3803,7 @@
           <w:spacing w:val="3"/>
           <w:shd w:val="clear" w:color="auto" w:fill="FFFFFF"/>
         </w:rPr>
-        <w:t>Nc</w:t>
+        <w:t>plt.plot</w:t>
       </w:r>
       <w:proofErr w:type="spellEnd"/>
       <w:r>
@@ -3360,70 +3813,48 @@
           <w:spacing w:val="3"/>
           <w:shd w:val="clear" w:color="auto" w:fill="FFFFFF"/>
         </w:rPr>
-        <w:t>]</w:t>
-      </w:r>
-    </w:p>
-    <w:p>
-      <w:pPr>
-        <w:rPr>
-          <w:rFonts w:ascii="Helvetica" w:hAnsi="Helvetica" w:cs="Helvetica"/>
-          <w:color w:val="333333"/>
-          <w:spacing w:val="3"/>
-          <w:shd w:val="clear" w:color="auto" w:fill="FFFFFF"/>
-        </w:rPr>
-      </w:pPr>
+        <w:t>(</w:t>
+      </w:r>
       <w:proofErr w:type="spellStart"/>
-      <w:proofErr w:type="gramStart"/>
-      <w:r>
-        <w:rPr>
-          <w:rFonts w:ascii="Helvetica" w:hAnsi="Helvetica" w:cs="Helvetica"/>
-          <w:color w:val="333333"/>
-          <w:spacing w:val="3"/>
-          <w:shd w:val="clear" w:color="auto" w:fill="FFFFFF"/>
-        </w:rPr>
-        <w:t>kmeans</w:t>
+      <w:r>
+        <w:rPr>
+          <w:rFonts w:ascii="Helvetica" w:hAnsi="Helvetica" w:cs="Helvetica"/>
+          <w:color w:val="333333"/>
+          <w:spacing w:val="3"/>
+          <w:shd w:val="clear" w:color="auto" w:fill="FFFFFF"/>
+        </w:rPr>
+        <w:t>Nc,score</w:t>
       </w:r>
       <w:proofErr w:type="spellEnd"/>
-      <w:proofErr w:type="gramEnd"/>
-    </w:p>
-    <w:p>
-      <w:pPr>
-        <w:rPr>
-          <w:rFonts w:ascii="Helvetica" w:hAnsi="Helvetica" w:cs="Helvetica"/>
-          <w:color w:val="333333"/>
-          <w:spacing w:val="3"/>
-          <w:shd w:val="clear" w:color="auto" w:fill="FFFFFF"/>
-        </w:rPr>
-      </w:pPr>
-      <w:proofErr w:type="gramStart"/>
-      <w:r>
-        <w:rPr>
-          <w:rFonts w:ascii="Helvetica" w:hAnsi="Helvetica" w:cs="Helvetica"/>
-          <w:color w:val="333333"/>
-          <w:spacing w:val="3"/>
-          <w:shd w:val="clear" w:color="auto" w:fill="FFFFFF"/>
-        </w:rPr>
-        <w:t>score</w:t>
-      </w:r>
-      <w:proofErr w:type="gramEnd"/>
-      <w:r>
-        <w:rPr>
-          <w:rFonts w:ascii="Helvetica" w:hAnsi="Helvetica" w:cs="Helvetica"/>
-          <w:color w:val="333333"/>
-          <w:spacing w:val="3"/>
-          <w:shd w:val="clear" w:color="auto" w:fill="FFFFFF"/>
-        </w:rPr>
-        <w:t xml:space="preserve"> = [</w:t>
-      </w:r>
+      <w:r>
+        <w:rPr>
+          <w:rFonts w:ascii="Helvetica" w:hAnsi="Helvetica" w:cs="Helvetica"/>
+          <w:color w:val="333333"/>
+          <w:spacing w:val="3"/>
+          <w:shd w:val="clear" w:color="auto" w:fill="FFFFFF"/>
+        </w:rPr>
+        <w:t>)</w:t>
+      </w:r>
+    </w:p>
+    <w:p>
+      <w:pPr>
+        <w:rPr>
+          <w:rFonts w:ascii="Helvetica" w:hAnsi="Helvetica" w:cs="Helvetica"/>
+          <w:color w:val="333333"/>
+          <w:spacing w:val="3"/>
+          <w:shd w:val="clear" w:color="auto" w:fill="FFFFFF"/>
+        </w:rPr>
+      </w:pPr>
       <w:proofErr w:type="spellStart"/>
       <w:r>
         <w:rPr>
           <w:rFonts w:ascii="Helvetica" w:hAnsi="Helvetica" w:cs="Helvetica"/>
           <w:color w:val="333333"/>
           <w:spacing w:val="3"/>
-          <w:shd w:val="clear" w:color="auto" w:fill="FFFFFF"/>
-        </w:rPr>
-        <w:t>kmeans</w:t>
+          <w:highlight w:val="yellow"/>
+          <w:shd w:val="clear" w:color="auto" w:fill="FFFFFF"/>
+        </w:rPr>
+        <w:t>plt.xlabel</w:t>
       </w:r>
       <w:proofErr w:type="spellEnd"/>
       <w:r>
@@ -3431,10 +3862,21 @@
           <w:rFonts w:ascii="Helvetica" w:hAnsi="Helvetica" w:cs="Helvetica"/>
           <w:color w:val="333333"/>
           <w:spacing w:val="3"/>
-          <w:shd w:val="clear" w:color="auto" w:fill="FFFFFF"/>
-        </w:rPr>
-        <w:t>[i].</w:t>
-      </w:r>
+          <w:highlight w:val="yellow"/>
+          <w:shd w:val="clear" w:color="auto" w:fill="FFFFFF"/>
+        </w:rPr>
+        <w:t>('Número de clúster')</w:t>
+      </w:r>
+    </w:p>
+    <w:p>
+      <w:pPr>
+        <w:rPr>
+          <w:rFonts w:ascii="Helvetica" w:hAnsi="Helvetica" w:cs="Helvetica"/>
+          <w:color w:val="333333"/>
+          <w:spacing w:val="3"/>
+          <w:shd w:val="clear" w:color="auto" w:fill="FFFFFF"/>
+        </w:rPr>
+      </w:pPr>
       <w:proofErr w:type="spellStart"/>
       <w:r>
         <w:rPr>
@@ -3443,7 +3885,7 @@
           <w:spacing w:val="3"/>
           <w:shd w:val="clear" w:color="auto" w:fill="FFFFFF"/>
         </w:rPr>
-        <w:t>fit</w:t>
+        <w:t>plt.ylabel</w:t>
       </w:r>
       <w:proofErr w:type="spellEnd"/>
       <w:r>
@@ -3453,8 +3895,18 @@
           <w:spacing w:val="3"/>
           <w:shd w:val="clear" w:color="auto" w:fill="FFFFFF"/>
         </w:rPr>
-        <w:t xml:space="preserve">(datos).score(datos) </w:t>
-      </w:r>
+        <w:t>('Score')</w:t>
+      </w:r>
+    </w:p>
+    <w:p>
+      <w:pPr>
+        <w:rPr>
+          <w:rFonts w:ascii="Helvetica" w:hAnsi="Helvetica" w:cs="Helvetica"/>
+          <w:color w:val="333333"/>
+          <w:spacing w:val="3"/>
+          <w:shd w:val="clear" w:color="auto" w:fill="FFFFFF"/>
+        </w:rPr>
+      </w:pPr>
       <w:proofErr w:type="spellStart"/>
       <w:r>
         <w:rPr>
@@ -3463,7 +3915,7 @@
           <w:spacing w:val="3"/>
           <w:shd w:val="clear" w:color="auto" w:fill="FFFFFF"/>
         </w:rPr>
-        <w:t>for</w:t>
+        <w:t>plt.title</w:t>
       </w:r>
       <w:proofErr w:type="spellEnd"/>
       <w:r>
@@ -3473,17 +3925,28 @@
           <w:spacing w:val="3"/>
           <w:shd w:val="clear" w:color="auto" w:fill="FFFFFF"/>
         </w:rPr>
-        <w:t xml:space="preserve"> i in </w:t>
-      </w:r>
+        <w:t>('Gráfico de codo')</w:t>
+      </w:r>
+    </w:p>
+    <w:p>
+      <w:pPr>
+        <w:rPr>
+          <w:rFonts w:ascii="Helvetica" w:hAnsi="Helvetica" w:cs="Helvetica"/>
+          <w:color w:val="333333"/>
+          <w:spacing w:val="3"/>
+          <w:shd w:val="clear" w:color="auto" w:fill="FFFFFF"/>
+        </w:rPr>
+      </w:pPr>
       <w:proofErr w:type="spellStart"/>
       <w:r>
         <w:rPr>
           <w:rFonts w:ascii="Helvetica" w:hAnsi="Helvetica" w:cs="Helvetica"/>
           <w:color w:val="333333"/>
           <w:spacing w:val="3"/>
-          <w:shd w:val="clear" w:color="auto" w:fill="FFFFFF"/>
-        </w:rPr>
-        <w:t>range</w:t>
+          <w:highlight w:val="yellow"/>
+          <w:shd w:val="clear" w:color="auto" w:fill="FFFFFF"/>
+        </w:rPr>
+        <w:t>plt.savefig</w:t>
       </w:r>
       <w:proofErr w:type="spellEnd"/>
       <w:r>
@@ -3491,10 +3954,21 @@
           <w:rFonts w:ascii="Helvetica" w:hAnsi="Helvetica" w:cs="Helvetica"/>
           <w:color w:val="333333"/>
           <w:spacing w:val="3"/>
-          <w:shd w:val="clear" w:color="auto" w:fill="FFFFFF"/>
-        </w:rPr>
-        <w:t>(</w:t>
-      </w:r>
+          <w:highlight w:val="yellow"/>
+          <w:shd w:val="clear" w:color="auto" w:fill="FFFFFF"/>
+        </w:rPr>
+        <w:t>("GraficoCodo.png")</w:t>
+      </w:r>
+    </w:p>
+    <w:p>
+      <w:pPr>
+        <w:rPr>
+          <w:rFonts w:ascii="Helvetica" w:hAnsi="Helvetica" w:cs="Helvetica"/>
+          <w:color w:val="333333"/>
+          <w:spacing w:val="3"/>
+          <w:shd w:val="clear" w:color="auto" w:fill="FFFFFF"/>
+        </w:rPr>
+      </w:pPr>
       <w:proofErr w:type="spellStart"/>
       <w:r>
         <w:rPr>
@@ -3503,7 +3977,7 @@
           <w:spacing w:val="3"/>
           <w:shd w:val="clear" w:color="auto" w:fill="FFFFFF"/>
         </w:rPr>
-        <w:t>len</w:t>
+        <w:t>plt.show</w:t>
       </w:r>
       <w:proofErr w:type="spellEnd"/>
       <w:r>
@@ -3513,304 +3987,8 @@
           <w:spacing w:val="3"/>
           <w:shd w:val="clear" w:color="auto" w:fill="FFFFFF"/>
         </w:rPr>
-        <w:t>(</w:t>
-      </w:r>
-      <w:proofErr w:type="spellStart"/>
-      <w:r>
-        <w:rPr>
-          <w:rFonts w:ascii="Helvetica" w:hAnsi="Helvetica" w:cs="Helvetica"/>
-          <w:color w:val="333333"/>
-          <w:spacing w:val="3"/>
-          <w:shd w:val="clear" w:color="auto" w:fill="FFFFFF"/>
-        </w:rPr>
-        <w:t>kmeans</w:t>
-      </w:r>
-      <w:proofErr w:type="spellEnd"/>
-      <w:r>
-        <w:rPr>
-          <w:rFonts w:ascii="Helvetica" w:hAnsi="Helvetica" w:cs="Helvetica"/>
-          <w:color w:val="333333"/>
-          <w:spacing w:val="3"/>
-          <w:shd w:val="clear" w:color="auto" w:fill="FFFFFF"/>
-        </w:rPr>
-        <w:t>))]</w:t>
-      </w:r>
-    </w:p>
-    <w:p>
-      <w:pPr>
-        <w:rPr>
-          <w:rFonts w:ascii="Helvetica" w:hAnsi="Helvetica" w:cs="Helvetica"/>
-          <w:color w:val="333333"/>
-          <w:spacing w:val="3"/>
-          <w:shd w:val="clear" w:color="auto" w:fill="FFFFFF"/>
-        </w:rPr>
-      </w:pPr>
-      <w:proofErr w:type="gramStart"/>
-      <w:r>
-        <w:rPr>
-          <w:rFonts w:ascii="Helvetica" w:hAnsi="Helvetica" w:cs="Helvetica"/>
-          <w:color w:val="333333"/>
-          <w:spacing w:val="3"/>
-          <w:shd w:val="clear" w:color="auto" w:fill="FFFFFF"/>
-        </w:rPr>
-        <w:t>score</w:t>
-      </w:r>
-      <w:proofErr w:type="gramEnd"/>
-    </w:p>
-    <w:p>
-      <w:pPr>
-        <w:rPr>
-          <w:rFonts w:ascii="Helvetica" w:hAnsi="Helvetica" w:cs="Helvetica"/>
-          <w:color w:val="333333"/>
-          <w:spacing w:val="3"/>
-          <w:shd w:val="clear" w:color="auto" w:fill="FFFFFF"/>
-        </w:rPr>
-      </w:pPr>
-      <w:proofErr w:type="spellStart"/>
-      <w:proofErr w:type="gramStart"/>
-      <w:r>
-        <w:rPr>
-          <w:rFonts w:ascii="Helvetica" w:hAnsi="Helvetica" w:cs="Helvetica"/>
-          <w:color w:val="333333"/>
-          <w:spacing w:val="3"/>
-          <w:shd w:val="clear" w:color="auto" w:fill="FFFFFF"/>
-        </w:rPr>
-        <w:t>plt.plot</w:t>
-      </w:r>
-      <w:proofErr w:type="spellEnd"/>
-      <w:r>
-        <w:rPr>
-          <w:rFonts w:ascii="Helvetica" w:hAnsi="Helvetica" w:cs="Helvetica"/>
-          <w:color w:val="333333"/>
-          <w:spacing w:val="3"/>
-          <w:shd w:val="clear" w:color="auto" w:fill="FFFFFF"/>
-        </w:rPr>
-        <w:t>(</w:t>
-      </w:r>
-      <w:proofErr w:type="spellStart"/>
-      <w:proofErr w:type="gramEnd"/>
-      <w:r>
-        <w:rPr>
-          <w:rFonts w:ascii="Helvetica" w:hAnsi="Helvetica" w:cs="Helvetica"/>
-          <w:color w:val="333333"/>
-          <w:spacing w:val="3"/>
-          <w:shd w:val="clear" w:color="auto" w:fill="FFFFFF"/>
-        </w:rPr>
-        <w:t>Nc,score</w:t>
-      </w:r>
-      <w:proofErr w:type="spellEnd"/>
-      <w:r>
-        <w:rPr>
-          <w:rFonts w:ascii="Helvetica" w:hAnsi="Helvetica" w:cs="Helvetica"/>
-          <w:color w:val="333333"/>
-          <w:spacing w:val="3"/>
-          <w:shd w:val="clear" w:color="auto" w:fill="FFFFFF"/>
-        </w:rPr>
-        <w:t>)</w:t>
-      </w:r>
-    </w:p>
-    <w:p>
-      <w:pPr>
-        <w:rPr>
-          <w:rFonts w:ascii="Helvetica" w:hAnsi="Helvetica" w:cs="Helvetica"/>
-          <w:color w:val="333333"/>
-          <w:spacing w:val="3"/>
-          <w:shd w:val="clear" w:color="auto" w:fill="FFFFFF"/>
-        </w:rPr>
-      </w:pPr>
-      <w:proofErr w:type="spellStart"/>
-      <w:proofErr w:type="gramStart"/>
-      <w:r>
-        <w:rPr>
-          <w:rFonts w:ascii="Helvetica" w:hAnsi="Helvetica" w:cs="Helvetica"/>
-          <w:color w:val="333333"/>
-          <w:spacing w:val="3"/>
-          <w:highlight w:val="yellow"/>
-          <w:shd w:val="clear" w:color="auto" w:fill="FFFFFF"/>
-        </w:rPr>
-        <w:t>plt.xlabel</w:t>
-      </w:r>
-      <w:proofErr w:type="spellEnd"/>
-      <w:r>
-        <w:rPr>
-          <w:rFonts w:ascii="Helvetica" w:hAnsi="Helvetica" w:cs="Helvetica"/>
-          <w:color w:val="333333"/>
-          <w:spacing w:val="3"/>
-          <w:highlight w:val="yellow"/>
-          <w:shd w:val="clear" w:color="auto" w:fill="FFFFFF"/>
-        </w:rPr>
-        <w:t>(</w:t>
-      </w:r>
-      <w:proofErr w:type="gramEnd"/>
-      <w:r>
-        <w:rPr>
-          <w:rFonts w:ascii="Helvetica" w:hAnsi="Helvetica" w:cs="Helvetica"/>
-          <w:color w:val="333333"/>
-          <w:spacing w:val="3"/>
-          <w:highlight w:val="yellow"/>
-          <w:shd w:val="clear" w:color="auto" w:fill="FFFFFF"/>
-        </w:rPr>
-        <w:t>'Número de clúster')</w:t>
-      </w:r>
-    </w:p>
-    <w:p>
-      <w:pPr>
-        <w:rPr>
-          <w:rFonts w:ascii="Helvetica" w:hAnsi="Helvetica" w:cs="Helvetica"/>
-          <w:color w:val="333333"/>
-          <w:spacing w:val="3"/>
-          <w:shd w:val="clear" w:color="auto" w:fill="FFFFFF"/>
-        </w:rPr>
-      </w:pPr>
-      <w:proofErr w:type="spellStart"/>
-      <w:proofErr w:type="gramStart"/>
-      <w:r>
-        <w:rPr>
-          <w:rFonts w:ascii="Helvetica" w:hAnsi="Helvetica" w:cs="Helvetica"/>
-          <w:color w:val="333333"/>
-          <w:spacing w:val="3"/>
-          <w:shd w:val="clear" w:color="auto" w:fill="FFFFFF"/>
-        </w:rPr>
-        <w:t>plt.ylabel</w:t>
-      </w:r>
-      <w:proofErr w:type="spellEnd"/>
-      <w:r>
-        <w:rPr>
-          <w:rFonts w:ascii="Helvetica" w:hAnsi="Helvetica" w:cs="Helvetica"/>
-          <w:color w:val="333333"/>
-          <w:spacing w:val="3"/>
-          <w:shd w:val="clear" w:color="auto" w:fill="FFFFFF"/>
-        </w:rPr>
-        <w:t>(</w:t>
-      </w:r>
-      <w:proofErr w:type="gramEnd"/>
-      <w:r>
-        <w:rPr>
-          <w:rFonts w:ascii="Helvetica" w:hAnsi="Helvetica" w:cs="Helvetica"/>
-          <w:color w:val="333333"/>
-          <w:spacing w:val="3"/>
-          <w:shd w:val="clear" w:color="auto" w:fill="FFFFFF"/>
-        </w:rPr>
-        <w:t>'Score')</w:t>
-      </w:r>
-    </w:p>
-    <w:p>
-      <w:pPr>
-        <w:rPr>
-          <w:rFonts w:ascii="Helvetica" w:hAnsi="Helvetica" w:cs="Helvetica"/>
-          <w:color w:val="333333"/>
-          <w:spacing w:val="3"/>
-          <w:shd w:val="clear" w:color="auto" w:fill="FFFFFF"/>
-        </w:rPr>
-      </w:pPr>
-      <w:proofErr w:type="spellStart"/>
-      <w:proofErr w:type="gramStart"/>
-      <w:r>
-        <w:rPr>
-          <w:rFonts w:ascii="Helvetica" w:hAnsi="Helvetica" w:cs="Helvetica"/>
-          <w:color w:val="333333"/>
-          <w:spacing w:val="3"/>
-          <w:shd w:val="clear" w:color="auto" w:fill="FFFFFF"/>
-        </w:rPr>
-        <w:t>plt.title</w:t>
-      </w:r>
-      <w:proofErr w:type="spellEnd"/>
-      <w:r>
-        <w:rPr>
-          <w:rFonts w:ascii="Helvetica" w:hAnsi="Helvetica" w:cs="Helvetica"/>
-          <w:color w:val="333333"/>
-          <w:spacing w:val="3"/>
-          <w:shd w:val="clear" w:color="auto" w:fill="FFFFFF"/>
-        </w:rPr>
-        <w:t>(</w:t>
-      </w:r>
-      <w:proofErr w:type="gramEnd"/>
-      <w:r>
-        <w:rPr>
-          <w:rFonts w:ascii="Helvetica" w:hAnsi="Helvetica" w:cs="Helvetica"/>
-          <w:color w:val="333333"/>
-          <w:spacing w:val="3"/>
-          <w:shd w:val="clear" w:color="auto" w:fill="FFFFFF"/>
-        </w:rPr>
-        <w:t>'Gráfico de codo')</w:t>
-      </w:r>
-    </w:p>
-    <w:p>
-      <w:pPr>
-        <w:rPr>
-          <w:rFonts w:ascii="Helvetica" w:hAnsi="Helvetica" w:cs="Helvetica"/>
-          <w:color w:val="333333"/>
-          <w:spacing w:val="3"/>
-          <w:shd w:val="clear" w:color="auto" w:fill="FFFFFF"/>
-        </w:rPr>
-      </w:pPr>
-      <w:proofErr w:type="spellStart"/>
-      <w:proofErr w:type="gramStart"/>
-      <w:r>
-        <w:rPr>
-          <w:rFonts w:ascii="Helvetica" w:hAnsi="Helvetica" w:cs="Helvetica"/>
-          <w:color w:val="333333"/>
-          <w:spacing w:val="3"/>
-          <w:highlight w:val="yellow"/>
-          <w:shd w:val="clear" w:color="auto" w:fill="FFFFFF"/>
-        </w:rPr>
-        <w:lastRenderedPageBreak/>
-        <w:t>plt.savefig</w:t>
-      </w:r>
-      <w:proofErr w:type="spellEnd"/>
-      <w:r>
-        <w:rPr>
-          <w:rFonts w:ascii="Helvetica" w:hAnsi="Helvetica" w:cs="Helvetica"/>
-          <w:color w:val="333333"/>
-          <w:spacing w:val="3"/>
-          <w:highlight w:val="yellow"/>
-          <w:shd w:val="clear" w:color="auto" w:fill="FFFFFF"/>
-        </w:rPr>
-        <w:t>(</w:t>
-      </w:r>
-      <w:proofErr w:type="gramEnd"/>
-      <w:r>
-        <w:rPr>
-          <w:rFonts w:ascii="Helvetica" w:hAnsi="Helvetica" w:cs="Helvetica"/>
-          <w:color w:val="333333"/>
-          <w:spacing w:val="3"/>
-          <w:highlight w:val="yellow"/>
-          <w:shd w:val="clear" w:color="auto" w:fill="FFFFFF"/>
-        </w:rPr>
-        <w:t>"GraficoCodo.png")</w:t>
-      </w:r>
-    </w:p>
-    <w:p>
-      <w:pPr>
-        <w:rPr>
-          <w:rFonts w:ascii="Helvetica" w:hAnsi="Helvetica" w:cs="Helvetica"/>
-          <w:color w:val="333333"/>
-          <w:spacing w:val="3"/>
-          <w:shd w:val="clear" w:color="auto" w:fill="FFFFFF"/>
-        </w:rPr>
-      </w:pPr>
-      <w:proofErr w:type="spellStart"/>
-      <w:proofErr w:type="gramStart"/>
-      <w:r>
-        <w:rPr>
-          <w:rFonts w:ascii="Helvetica" w:hAnsi="Helvetica" w:cs="Helvetica"/>
-          <w:color w:val="333333"/>
-          <w:spacing w:val="3"/>
-          <w:shd w:val="clear" w:color="auto" w:fill="FFFFFF"/>
-        </w:rPr>
-        <w:t>plt.show</w:t>
-      </w:r>
-      <w:proofErr w:type="spellEnd"/>
-      <w:r>
-        <w:rPr>
-          <w:rFonts w:ascii="Helvetica" w:hAnsi="Helvetica" w:cs="Helvetica"/>
-          <w:color w:val="333333"/>
-          <w:spacing w:val="3"/>
-          <w:shd w:val="clear" w:color="auto" w:fill="FFFFFF"/>
-        </w:rPr>
         <w:t>()</w:t>
       </w:r>
-      <w:proofErr w:type="gramEnd"/>
     </w:p>
     <w:p>
       <w:pPr>
@@ -3930,17 +4108,870 @@
         <w:spacing w:before="306" w:after="204"/>
         <w:rPr>
           <w:rFonts w:ascii="Helvetica Neue" w:hAnsi="Helvetica Neue"/>
+          <w:b/>
+          <w:bCs/>
           <w:color w:val="333333"/>
           <w:spacing w:val="3"/>
           <w:sz w:val="36"/>
           <w:szCs w:val="36"/>
         </w:rPr>
       </w:pPr>
+      <w:r>
+        <w:rPr>
+          <w:rStyle w:val="header-section-number"/>
+          <w:rFonts w:ascii="Helvetica Neue" w:hAnsi="Helvetica Neue"/>
+          <w:b/>
+          <w:bCs/>
+          <w:color w:val="333333"/>
+          <w:spacing w:val="3"/>
+          <w:sz w:val="36"/>
+          <w:szCs w:val="36"/>
+          <w:highlight w:val="yellow"/>
+        </w:rPr>
+        <w:lastRenderedPageBreak/>
+        <w:t>6.6.2</w:t>
+      </w:r>
+      <w:r>
+        <w:rPr>
+          <w:rFonts w:ascii="Helvetica Neue" w:hAnsi="Helvetica Neue"/>
+          <w:b/>
+          <w:bCs/>
+          <w:color w:val="333333"/>
+          <w:spacing w:val="3"/>
+          <w:sz w:val="36"/>
+          <w:szCs w:val="36"/>
+          <w:highlight w:val="yellow"/>
+        </w:rPr>
+        <w:t> Método jerárquico.</w:t>
+      </w:r>
+    </w:p>
+    <w:p>
+      <w:r>
+        <w:rPr>
+          <w:rFonts w:ascii="Helvetica Neue" w:hAnsi="Helvetica Neue"/>
+          <w:color w:val="333333"/>
+          <w:spacing w:val="3"/>
+          <w:shd w:val="clear" w:color="auto" w:fill="FFFFFF"/>
+        </w:rPr>
+        <w:t xml:space="preserve">Para el cálculo de los grupos usaremos el mismo conjunto de datos, una vez cargados construimos el </w:t>
+      </w:r>
+      <w:r>
+        <w:rPr>
+          <w:rFonts w:ascii="Helvetica Neue" w:hAnsi="Helvetica Neue"/>
+          <w:color w:val="333333"/>
+          <w:spacing w:val="3"/>
+          <w:highlight w:val="yellow"/>
+          <w:shd w:val="clear" w:color="auto" w:fill="FFFFFF"/>
+        </w:rPr>
+        <w:t>dendrograma</w:t>
+      </w:r>
+      <w:r>
+        <w:rPr>
+          <w:rFonts w:ascii="Helvetica Neue" w:hAnsi="Helvetica Neue"/>
+          <w:color w:val="333333"/>
+          <w:spacing w:val="3"/>
+          <w:shd w:val="clear" w:color="auto" w:fill="FFFFFF"/>
+        </w:rPr>
+        <w:t>, para lo cual usaremos la función </w:t>
+      </w:r>
+      <w:r>
+        <w:rPr>
+          <w:rStyle w:val="nfasis"/>
+          <w:rFonts w:ascii="Helvetica Neue" w:hAnsi="Helvetica Neue"/>
+          <w:color w:val="333333"/>
+          <w:spacing w:val="3"/>
+          <w:shd w:val="clear" w:color="auto" w:fill="FFFFFF"/>
+        </w:rPr>
+        <w:t>.</w:t>
+      </w:r>
+      <w:proofErr w:type="spellStart"/>
+      <w:r>
+        <w:rPr>
+          <w:rStyle w:val="nfasis"/>
+          <w:rFonts w:ascii="Helvetica Neue" w:hAnsi="Helvetica Neue"/>
+          <w:color w:val="333333"/>
+          <w:spacing w:val="3"/>
+          <w:highlight w:val="yellow"/>
+          <w:shd w:val="clear" w:color="auto" w:fill="FFFFFF"/>
+        </w:rPr>
+        <w:t>dendrogram</w:t>
+      </w:r>
+      <w:proofErr w:type="spellEnd"/>
+      <w:r>
+        <w:rPr>
+          <w:rStyle w:val="nfasis"/>
+          <w:rFonts w:ascii="Helvetica Neue" w:hAnsi="Helvetica Neue"/>
+          <w:color w:val="333333"/>
+          <w:spacing w:val="3"/>
+          <w:highlight w:val="yellow"/>
+          <w:shd w:val="clear" w:color="auto" w:fill="FFFFFF"/>
+        </w:rPr>
+        <w:t>()</w:t>
+      </w:r>
+      <w:r>
+        <w:rPr>
+          <w:rFonts w:ascii="Helvetica Neue" w:hAnsi="Helvetica Neue"/>
+          <w:color w:val="333333"/>
+          <w:spacing w:val="3"/>
+          <w:shd w:val="clear" w:color="auto" w:fill="FFFFFF"/>
+        </w:rPr>
+        <w:t> de la librería </w:t>
+      </w:r>
+      <w:proofErr w:type="spellStart"/>
+      <w:r>
+        <w:rPr>
+          <w:rStyle w:val="nfasis"/>
+          <w:rFonts w:ascii="Helvetica Neue" w:hAnsi="Helvetica Neue"/>
+          <w:color w:val="333333"/>
+          <w:spacing w:val="3"/>
+          <w:shd w:val="clear" w:color="auto" w:fill="FFFFFF"/>
+        </w:rPr>
+        <w:t>scipy</w:t>
+      </w:r>
+      <w:proofErr w:type="spellEnd"/>
+      <w:r>
+        <w:rPr>
+          <w:rFonts w:ascii="Helvetica Neue" w:hAnsi="Helvetica Neue"/>
+          <w:color w:val="333333"/>
+          <w:spacing w:val="3"/>
+          <w:shd w:val="clear" w:color="auto" w:fill="FFFFFF"/>
+        </w:rPr>
+        <w:t>. En este ejemplo usaremos el método de </w:t>
+      </w:r>
+      <w:proofErr w:type="spellStart"/>
+      <w:r>
+        <w:rPr>
+          <w:rStyle w:val="nfasis"/>
+          <w:rFonts w:ascii="Helvetica Neue" w:hAnsi="Helvetica Neue"/>
+          <w:color w:val="333333"/>
+          <w:spacing w:val="3"/>
+          <w:shd w:val="clear" w:color="auto" w:fill="FFFFFF"/>
+        </w:rPr>
+        <w:t>ward</w:t>
+      </w:r>
+      <w:proofErr w:type="spellEnd"/>
+      <w:r>
+        <w:rPr>
+          <w:rFonts w:ascii="Helvetica Neue" w:hAnsi="Helvetica Neue"/>
+          <w:color w:val="333333"/>
+          <w:spacing w:val="3"/>
+          <w:shd w:val="clear" w:color="auto" w:fill="FFFFFF"/>
+        </w:rPr>
+        <w:t>. A continuación mostramos el código:</w:t>
+      </w:r>
+    </w:p>
+    <w:p>
+      <w:r>
+        <w:rPr>
+          <w:highlight w:val="yellow"/>
+        </w:rPr>
+        <w:t>Corregir los códigos por acentos</w:t>
+      </w:r>
+      <w:r>
+        <w:rPr>
+          <w:highlight w:val="yellow"/>
+        </w:rPr>
+        <w:t xml:space="preserve"> y la palabra correcta es dendrograma porque viene del griego </w:t>
+      </w:r>
+      <w:proofErr w:type="spellStart"/>
+      <w:r>
+        <w:rPr>
+          <w:highlight w:val="yellow"/>
+        </w:rPr>
+        <w:t>dendron</w:t>
+      </w:r>
+      <w:proofErr w:type="spellEnd"/>
+      <w:r>
+        <w:rPr>
+          <w:highlight w:val="yellow"/>
+        </w:rPr>
+        <w:t>=árbol)</w:t>
+      </w:r>
+    </w:p>
+    <w:p>
+      <w:pPr>
+        <w:rPr>
+          <w:rFonts w:ascii="Helvetica" w:hAnsi="Helvetica" w:cs="Helvetica"/>
+          <w:color w:val="333333"/>
+          <w:spacing w:val="3"/>
+          <w:shd w:val="clear" w:color="auto" w:fill="FFFFFF"/>
+        </w:rPr>
+      </w:pPr>
+      <w:r>
+        <w:rPr>
+          <w:rFonts w:ascii="Helvetica" w:hAnsi="Helvetica" w:cs="Helvetica"/>
+          <w:color w:val="333333"/>
+          <w:spacing w:val="3"/>
+          <w:highlight w:val="yellow"/>
+          <w:shd w:val="clear" w:color="auto" w:fill="FFFFFF"/>
+        </w:rPr>
+        <w:t>Clústeres jerárquicos</w:t>
+      </w:r>
+    </w:p>
+    <w:p>
+      <w:pPr>
+        <w:rPr>
+          <w:rFonts w:ascii="Helvetica" w:hAnsi="Helvetica" w:cs="Helvetica"/>
+          <w:color w:val="333333"/>
+          <w:spacing w:val="3"/>
+          <w:shd w:val="clear" w:color="auto" w:fill="FFFFFF"/>
+        </w:rPr>
+      </w:pPr>
+    </w:p>
+    <w:p>
+      <w:pPr>
+        <w:rPr>
+          <w:rFonts w:ascii="Helvetica" w:hAnsi="Helvetica" w:cs="Helvetica"/>
+          <w:color w:val="333333"/>
+          <w:spacing w:val="3"/>
+          <w:shd w:val="clear" w:color="auto" w:fill="FFFFFF"/>
+        </w:rPr>
+      </w:pPr>
+      <w:r>
+        <w:rPr>
+          <w:rFonts w:ascii="Helvetica" w:hAnsi="Helvetica" w:cs="Helvetica"/>
+          <w:color w:val="333333"/>
+          <w:spacing w:val="3"/>
+          <w:highlight w:val="yellow"/>
+          <w:shd w:val="clear" w:color="auto" w:fill="FFFFFF"/>
+        </w:rPr>
+        <w:t>Reemplazar imagen del dendrograma por error en título</w:t>
+      </w:r>
+    </w:p>
+    <w:p>
+      <w:pPr>
+        <w:rPr>
+          <w:rFonts w:ascii="Helvetica" w:hAnsi="Helvetica" w:cs="Helvetica"/>
+          <w:color w:val="333333"/>
+          <w:spacing w:val="3"/>
+          <w:shd w:val="clear" w:color="auto" w:fill="FFFFFF"/>
+        </w:rPr>
+      </w:pPr>
+    </w:p>
+    <w:p>
+      <w:pPr>
+        <w:rPr>
+          <w:rFonts w:ascii="Helvetica" w:hAnsi="Helvetica" w:cs="Helvetica"/>
+          <w:color w:val="333333"/>
+          <w:spacing w:val="3"/>
+          <w:shd w:val="clear" w:color="auto" w:fill="FFFFFF"/>
+        </w:rPr>
+      </w:pPr>
+      <w:r>
+        <w:rPr>
+          <w:rFonts w:ascii="Helvetica" w:hAnsi="Helvetica" w:cs="Helvetica"/>
+          <w:noProof/>
+          <w:color w:val="333333"/>
+          <w:spacing w:val="3"/>
+          <w:shd w:val="clear" w:color="auto" w:fill="FFFFFF"/>
+          <w:lang w:eastAsia="es-VE"/>
+        </w:rPr>
+        <w:drawing>
+          <wp:inline distT="0" distB="0" distL="0" distR="0" wp14:anchorId="5F3CEE5B" wp14:editId="384FE161">
+            <wp:extent cx="5487650" cy="3658433"/>
+            <wp:effectExtent l="0" t="0" r="0" b="0"/>
+            <wp:docPr id="4" name="Imagen 4"/>
+            <wp:cNvGraphicFramePr>
+              <a:graphicFrameLocks xmlns:a="http://schemas.openxmlformats.org/drawingml/2006/main" noChangeAspect="1"/>
+            </wp:cNvGraphicFramePr>
+            <a:graphic xmlns:a="http://schemas.openxmlformats.org/drawingml/2006/main">
+              <a:graphicData uri="http://schemas.openxmlformats.org/drawingml/2006/picture">
+                <pic:pic xmlns:pic="http://schemas.openxmlformats.org/drawingml/2006/picture">
+                  <pic:nvPicPr>
+                    <pic:cNvPr id="4" name="Dendrograma.png"/>
+                    <pic:cNvPicPr/>
+                  </pic:nvPicPr>
+                  <pic:blipFill>
+                    <a:blip r:embed="rId10">
+                      <a:extLst>
+                        <a:ext uri="{28A0092B-C50C-407E-A947-70E740481C1C}">
+                          <a14:useLocalDpi xmlns:a14="http://schemas.microsoft.com/office/drawing/2010/main" val="0"/>
+                        </a:ext>
+                      </a:extLst>
+                    </a:blip>
+                    <a:stretch>
+                      <a:fillRect/>
+                    </a:stretch>
+                  </pic:blipFill>
+                  <pic:spPr>
+                    <a:xfrm>
+                      <a:off x="0" y="0"/>
+                      <a:ext cx="5487650" cy="3658433"/>
+                    </a:xfrm>
+                    <a:prstGeom prst="rect">
+                      <a:avLst/>
+                    </a:prstGeom>
+                  </pic:spPr>
+                </pic:pic>
+              </a:graphicData>
+            </a:graphic>
+          </wp:inline>
+        </w:drawing>
+      </w:r>
+    </w:p>
+    <w:p>
+      <w:pPr>
+        <w:rPr>
+          <w:rFonts w:ascii="Helvetica" w:hAnsi="Helvetica" w:cs="Helvetica"/>
+          <w:color w:val="333333"/>
+          <w:spacing w:val="3"/>
+          <w:shd w:val="clear" w:color="auto" w:fill="FFFFFF"/>
+        </w:rPr>
+      </w:pPr>
+      <w:r>
+        <w:rPr>
+          <w:rFonts w:ascii="Helvetica Neue" w:hAnsi="Helvetica Neue"/>
+          <w:color w:val="333333"/>
+          <w:spacing w:val="3"/>
+          <w:shd w:val="clear" w:color="auto" w:fill="FFFFFF"/>
+        </w:rPr>
+        <w:t>Al observar el dendograma observamos la existencia de tres grupos posibles. Para obtenerlos usaremos la función </w:t>
+      </w:r>
+      <w:proofErr w:type="spellStart"/>
+      <w:r>
+        <w:rPr>
+          <w:rStyle w:val="nfasis"/>
+          <w:rFonts w:ascii="Helvetica Neue" w:hAnsi="Helvetica Neue"/>
+          <w:color w:val="333333"/>
+          <w:spacing w:val="3"/>
+          <w:highlight w:val="yellow"/>
+          <w:shd w:val="clear" w:color="auto" w:fill="FFFFFF"/>
+        </w:rPr>
+        <w:t>AgglomerativeClustering</w:t>
+      </w:r>
+      <w:proofErr w:type="spellEnd"/>
+      <w:r>
+        <w:rPr>
+          <w:rStyle w:val="nfasis"/>
+          <w:rFonts w:ascii="Helvetica Neue" w:hAnsi="Helvetica Neue"/>
+          <w:color w:val="333333"/>
+          <w:spacing w:val="3"/>
+          <w:highlight w:val="yellow"/>
+          <w:shd w:val="clear" w:color="auto" w:fill="FFFFFF"/>
+        </w:rPr>
+        <w:t>()</w:t>
+      </w:r>
+      <w:r>
+        <w:rPr>
+          <w:rFonts w:ascii="Helvetica Neue" w:hAnsi="Helvetica Neue"/>
+          <w:color w:val="333333"/>
+          <w:spacing w:val="3"/>
+          <w:shd w:val="clear" w:color="auto" w:fill="FFFFFF"/>
+        </w:rPr>
+        <w:t> de la librería </w:t>
+      </w:r>
+      <w:proofErr w:type="spellStart"/>
+      <w:r>
+        <w:rPr>
+          <w:rStyle w:val="nfasis"/>
+          <w:rFonts w:ascii="Helvetica Neue" w:hAnsi="Helvetica Neue"/>
+          <w:color w:val="333333"/>
+          <w:spacing w:val="3"/>
+          <w:shd w:val="clear" w:color="auto" w:fill="FFFFFF"/>
+        </w:rPr>
+        <w:t>sklear</w:t>
+      </w:r>
+      <w:proofErr w:type="spellEnd"/>
+      <w:r>
+        <w:rPr>
+          <w:rFonts w:ascii="Helvetica Neue" w:hAnsi="Helvetica Neue"/>
+          <w:color w:val="333333"/>
+          <w:spacing w:val="3"/>
+          <w:shd w:val="clear" w:color="auto" w:fill="FFFFFF"/>
+        </w:rPr>
+        <w:t> y finalmente </w:t>
+      </w:r>
+      <w:r>
+        <w:rPr>
+          <w:rStyle w:val="nfasis"/>
+          <w:rFonts w:ascii="Helvetica Neue" w:hAnsi="Helvetica Neue"/>
+          <w:color w:val="333333"/>
+          <w:spacing w:val="3"/>
+          <w:shd w:val="clear" w:color="auto" w:fill="FFFFFF"/>
+        </w:rPr>
+        <w:t>.</w:t>
+      </w:r>
+      <w:proofErr w:type="spellStart"/>
+      <w:r>
+        <w:rPr>
+          <w:rStyle w:val="nfasis"/>
+          <w:rFonts w:ascii="Helvetica Neue" w:hAnsi="Helvetica Neue"/>
+          <w:color w:val="333333"/>
+          <w:spacing w:val="3"/>
+          <w:shd w:val="clear" w:color="auto" w:fill="FFFFFF"/>
+        </w:rPr>
+        <w:t>fit_predict</w:t>
+      </w:r>
+      <w:proofErr w:type="spellEnd"/>
+      <w:r>
+        <w:rPr>
+          <w:rStyle w:val="nfasis"/>
+          <w:rFonts w:ascii="Helvetica Neue" w:hAnsi="Helvetica Neue"/>
+          <w:color w:val="333333"/>
+          <w:spacing w:val="3"/>
+          <w:shd w:val="clear" w:color="auto" w:fill="FFFFFF"/>
+        </w:rPr>
+        <w:t>()</w:t>
+      </w:r>
+      <w:r>
+        <w:rPr>
+          <w:rFonts w:ascii="Helvetica Neue" w:hAnsi="Helvetica Neue"/>
+          <w:color w:val="333333"/>
+          <w:spacing w:val="3"/>
+          <w:shd w:val="clear" w:color="auto" w:fill="FFFFFF"/>
+        </w:rPr>
+        <w:t> para obtener los grupos. El procedimiento a s</w:t>
+      </w:r>
+      <w:r>
+        <w:rPr>
+          <w:rFonts w:ascii="Helvetica Neue" w:hAnsi="Helvetica Neue"/>
+          <w:color w:val="333333"/>
+          <w:spacing w:val="3"/>
+          <w:shd w:val="clear" w:color="auto" w:fill="FFFFFF"/>
+        </w:rPr>
+        <w:t xml:space="preserve">eguir se presenta a </w:t>
+      </w:r>
+      <w:proofErr w:type="spellStart"/>
+      <w:r>
+        <w:rPr>
+          <w:rFonts w:ascii="Helvetica Neue" w:hAnsi="Helvetica Neue"/>
+          <w:color w:val="333333"/>
+          <w:spacing w:val="3"/>
+          <w:shd w:val="clear" w:color="auto" w:fill="FFFFFF"/>
+        </w:rPr>
+        <w:t>continuació</w:t>
+      </w:r>
+      <w:proofErr w:type="spellEnd"/>
+      <w:r>
+        <w:rPr>
+          <w:rFonts w:ascii="Helvetica" w:hAnsi="Helvetica" w:cs="Helvetica"/>
+          <w:color w:val="333333"/>
+          <w:spacing w:val="3"/>
+          <w:highlight w:val="yellow"/>
+          <w:shd w:val="clear" w:color="auto" w:fill="FFFFFF"/>
+        </w:rPr>
+        <w:t xml:space="preserve"> </w:t>
+      </w:r>
+      <w:r>
+        <w:rPr>
+          <w:rFonts w:ascii="Helvetica" w:hAnsi="Helvetica" w:cs="Helvetica"/>
+          <w:color w:val="333333"/>
+          <w:spacing w:val="3"/>
+          <w:highlight w:val="yellow"/>
+          <w:shd w:val="clear" w:color="auto" w:fill="FFFFFF"/>
+        </w:rPr>
+        <w:t>Obtener los clústeres de los datos</w:t>
+      </w:r>
+    </w:p>
+    <w:p>
+      <w:pPr>
+        <w:rPr>
+          <w:rFonts w:ascii="Helvetica" w:hAnsi="Helvetica" w:cs="Helvetica"/>
+          <w:color w:val="333333"/>
+          <w:spacing w:val="3"/>
+          <w:shd w:val="clear" w:color="auto" w:fill="FFFFFF"/>
+        </w:rPr>
+      </w:pPr>
+    </w:p>
+    <w:p>
+      <w:pPr>
+        <w:pStyle w:val="Ttulo3"/>
+        <w:shd w:val="clear" w:color="auto" w:fill="FFFFFF"/>
+        <w:spacing w:before="306" w:after="204"/>
+        <w:rPr>
+          <w:rFonts w:ascii="Helvetica Neue" w:hAnsi="Helvetica Neue"/>
+          <w:b/>
+          <w:bCs/>
+          <w:color w:val="333333"/>
+          <w:spacing w:val="3"/>
+          <w:sz w:val="36"/>
+          <w:szCs w:val="36"/>
+        </w:rPr>
+      </w:pPr>
+      <w:r>
+        <w:rPr>
+          <w:rStyle w:val="header-section-number"/>
+          <w:rFonts w:ascii="Helvetica Neue" w:hAnsi="Helvetica Neue"/>
+          <w:b/>
+          <w:bCs/>
+          <w:color w:val="333333"/>
+          <w:spacing w:val="3"/>
+          <w:sz w:val="36"/>
+          <w:szCs w:val="36"/>
+        </w:rPr>
+        <w:t>7.4.2</w:t>
+      </w:r>
+      <w:r>
+        <w:rPr>
+          <w:rFonts w:ascii="Helvetica Neue" w:hAnsi="Helvetica Neue"/>
+          <w:b/>
+          <w:bCs/>
+          <w:color w:val="333333"/>
+          <w:spacing w:val="3"/>
+          <w:sz w:val="36"/>
+          <w:szCs w:val="36"/>
+        </w:rPr>
+        <w:t> Cálculo de componentes</w:t>
+      </w:r>
+    </w:p>
+    <w:p/>
+    <w:p>
+      <w:pPr>
+        <w:rPr>
+          <w:highlight w:val="yellow"/>
+        </w:rPr>
+      </w:pPr>
+      <w:r>
+        <w:rPr>
+          <w:highlight w:val="yellow"/>
+        </w:rPr>
+        <w:lastRenderedPageBreak/>
+        <w:t xml:space="preserve">Actualizar códigos a partir de </w:t>
+      </w:r>
+    </w:p>
+    <w:p>
+      <w:r>
+        <w:t>Normalizando los datos</w:t>
+      </w:r>
+    </w:p>
+    <w:p>
+      <w:pPr>
+        <w:rPr>
+          <w:highlight w:val="yellow"/>
+        </w:rPr>
+      </w:pPr>
+      <w:r>
+        <w:rPr>
+          <w:highlight w:val="yellow"/>
+        </w:rPr>
+        <w:t>d = iris[["Sepal.Length","Sepal.Width","Petal.Length","Petal.Width"]]</w:t>
+      </w:r>
+    </w:p>
+    <w:p>
+      <w:pPr>
+        <w:rPr>
+          <w:highlight w:val="yellow"/>
+        </w:rPr>
+      </w:pPr>
+      <w:proofErr w:type="spellStart"/>
+      <w:r>
+        <w:rPr>
+          <w:highlight w:val="yellow"/>
+        </w:rPr>
+        <w:t>from</w:t>
+      </w:r>
+      <w:proofErr w:type="spellEnd"/>
+      <w:r>
+        <w:rPr>
+          <w:highlight w:val="yellow"/>
+        </w:rPr>
+        <w:t xml:space="preserve"> </w:t>
+      </w:r>
+      <w:proofErr w:type="spellStart"/>
+      <w:r>
+        <w:rPr>
+          <w:highlight w:val="yellow"/>
+        </w:rPr>
+        <w:t>sklearn.preprocessing</w:t>
+      </w:r>
+      <w:proofErr w:type="spellEnd"/>
+      <w:r>
+        <w:rPr>
+          <w:highlight w:val="yellow"/>
+        </w:rPr>
+        <w:t xml:space="preserve"> </w:t>
+      </w:r>
+      <w:proofErr w:type="spellStart"/>
+      <w:r>
+        <w:rPr>
+          <w:highlight w:val="yellow"/>
+        </w:rPr>
+        <w:t>import</w:t>
+      </w:r>
+      <w:proofErr w:type="spellEnd"/>
+      <w:r>
+        <w:rPr>
+          <w:highlight w:val="yellow"/>
+        </w:rPr>
+        <w:t xml:space="preserve"> </w:t>
+      </w:r>
+      <w:proofErr w:type="spellStart"/>
+      <w:r>
+        <w:rPr>
+          <w:highlight w:val="yellow"/>
+        </w:rPr>
+        <w:t>scale</w:t>
+      </w:r>
+      <w:proofErr w:type="spellEnd"/>
+    </w:p>
+    <w:p>
+      <w:r>
+        <w:rPr>
+          <w:highlight w:val="yellow"/>
+        </w:rPr>
+        <w:t>data=</w:t>
+      </w:r>
+      <w:proofErr w:type="spellStart"/>
+      <w:r>
+        <w:rPr>
+          <w:highlight w:val="yellow"/>
+        </w:rPr>
+        <w:t>pd.DataFrame</w:t>
+      </w:r>
+      <w:proofErr w:type="spellEnd"/>
+      <w:r>
+        <w:rPr>
+          <w:highlight w:val="yellow"/>
+        </w:rPr>
+        <w:t>(</w:t>
+      </w:r>
+      <w:proofErr w:type="spellStart"/>
+      <w:r>
+        <w:rPr>
+          <w:highlight w:val="yellow"/>
+        </w:rPr>
+        <w:t>scale</w:t>
+      </w:r>
+      <w:proofErr w:type="spellEnd"/>
+      <w:r>
+        <w:rPr>
+          <w:highlight w:val="yellow"/>
+        </w:rPr>
+        <w:t>(d</w:t>
+      </w:r>
       <w:bookmarkStart w:id="0" w:name="_GoBack"/>
       <w:bookmarkEnd w:id="0"/>
       <w:r>
         <w:rPr>
-          <w:rStyle w:val="header-section-number"/>
+          <w:highlight w:val="yellow"/>
+        </w:rPr>
+        <w:t>))</w:t>
+      </w:r>
+    </w:p>
+    <w:p>
+      <w:r>
+        <w:t>Calculando componentes</w:t>
+      </w:r>
+    </w:p>
+    <w:p>
+      <w:pPr>
+        <w:rPr>
+          <w:highlight w:val="yellow"/>
+        </w:rPr>
+      </w:pPr>
+      <w:proofErr w:type="spellStart"/>
+      <w:r>
+        <w:rPr>
+          <w:highlight w:val="yellow"/>
+        </w:rPr>
+        <w:t>from</w:t>
+      </w:r>
+      <w:proofErr w:type="spellEnd"/>
+      <w:r>
+        <w:rPr>
+          <w:highlight w:val="yellow"/>
+        </w:rPr>
+        <w:t xml:space="preserve"> </w:t>
+      </w:r>
+      <w:proofErr w:type="spellStart"/>
+      <w:r>
+        <w:rPr>
+          <w:highlight w:val="yellow"/>
+        </w:rPr>
+        <w:t>sklearn.decomposition</w:t>
+      </w:r>
+      <w:proofErr w:type="spellEnd"/>
+      <w:r>
+        <w:rPr>
+          <w:highlight w:val="yellow"/>
+        </w:rPr>
+        <w:t xml:space="preserve"> </w:t>
+      </w:r>
+      <w:proofErr w:type="spellStart"/>
+      <w:r>
+        <w:rPr>
+          <w:highlight w:val="yellow"/>
+        </w:rPr>
+        <w:t>import</w:t>
+      </w:r>
+      <w:proofErr w:type="spellEnd"/>
+      <w:r>
+        <w:rPr>
+          <w:highlight w:val="yellow"/>
+        </w:rPr>
+        <w:t xml:space="preserve"> PCA</w:t>
+      </w:r>
+    </w:p>
+    <w:p>
+      <w:pPr>
+        <w:rPr>
+          <w:highlight w:val="yellow"/>
+        </w:rPr>
+      </w:pPr>
+      <w:proofErr w:type="spellStart"/>
+      <w:r>
+        <w:rPr>
+          <w:highlight w:val="yellow"/>
+        </w:rPr>
+        <w:t>pca</w:t>
+      </w:r>
+      <w:proofErr w:type="spellEnd"/>
+      <w:r>
+        <w:rPr>
+          <w:highlight w:val="yellow"/>
+        </w:rPr>
+        <w:t>=PCA().</w:t>
+      </w:r>
+      <w:proofErr w:type="spellStart"/>
+      <w:r>
+        <w:rPr>
+          <w:highlight w:val="yellow"/>
+        </w:rPr>
+        <w:t>fit</w:t>
+      </w:r>
+      <w:proofErr w:type="spellEnd"/>
+      <w:r>
+        <w:rPr>
+          <w:highlight w:val="yellow"/>
+        </w:rPr>
+        <w:t>(d)</w:t>
+      </w:r>
+    </w:p>
+    <w:p>
+      <w:proofErr w:type="spellStart"/>
+      <w:r>
+        <w:rPr>
+          <w:highlight w:val="yellow"/>
+        </w:rPr>
+        <w:t>pca_samples</w:t>
+      </w:r>
+      <w:proofErr w:type="spellEnd"/>
+      <w:r>
+        <w:rPr>
+          <w:highlight w:val="yellow"/>
+        </w:rPr>
+        <w:t>=</w:t>
+      </w:r>
+      <w:proofErr w:type="spellStart"/>
+      <w:r>
+        <w:rPr>
+          <w:highlight w:val="yellow"/>
+        </w:rPr>
+        <w:t>pca.transform</w:t>
+      </w:r>
+      <w:proofErr w:type="spellEnd"/>
+      <w:r>
+        <w:rPr>
+          <w:highlight w:val="yellow"/>
+        </w:rPr>
+        <w:t>(d)</w:t>
+      </w:r>
+    </w:p>
+    <w:p>
+      <w:pPr>
+        <w:shd w:val="clear" w:color="auto" w:fill="FFFFFF"/>
+        <w:spacing w:before="306" w:after="204" w:line="240" w:lineRule="auto"/>
+        <w:jc w:val="left"/>
+        <w:outlineLvl w:val="2"/>
+        <w:rPr>
+          <w:rFonts w:ascii="Helvetica Neue" w:eastAsia="Times New Roman" w:hAnsi="Helvetica Neue" w:cs="Times New Roman"/>
+          <w:color w:val="333333"/>
+          <w:spacing w:val="3"/>
+          <w:sz w:val="36"/>
+          <w:szCs w:val="36"/>
+          <w:lang w:eastAsia="es-VE"/>
+        </w:rPr>
+      </w:pPr>
+      <w:r>
+        <w:rPr>
+          <w:rFonts w:ascii="Helvetica Neue" w:eastAsia="Times New Roman" w:hAnsi="Helvetica Neue" w:cs="Times New Roman"/>
+          <w:color w:val="333333"/>
+          <w:spacing w:val="3"/>
+          <w:sz w:val="36"/>
+          <w:szCs w:val="36"/>
+          <w:lang w:eastAsia="es-VE"/>
+        </w:rPr>
+        <w:t>7.4.3 Funciones Gráficas</w:t>
+      </w:r>
+    </w:p>
+    <w:p>
+      <w:pPr>
+        <w:shd w:val="clear" w:color="auto" w:fill="FFFFFF"/>
+        <w:spacing w:before="306" w:after="204" w:line="240" w:lineRule="auto"/>
+        <w:jc w:val="left"/>
+        <w:outlineLvl w:val="2"/>
+        <w:rPr>
+          <w:rFonts w:ascii="Helvetica Neue" w:eastAsia="Times New Roman" w:hAnsi="Helvetica Neue" w:cs="Times New Roman"/>
+          <w:color w:val="333333"/>
+          <w:spacing w:val="3"/>
+          <w:sz w:val="36"/>
+          <w:szCs w:val="36"/>
+          <w:lang w:eastAsia="es-VE"/>
+        </w:rPr>
+      </w:pPr>
+      <w:r>
+        <w:rPr>
+          <w:rFonts w:ascii="Helvetica Neue" w:eastAsia="Times New Roman" w:hAnsi="Helvetica Neue" w:cs="Times New Roman"/>
+          <w:color w:val="333333"/>
+          <w:spacing w:val="3"/>
+          <w:sz w:val="36"/>
+          <w:szCs w:val="36"/>
+          <w:lang w:eastAsia="es-VE"/>
+        </w:rPr>
+        <w:t>Función para graficar componentes</w:t>
+      </w:r>
+    </w:p>
+    <w:p>
+      <w:pPr>
+        <w:shd w:val="clear" w:color="auto" w:fill="FFFFFF"/>
+        <w:spacing w:before="306" w:after="204" w:line="240" w:lineRule="auto"/>
+        <w:jc w:val="left"/>
+        <w:outlineLvl w:val="2"/>
+        <w:rPr>
+          <w:rFonts w:ascii="Helvetica Neue" w:eastAsia="Times New Roman" w:hAnsi="Helvetica Neue" w:cs="Times New Roman"/>
+          <w:color w:val="333333"/>
+          <w:spacing w:val="3"/>
+          <w:sz w:val="36"/>
+          <w:szCs w:val="36"/>
+          <w:lang w:eastAsia="es-VE"/>
+        </w:rPr>
+      </w:pPr>
+      <w:r>
+        <w:rPr>
+          <w:rFonts w:ascii="Helvetica Neue" w:eastAsia="Times New Roman" w:hAnsi="Helvetica Neue" w:cs="Times New Roman"/>
+          <w:color w:val="333333"/>
+          <w:spacing w:val="3"/>
+          <w:sz w:val="36"/>
+          <w:szCs w:val="36"/>
+          <w:highlight w:val="yellow"/>
+          <w:lang w:eastAsia="es-VE"/>
+        </w:rPr>
+        <w:t>Actualizar códigos</w:t>
+      </w:r>
+    </w:p>
+    <w:p>
+      <w:pPr>
+        <w:shd w:val="clear" w:color="auto" w:fill="FFFFFF"/>
+        <w:spacing w:before="306" w:after="204" w:line="240" w:lineRule="auto"/>
+        <w:jc w:val="left"/>
+        <w:outlineLvl w:val="2"/>
+        <w:rPr>
+          <w:rFonts w:ascii="Helvetica Neue" w:eastAsia="Times New Roman" w:hAnsi="Helvetica Neue" w:cs="Times New Roman"/>
+          <w:color w:val="333333"/>
+          <w:spacing w:val="3"/>
+          <w:sz w:val="36"/>
+          <w:szCs w:val="36"/>
+          <w:lang w:eastAsia="es-VE"/>
+        </w:rPr>
+      </w:pPr>
+    </w:p>
+    <w:p>
+      <w:pPr>
+        <w:pStyle w:val="Ttulo3"/>
+        <w:shd w:val="clear" w:color="auto" w:fill="FFFFFF"/>
+        <w:spacing w:before="306" w:after="204"/>
+        <w:rPr>
+          <w:rStyle w:val="nfasis"/>
           <w:rFonts w:ascii="Helvetica Neue" w:hAnsi="Helvetica Neue"/>
           <w:b/>
           <w:bCs/>
@@ -3948,12 +4979,11 @@
           <w:spacing w:val="3"/>
           <w:sz w:val="36"/>
           <w:szCs w:val="36"/>
-          <w:highlight w:val="yellow"/>
-        </w:rPr>
-        <w:t>6.6.2</w:t>
-      </w:r>
-      <w:r>
-        <w:rPr>
+        </w:rPr>
+      </w:pPr>
+      <w:r>
+        <w:rPr>
+          <w:rStyle w:val="header-section-number"/>
           <w:rFonts w:ascii="Helvetica Neue" w:hAnsi="Helvetica Neue"/>
           <w:b/>
           <w:bCs/>
@@ -3961,20 +4991,225 @@
           <w:spacing w:val="3"/>
           <w:sz w:val="36"/>
           <w:szCs w:val="36"/>
-          <w:highlight w:val="yellow"/>
-        </w:rPr>
-        <w:t> Método jerárquico.</w:t>
-      </w:r>
-    </w:p>
-    <w:p>
-      <w:pPr>
-        <w:rPr>
-          <w:rFonts w:ascii="Helvetica" w:hAnsi="Helvetica" w:cs="Helvetica"/>
-          <w:color w:val="333333"/>
-          <w:spacing w:val="3"/>
-          <w:shd w:val="clear" w:color="auto" w:fill="FFFFFF"/>
-        </w:rPr>
-      </w:pPr>
+        </w:rPr>
+        <w:t>8.1.2</w:t>
+      </w:r>
+      <w:r>
+        <w:rPr>
+          <w:rFonts w:ascii="Helvetica Neue" w:hAnsi="Helvetica Neue"/>
+          <w:b/>
+          <w:bCs/>
+          <w:color w:val="333333"/>
+          <w:spacing w:val="3"/>
+          <w:sz w:val="36"/>
+          <w:szCs w:val="36"/>
+        </w:rPr>
+        <w:t> Árboles de decisión en </w:t>
+      </w:r>
+      <w:r>
+        <w:rPr>
+          <w:rStyle w:val="nfasis"/>
+          <w:rFonts w:ascii="Helvetica Neue" w:hAnsi="Helvetica Neue"/>
+          <w:b/>
+          <w:bCs/>
+          <w:color w:val="333333"/>
+          <w:spacing w:val="3"/>
+          <w:sz w:val="36"/>
+          <w:szCs w:val="36"/>
+        </w:rPr>
+        <w:t>Python</w:t>
+      </w:r>
+    </w:p>
+    <w:p>
+      <w:r>
+        <w:t>Corregir código en Construcción del modelo</w:t>
+      </w:r>
+    </w:p>
+    <w:p>
+      <w:proofErr w:type="spellStart"/>
+      <w:r>
+        <w:t>Arbol</w:t>
+      </w:r>
+      <w:proofErr w:type="spellEnd"/>
+      <w:r>
+        <w:t xml:space="preserve"> =</w:t>
+      </w:r>
+      <w:proofErr w:type="spellStart"/>
+      <w:r>
+        <w:t>DecisionTreeClassifier</w:t>
+      </w:r>
+      <w:proofErr w:type="spellEnd"/>
+      <w:r>
+        <w:t>()</w:t>
+      </w:r>
+    </w:p>
+    <w:p>
+      <w:proofErr w:type="spellStart"/>
+      <w:r>
+        <w:t>Arbol</w:t>
+      </w:r>
+      <w:proofErr w:type="spellEnd"/>
+      <w:r>
+        <w:t xml:space="preserve"> = </w:t>
+      </w:r>
+      <w:proofErr w:type="spellStart"/>
+      <w:r>
+        <w:t>Arbol.fit</w:t>
+      </w:r>
+      <w:proofErr w:type="spellEnd"/>
+      <w:r>
+        <w:t>(</w:t>
+      </w:r>
+      <w:proofErr w:type="spellStart"/>
+      <w:r>
+        <w:rPr>
+          <w:highlight w:val="yellow"/>
+        </w:rPr>
+        <w:t>predictores,objetivo</w:t>
+      </w:r>
+      <w:proofErr w:type="spellEnd"/>
+      <w:r>
+        <w:t>)</w:t>
+      </w:r>
+    </w:p>
+    <w:p/>
+    <w:p>
+      <w:pPr>
+        <w:pStyle w:val="Ttulo2"/>
+        <w:shd w:val="clear" w:color="auto" w:fill="FFFFFF"/>
+        <w:spacing w:before="306" w:beforeAutospacing="0" w:after="204" w:afterAutospacing="0"/>
+        <w:rPr>
+          <w:rFonts w:ascii="Helvetica Neue" w:hAnsi="Helvetica Neue"/>
+          <w:b w:val="0"/>
+          <w:bCs w:val="0"/>
+          <w:color w:val="333333"/>
+          <w:spacing w:val="3"/>
+          <w:sz w:val="42"/>
+          <w:szCs w:val="42"/>
+        </w:rPr>
+      </w:pPr>
+      <w:r>
+        <w:rPr>
+          <w:rStyle w:val="header-section-number"/>
+          <w:rFonts w:ascii="Helvetica Neue" w:hAnsi="Helvetica Neue"/>
+          <w:b w:val="0"/>
+          <w:bCs w:val="0"/>
+          <w:color w:val="333333"/>
+          <w:spacing w:val="3"/>
+          <w:sz w:val="42"/>
+          <w:szCs w:val="42"/>
+        </w:rPr>
+        <w:t>8.4</w:t>
+      </w:r>
+      <w:r>
+        <w:rPr>
+          <w:rFonts w:ascii="Helvetica Neue" w:hAnsi="Helvetica Neue"/>
+          <w:b w:val="0"/>
+          <w:bCs w:val="0"/>
+          <w:color w:val="333333"/>
+          <w:spacing w:val="3"/>
+          <w:sz w:val="42"/>
+          <w:szCs w:val="42"/>
+        </w:rPr>
+        <w:t> Bosques aleatorios en </w:t>
+      </w:r>
+      <w:r>
+        <w:rPr>
+          <w:rStyle w:val="nfasis"/>
+          <w:rFonts w:ascii="Helvetica Neue" w:hAnsi="Helvetica Neue"/>
+          <w:b w:val="0"/>
+          <w:bCs w:val="0"/>
+          <w:color w:val="333333"/>
+          <w:spacing w:val="3"/>
+          <w:sz w:val="42"/>
+          <w:szCs w:val="42"/>
+        </w:rPr>
+        <w:t>Python</w:t>
+      </w:r>
+    </w:p>
+    <w:p>
+      <w:r>
+        <w:rPr>
+          <w:rFonts w:ascii="Helvetica Neue" w:hAnsi="Helvetica Neue"/>
+          <w:color w:val="333333"/>
+          <w:spacing w:val="3"/>
+          <w:shd w:val="clear" w:color="auto" w:fill="FFFFFF"/>
+        </w:rPr>
+        <w:t>Usaremos de igual manera la librería </w:t>
+      </w:r>
+      <w:proofErr w:type="spellStart"/>
+      <w:r>
+        <w:rPr>
+          <w:rStyle w:val="nfasis"/>
+          <w:rFonts w:ascii="Helvetica Neue" w:hAnsi="Helvetica Neue"/>
+          <w:color w:val="333333"/>
+          <w:spacing w:val="3"/>
+          <w:highlight w:val="yellow"/>
+          <w:shd w:val="clear" w:color="auto" w:fill="FFFFFF"/>
+        </w:rPr>
+        <w:t>sklearn</w:t>
+      </w:r>
+      <w:proofErr w:type="spellEnd"/>
+      <w:r>
+        <w:rPr>
+          <w:rFonts w:ascii="Helvetica Neue" w:hAnsi="Helvetica Neue"/>
+          <w:color w:val="333333"/>
+          <w:spacing w:val="3"/>
+          <w:shd w:val="clear" w:color="auto" w:fill="FFFFFF"/>
+        </w:rPr>
+        <w:t>, a modo de conocimiento cargaremos los datos </w:t>
+      </w:r>
+      <w:r>
+        <w:rPr>
+          <w:rStyle w:val="nfasis"/>
+          <w:rFonts w:ascii="Helvetica Neue" w:hAnsi="Helvetica Neue"/>
+          <w:color w:val="333333"/>
+          <w:spacing w:val="3"/>
+          <w:shd w:val="clear" w:color="auto" w:fill="FFFFFF"/>
+        </w:rPr>
+        <w:t>iris</w:t>
+      </w:r>
+      <w:r>
+        <w:rPr>
+          <w:rFonts w:ascii="Helvetica Neue" w:hAnsi="Helvetica Neue"/>
+          <w:color w:val="333333"/>
+          <w:spacing w:val="3"/>
+          <w:shd w:val="clear" w:color="auto" w:fill="FFFFFF"/>
+        </w:rPr>
+        <w:t> desde </w:t>
+      </w:r>
+      <w:proofErr w:type="spellStart"/>
+      <w:r>
+        <w:rPr>
+          <w:rStyle w:val="nfasis"/>
+          <w:rFonts w:ascii="Helvetica Neue" w:hAnsi="Helvetica Neue"/>
+          <w:color w:val="333333"/>
+          <w:spacing w:val="3"/>
+          <w:highlight w:val="yellow"/>
+          <w:shd w:val="clear" w:color="auto" w:fill="FFFFFF"/>
+        </w:rPr>
+        <w:t>sklear</w:t>
+      </w:r>
+      <w:r>
+        <w:rPr>
+          <w:rStyle w:val="nfasis"/>
+          <w:rFonts w:ascii="Helvetica Neue" w:hAnsi="Helvetica Neue"/>
+          <w:color w:val="333333"/>
+          <w:spacing w:val="3"/>
+          <w:shd w:val="clear" w:color="auto" w:fill="FFFFFF"/>
+        </w:rPr>
+        <w:t>n</w:t>
+      </w:r>
+      <w:proofErr w:type="spellEnd"/>
+      <w:r>
+        <w:rPr>
+          <w:rFonts w:ascii="Helvetica Neue" w:hAnsi="Helvetica Neue"/>
+          <w:color w:val="333333"/>
+          <w:spacing w:val="3"/>
+          <w:shd w:val="clear" w:color="auto" w:fill="FFFFFF"/>
+        </w:rPr>
+        <w:t>, pero tendremos que hacerles unas modificaciones previas de la siguiente forma:</w:t>
+      </w:r>
     </w:p>
     <w:sectPr>
       <w:pgSz w:w="12240" w:h="15840"/>
@@ -12089,7 +13324,7 @@
 </file>
 
 <file path=customXml/itemProps1.xml><?xml version="1.0" encoding="utf-8"?>
-<ds:datastoreItem xmlns:ds="http://schemas.openxmlformats.org/officeDocument/2006/customXml" ds:itemID="{18ED12B6-1C5E-4062-BDA9-C1CA23A6485B}">
+<ds:datastoreItem xmlns:ds="http://schemas.openxmlformats.org/officeDocument/2006/customXml" ds:itemID="{8F78AEC3-D1F6-44BC-865E-1FA7FD014EDD}">
   <ds:schemaRefs>
     <ds:schemaRef ds:uri="http://schemas.openxmlformats.org/officeDocument/2006/bibliography"/>
   </ds:schemaRefs>

</xml_diff>

<commit_message>
Culminada Introducción. Se incluyò tabla de bases de datos utilizadas. Solo falta indicar dónde reposarán los código de R y Phyton.
</commit_message>
<xml_diff>
--- a/bookdown/Observaciones de Bernardo 17-6-19.docx
+++ b/bookdown/Observaciones de Bernardo 17-6-19.docx
@@ -288,7 +288,13 @@
         <w:rPr>
           <w:lang w:eastAsia="es-VE"/>
         </w:rPr>
-        <w:t xml:space="preserve"> los datos llegan en una policromía de</w:t>
+        <w:t xml:space="preserve"> los datos fluyen</w:t>
+      </w:r>
+      <w:r>
+        <w:rPr>
+          <w:lang w:eastAsia="es-VE"/>
+        </w:rPr>
+        <w:t xml:space="preserve"> en una policromía de</w:t>
       </w:r>
       <w:r>
         <w:rPr>
@@ -332,19 +338,7 @@
         <w:rPr>
           <w:lang w:eastAsia="es-VE"/>
         </w:rPr>
-        <w:t xml:space="preserve">A esta enorme cantidad de datos </w:t>
-      </w:r>
-      <w:r>
-        <w:rPr>
-          <w:lang w:eastAsia="es-VE"/>
-        </w:rPr>
-        <w:t>se le conoce</w:t>
-      </w:r>
-      <w:r>
-        <w:rPr>
-          <w:lang w:eastAsia="es-VE"/>
-        </w:rPr>
-        <w:t xml:space="preserve"> como </w:t>
+        <w:t xml:space="preserve">A esta enorme cantidad de datos se le conoce como </w:t>
       </w:r>
       <w:r>
         <w:rPr>
@@ -357,13 +351,7 @@
         <w:rPr>
           <w:lang w:eastAsia="es-VE"/>
         </w:rPr>
-        <w:t xml:space="preserve">, </w:t>
-      </w:r>
-      <w:r>
-        <w:rPr>
-          <w:lang w:eastAsia="es-VE"/>
-        </w:rPr>
-        <w:t>y</w:t>
+        <w:t>, y</w:t>
       </w:r>
       <w:r>
         <w:rPr>
@@ -476,7 +464,25 @@
         <w:rPr>
           <w:lang w:eastAsia="es-VE"/>
         </w:rPr>
-        <w:t xml:space="preserve"> y  e</w:t>
+        <w:t xml:space="preserve"> y </w:t>
+      </w:r>
+      <w:r>
+        <w:rPr>
+          <w:lang w:eastAsia="es-VE"/>
+        </w:rPr>
+        <w:t>la tecnología clave para esta tarea</w:t>
+      </w:r>
+      <w:r>
+        <w:rPr>
+          <w:lang w:eastAsia="es-VE"/>
+        </w:rPr>
+        <w:t xml:space="preserve"> es </w:t>
+      </w:r>
+      <w:r>
+        <w:rPr>
+          <w:lang w:eastAsia="es-VE"/>
+        </w:rPr>
+        <w:t>e</w:t>
       </w:r>
       <w:r>
         <w:rPr>
@@ -501,25 +507,7 @@
         <w:rPr>
           <w:lang w:eastAsia="es-VE"/>
         </w:rPr>
-        <w:t xml:space="preserve">o aprendizaje automático, </w:t>
-      </w:r>
-      <w:r>
-        <w:rPr>
-          <w:lang w:eastAsia="es-VE"/>
-        </w:rPr>
-        <w:t>es la</w:t>
-      </w:r>
-      <w:r>
-        <w:rPr>
-          <w:lang w:eastAsia="es-VE"/>
-        </w:rPr>
-        <w:t xml:space="preserve"> tecnología </w:t>
-      </w:r>
-      <w:r>
-        <w:rPr>
-          <w:lang w:eastAsia="es-VE"/>
-        </w:rPr>
-        <w:t>clave para esta tarea</w:t>
+        <w:t>o aprendizaje automático</w:t>
       </w:r>
       <w:r>
         <w:rPr>
@@ -563,6 +551,47 @@
         <w:rPr>
           <w:lang w:eastAsia="es-VE"/>
         </w:rPr>
+        <w:t xml:space="preserve">es parte de la </w:t>
+      </w:r>
+      <w:r>
+        <w:rPr>
+          <w:i/>
+          <w:lang w:eastAsia="es-VE"/>
+        </w:rPr>
+        <w:t>Ciencia de Datos</w:t>
+      </w:r>
+      <w:r>
+        <w:rPr>
+          <w:lang w:eastAsia="es-VE"/>
+        </w:rPr>
+        <w:t xml:space="preserve"> o </w:t>
+      </w:r>
+      <w:r>
+        <w:rPr>
+          <w:i/>
+          <w:lang w:eastAsia="es-VE"/>
+        </w:rPr>
+        <w:t xml:space="preserve">Data </w:t>
+      </w:r>
+      <w:proofErr w:type="spellStart"/>
+      <w:r>
+        <w:rPr>
+          <w:i/>
+          <w:lang w:eastAsia="es-VE"/>
+        </w:rPr>
+        <w:t>Science</w:t>
+      </w:r>
+      <w:proofErr w:type="spellEnd"/>
+      <w:r>
+        <w:rPr>
+          <w:lang w:eastAsia="es-VE"/>
+        </w:rPr>
+        <w:t xml:space="preserve"> y </w:t>
+      </w:r>
+      <w:r>
+        <w:rPr>
+          <w:lang w:eastAsia="es-VE"/>
+        </w:rPr>
         <w:t>fue creado</w:t>
       </w:r>
       <w:r>
@@ -599,7 +628,7 @@
         <w:rPr>
           <w:lang w:eastAsia="es-VE"/>
         </w:rPr>
-        <w:t xml:space="preserve"> estrategias </w:t>
+        <w:t xml:space="preserve">estrategias </w:t>
       </w:r>
       <w:r>
         <w:rPr>
@@ -665,43 +694,7 @@
         <w:rPr>
           <w:lang w:eastAsia="es-VE"/>
         </w:rPr>
-        <w:t xml:space="preserve"> se debe a </w:t>
-      </w:r>
-      <w:r>
-        <w:rPr>
-          <w:lang w:eastAsia="es-VE"/>
-        </w:rPr>
-        <w:t xml:space="preserve">dos factores: </w:t>
-      </w:r>
-      <w:r>
-        <w:rPr>
-          <w:lang w:eastAsia="es-VE"/>
-        </w:rPr>
-        <w:t xml:space="preserve">el primero es </w:t>
-      </w:r>
-      <w:r>
-        <w:rPr>
-          <w:lang w:eastAsia="es-VE"/>
-        </w:rPr>
-        <w:t xml:space="preserve">la </w:t>
-      </w:r>
-      <w:r>
-        <w:rPr>
-          <w:lang w:eastAsia="es-VE"/>
-        </w:rPr>
-        <w:t xml:space="preserve">ya comentada </w:t>
-      </w:r>
-      <w:r>
-        <w:rPr>
-          <w:lang w:eastAsia="es-VE"/>
-        </w:rPr>
-        <w:t xml:space="preserve">accesibilidad a grandes volúmenes de información y </w:t>
-      </w:r>
-      <w:r>
-        <w:rPr>
-          <w:lang w:eastAsia="es-VE"/>
-        </w:rPr>
-        <w:t>el segundo</w:t>
+        <w:t xml:space="preserve"> se debe a dos factores: el primero es la ya comentada accesibilidad a grandes volúmenes de información y el segundo</w:t>
       </w:r>
       <w:r>
         <w:rPr>
@@ -713,13 +706,7 @@
         <w:rPr>
           <w:lang w:eastAsia="es-VE"/>
         </w:rPr>
-        <w:t xml:space="preserve"> es </w:t>
-      </w:r>
-      <w:r>
-        <w:rPr>
-          <w:lang w:eastAsia="es-VE"/>
-        </w:rPr>
-        <w:t xml:space="preserve">la aparición de herramientas computacionales para manejarlos </w:t>
+        <w:t xml:space="preserve"> es la aparición de herramientas computacionales para manejarlos </w:t>
       </w:r>
       <w:r>
         <w:rPr>
@@ -731,6 +718,12 @@
         <w:rPr>
           <w:lang w:eastAsia="es-VE"/>
         </w:rPr>
+        <w:t xml:space="preserve"> y con tecnologías asequibles</w:t>
+      </w:r>
+      <w:r>
+        <w:rPr>
+          <w:lang w:eastAsia="es-VE"/>
+        </w:rPr>
         <w:t>,</w:t>
       </w:r>
       <w:r>
@@ -755,19 +748,7 @@
         <w:rPr>
           <w:lang w:eastAsia="es-VE"/>
         </w:rPr>
-        <w:t>código abierto</w:t>
-      </w:r>
-      <w:r>
-        <w:rPr>
-          <w:lang w:eastAsia="es-VE"/>
-        </w:rPr>
-        <w:t xml:space="preserve"> como R y Python.</w:t>
-      </w:r>
-      <w:r>
-        <w:rPr>
-          <w:lang w:eastAsia="es-VE"/>
-        </w:rPr>
-        <w:t xml:space="preserve"> </w:t>
+        <w:t xml:space="preserve">código abierto como R y Python. </w:t>
       </w:r>
     </w:p>
     <w:p>
@@ -878,6 +859,7 @@
         <w:rPr>
           <w:lang w:eastAsia="es-VE"/>
         </w:rPr>
+        <w:lastRenderedPageBreak/>
         <w:t>Aparte</w:t>
       </w:r>
       <w:r>
@@ -952,7 +934,6 @@
         <w:rPr>
           <w:lang w:eastAsia="es-VE"/>
         </w:rPr>
-        <w:lastRenderedPageBreak/>
         <w:t>se encuent</w:t>
       </w:r>
       <w:r>
@@ -1471,31 +1452,61 @@
         <w:rPr>
           <w:lang w:eastAsia="es-VE"/>
         </w:rPr>
-        <w:t>aprendizaje supervisado</w:t>
-      </w:r>
-      <w:r>
-        <w:rPr>
-          <w:lang w:eastAsia="es-VE"/>
-        </w:rPr>
-        <w:t>,</w:t>
-      </w:r>
+        <w:t xml:space="preserve">aprendizaje supervisado, </w:t>
+      </w:r>
+      <w:proofErr w:type="spellStart"/>
+      <w:r>
+        <w:rPr>
+          <w:i/>
+          <w:lang w:eastAsia="es-VE"/>
+        </w:rPr>
+        <w:t>unsupervised</w:t>
+      </w:r>
+      <w:proofErr w:type="spellEnd"/>
       <w:r>
         <w:rPr>
           <w:lang w:eastAsia="es-VE"/>
         </w:rPr>
         <w:t xml:space="preserve"> </w:t>
       </w:r>
+      <w:r>
+        <w:rPr>
+          <w:i/>
+          <w:lang w:eastAsia="es-VE"/>
+        </w:rPr>
+        <w:t>l</w:t>
+      </w:r>
+      <w:r>
+        <w:rPr>
+          <w:i/>
+          <w:lang w:eastAsia="es-VE"/>
+        </w:rPr>
+        <w:t>earning</w:t>
+      </w:r>
+      <w:r>
+        <w:rPr>
+          <w:lang w:eastAsia="es-VE"/>
+        </w:rPr>
+        <w:t xml:space="preserve"> o aprendizaje no supervisado, y</w:t>
+      </w:r>
+      <w:r>
+        <w:rPr>
+          <w:lang w:eastAsia="es-VE"/>
+        </w:rPr>
+        <w:t xml:space="preserve"> </w:t>
+      </w:r>
       <w:proofErr w:type="spellStart"/>
       <w:r>
         <w:rPr>
           <w:i/>
           <w:lang w:eastAsia="es-VE"/>
         </w:rPr>
-        <w:t>unsupervised</w:t>
+        <w:t>reinforcement</w:t>
       </w:r>
       <w:proofErr w:type="spellEnd"/>
       <w:r>
         <w:rPr>
+          <w:i/>
           <w:lang w:eastAsia="es-VE"/>
         </w:rPr>
         <w:t xml:space="preserve"> </w:t>
@@ -1518,19 +1529,7 @@
         <w:rPr>
           <w:lang w:eastAsia="es-VE"/>
         </w:rPr>
-        <w:t xml:space="preserve"> o </w:t>
-      </w:r>
-      <w:r>
-        <w:rPr>
-          <w:lang w:eastAsia="es-VE"/>
-        </w:rPr>
-        <w:t>aprendizaje no supervisado</w:t>
-      </w:r>
-      <w:r>
-        <w:rPr>
-          <w:lang w:eastAsia="es-VE"/>
-        </w:rPr>
-        <w:t>, y</w:t>
+        <w:t xml:space="preserve"> o</w:t>
       </w:r>
       <w:r>
         <w:rPr>
@@ -1538,59 +1537,11 @@
         </w:rPr>
         <w:t xml:space="preserve"> </w:t>
       </w:r>
-      <w:proofErr w:type="spellStart"/>
-      <w:r>
-        <w:rPr>
-          <w:i/>
-          <w:lang w:eastAsia="es-VE"/>
-        </w:rPr>
-        <w:t>reinforcement</w:t>
-      </w:r>
-      <w:proofErr w:type="spellEnd"/>
-      <w:r>
-        <w:rPr>
-          <w:i/>
-          <w:lang w:eastAsia="es-VE"/>
-        </w:rPr>
-        <w:t xml:space="preserve"> </w:t>
-      </w:r>
-      <w:r>
-        <w:rPr>
-          <w:i/>
-          <w:lang w:eastAsia="es-VE"/>
-        </w:rPr>
-        <w:t>l</w:t>
-      </w:r>
-      <w:r>
-        <w:rPr>
-          <w:i/>
-          <w:lang w:eastAsia="es-VE"/>
-        </w:rPr>
-        <w:t>earning</w:t>
-      </w:r>
-      <w:r>
-        <w:rPr>
-          <w:lang w:eastAsia="es-VE"/>
-        </w:rPr>
-        <w:t xml:space="preserve"> o</w:t>
-      </w:r>
-      <w:r>
-        <w:rPr>
-          <w:lang w:eastAsia="es-VE"/>
-        </w:rPr>
-        <w:t xml:space="preserve"> </w:t>
-      </w:r>
-      <w:r>
-        <w:rPr>
-          <w:lang w:eastAsia="es-VE"/>
-        </w:rPr>
-        <w:t xml:space="preserve">aprendizaje </w:t>
-      </w:r>
-      <w:r>
-        <w:rPr>
-          <w:lang w:eastAsia="es-VE"/>
-        </w:rPr>
-        <w:t>reforzado</w:t>
+      <w:r>
+        <w:rPr>
+          <w:lang w:eastAsia="es-VE"/>
+        </w:rPr>
+        <w:t>aprendizaje reforzado</w:t>
       </w:r>
       <w:r>
         <w:rPr>
@@ -1655,6 +1606,333 @@
         <w:rPr>
           <w:lang w:eastAsia="es-VE"/>
         </w:rPr>
+        <w:t xml:space="preserve">, </w:t>
+      </w:r>
+      <w:r>
+        <w:rPr>
+          <w:lang w:eastAsia="es-VE"/>
+        </w:rPr>
+        <w:t xml:space="preserve">en </w:t>
+      </w:r>
+      <w:r>
+        <w:rPr>
+          <w:lang w:eastAsia="es-VE"/>
+        </w:rPr>
+        <w:t>el cual una computadora aprende de un usuario a través de preguntas y respuestas. L</w:t>
+      </w:r>
+      <w:r>
+        <w:rPr>
+          <w:lang w:eastAsia="es-VE"/>
+        </w:rPr>
+        <w:t>a computadora aprende a</w:t>
+      </w:r>
+      <w:r>
+        <w:rPr>
+          <w:lang w:eastAsia="es-VE"/>
+        </w:rPr>
+        <w:t xml:space="preserve"> </w:t>
+      </w:r>
+      <w:r>
+        <w:rPr>
+          <w:lang w:eastAsia="es-VE"/>
+        </w:rPr>
+        <w:t>vincular una pregunta con</w:t>
+      </w:r>
+      <w:r>
+        <w:rPr>
+          <w:lang w:eastAsia="es-VE"/>
+        </w:rPr>
+        <w:t xml:space="preserve"> su r</w:t>
+      </w:r>
+      <w:r>
+        <w:rPr>
+          <w:lang w:eastAsia="es-VE"/>
+        </w:rPr>
+        <w:t>espuesta a partir de muestras a</w:t>
+      </w:r>
+      <w:r>
+        <w:rPr>
+          <w:lang w:eastAsia="es-VE"/>
+        </w:rPr>
+        <w:t xml:space="preserve">pareadas de preguntas y respuestas. El objetivo es </w:t>
+      </w:r>
+      <w:r>
+        <w:rPr>
+          <w:lang w:eastAsia="es-VE"/>
+        </w:rPr>
+        <w:t xml:space="preserve">que la computadora </w:t>
+      </w:r>
+      <w:r>
+        <w:rPr>
+          <w:lang w:eastAsia="es-VE"/>
+        </w:rPr>
+        <w:t>adqui</w:t>
+      </w:r>
+      <w:r>
+        <w:rPr>
+          <w:lang w:eastAsia="es-VE"/>
+        </w:rPr>
+        <w:t>era</w:t>
+      </w:r>
+      <w:r>
+        <w:rPr>
+          <w:lang w:eastAsia="es-VE"/>
+        </w:rPr>
+        <w:t xml:space="preserve"> la capacidad de generalización, </w:t>
+      </w:r>
+      <w:r>
+        <w:rPr>
+          <w:lang w:eastAsia="es-VE"/>
+        </w:rPr>
+        <w:t>generando</w:t>
+      </w:r>
+      <w:r>
+        <w:rPr>
+          <w:lang w:eastAsia="es-VE"/>
+        </w:rPr>
+        <w:t xml:space="preserve"> una respuesta apropiada </w:t>
+      </w:r>
+      <w:r>
+        <w:rPr>
+          <w:lang w:eastAsia="es-VE"/>
+        </w:rPr>
+        <w:t xml:space="preserve">a preguntas </w:t>
+      </w:r>
+      <w:r>
+        <w:rPr>
+          <w:lang w:eastAsia="es-VE"/>
+        </w:rPr>
+        <w:t xml:space="preserve">no </w:t>
+      </w:r>
+      <w:r>
+        <w:rPr>
+          <w:lang w:eastAsia="es-VE"/>
+        </w:rPr>
+        <w:t>aprendidas</w:t>
+      </w:r>
+      <w:r>
+        <w:rPr>
+          <w:lang w:eastAsia="es-VE"/>
+        </w:rPr>
+        <w:t>.</w:t>
+      </w:r>
+      <w:r>
+        <w:rPr>
+          <w:lang w:eastAsia="es-VE"/>
+        </w:rPr>
+        <w:t xml:space="preserve"> </w:t>
+      </w:r>
+      <w:r>
+        <w:rPr>
+          <w:lang w:eastAsia="es-VE"/>
+        </w:rPr>
+        <w:t>De este modo, el usuario no tiene que enseñarle todo a</w:t>
+      </w:r>
+      <w:r>
+        <w:rPr>
+          <w:lang w:eastAsia="es-VE"/>
+        </w:rPr>
+        <w:t xml:space="preserve"> </w:t>
+      </w:r>
+      <w:r>
+        <w:rPr>
+          <w:lang w:eastAsia="es-VE"/>
+        </w:rPr>
+        <w:t>l</w:t>
+      </w:r>
+      <w:r>
+        <w:rPr>
+          <w:lang w:eastAsia="es-VE"/>
+        </w:rPr>
+        <w:t>a</w:t>
+      </w:r>
+      <w:r>
+        <w:rPr>
+          <w:lang w:eastAsia="es-VE"/>
+        </w:rPr>
+        <w:t xml:space="preserve"> </w:t>
+      </w:r>
+      <w:r>
+        <w:rPr>
+          <w:lang w:eastAsia="es-VE"/>
+        </w:rPr>
+        <w:t>computadora</w:t>
+      </w:r>
+      <w:r>
+        <w:rPr>
+          <w:lang w:eastAsia="es-VE"/>
+        </w:rPr>
+        <w:t xml:space="preserve">, sino </w:t>
+      </w:r>
+      <w:r>
+        <w:rPr>
+          <w:lang w:eastAsia="es-VE"/>
+        </w:rPr>
+        <w:t>que ella</w:t>
+      </w:r>
+      <w:r>
+        <w:rPr>
+          <w:lang w:eastAsia="es-VE"/>
+        </w:rPr>
+        <w:t xml:space="preserve"> puede hacer frente automáticamente a situaciones desconocidas aprendiendo sólo una fracción de conocimiento. El aprendizaje supervisado se ha aplicado con éxito a una amplia gama de temas, como el reconocimiento de </w:t>
+      </w:r>
+      <w:r>
+        <w:rPr>
+          <w:lang w:eastAsia="es-VE"/>
+        </w:rPr>
+        <w:t>escritura a mano</w:t>
+      </w:r>
+      <w:r>
+        <w:rPr>
+          <w:lang w:eastAsia="es-VE"/>
+        </w:rPr>
+        <w:t xml:space="preserve">, </w:t>
+      </w:r>
+      <w:r>
+        <w:rPr>
+          <w:lang w:eastAsia="es-VE"/>
+        </w:rPr>
+        <w:t>habla</w:t>
+      </w:r>
+      <w:r>
+        <w:rPr>
+          <w:lang w:eastAsia="es-VE"/>
+        </w:rPr>
+        <w:t xml:space="preserve"> </w:t>
+      </w:r>
+      <w:r>
+        <w:rPr>
+          <w:lang w:eastAsia="es-VE"/>
+        </w:rPr>
+        <w:t>e imágenes, filtrado de spam, p</w:t>
+      </w:r>
+      <w:r>
+        <w:rPr>
+          <w:lang w:eastAsia="es-VE"/>
+        </w:rPr>
+        <w:t xml:space="preserve">ublicidad online, </w:t>
+      </w:r>
+      <w:r>
+        <w:rPr>
+          <w:lang w:eastAsia="es-VE"/>
+        </w:rPr>
+        <w:t>análisis de señales neuronales</w:t>
+      </w:r>
+      <w:r>
+        <w:rPr>
+          <w:lang w:eastAsia="es-VE"/>
+        </w:rPr>
+        <w:t xml:space="preserve">, análisis </w:t>
+      </w:r>
+      <w:r>
+        <w:rPr>
+          <w:lang w:eastAsia="es-VE"/>
+        </w:rPr>
+        <w:t>genético</w:t>
+      </w:r>
+      <w:r>
+        <w:rPr>
+          <w:lang w:eastAsia="es-VE"/>
+        </w:rPr>
+        <w:t xml:space="preserve">, predicción del precio de </w:t>
+      </w:r>
+      <w:r>
+        <w:rPr>
+          <w:lang w:eastAsia="es-VE"/>
+        </w:rPr>
+        <w:t xml:space="preserve">acciones, pronóstico del tiempo, </w:t>
+      </w:r>
+      <w:r>
+        <w:rPr>
+          <w:lang w:eastAsia="es-VE"/>
+        </w:rPr>
+        <w:t>entre muchos más</w:t>
+      </w:r>
+      <w:r>
+        <w:rPr>
+          <w:lang w:eastAsia="es-VE"/>
+        </w:rPr>
+        <w:t xml:space="preserve">. El aprendizaje </w:t>
+      </w:r>
+      <w:r>
+        <w:rPr>
+          <w:i/>
+          <w:lang w:eastAsia="es-VE"/>
+        </w:rPr>
+        <w:t>supervisado</w:t>
+      </w:r>
+      <w:r>
+        <w:rPr>
+          <w:lang w:eastAsia="es-VE"/>
+        </w:rPr>
+        <w:t xml:space="preserve"> es conocido como </w:t>
+      </w:r>
+      <w:r>
+        <w:rPr>
+          <w:i/>
+          <w:lang w:eastAsia="es-VE"/>
+        </w:rPr>
+        <w:t xml:space="preserve">regresión </w:t>
+      </w:r>
+      <w:r>
+        <w:rPr>
+          <w:lang w:eastAsia="es-VE"/>
+        </w:rPr>
+        <w:t>si</w:t>
+      </w:r>
+      <w:r>
+        <w:rPr>
+          <w:lang w:eastAsia="es-VE"/>
+        </w:rPr>
+        <w:t xml:space="preserve"> la respuesta es un valor real </w:t>
+      </w:r>
+      <w:r>
+        <w:rPr>
+          <w:lang w:eastAsia="es-VE"/>
+        </w:rPr>
+        <w:t>com</w:t>
+      </w:r>
+      <w:r>
+        <w:rPr>
+          <w:lang w:eastAsia="es-VE"/>
+        </w:rPr>
+        <w:t>o la temperatura;</w:t>
+      </w:r>
+      <w:r>
+        <w:rPr>
+          <w:lang w:eastAsia="es-VE"/>
+        </w:rPr>
+        <w:t xml:space="preserve"> </w:t>
+      </w:r>
+      <w:r>
+        <w:rPr>
+          <w:i/>
+          <w:lang w:eastAsia="es-VE"/>
+        </w:rPr>
+        <w:t>clasificación</w:t>
+      </w:r>
+      <w:r>
+        <w:rPr>
+          <w:lang w:eastAsia="es-VE"/>
+        </w:rPr>
+        <w:t xml:space="preserve"> </w:t>
+      </w:r>
+      <w:r>
+        <w:rPr>
+          <w:lang w:eastAsia="es-VE"/>
+        </w:rPr>
+        <w:t>o</w:t>
+      </w:r>
+      <w:r>
+        <w:rPr>
+          <w:lang w:eastAsia="es-VE"/>
+        </w:rPr>
+        <w:t xml:space="preserve"> problema de reconocimiento de patrones</w:t>
+      </w:r>
+      <w:r>
+        <w:rPr>
+          <w:lang w:eastAsia="es-VE"/>
+        </w:rPr>
         <w:t>,</w:t>
       </w:r>
       <w:r>
@@ -1667,37 +1945,13 @@
         <w:rPr>
           <w:lang w:eastAsia="es-VE"/>
         </w:rPr>
-        <w:t xml:space="preserve">en </w:t>
-      </w:r>
-      <w:r>
-        <w:rPr>
-          <w:lang w:eastAsia="es-VE"/>
-        </w:rPr>
-        <w:t>el cual un</w:t>
-      </w:r>
-      <w:r>
-        <w:rPr>
-          <w:lang w:eastAsia="es-VE"/>
-        </w:rPr>
-        <w:t>a computadora</w:t>
-      </w:r>
-      <w:r>
-        <w:rPr>
-          <w:lang w:eastAsia="es-VE"/>
-        </w:rPr>
-        <w:t xml:space="preserve"> aprende de un </w:t>
-      </w:r>
-      <w:r>
-        <w:rPr>
-          <w:lang w:eastAsia="es-VE"/>
-        </w:rPr>
-        <w:t>usuario</w:t>
-      </w:r>
-      <w:r>
-        <w:rPr>
-          <w:lang w:eastAsia="es-VE"/>
-        </w:rPr>
-        <w:t xml:space="preserve"> a través de preguntas y</w:t>
+        <w:t>si la respuesta es un valo</w:t>
+      </w:r>
+      <w:r>
+        <w:rPr>
+          <w:lang w:eastAsia="es-VE"/>
+        </w:rPr>
+        <w:t>r categórico como "sí" o "no".</w:t>
       </w:r>
       <w:r>
         <w:rPr>
@@ -1709,64 +1963,74 @@
         <w:rPr>
           <w:lang w:eastAsia="es-VE"/>
         </w:rPr>
-        <w:t>resp</w:t>
-      </w:r>
-      <w:r>
-        <w:rPr>
-          <w:lang w:eastAsia="es-VE"/>
-        </w:rPr>
-        <w:t>uestas</w:t>
-      </w:r>
-      <w:r>
-        <w:rPr>
-          <w:lang w:eastAsia="es-VE"/>
-        </w:rPr>
-        <w:t xml:space="preserve">. </w:t>
-      </w:r>
-      <w:r>
-        <w:rPr>
-          <w:lang w:eastAsia="es-VE"/>
-        </w:rPr>
-        <w:t>L</w:t>
-      </w:r>
-      <w:r>
-        <w:rPr>
-          <w:lang w:eastAsia="es-VE"/>
-        </w:rPr>
-        <w:t>a computadora aprende a</w:t>
-      </w:r>
-      <w:r>
-        <w:rPr>
+        <w:t>Entre esto</w:t>
+      </w:r>
+      <w:r>
+        <w:rPr>
+          <w:lang w:eastAsia="es-VE"/>
+        </w:rPr>
+        <w:t xml:space="preserve">s destacan los llamados árboles de </w:t>
+      </w:r>
+      <w:r>
+        <w:rPr>
+          <w:i/>
+          <w:lang w:eastAsia="es-VE"/>
+        </w:rPr>
+        <w:t>decisión</w:t>
+      </w:r>
+      <w:r>
+        <w:rPr>
+          <w:lang w:eastAsia="es-VE"/>
+        </w:rPr>
+        <w:t xml:space="preserve"> y los </w:t>
+      </w:r>
+      <w:proofErr w:type="spellStart"/>
+      <w:r>
+        <w:rPr>
+          <w:i/>
+          <w:lang w:eastAsia="es-VE"/>
+        </w:rPr>
+        <w:t>random</w:t>
+      </w:r>
+      <w:proofErr w:type="spellEnd"/>
+      <w:r>
+        <w:rPr>
+          <w:i/>
           <w:lang w:eastAsia="es-VE"/>
         </w:rPr>
         <w:t xml:space="preserve"> </w:t>
       </w:r>
-      <w:r>
-        <w:rPr>
-          <w:lang w:eastAsia="es-VE"/>
-        </w:rPr>
-        <w:t>mapear</w:t>
-      </w:r>
-      <w:r>
-        <w:rPr>
-          <w:lang w:eastAsia="es-VE"/>
-        </w:rPr>
-        <w:t xml:space="preserve"> una pregunta a su r</w:t>
-      </w:r>
-      <w:r>
-        <w:rPr>
-          <w:lang w:eastAsia="es-VE"/>
-        </w:rPr>
-        <w:t>espuesta a partir de muestras a</w:t>
-      </w:r>
-      <w:r>
-        <w:rPr>
-          <w:lang w:eastAsia="es-VE"/>
-        </w:rPr>
-        <w:t>pareadas de preguntas y respuestas.</w:t>
-      </w:r>
-      <w:r>
-        <w:rPr>
+      <w:proofErr w:type="spellStart"/>
+      <w:r>
+        <w:rPr>
+          <w:i/>
+          <w:lang w:eastAsia="es-VE"/>
+        </w:rPr>
+        <w:t>forest</w:t>
+      </w:r>
+      <w:proofErr w:type="spellEnd"/>
+      <w:r>
+        <w:rPr>
+          <w:lang w:eastAsia="es-VE"/>
+        </w:rPr>
+        <w:t xml:space="preserve"> o </w:t>
+      </w:r>
+      <w:r>
+        <w:rPr>
+          <w:i/>
+          <w:lang w:eastAsia="es-VE"/>
+        </w:rPr>
+        <w:t>bosques aleatorios</w:t>
+      </w:r>
+      <w:r>
+        <w:rPr>
+          <w:lang w:eastAsia="es-VE"/>
+        </w:rPr>
+        <w:t>.</w:t>
+      </w:r>
+      <w:r>
+        <w:rPr>
+          <w:i/>
           <w:lang w:eastAsia="es-VE"/>
         </w:rPr>
         <w:t xml:space="preserve"> </w:t>
@@ -1775,40 +2039,17 @@
         <w:rPr>
           <w:lang w:eastAsia="es-VE"/>
         </w:rPr>
-        <w:t xml:space="preserve">El objetivo es </w:t>
-      </w:r>
-      <w:r>
-        <w:rPr>
-          <w:lang w:eastAsia="es-VE"/>
-        </w:rPr>
-        <w:t xml:space="preserve">que la computadora </w:t>
-      </w:r>
-      <w:r>
-        <w:rPr>
-          <w:lang w:eastAsia="es-VE"/>
-        </w:rPr>
-        <w:t>adqui</w:t>
-      </w:r>
-      <w:r>
-        <w:rPr>
-          <w:lang w:eastAsia="es-VE"/>
-        </w:rPr>
-        <w:t>era</w:t>
-      </w:r>
-      <w:r>
-        <w:rPr>
-          <w:lang w:eastAsia="es-VE"/>
-        </w:rPr>
-        <w:t xml:space="preserve"> la capacidad de generalización, </w:t>
-      </w:r>
-      <w:r>
-        <w:rPr>
-          <w:lang w:eastAsia="es-VE"/>
-        </w:rPr>
-        <w:t>generando</w:t>
-      </w:r>
-      <w:r>
-        <w:rPr>
+        <w:t>F</w:t>
+      </w:r>
+      <w:r>
+        <w:rPr>
+          <w:lang w:eastAsia="es-VE"/>
+        </w:rPr>
+        <w:t>inalmente</w:t>
+      </w:r>
+      <w:r>
+        <w:rPr>
+          <w:i/>
           <w:lang w:eastAsia="es-VE"/>
         </w:rPr>
         <w:t xml:space="preserve"> </w:t>
@@ -1817,433 +2058,77 @@
         <w:rPr>
           <w:lang w:eastAsia="es-VE"/>
         </w:rPr>
-        <w:t xml:space="preserve">una respuesta apropiada </w:t>
-      </w:r>
-      <w:r>
-        <w:rPr>
-          <w:lang w:eastAsia="es-VE"/>
-        </w:rPr>
-        <w:t xml:space="preserve">a preguntas </w:t>
-      </w:r>
-      <w:r>
-        <w:rPr>
-          <w:lang w:eastAsia="es-VE"/>
-        </w:rPr>
-        <w:t xml:space="preserve">no </w:t>
-      </w:r>
-      <w:r>
-        <w:rPr>
-          <w:lang w:eastAsia="es-VE"/>
-        </w:rPr>
-        <w:t>aprendidas</w:t>
-      </w:r>
-      <w:r>
-        <w:rPr>
-          <w:lang w:eastAsia="es-VE"/>
-        </w:rPr>
-        <w:t>.</w:t>
-      </w:r>
-      <w:r>
-        <w:rPr>
+        <w:t xml:space="preserve">tenemos el </w:t>
+      </w:r>
+      <w:r>
+        <w:rPr>
+          <w:i/>
+          <w:lang w:eastAsia="es-VE"/>
+        </w:rPr>
+        <w:t>ranking</w:t>
+      </w:r>
+      <w:r>
+        <w:rPr>
+          <w:i/>
+          <w:lang w:eastAsia="es-VE"/>
+        </w:rPr>
+        <w:t xml:space="preserve"> u</w:t>
+      </w:r>
+      <w:r>
+        <w:rPr>
+          <w:i/>
           <w:lang w:eastAsia="es-VE"/>
         </w:rPr>
         <w:t xml:space="preserve"> </w:t>
       </w:r>
       <w:r>
         <w:rPr>
-          <w:lang w:eastAsia="es-VE"/>
-        </w:rPr>
-        <w:t>De este modo, el usuario no tiene que enseñarle todo a</w:t>
-      </w:r>
-      <w:r>
-        <w:rPr>
+          <w:i/>
+          <w:lang w:eastAsia="es-VE"/>
+        </w:rPr>
+        <w:t xml:space="preserve">ordinal </w:t>
+      </w:r>
+      <w:proofErr w:type="spellStart"/>
+      <w:r>
+        <w:rPr>
+          <w:i/>
+          <w:lang w:eastAsia="es-VE"/>
+        </w:rPr>
+        <w:t>regression</w:t>
+      </w:r>
+      <w:proofErr w:type="spellEnd"/>
+      <w:r>
+        <w:rPr>
+          <w:lang w:eastAsia="es-VE"/>
+        </w:rPr>
+        <w:t>, conocido en español como</w:t>
+      </w:r>
+      <w:r>
+        <w:rPr>
+          <w:i/>
           <w:lang w:eastAsia="es-VE"/>
         </w:rPr>
         <w:t xml:space="preserve"> </w:t>
       </w:r>
       <w:r>
         <w:rPr>
-          <w:lang w:eastAsia="es-VE"/>
-        </w:rPr>
-        <w:t>l</w:t>
-      </w:r>
-      <w:r>
-        <w:rPr>
-          <w:lang w:eastAsia="es-VE"/>
-        </w:rPr>
-        <w:t>a</w:t>
-      </w:r>
-      <w:r>
-        <w:rPr>
-          <w:lang w:eastAsia="es-VE"/>
-        </w:rPr>
-        <w:t xml:space="preserve"> </w:t>
-      </w:r>
-      <w:r>
-        <w:rPr>
-          <w:lang w:eastAsia="es-VE"/>
-        </w:rPr>
-        <w:t>computadora</w:t>
-      </w:r>
-      <w:r>
-        <w:rPr>
-          <w:lang w:eastAsia="es-VE"/>
-        </w:rPr>
-        <w:t xml:space="preserve">, sino </w:t>
-      </w:r>
-      <w:r>
-        <w:rPr>
-          <w:lang w:eastAsia="es-VE"/>
-        </w:rPr>
-        <w:t>que ella</w:t>
-      </w:r>
-      <w:r>
-        <w:rPr>
-          <w:lang w:eastAsia="es-VE"/>
-        </w:rPr>
-        <w:t xml:space="preserve"> </w:t>
-      </w:r>
-      <w:r>
-        <w:rPr>
-          <w:lang w:eastAsia="es-VE"/>
-        </w:rPr>
-        <w:t>puede hacer frente automáticamente a situaciones desconocidas aprendiendo sólo una fracción</w:t>
-      </w:r>
-      <w:r>
-        <w:rPr>
-          <w:lang w:eastAsia="es-VE"/>
-        </w:rPr>
-        <w:t xml:space="preserve"> </w:t>
-      </w:r>
-      <w:r>
-        <w:rPr>
-          <w:lang w:eastAsia="es-VE"/>
-        </w:rPr>
-        <w:t xml:space="preserve">de conocimiento. El aprendizaje supervisado se ha aplicado con éxito a una amplia gama de temas, como el reconocimiento de </w:t>
-      </w:r>
-      <w:r>
-        <w:rPr>
-          <w:lang w:eastAsia="es-VE"/>
-        </w:rPr>
-        <w:t xml:space="preserve">escritura, </w:t>
-      </w:r>
-      <w:r>
-        <w:rPr>
-          <w:lang w:eastAsia="es-VE"/>
-        </w:rPr>
-        <w:t>habla</w:t>
-      </w:r>
-      <w:r>
-        <w:rPr>
-          <w:lang w:eastAsia="es-VE"/>
-        </w:rPr>
-        <w:t xml:space="preserve"> </w:t>
-      </w:r>
-      <w:r>
-        <w:rPr>
-          <w:lang w:eastAsia="es-VE"/>
-        </w:rPr>
-        <w:t>e imágenes, filtrado de spam, p</w:t>
-      </w:r>
-      <w:r>
-        <w:rPr>
-          <w:lang w:eastAsia="es-VE"/>
-        </w:rPr>
-        <w:t xml:space="preserve">ublicidad online, </w:t>
-      </w:r>
-      <w:r>
-        <w:rPr>
-          <w:lang w:eastAsia="es-VE"/>
-        </w:rPr>
-        <w:t>análisis de señales cerebrales, análisis de genes, predicción del precio de las acciones, pronóstico del tiempo,</w:t>
-      </w:r>
-      <w:r>
-        <w:rPr>
-          <w:lang w:eastAsia="es-VE"/>
-        </w:rPr>
-        <w:t xml:space="preserve"> </w:t>
-      </w:r>
-      <w:r>
-        <w:rPr>
-          <w:lang w:eastAsia="es-VE"/>
-        </w:rPr>
-        <w:t>entre muchos más</w:t>
-      </w:r>
-      <w:r>
-        <w:rPr>
-          <w:lang w:eastAsia="es-VE"/>
-        </w:rPr>
-        <w:t xml:space="preserve">. El </w:t>
-      </w:r>
-      <w:r>
-        <w:rPr>
-          <w:lang w:eastAsia="es-VE"/>
-        </w:rPr>
-        <w:t xml:space="preserve">aprendizaje </w:t>
-      </w:r>
-      <w:r>
-        <w:rPr>
           <w:i/>
           <w:lang w:eastAsia="es-VE"/>
         </w:rPr>
-        <w:t>supervisado</w:t>
-      </w:r>
-      <w:r>
-        <w:rPr>
-          <w:lang w:eastAsia="es-VE"/>
-        </w:rPr>
-        <w:t xml:space="preserve"> </w:t>
-      </w:r>
-      <w:r>
-        <w:rPr>
-          <w:lang w:eastAsia="es-VE"/>
-        </w:rPr>
-        <w:t xml:space="preserve">es conocido como </w:t>
+        <w:t>ordenación</w:t>
       </w:r>
       <w:r>
         <w:rPr>
           <w:i/>
           <w:lang w:eastAsia="es-VE"/>
         </w:rPr>
-        <w:t xml:space="preserve">regresión </w:t>
-      </w:r>
-      <w:r>
-        <w:rPr>
-          <w:lang w:eastAsia="es-VE"/>
-        </w:rPr>
-        <w:t xml:space="preserve">si la respuesta es un valor real (como la temperatura), </w:t>
-      </w:r>
-      <w:r>
-        <w:rPr>
-          <w:i/>
-          <w:lang w:eastAsia="es-VE"/>
-        </w:rPr>
-        <w:t>clasificación</w:t>
-      </w:r>
-      <w:r>
-        <w:rPr>
-          <w:lang w:eastAsia="es-VE"/>
-        </w:rPr>
-        <w:t xml:space="preserve"> </w:t>
-      </w:r>
-      <w:r>
-        <w:rPr>
-          <w:lang w:eastAsia="es-VE"/>
-        </w:rPr>
-        <w:t>o</w:t>
-      </w:r>
-      <w:r>
-        <w:rPr>
-          <w:lang w:eastAsia="es-VE"/>
-        </w:rPr>
-        <w:t xml:space="preserve"> problema de reconocimiento de patrones</w:t>
-      </w:r>
-      <w:r>
-        <w:rPr>
-          <w:lang w:eastAsia="es-VE"/>
-        </w:rPr>
         <w:t>,</w:t>
       </w:r>
       <w:r>
         <w:rPr>
           <w:lang w:eastAsia="es-VE"/>
         </w:rPr>
-        <w:t xml:space="preserve"> </w:t>
-      </w:r>
-      <w:r>
-        <w:rPr>
-          <w:lang w:eastAsia="es-VE"/>
-        </w:rPr>
-        <w:t>si la respuesta es un valo</w:t>
-      </w:r>
-      <w:r>
-        <w:rPr>
-          <w:lang w:eastAsia="es-VE"/>
-        </w:rPr>
-        <w:t>r categórico como "sí" o "no".</w:t>
-      </w:r>
-      <w:r>
-        <w:rPr>
-          <w:lang w:eastAsia="es-VE"/>
-        </w:rPr>
-        <w:t xml:space="preserve"> </w:t>
-      </w:r>
-      <w:r>
-        <w:rPr>
-          <w:lang w:eastAsia="es-VE"/>
-        </w:rPr>
-        <w:t>Entre esto</w:t>
-      </w:r>
-      <w:r>
-        <w:rPr>
-          <w:lang w:eastAsia="es-VE"/>
-        </w:rPr>
-        <w:t xml:space="preserve">s destacan los llamados árboles de </w:t>
-      </w:r>
-      <w:r>
-        <w:rPr>
-          <w:i/>
-          <w:lang w:eastAsia="es-VE"/>
-        </w:rPr>
-        <w:t>decisión</w:t>
-      </w:r>
-      <w:r>
-        <w:rPr>
-          <w:lang w:eastAsia="es-VE"/>
-        </w:rPr>
-        <w:t xml:space="preserve"> y los </w:t>
-      </w:r>
-      <w:proofErr w:type="spellStart"/>
-      <w:r>
-        <w:rPr>
-          <w:i/>
-          <w:lang w:eastAsia="es-VE"/>
-        </w:rPr>
-        <w:t>random</w:t>
-      </w:r>
-      <w:proofErr w:type="spellEnd"/>
-      <w:r>
-        <w:rPr>
-          <w:i/>
-          <w:lang w:eastAsia="es-VE"/>
-        </w:rPr>
-        <w:t xml:space="preserve"> </w:t>
-      </w:r>
-      <w:proofErr w:type="spellStart"/>
-      <w:r>
-        <w:rPr>
-          <w:i/>
-          <w:lang w:eastAsia="es-VE"/>
-        </w:rPr>
-        <w:t>forest</w:t>
-      </w:r>
-      <w:proofErr w:type="spellEnd"/>
-      <w:r>
-        <w:rPr>
-          <w:lang w:eastAsia="es-VE"/>
-        </w:rPr>
-        <w:t xml:space="preserve"> o </w:t>
-      </w:r>
-      <w:r>
-        <w:rPr>
-          <w:i/>
-          <w:lang w:eastAsia="es-VE"/>
-        </w:rPr>
-        <w:t>bosques aleatorios</w:t>
-      </w:r>
-      <w:r>
-        <w:rPr>
-          <w:lang w:eastAsia="es-VE"/>
-        </w:rPr>
-        <w:t>.</w:t>
-      </w:r>
-      <w:r>
-        <w:rPr>
-          <w:i/>
-          <w:lang w:eastAsia="es-VE"/>
-        </w:rPr>
-        <w:t xml:space="preserve"> </w:t>
-      </w:r>
-      <w:r>
-        <w:rPr>
-          <w:lang w:eastAsia="es-VE"/>
-        </w:rPr>
-        <w:t>F</w:t>
-      </w:r>
-      <w:r>
-        <w:rPr>
-          <w:lang w:eastAsia="es-VE"/>
-        </w:rPr>
-        <w:t>inalmente</w:t>
-      </w:r>
-      <w:r>
-        <w:rPr>
-          <w:i/>
-          <w:lang w:eastAsia="es-VE"/>
-        </w:rPr>
-        <w:t xml:space="preserve"> </w:t>
-      </w:r>
-      <w:r>
-        <w:rPr>
-          <w:lang w:eastAsia="es-VE"/>
-        </w:rPr>
-        <w:t xml:space="preserve">tenemos el </w:t>
-      </w:r>
-      <w:r>
-        <w:rPr>
-          <w:i/>
-          <w:lang w:eastAsia="es-VE"/>
-        </w:rPr>
-        <w:t>ranking</w:t>
-      </w:r>
-      <w:r>
-        <w:rPr>
-          <w:i/>
-          <w:lang w:eastAsia="es-VE"/>
-        </w:rPr>
-        <w:t xml:space="preserve"> u</w:t>
-      </w:r>
-      <w:r>
-        <w:rPr>
-          <w:i/>
-          <w:lang w:eastAsia="es-VE"/>
-        </w:rPr>
-        <w:t xml:space="preserve"> </w:t>
-      </w:r>
-      <w:r>
-        <w:rPr>
-          <w:i/>
-          <w:lang w:eastAsia="es-VE"/>
-        </w:rPr>
-        <w:t xml:space="preserve">ordinal </w:t>
-      </w:r>
-      <w:proofErr w:type="spellStart"/>
-      <w:r>
-        <w:rPr>
-          <w:i/>
-          <w:lang w:eastAsia="es-VE"/>
-        </w:rPr>
-        <w:t>regression</w:t>
-      </w:r>
-      <w:proofErr w:type="spellEnd"/>
-      <w:r>
-        <w:rPr>
-          <w:lang w:eastAsia="es-VE"/>
-        </w:rPr>
-        <w:t>, conocido en español como</w:t>
-      </w:r>
-      <w:r>
-        <w:rPr>
-          <w:i/>
-          <w:lang w:eastAsia="es-VE"/>
-        </w:rPr>
-        <w:t xml:space="preserve"> </w:t>
-      </w:r>
-      <w:r>
-        <w:rPr>
-          <w:i/>
-          <w:lang w:eastAsia="es-VE"/>
-        </w:rPr>
-        <w:t>ordenación</w:t>
-      </w:r>
-      <w:r>
-        <w:rPr>
-          <w:i/>
-          <w:lang w:eastAsia="es-VE"/>
-        </w:rPr>
-        <w:t>,</w:t>
-      </w:r>
-      <w:r>
-        <w:rPr>
-          <w:lang w:eastAsia="es-VE"/>
-        </w:rPr>
-        <w:t xml:space="preserve"> si la respuesta </w:t>
-      </w:r>
-      <w:r>
-        <w:rPr>
-          <w:lang w:eastAsia="es-VE"/>
-        </w:rPr>
-        <w:t xml:space="preserve">es un </w:t>
+        <w:t xml:space="preserve"> si la respuesta es un </w:t>
       </w:r>
       <w:r>
         <w:rPr>
@@ -2297,13 +2182,7 @@
         <w:rPr>
           <w:lang w:eastAsia="es-VE"/>
         </w:rPr>
-        <w:t xml:space="preserve"> considera la situación donde no existe un </w:t>
-      </w:r>
-      <w:r>
-        <w:rPr>
-          <w:lang w:eastAsia="es-VE"/>
-        </w:rPr>
-        <w:t>usuario que actúe co</w:t>
+        <w:t xml:space="preserve"> considera la situación donde no existe un usuario que actúe co</w:t>
       </w:r>
       <w:r>
         <w:rPr>
@@ -2315,37 +2194,7 @@
         <w:rPr>
           <w:lang w:eastAsia="es-VE"/>
         </w:rPr>
-        <w:t xml:space="preserve"> de la computadora, la cual r</w:t>
-      </w:r>
-      <w:r>
-        <w:rPr>
-          <w:lang w:eastAsia="es-VE"/>
-        </w:rPr>
-        <w:t>ecopila datos de forma autónoma a través de Internet</w:t>
-      </w:r>
-      <w:r>
-        <w:rPr>
-          <w:lang w:eastAsia="es-VE"/>
-        </w:rPr>
-        <w:t xml:space="preserve"> u otra fuente de datos,</w:t>
-      </w:r>
-      <w:r>
-        <w:rPr>
-          <w:lang w:eastAsia="es-VE"/>
-        </w:rPr>
-        <w:t xml:space="preserve"> e intent</w:t>
-      </w:r>
-      <w:r>
-        <w:rPr>
-          <w:lang w:eastAsia="es-VE"/>
-        </w:rPr>
-        <w:t>a extraer conocimientos útiles</w:t>
-      </w:r>
-      <w:r>
-        <w:rPr>
-          <w:lang w:eastAsia="es-VE"/>
-        </w:rPr>
-        <w:t xml:space="preserve">. </w:t>
+        <w:t xml:space="preserve"> de la computadora, la cual recopila datos de forma autónoma a través de Internet u otra fuente de datos, e intenta extraer conocimientos útiles. </w:t>
       </w:r>
       <w:r>
         <w:rPr>
@@ -2364,64 +2213,419 @@
           <w:i/>
           <w:lang w:eastAsia="es-VE"/>
         </w:rPr>
-        <w:t>aprendizaje n</w:t>
+        <w:t>aprendizaje no supervisado</w:t>
+      </w:r>
+      <w:r>
+        <w:rPr>
+          <w:lang w:eastAsia="es-VE"/>
+        </w:rPr>
+        <w:t xml:space="preserve"> es más automático que el </w:t>
       </w:r>
       <w:r>
         <w:rPr>
           <w:i/>
           <w:lang w:eastAsia="es-VE"/>
         </w:rPr>
-        <w:t>o supervisado</w:t>
-      </w:r>
-      <w:r>
-        <w:rPr>
-          <w:lang w:eastAsia="es-VE"/>
-        </w:rPr>
-        <w:t xml:space="preserve"> es más automático que el </w:t>
+        <w:t>a</w:t>
       </w:r>
       <w:r>
         <w:rPr>
           <w:i/>
           <w:lang w:eastAsia="es-VE"/>
         </w:rPr>
-        <w:t>a</w:t>
+        <w:t>prendizaje supervisado</w:t>
+      </w:r>
+      <w:r>
+        <w:rPr>
+          <w:lang w:eastAsia="es-VE"/>
+        </w:rPr>
+        <w:t xml:space="preserve">, </w:t>
+      </w:r>
+      <w:r>
+        <w:rPr>
+          <w:lang w:eastAsia="es-VE"/>
+        </w:rPr>
+        <w:t>y su objetivo no</w:t>
+      </w:r>
+      <w:r>
+        <w:rPr>
+          <w:lang w:eastAsia="es-VE"/>
+        </w:rPr>
+        <w:t xml:space="preserve"> necesariamente se </w:t>
+      </w:r>
+      <w:r>
+        <w:rPr>
+          <w:lang w:eastAsia="es-VE"/>
+        </w:rPr>
+        <w:t xml:space="preserve">especifica </w:t>
+      </w:r>
+      <w:r>
+        <w:rPr>
+          <w:lang w:eastAsia="es-VE"/>
+        </w:rPr>
+        <w:t>de manera clara</w:t>
+      </w:r>
+      <w:r>
+        <w:rPr>
+          <w:lang w:eastAsia="es-VE"/>
+        </w:rPr>
+        <w:t>.</w:t>
+      </w:r>
+      <w:r>
+        <w:rPr>
+          <w:lang w:eastAsia="es-VE"/>
+        </w:rPr>
+        <w:t xml:space="preserve"> Entre l</w:t>
+      </w:r>
+      <w:r>
+        <w:rPr>
+          <w:lang w:eastAsia="es-VE"/>
+        </w:rPr>
+        <w:t xml:space="preserve">as tareas típicas del </w:t>
       </w:r>
       <w:r>
         <w:rPr>
           <w:i/>
           <w:lang w:eastAsia="es-VE"/>
         </w:rPr>
-        <w:t>prendizaje supervisado</w:t>
-      </w:r>
-      <w:r>
-        <w:rPr>
-          <w:lang w:eastAsia="es-VE"/>
-        </w:rPr>
-        <w:t xml:space="preserve">, </w:t>
-      </w:r>
-      <w:r>
-        <w:rPr>
-          <w:lang w:eastAsia="es-VE"/>
-        </w:rPr>
-        <w:t>y su objetivo no</w:t>
-      </w:r>
-      <w:r>
-        <w:rPr>
-          <w:lang w:eastAsia="es-VE"/>
-        </w:rPr>
-        <w:t xml:space="preserve"> necesariamente se </w:t>
-      </w:r>
-      <w:r>
-        <w:rPr>
-          <w:lang w:eastAsia="es-VE"/>
-        </w:rPr>
-        <w:t xml:space="preserve">especifica </w:t>
-      </w:r>
-      <w:r>
-        <w:rPr>
-          <w:lang w:eastAsia="es-VE"/>
-        </w:rPr>
-        <w:t>de manera clara</w:t>
+        <w:t>aprendizaje no supervisado</w:t>
+      </w:r>
+      <w:r>
+        <w:rPr>
+          <w:lang w:eastAsia="es-VE"/>
+        </w:rPr>
+        <w:t xml:space="preserve"> </w:t>
+      </w:r>
+      <w:r>
+        <w:rPr>
+          <w:lang w:eastAsia="es-VE"/>
+        </w:rPr>
+        <w:t>está</w:t>
+      </w:r>
+      <w:r>
+        <w:rPr>
+          <w:lang w:eastAsia="es-VE"/>
+        </w:rPr>
+        <w:t xml:space="preserve"> </w:t>
+      </w:r>
+      <w:r>
+        <w:rPr>
+          <w:lang w:eastAsia="es-VE"/>
+        </w:rPr>
+        <w:t xml:space="preserve">la </w:t>
+      </w:r>
+      <w:r>
+        <w:rPr>
+          <w:lang w:eastAsia="es-VE"/>
+        </w:rPr>
+        <w:t xml:space="preserve">agrupación de datos y </w:t>
+      </w:r>
+      <w:r>
+        <w:rPr>
+          <w:lang w:eastAsia="es-VE"/>
+        </w:rPr>
+        <w:t>la detección de valores atípicos. E</w:t>
+      </w:r>
+      <w:r>
+        <w:rPr>
+          <w:lang w:eastAsia="es-VE"/>
+        </w:rPr>
+        <w:t xml:space="preserve">stas técnicas </w:t>
+      </w:r>
+      <w:r>
+        <w:rPr>
+          <w:lang w:eastAsia="es-VE"/>
+        </w:rPr>
+        <w:t>se utilizan con</w:t>
+      </w:r>
+      <w:r>
+        <w:rPr>
+          <w:lang w:eastAsia="es-VE"/>
+        </w:rPr>
+        <w:t xml:space="preserve"> éxito en una amplia</w:t>
+      </w:r>
+      <w:r>
+        <w:rPr>
+          <w:lang w:eastAsia="es-VE"/>
+        </w:rPr>
+        <w:t xml:space="preserve"> </w:t>
+      </w:r>
+      <w:r>
+        <w:rPr>
+          <w:lang w:eastAsia="es-VE"/>
+        </w:rPr>
+        <w:t xml:space="preserve">gama </w:t>
+      </w:r>
+      <w:r>
+        <w:rPr>
+          <w:lang w:eastAsia="es-VE"/>
+        </w:rPr>
+        <w:t>de problemas como</w:t>
+      </w:r>
+      <w:r>
+        <w:rPr>
+          <w:lang w:eastAsia="es-VE"/>
+        </w:rPr>
+        <w:t xml:space="preserve"> </w:t>
+      </w:r>
+      <w:r>
+        <w:rPr>
+          <w:lang w:eastAsia="es-VE"/>
+        </w:rPr>
+        <w:t xml:space="preserve">el </w:t>
+      </w:r>
+      <w:r>
+        <w:rPr>
+          <w:lang w:eastAsia="es-VE"/>
+        </w:rPr>
+        <w:t>diagnóstico</w:t>
+      </w:r>
+      <w:r>
+        <w:rPr>
+          <w:lang w:eastAsia="es-VE"/>
+        </w:rPr>
+        <w:t xml:space="preserve"> de</w:t>
+      </w:r>
+      <w:r>
+        <w:rPr>
+          <w:lang w:eastAsia="es-VE"/>
+        </w:rPr>
+        <w:t xml:space="preserve"> sistema</w:t>
+      </w:r>
+      <w:r>
+        <w:rPr>
+          <w:lang w:eastAsia="es-VE"/>
+        </w:rPr>
+        <w:t>s</w:t>
+      </w:r>
+      <w:r>
+        <w:rPr>
+          <w:lang w:eastAsia="es-VE"/>
+        </w:rPr>
+        <w:t>, seguridad, detección de eventos y</w:t>
+      </w:r>
+      <w:r>
+        <w:rPr>
+          <w:lang w:eastAsia="es-VE"/>
+        </w:rPr>
+        <w:t xml:space="preserve"> </w:t>
+      </w:r>
+      <w:r>
+        <w:rPr>
+          <w:lang w:eastAsia="es-VE"/>
+        </w:rPr>
+        <w:t xml:space="preserve">análisis de redes </w:t>
+      </w:r>
+      <w:r>
+        <w:rPr>
+          <w:lang w:eastAsia="es-VE"/>
+        </w:rPr>
+        <w:lastRenderedPageBreak/>
+        <w:t xml:space="preserve">sociales. </w:t>
+      </w:r>
+      <w:r>
+        <w:rPr>
+          <w:lang w:eastAsia="es-VE"/>
+        </w:rPr>
+        <w:t>T</w:t>
+      </w:r>
+      <w:r>
+        <w:rPr>
+          <w:lang w:eastAsia="es-VE"/>
+        </w:rPr>
+        <w:t xml:space="preserve">ambién se utiliza a menudo como un </w:t>
+      </w:r>
+      <w:r>
+        <w:rPr>
+          <w:lang w:eastAsia="es-VE"/>
+        </w:rPr>
+        <w:t xml:space="preserve">paso de </w:t>
+      </w:r>
+      <w:r>
+        <w:rPr>
+          <w:lang w:eastAsia="es-VE"/>
+        </w:rPr>
+        <w:t>preprocesamiento</w:t>
+      </w:r>
+      <w:r>
+        <w:rPr>
+          <w:lang w:eastAsia="es-VE"/>
+        </w:rPr>
+        <w:t xml:space="preserve"> </w:t>
+      </w:r>
+      <w:r>
+        <w:rPr>
+          <w:lang w:eastAsia="es-VE"/>
+        </w:rPr>
+        <w:t>de</w:t>
+      </w:r>
+      <w:r>
+        <w:rPr>
+          <w:lang w:eastAsia="es-VE"/>
+        </w:rPr>
+        <w:t>l</w:t>
+      </w:r>
+      <w:r>
+        <w:rPr>
+          <w:lang w:eastAsia="es-VE"/>
+        </w:rPr>
+        <w:t xml:space="preserve"> aprendizaje supervisado.</w:t>
+      </w:r>
+      <w:r>
+        <w:rPr>
+          <w:lang w:eastAsia="es-VE"/>
+        </w:rPr>
+        <w:t xml:space="preserve"> </w:t>
+      </w:r>
+      <w:r>
+        <w:rPr>
+          <w:lang w:eastAsia="es-VE"/>
+        </w:rPr>
+        <w:t xml:space="preserve">Entre las técnicas </w:t>
+      </w:r>
+      <w:r>
+        <w:rPr>
+          <w:lang w:eastAsia="es-VE"/>
+        </w:rPr>
+        <w:t>más conocidas</w:t>
+      </w:r>
+      <w:r>
+        <w:rPr>
+          <w:lang w:eastAsia="es-VE"/>
+        </w:rPr>
+        <w:t xml:space="preserve"> se encuentran: </w:t>
+      </w:r>
+      <w:r>
+        <w:rPr>
+          <w:i/>
+          <w:lang w:eastAsia="es-VE"/>
+        </w:rPr>
+        <w:t>detección de outliers</w:t>
+      </w:r>
+      <w:r>
+        <w:rPr>
+          <w:lang w:eastAsia="es-VE"/>
+        </w:rPr>
+        <w:t xml:space="preserve"> y de </w:t>
+      </w:r>
+      <w:r>
+        <w:rPr>
+          <w:i/>
+          <w:lang w:eastAsia="es-VE"/>
+        </w:rPr>
+        <w:t>novedades</w:t>
+      </w:r>
+      <w:r>
+        <w:rPr>
+          <w:lang w:eastAsia="es-VE"/>
+        </w:rPr>
+        <w:t xml:space="preserve">; </w:t>
+      </w:r>
+      <w:r>
+        <w:rPr>
+          <w:i/>
+          <w:lang w:eastAsia="es-VE"/>
+        </w:rPr>
+        <w:t>análisis de componentes principales</w:t>
+      </w:r>
+      <w:r>
+        <w:rPr>
+          <w:lang w:eastAsia="es-VE"/>
+        </w:rPr>
+        <w:t xml:space="preserve"> más conocido por sus siglas en inglés </w:t>
+      </w:r>
+      <w:r>
+        <w:rPr>
+          <w:i/>
+          <w:lang w:eastAsia="es-VE"/>
+        </w:rPr>
+        <w:t>PCA</w:t>
+      </w:r>
+      <w:r>
+        <w:rPr>
+          <w:lang w:eastAsia="es-VE"/>
+        </w:rPr>
+        <w:t xml:space="preserve"> de </w:t>
+      </w:r>
+      <w:r>
+        <w:rPr>
+          <w:i/>
+          <w:lang w:eastAsia="es-VE"/>
+        </w:rPr>
+        <w:t xml:space="preserve">Principal </w:t>
+      </w:r>
+      <w:proofErr w:type="spellStart"/>
+      <w:r>
+        <w:rPr>
+          <w:i/>
+          <w:lang w:eastAsia="es-VE"/>
+        </w:rPr>
+        <w:t>Components</w:t>
+      </w:r>
+      <w:proofErr w:type="spellEnd"/>
+      <w:r>
+        <w:rPr>
+          <w:i/>
+          <w:lang w:eastAsia="es-VE"/>
+        </w:rPr>
+        <w:t xml:space="preserve"> </w:t>
+      </w:r>
+      <w:proofErr w:type="spellStart"/>
+      <w:r>
+        <w:rPr>
+          <w:i/>
+          <w:lang w:eastAsia="es-VE"/>
+        </w:rPr>
+        <w:t>Analys</w:t>
+      </w:r>
+      <w:r>
+        <w:rPr>
+          <w:i/>
+          <w:lang w:eastAsia="es-VE"/>
+        </w:rPr>
+        <w:t>is</w:t>
+      </w:r>
+      <w:proofErr w:type="spellEnd"/>
+      <w:r>
+        <w:rPr>
+          <w:lang w:eastAsia="es-VE"/>
+        </w:rPr>
+        <w:t>;</w:t>
+      </w:r>
+      <w:r>
+        <w:rPr>
+          <w:lang w:eastAsia="es-VE"/>
+        </w:rPr>
+        <w:t xml:space="preserve"> </w:t>
+      </w:r>
+      <w:proofErr w:type="spellStart"/>
+      <w:r>
+        <w:rPr>
+          <w:i/>
+          <w:lang w:eastAsia="es-VE"/>
+        </w:rPr>
+        <w:t>clusteri</w:t>
+      </w:r>
+      <w:r>
+        <w:rPr>
+          <w:i/>
+          <w:lang w:eastAsia="es-VE"/>
+        </w:rPr>
+        <w:t>ng</w:t>
+      </w:r>
+      <w:proofErr w:type="spellEnd"/>
+      <w:r>
+        <w:rPr>
+          <w:lang w:eastAsia="es-VE"/>
+        </w:rPr>
+        <w:t xml:space="preserve">; y </w:t>
+      </w:r>
+      <w:r>
+        <w:rPr>
+          <w:i/>
+          <w:lang w:eastAsia="es-VE"/>
+        </w:rPr>
+        <w:t>bosques aleatorios</w:t>
       </w:r>
       <w:r>
         <w:rPr>
@@ -2433,20 +2637,41 @@
         <w:rPr>
           <w:lang w:eastAsia="es-VE"/>
         </w:rPr>
-        <w:t xml:space="preserve"> Entre l</w:t>
-      </w:r>
-      <w:r>
-        <w:rPr>
-          <w:lang w:eastAsia="es-VE"/>
-        </w:rPr>
-        <w:t xml:space="preserve">as tareas típicas del </w:t>
-      </w:r>
+        <w:t xml:space="preserve"> </w:t>
+      </w:r>
+      <w:r>
+        <w:rPr>
+          <w:lang w:eastAsia="es-VE"/>
+        </w:rPr>
+        <w:t xml:space="preserve">El </w:t>
+      </w:r>
+      <w:proofErr w:type="spellStart"/>
       <w:r>
         <w:rPr>
           <w:i/>
           <w:lang w:eastAsia="es-VE"/>
         </w:rPr>
-        <w:t>aprendizaje no supervisado</w:t>
+        <w:t>clustering</w:t>
+      </w:r>
+      <w:proofErr w:type="spellEnd"/>
+      <w:r>
+        <w:rPr>
+          <w:lang w:eastAsia="es-VE"/>
+        </w:rPr>
+        <w:t xml:space="preserve"> o </w:t>
+      </w:r>
+      <w:r>
+        <w:rPr>
+          <w:i/>
+          <w:lang w:eastAsia="es-VE"/>
+        </w:rPr>
+        <w:t>agrupamiento</w:t>
+      </w:r>
+      <w:r>
+        <w:rPr>
+          <w:lang w:eastAsia="es-VE"/>
+        </w:rPr>
+        <w:t xml:space="preserve"> es una parte no supervisada de la clasificación, y su objetivo es</w:t>
       </w:r>
       <w:r>
         <w:rPr>
@@ -2458,7 +2683,25 @@
         <w:rPr>
           <w:lang w:eastAsia="es-VE"/>
         </w:rPr>
-        <w:t>está</w:t>
+        <w:t>cate</w:t>
+      </w:r>
+      <w:r>
+        <w:rPr>
+          <w:lang w:eastAsia="es-VE"/>
+        </w:rPr>
+        <w:t xml:space="preserve">gorizar las muestras de entrada </w:t>
+      </w:r>
+      <w:r>
+        <w:rPr>
+          <w:lang w:eastAsia="es-VE"/>
+        </w:rPr>
+        <w:t xml:space="preserve">en </w:t>
+      </w:r>
+      <w:r>
+        <w:rPr>
+          <w:lang w:eastAsia="es-VE"/>
+        </w:rPr>
+        <w:t>clústeres</w:t>
       </w:r>
       <w:r>
         <w:rPr>
@@ -2470,37 +2713,13 @@
         <w:rPr>
           <w:lang w:eastAsia="es-VE"/>
         </w:rPr>
-        <w:t xml:space="preserve">la </w:t>
-      </w:r>
-      <w:r>
-        <w:rPr>
-          <w:lang w:eastAsia="es-VE"/>
-        </w:rPr>
-        <w:t xml:space="preserve">agrupación de datos y </w:t>
-      </w:r>
-      <w:r>
-        <w:rPr>
-          <w:lang w:eastAsia="es-VE"/>
-        </w:rPr>
-        <w:t>la detección de valores atípicos. E</w:t>
-      </w:r>
-      <w:r>
-        <w:rPr>
-          <w:lang w:eastAsia="es-VE"/>
-        </w:rPr>
-        <w:t xml:space="preserve">stas técnicas </w:t>
-      </w:r>
-      <w:r>
-        <w:rPr>
-          <w:lang w:eastAsia="es-VE"/>
-        </w:rPr>
-        <w:t>se utilizan con</w:t>
-      </w:r>
-      <w:r>
-        <w:rPr>
-          <w:lang w:eastAsia="es-VE"/>
-        </w:rPr>
-        <w:t xml:space="preserve"> éxito en una amplia</w:t>
+        <w:t xml:space="preserve">o grupos </w:t>
+      </w:r>
+      <w:r>
+        <w:rPr>
+          <w:lang w:eastAsia="es-VE"/>
+        </w:rPr>
+        <w:t>sin ninguna supervisión.</w:t>
       </w:r>
       <w:r>
         <w:rPr>
@@ -2512,396 +2731,13 @@
         <w:rPr>
           <w:lang w:eastAsia="es-VE"/>
         </w:rPr>
-        <w:t xml:space="preserve">gama </w:t>
-      </w:r>
-      <w:r>
-        <w:rPr>
-          <w:lang w:eastAsia="es-VE"/>
-        </w:rPr>
-        <w:t>de problemas como</w:t>
-      </w:r>
-      <w:r>
-        <w:rPr>
-          <w:lang w:eastAsia="es-VE"/>
-        </w:rPr>
-        <w:t xml:space="preserve"> </w:t>
-      </w:r>
-      <w:r>
-        <w:rPr>
-          <w:lang w:eastAsia="es-VE"/>
-        </w:rPr>
-        <w:t xml:space="preserve">el </w:t>
-      </w:r>
-      <w:r>
-        <w:rPr>
-          <w:lang w:eastAsia="es-VE"/>
-        </w:rPr>
-        <w:t>diagnóstico</w:t>
-      </w:r>
-      <w:r>
-        <w:rPr>
-          <w:lang w:eastAsia="es-VE"/>
-        </w:rPr>
-        <w:t xml:space="preserve"> de</w:t>
-      </w:r>
-      <w:r>
-        <w:rPr>
-          <w:lang w:eastAsia="es-VE"/>
-        </w:rPr>
-        <w:t xml:space="preserve"> sistema</w:t>
-      </w:r>
-      <w:r>
-        <w:rPr>
-          <w:lang w:eastAsia="es-VE"/>
-        </w:rPr>
-        <w:t>s</w:t>
-      </w:r>
-      <w:r>
-        <w:rPr>
-          <w:lang w:eastAsia="es-VE"/>
-        </w:rPr>
-        <w:t>, seguridad, detección de eventos y</w:t>
-      </w:r>
-      <w:r>
-        <w:rPr>
-          <w:lang w:eastAsia="es-VE"/>
-        </w:rPr>
-        <w:t xml:space="preserve"> </w:t>
-      </w:r>
-      <w:r>
-        <w:rPr>
-          <w:lang w:eastAsia="es-VE"/>
-        </w:rPr>
-        <w:t xml:space="preserve">análisis de redes sociales. </w:t>
-      </w:r>
-      <w:r>
-        <w:rPr>
-          <w:lang w:eastAsia="es-VE"/>
-        </w:rPr>
-        <w:t>T</w:t>
-      </w:r>
-      <w:r>
-        <w:rPr>
-          <w:lang w:eastAsia="es-VE"/>
-        </w:rPr>
-        <w:t xml:space="preserve">ambién se utiliza a menudo como un </w:t>
-      </w:r>
-      <w:r>
-        <w:rPr>
-          <w:lang w:eastAsia="es-VE"/>
-        </w:rPr>
-        <w:t xml:space="preserve">paso de </w:t>
-      </w:r>
-      <w:r>
-        <w:rPr>
-          <w:lang w:eastAsia="es-VE"/>
-        </w:rPr>
-        <w:t>preprocesamiento</w:t>
-      </w:r>
-      <w:r>
-        <w:rPr>
-          <w:lang w:eastAsia="es-VE"/>
-        </w:rPr>
-        <w:t xml:space="preserve"> </w:t>
-      </w:r>
-      <w:r>
-        <w:rPr>
-          <w:lang w:eastAsia="es-VE"/>
-        </w:rPr>
-        <w:t>de</w:t>
-      </w:r>
-      <w:r>
-        <w:rPr>
-          <w:lang w:eastAsia="es-VE"/>
-        </w:rPr>
-        <w:t>l</w:t>
-      </w:r>
-      <w:r>
-        <w:rPr>
-          <w:lang w:eastAsia="es-VE"/>
-        </w:rPr>
-        <w:t xml:space="preserve"> aprendizaje supervisado.</w:t>
-      </w:r>
-      <w:r>
-        <w:rPr>
-          <w:lang w:eastAsia="es-VE"/>
-        </w:rPr>
-        <w:t xml:space="preserve"> </w:t>
-      </w:r>
-      <w:r>
-        <w:rPr>
-          <w:lang w:eastAsia="es-VE"/>
-        </w:rPr>
-        <w:t xml:space="preserve">Entre las técnicas </w:t>
-      </w:r>
-      <w:r>
-        <w:rPr>
-          <w:lang w:eastAsia="es-VE"/>
-        </w:rPr>
-        <w:t>más conocidas</w:t>
-      </w:r>
-      <w:r>
-        <w:rPr>
-          <w:lang w:eastAsia="es-VE"/>
-        </w:rPr>
-        <w:t xml:space="preserve"> se encuentran: </w:t>
-      </w:r>
-      <w:r>
-        <w:rPr>
-          <w:i/>
-          <w:lang w:eastAsia="es-VE"/>
-        </w:rPr>
-        <w:t>detección de outliers</w:t>
-      </w:r>
-      <w:r>
-        <w:rPr>
-          <w:lang w:eastAsia="es-VE"/>
-        </w:rPr>
-        <w:t xml:space="preserve"> y de </w:t>
-      </w:r>
-      <w:r>
-        <w:rPr>
-          <w:i/>
-          <w:lang w:eastAsia="es-VE"/>
-        </w:rPr>
-        <w:t>novedades</w:t>
-      </w:r>
-      <w:r>
-        <w:rPr>
-          <w:lang w:eastAsia="es-VE"/>
-        </w:rPr>
-        <w:t xml:space="preserve">; </w:t>
-      </w:r>
-      <w:r>
-        <w:rPr>
-          <w:i/>
-          <w:lang w:eastAsia="es-VE"/>
-        </w:rPr>
-        <w:lastRenderedPageBreak/>
-        <w:t>análisis de componentes principales</w:t>
-      </w:r>
-      <w:r>
-        <w:rPr>
-          <w:lang w:eastAsia="es-VE"/>
-        </w:rPr>
-        <w:t xml:space="preserve"> más conocido por sus siglas en inglés </w:t>
-      </w:r>
-      <w:r>
-        <w:rPr>
-          <w:i/>
-          <w:lang w:eastAsia="es-VE"/>
-        </w:rPr>
-        <w:t>PCA</w:t>
-      </w:r>
-      <w:r>
-        <w:rPr>
-          <w:lang w:eastAsia="es-VE"/>
-        </w:rPr>
-        <w:t xml:space="preserve"> de </w:t>
-      </w:r>
-      <w:r>
-        <w:rPr>
-          <w:i/>
-          <w:lang w:eastAsia="es-VE"/>
-        </w:rPr>
-        <w:t xml:space="preserve">Principal </w:t>
-      </w:r>
-      <w:proofErr w:type="spellStart"/>
-      <w:r>
-        <w:rPr>
-          <w:i/>
-          <w:lang w:eastAsia="es-VE"/>
-        </w:rPr>
-        <w:t>Components</w:t>
-      </w:r>
-      <w:proofErr w:type="spellEnd"/>
-      <w:r>
-        <w:rPr>
-          <w:i/>
-          <w:lang w:eastAsia="es-VE"/>
-        </w:rPr>
-        <w:t xml:space="preserve"> </w:t>
-      </w:r>
-      <w:proofErr w:type="spellStart"/>
-      <w:r>
-        <w:rPr>
-          <w:i/>
-          <w:lang w:eastAsia="es-VE"/>
-        </w:rPr>
-        <w:t>Analys</w:t>
-      </w:r>
-      <w:r>
-        <w:rPr>
-          <w:i/>
-          <w:lang w:eastAsia="es-VE"/>
-        </w:rPr>
-        <w:t>is</w:t>
-      </w:r>
-      <w:proofErr w:type="spellEnd"/>
-      <w:r>
-        <w:rPr>
-          <w:lang w:eastAsia="es-VE"/>
-        </w:rPr>
-        <w:t>;</w:t>
-      </w:r>
-      <w:r>
-        <w:rPr>
-          <w:lang w:eastAsia="es-VE"/>
-        </w:rPr>
-        <w:t xml:space="preserve"> </w:t>
-      </w:r>
-      <w:proofErr w:type="spellStart"/>
-      <w:r>
-        <w:rPr>
-          <w:i/>
-          <w:lang w:eastAsia="es-VE"/>
-        </w:rPr>
-        <w:t>clusteri</w:t>
-      </w:r>
-      <w:r>
-        <w:rPr>
-          <w:i/>
-          <w:lang w:eastAsia="es-VE"/>
-        </w:rPr>
-        <w:t>ng</w:t>
-      </w:r>
-      <w:proofErr w:type="spellEnd"/>
-      <w:r>
-        <w:rPr>
-          <w:lang w:eastAsia="es-VE"/>
-        </w:rPr>
-        <w:t xml:space="preserve">; y </w:t>
-      </w:r>
-      <w:r>
-        <w:rPr>
-          <w:i/>
-          <w:lang w:eastAsia="es-VE"/>
-        </w:rPr>
-        <w:t>bosques aleatorios</w:t>
-      </w:r>
-      <w:r>
-        <w:rPr>
-          <w:lang w:eastAsia="es-VE"/>
-        </w:rPr>
-        <w:t>.</w:t>
-      </w:r>
-      <w:r>
-        <w:rPr>
-          <w:lang w:eastAsia="es-VE"/>
-        </w:rPr>
-        <w:t xml:space="preserve"> </w:t>
-      </w:r>
-      <w:r>
-        <w:rPr>
-          <w:lang w:eastAsia="es-VE"/>
-        </w:rPr>
-        <w:t xml:space="preserve">El </w:t>
-      </w:r>
-      <w:proofErr w:type="spellStart"/>
-      <w:r>
-        <w:rPr>
-          <w:i/>
-          <w:lang w:eastAsia="es-VE"/>
-        </w:rPr>
-        <w:t>clustering</w:t>
-      </w:r>
-      <w:proofErr w:type="spellEnd"/>
-      <w:r>
-        <w:rPr>
-          <w:lang w:eastAsia="es-VE"/>
-        </w:rPr>
-        <w:t xml:space="preserve"> o </w:t>
-      </w:r>
-      <w:r>
-        <w:rPr>
-          <w:i/>
-          <w:lang w:eastAsia="es-VE"/>
-        </w:rPr>
-        <w:t>agrupamiento</w:t>
-      </w:r>
-      <w:r>
-        <w:rPr>
-          <w:lang w:eastAsia="es-VE"/>
-        </w:rPr>
-        <w:t xml:space="preserve"> es una parte no supervisada de la clasificación, y su objetivo es</w:t>
-      </w:r>
-      <w:r>
-        <w:rPr>
-          <w:lang w:eastAsia="es-VE"/>
-        </w:rPr>
-        <w:t xml:space="preserve"> </w:t>
-      </w:r>
-      <w:r>
-        <w:rPr>
-          <w:lang w:eastAsia="es-VE"/>
-        </w:rPr>
-        <w:t>cate</w:t>
-      </w:r>
-      <w:r>
-        <w:rPr>
-          <w:lang w:eastAsia="es-VE"/>
-        </w:rPr>
-        <w:t xml:space="preserve">gorizar las muestras de entrada </w:t>
-      </w:r>
-      <w:r>
-        <w:rPr>
-          <w:lang w:eastAsia="es-VE"/>
-        </w:rPr>
-        <w:t xml:space="preserve">en </w:t>
-      </w:r>
-      <w:r>
-        <w:rPr>
-          <w:lang w:eastAsia="es-VE"/>
-        </w:rPr>
-        <w:t>clústeres</w:t>
-      </w:r>
-      <w:r>
-        <w:rPr>
-          <w:lang w:eastAsia="es-VE"/>
-        </w:rPr>
-        <w:t xml:space="preserve"> </w:t>
-      </w:r>
-      <w:r>
-        <w:rPr>
-          <w:lang w:eastAsia="es-VE"/>
-        </w:rPr>
-        <w:t xml:space="preserve">o grupos </w:t>
-      </w:r>
-      <w:r>
-        <w:rPr>
-          <w:lang w:eastAsia="es-VE"/>
-        </w:rPr>
-        <w:t>sin ninguna supervisión.</w:t>
-      </w:r>
-      <w:r>
-        <w:rPr>
-          <w:lang w:eastAsia="es-VE"/>
-        </w:rPr>
-        <w:t xml:space="preserve"> </w:t>
-      </w:r>
-      <w:r>
-        <w:rPr>
-          <w:lang w:eastAsia="es-VE"/>
-        </w:rPr>
         <w:t xml:space="preserve">Por lo general, se supone que muestras similares pertenecen al mismo grupo, y </w:t>
       </w:r>
       <w:r>
         <w:rPr>
           <w:lang w:eastAsia="es-VE"/>
         </w:rPr>
-        <w:t>se supone que las muestras disímiles pertenecen a grupos diferentes. Por lo tanto, cómo medir</w:t>
-      </w:r>
-      <w:r>
-        <w:rPr>
-          <w:lang w:eastAsia="es-VE"/>
-        </w:rPr>
-        <w:t xml:space="preserve"> </w:t>
-      </w:r>
-      <w:r>
-        <w:rPr>
-          <w:lang w:eastAsia="es-VE"/>
-        </w:rPr>
-        <w:t>la similitud entre las muestras es la cuestión clave en la agrupación</w:t>
+        <w:t>se supone que las muestras disímiles pertenecen a grupos diferentes. Por lo tanto, cómo medir la similitud entre las muestras es la cuestión clave en la agrupación</w:t>
       </w:r>
       <w:r>
         <w:rPr>
@@ -3095,19 +2931,43 @@
         <w:rPr>
           <w:lang w:eastAsia="es-VE"/>
         </w:rPr>
-        <w:t xml:space="preserve">supervisor no responde </w:t>
-      </w:r>
-      <w:r>
-        <w:rPr>
-          <w:lang w:eastAsia="es-VE"/>
-        </w:rPr>
-        <w:t>d</w:t>
-      </w:r>
-      <w:r>
-        <w:rPr>
-          <w:lang w:eastAsia="es-VE"/>
-        </w:rPr>
-        <w:t>irectamente</w:t>
+        <w:t xml:space="preserve">supervisor no responde directamente a las preguntas </w:t>
+      </w:r>
+      <w:r>
+        <w:rPr>
+          <w:lang w:eastAsia="es-VE"/>
+        </w:rPr>
+        <w:t>sino que</w:t>
+      </w:r>
+      <w:r>
+        <w:rPr>
+          <w:lang w:eastAsia="es-VE"/>
+        </w:rPr>
+        <w:t xml:space="preserve"> evalúa </w:t>
+      </w:r>
+      <w:r>
+        <w:rPr>
+          <w:lang w:eastAsia="es-VE"/>
+        </w:rPr>
+        <w:t>el comportamiento del sistema</w:t>
+      </w:r>
+      <w:r>
+        <w:rPr>
+          <w:lang w:eastAsia="es-VE"/>
+        </w:rPr>
+        <w:t xml:space="preserve"> y </w:t>
+      </w:r>
+      <w:r>
+        <w:rPr>
+          <w:lang w:eastAsia="es-VE"/>
+        </w:rPr>
+        <w:t xml:space="preserve">le </w:t>
+      </w:r>
+      <w:r>
+        <w:rPr>
+          <w:lang w:eastAsia="es-VE"/>
+        </w:rPr>
+        <w:t>proporciona</w:t>
       </w:r>
       <w:r>
         <w:rPr>
@@ -3119,25 +2979,19 @@
         <w:rPr>
           <w:lang w:eastAsia="es-VE"/>
         </w:rPr>
-        <w:t xml:space="preserve">a las preguntas </w:t>
-      </w:r>
-      <w:r>
-        <w:rPr>
-          <w:lang w:eastAsia="es-VE"/>
-        </w:rPr>
-        <w:t>sino que</w:t>
-      </w:r>
-      <w:r>
-        <w:rPr>
-          <w:lang w:eastAsia="es-VE"/>
-        </w:rPr>
-        <w:t xml:space="preserve"> evalúa </w:t>
-      </w:r>
-      <w:r>
-        <w:rPr>
-          <w:lang w:eastAsia="es-VE"/>
-        </w:rPr>
-        <w:t>el comportamiento del sistema</w:t>
+        <w:t>retroalimentación</w:t>
+      </w:r>
+      <w:r>
+        <w:rPr>
+          <w:lang w:eastAsia="es-VE"/>
+        </w:rPr>
+        <w:t xml:space="preserve"> al respecto. El objetivo </w:t>
+      </w:r>
+      <w:r>
+        <w:rPr>
+          <w:lang w:eastAsia="es-VE"/>
+        </w:rPr>
+        <w:t>del aprendizaje por refuerzo es que en base</w:t>
       </w:r>
       <w:r>
         <w:rPr>
@@ -3149,19 +3003,103 @@
         <w:rPr>
           <w:lang w:eastAsia="es-VE"/>
         </w:rPr>
-        <w:t xml:space="preserve">y </w:t>
-      </w:r>
-      <w:r>
-        <w:rPr>
-          <w:lang w:eastAsia="es-VE"/>
-        </w:rPr>
-        <w:t xml:space="preserve">le </w:t>
-      </w:r>
-      <w:r>
-        <w:rPr>
-          <w:lang w:eastAsia="es-VE"/>
-        </w:rPr>
-        <w:t>proporciona</w:t>
+        <w:t>a la</w:t>
+      </w:r>
+      <w:r>
+        <w:rPr>
+          <w:lang w:eastAsia="es-VE"/>
+        </w:rPr>
+        <w:t xml:space="preserve"> retroalimentación del supervisor, </w:t>
+      </w:r>
+      <w:r>
+        <w:rPr>
+          <w:lang w:eastAsia="es-VE"/>
+        </w:rPr>
+        <w:t>le permita a la computadora mejorar</w:t>
+      </w:r>
+      <w:r>
+        <w:rPr>
+          <w:lang w:eastAsia="es-VE"/>
+        </w:rPr>
+        <w:t xml:space="preserve"> su comportamiento para maximizar </w:t>
+      </w:r>
+      <w:r>
+        <w:rPr>
+          <w:lang w:eastAsia="es-VE"/>
+        </w:rPr>
+        <w:t>el resultado de l</w:t>
+      </w:r>
+      <w:r>
+        <w:rPr>
+          <w:lang w:eastAsia="es-VE"/>
+        </w:rPr>
+        <w:t>a evaluación</w:t>
+      </w:r>
+      <w:r>
+        <w:rPr>
+          <w:lang w:eastAsia="es-VE"/>
+        </w:rPr>
+        <w:t>. El aprendizaje por refuer</w:t>
+      </w:r>
+      <w:r>
+        <w:rPr>
+          <w:lang w:eastAsia="es-VE"/>
+        </w:rPr>
+        <w:t>zo es un modelo importante para e</w:t>
+      </w:r>
+      <w:r>
+        <w:rPr>
+          <w:lang w:eastAsia="es-VE"/>
+        </w:rPr>
+        <w:t xml:space="preserve">l comportamiento de los humanos y los robots, y se ha aplicado a varias áreas, tales como </w:t>
+      </w:r>
+      <w:r>
+        <w:rPr>
+          <w:lang w:eastAsia="es-VE"/>
+        </w:rPr>
+        <w:t>el c</w:t>
+      </w:r>
+      <w:r>
+        <w:rPr>
+          <w:lang w:eastAsia="es-VE"/>
+        </w:rPr>
+        <w:t>ontrol autónom</w:t>
+      </w:r>
+      <w:r>
+        <w:rPr>
+          <w:lang w:eastAsia="es-VE"/>
+        </w:rPr>
+        <w:t>o de robots, juegos de computadora</w:t>
+      </w:r>
+      <w:r>
+        <w:rPr>
+          <w:lang w:eastAsia="es-VE"/>
+        </w:rPr>
+        <w:t xml:space="preserve"> y </w:t>
+      </w:r>
+      <w:r>
+        <w:rPr>
+          <w:lang w:eastAsia="es-VE"/>
+        </w:rPr>
+        <w:t xml:space="preserve">estrategias de </w:t>
+      </w:r>
+      <w:r>
+        <w:rPr>
+          <w:lang w:eastAsia="es-VE"/>
+        </w:rPr>
+        <w:t xml:space="preserve">optimización de </w:t>
+      </w:r>
+      <w:r>
+        <w:rPr>
+          <w:lang w:eastAsia="es-VE"/>
+        </w:rPr>
+        <w:t>mercadeo</w:t>
+      </w:r>
+      <w:r>
+        <w:rPr>
+          <w:lang w:eastAsia="es-VE"/>
+        </w:rPr>
+        <w:t>.</w:t>
       </w:r>
       <w:r>
         <w:rPr>
@@ -3173,169 +3111,13 @@
         <w:rPr>
           <w:lang w:eastAsia="es-VE"/>
         </w:rPr>
-        <w:t>retroalimentación</w:t>
-      </w:r>
-      <w:r>
-        <w:rPr>
-          <w:lang w:eastAsia="es-VE"/>
-        </w:rPr>
-        <w:t xml:space="preserve"> al respecto. El objetivo </w:t>
-      </w:r>
-      <w:r>
-        <w:rPr>
-          <w:lang w:eastAsia="es-VE"/>
-        </w:rPr>
-        <w:t>del aprendizaje por refuerzo es que en base</w:t>
-      </w:r>
-      <w:r>
-        <w:rPr>
-          <w:lang w:eastAsia="es-VE"/>
-        </w:rPr>
-        <w:t xml:space="preserve"> </w:t>
-      </w:r>
-      <w:r>
-        <w:rPr>
-          <w:lang w:eastAsia="es-VE"/>
-        </w:rPr>
-        <w:t>a la</w:t>
-      </w:r>
-      <w:r>
-        <w:rPr>
-          <w:lang w:eastAsia="es-VE"/>
-        </w:rPr>
-        <w:t xml:space="preserve"> </w:t>
-      </w:r>
-      <w:r>
-        <w:rPr>
-          <w:lang w:eastAsia="es-VE"/>
-        </w:rPr>
-        <w:t xml:space="preserve">retroalimentación del supervisor, </w:t>
-      </w:r>
-      <w:r>
-        <w:rPr>
-          <w:lang w:eastAsia="es-VE"/>
-        </w:rPr>
-        <w:t>le permita a la computadora mejorar</w:t>
-      </w:r>
-      <w:r>
-        <w:rPr>
-          <w:lang w:eastAsia="es-VE"/>
-        </w:rPr>
-        <w:t xml:space="preserve"> su comportamient</w:t>
-      </w:r>
-      <w:r>
-        <w:rPr>
-          <w:lang w:eastAsia="es-VE"/>
-        </w:rPr>
-        <w:t xml:space="preserve">o para maximizar </w:t>
-      </w:r>
-      <w:r>
-        <w:rPr>
-          <w:lang w:eastAsia="es-VE"/>
-        </w:rPr>
-        <w:t>el resultado de l</w:t>
-      </w:r>
-      <w:r>
-        <w:rPr>
-          <w:lang w:eastAsia="es-VE"/>
-        </w:rPr>
-        <w:t>a evaluación</w:t>
-      </w:r>
-      <w:r>
-        <w:rPr>
-          <w:lang w:eastAsia="es-VE"/>
-        </w:rPr>
-        <w:t>. El aprendizaje por refuer</w:t>
-      </w:r>
-      <w:r>
-        <w:rPr>
-          <w:lang w:eastAsia="es-VE"/>
-        </w:rPr>
-        <w:t>zo es un modelo importante para e</w:t>
-      </w:r>
-      <w:r>
-        <w:rPr>
-          <w:lang w:eastAsia="es-VE"/>
-        </w:rPr>
-        <w:t>l comportamiento de los humanos y los robots, y se ha aplicado a varias áreas, tales como</w:t>
-      </w:r>
-      <w:r>
-        <w:rPr>
-          <w:lang w:eastAsia="es-VE"/>
-        </w:rPr>
-        <w:t xml:space="preserve"> </w:t>
-      </w:r>
-      <w:r>
-        <w:rPr>
-          <w:lang w:eastAsia="es-VE"/>
-        </w:rPr>
-        <w:t>el c</w:t>
-      </w:r>
-      <w:r>
-        <w:rPr>
-          <w:lang w:eastAsia="es-VE"/>
-        </w:rPr>
-        <w:t>ontrol autónom</w:t>
-      </w:r>
-      <w:r>
-        <w:rPr>
-          <w:lang w:eastAsia="es-VE"/>
-        </w:rPr>
-        <w:t>o de robots, juegos de computadora</w:t>
-      </w:r>
-      <w:r>
-        <w:rPr>
-          <w:lang w:eastAsia="es-VE"/>
-        </w:rPr>
-        <w:t xml:space="preserve"> y </w:t>
-      </w:r>
-      <w:r>
-        <w:rPr>
-          <w:lang w:eastAsia="es-VE"/>
-        </w:rPr>
-        <w:t xml:space="preserve">estrategias de </w:t>
-      </w:r>
-      <w:r>
-        <w:rPr>
-          <w:lang w:eastAsia="es-VE"/>
-        </w:rPr>
-        <w:t xml:space="preserve">optimización de </w:t>
-      </w:r>
-      <w:r>
-        <w:rPr>
-          <w:lang w:eastAsia="es-VE"/>
-        </w:rPr>
-        <w:t>mercadeo</w:t>
-      </w:r>
-      <w:r>
-        <w:rPr>
-          <w:lang w:eastAsia="es-VE"/>
-        </w:rPr>
-        <w:t>.</w:t>
-      </w:r>
-      <w:r>
-        <w:rPr>
-          <w:lang w:eastAsia="es-VE"/>
-        </w:rPr>
-        <w:t xml:space="preserve"> </w:t>
-      </w:r>
-      <w:r>
-        <w:rPr>
-          <w:lang w:eastAsia="es-VE"/>
-        </w:rPr>
         <w:t xml:space="preserve">Detrás del aprendizaje por refuerzo, </w:t>
       </w:r>
       <w:r>
         <w:rPr>
           <w:lang w:eastAsia="es-VE"/>
         </w:rPr>
-        <w:t>se utilizan a menudo</w:t>
-      </w:r>
-      <w:r>
-        <w:rPr>
-          <w:lang w:eastAsia="es-VE"/>
-        </w:rPr>
-        <w:t xml:space="preserve"> </w:t>
+        <w:t xml:space="preserve">se utilizan a menudo </w:t>
       </w:r>
       <w:r>
         <w:rPr>
@@ -3359,25 +3141,13 @@
         <w:rPr>
           <w:lang w:eastAsia="es-VE"/>
         </w:rPr>
-        <w:t xml:space="preserve"> y no supervisados tales como</w:t>
-      </w:r>
-      <w:r>
-        <w:rPr>
-          <w:lang w:eastAsia="es-VE"/>
-        </w:rPr>
-        <w:t xml:space="preserve"> </w:t>
-      </w:r>
-      <w:r>
-        <w:rPr>
-          <w:lang w:eastAsia="es-VE"/>
-        </w:rPr>
-        <w:t>como regresión, clasificación y agrupamiento.</w:t>
-      </w:r>
-      <w:r>
-        <w:rPr>
-          <w:lang w:eastAsia="es-VE"/>
-        </w:rPr>
-        <w:t xml:space="preserve"> </w:t>
+        <w:t xml:space="preserve"> y no supervisados tales como como regresión, clasificación y agrupamiento. </w:t>
+      </w:r>
+      <w:r>
+        <w:rPr>
+          <w:lang w:eastAsia="es-VE"/>
+        </w:rPr>
+        <w:t>En este libro no abordaremos esta metodología.</w:t>
       </w:r>
     </w:p>
     <w:p>
@@ -3596,447 +3366,426 @@
         </w:rPr>
         <w:t>, no supervisados o una</w:t>
       </w:r>
+      <w:r>
+        <w:rPr>
+          <w:lang w:eastAsia="es-VE"/>
+        </w:rPr>
+        <w:t xml:space="preserve"> combinación de los anteriores</w:t>
+      </w:r>
+      <w:r>
+        <w:rPr>
+          <w:lang w:eastAsia="es-VE"/>
+        </w:rPr>
+        <w:t xml:space="preserve">. </w:t>
+      </w:r>
+    </w:p>
+    <w:p>
+      <w:pPr>
+        <w:spacing w:after="0"/>
+        <w:rPr>
+          <w:lang w:eastAsia="es-VE"/>
+        </w:rPr>
+      </w:pPr>
+    </w:p>
+    <w:p>
+      <w:pPr>
+        <w:spacing w:after="0"/>
+        <w:rPr>
+          <w:lang w:eastAsia="es-VE"/>
+        </w:rPr>
+      </w:pPr>
+      <w:r>
+        <w:rPr>
+          <w:lang w:eastAsia="es-VE"/>
+        </w:rPr>
+        <w:t>El</w:t>
+      </w:r>
+      <w:r>
+        <w:rPr>
+          <w:lang w:eastAsia="es-VE"/>
+        </w:rPr>
+        <w:t xml:space="preserve"> </w:t>
+      </w:r>
+      <w:r>
+        <w:rPr>
+          <w:b/>
+          <w:lang w:eastAsia="es-VE"/>
+        </w:rPr>
+        <w:t>Capítulo</w:t>
+      </w:r>
+      <w:r>
+        <w:rPr>
+          <w:b/>
+          <w:lang w:eastAsia="es-VE"/>
+        </w:rPr>
+        <w:t xml:space="preserve"> 4</w:t>
+      </w:r>
+      <w:r>
+        <w:rPr>
+          <w:lang w:eastAsia="es-VE"/>
+        </w:rPr>
+        <w:t xml:space="preserve"> </w:t>
+      </w:r>
+      <w:r>
+        <w:rPr>
+          <w:lang w:eastAsia="es-VE"/>
+        </w:rPr>
+        <w:t xml:space="preserve">se </w:t>
+      </w:r>
+      <w:r>
+        <w:rPr>
+          <w:lang w:eastAsia="es-VE"/>
+        </w:rPr>
+        <w:t>dedica</w:t>
+      </w:r>
+      <w:r>
+        <w:rPr>
+          <w:lang w:eastAsia="es-VE"/>
+        </w:rPr>
+        <w:t xml:space="preserve"> a la regresión lineal</w:t>
+      </w:r>
+      <w:r>
+        <w:rPr>
+          <w:lang w:eastAsia="es-VE"/>
+        </w:rPr>
+        <w:t xml:space="preserve">, inicio básico para todos los métodos de regresión. En el </w:t>
+      </w:r>
+      <w:r>
+        <w:rPr>
+          <w:b/>
+          <w:lang w:eastAsia="es-VE"/>
+        </w:rPr>
+        <w:t>Capítulo 5</w:t>
+      </w:r>
+      <w:r>
+        <w:rPr>
+          <w:lang w:eastAsia="es-VE"/>
+        </w:rPr>
+        <w:t xml:space="preserve"> analizamos la regresión logística, esencial en problemas con datos cualitativos o categóricos. </w:t>
+      </w:r>
+      <w:r>
+        <w:rPr>
+          <w:lang w:eastAsia="es-VE"/>
+        </w:rPr>
+        <w:t xml:space="preserve"> </w:t>
+      </w:r>
+      <w:r>
+        <w:rPr>
+          <w:lang w:eastAsia="es-VE"/>
+        </w:rPr>
+        <w:t xml:space="preserve">Ambas técnicas de regresión corresponden </w:t>
+      </w:r>
+      <w:r>
+        <w:rPr>
+          <w:lang w:eastAsia="es-VE"/>
+        </w:rPr>
+        <w:t>a aprendizajes supervisados.</w:t>
+      </w:r>
+      <w:r>
+        <w:rPr>
+          <w:lang w:eastAsia="es-VE"/>
+        </w:rPr>
+        <w:t xml:space="preserve"> </w:t>
+      </w:r>
+      <w:r>
+        <w:rPr>
+          <w:lang w:eastAsia="es-VE"/>
+        </w:rPr>
+        <w:t>En</w:t>
+      </w:r>
+      <w:r>
+        <w:rPr>
+          <w:lang w:eastAsia="es-VE"/>
+        </w:rPr>
+        <w:t xml:space="preserve"> en el </w:t>
+      </w:r>
+      <w:r>
+        <w:rPr>
+          <w:b/>
+          <w:lang w:eastAsia="es-VE"/>
+        </w:rPr>
+        <w:t>Capítulo 6</w:t>
+      </w:r>
+      <w:r>
+        <w:rPr>
+          <w:lang w:eastAsia="es-VE"/>
+        </w:rPr>
+        <w:t xml:space="preserve"> veremos una de las técnicas más usadas de aprendizaje no supervisado como es el análisis de clúster.</w:t>
+      </w:r>
+      <w:r>
+        <w:rPr>
+          <w:lang w:eastAsia="es-VE"/>
+        </w:rPr>
+        <w:t xml:space="preserve"> Continuamos en el </w:t>
+      </w:r>
+      <w:r>
+        <w:rPr>
+          <w:b/>
+          <w:lang w:eastAsia="es-VE"/>
+        </w:rPr>
+        <w:t>Capítulo 7</w:t>
+      </w:r>
+      <w:r>
+        <w:rPr>
+          <w:lang w:eastAsia="es-VE"/>
+        </w:rPr>
+        <w:t xml:space="preserve"> con e</w:t>
+      </w:r>
+      <w:r>
+        <w:rPr>
+          <w:lang w:eastAsia="es-VE"/>
+        </w:rPr>
+        <w:t>ste tipo de</w:t>
+      </w:r>
+      <w:r>
+        <w:rPr>
+          <w:lang w:eastAsia="es-VE"/>
+        </w:rPr>
+        <w:t xml:space="preserve"> aprendizaje, </w:t>
+      </w:r>
+      <w:r>
+        <w:rPr>
+          <w:lang w:eastAsia="es-VE"/>
+        </w:rPr>
+        <w:t>introduciendo</w:t>
+      </w:r>
+      <w:r>
+        <w:rPr>
+          <w:lang w:eastAsia="es-VE"/>
+        </w:rPr>
+        <w:t xml:space="preserve"> </w:t>
+      </w:r>
+      <w:r>
+        <w:rPr>
+          <w:lang w:eastAsia="es-VE"/>
+        </w:rPr>
+        <w:t>las bases d</w:t>
+      </w:r>
+      <w:r>
+        <w:rPr>
+          <w:lang w:eastAsia="es-VE"/>
+        </w:rPr>
+        <w:t>el</w:t>
+      </w:r>
+      <w:r>
+        <w:rPr>
+          <w:lang w:eastAsia="es-VE"/>
+        </w:rPr>
+        <w:t xml:space="preserve"> análisis de componentes principales (PCA)</w:t>
+      </w:r>
+      <w:r>
+        <w:rPr>
+          <w:lang w:eastAsia="es-VE"/>
+        </w:rPr>
+        <w:t>,</w:t>
+      </w:r>
+      <w:r>
+        <w:rPr>
+          <w:lang w:eastAsia="es-VE"/>
+        </w:rPr>
+        <w:t xml:space="preserve"> </w:t>
+      </w:r>
+      <w:r>
+        <w:rPr>
+          <w:lang w:eastAsia="es-VE"/>
+        </w:rPr>
+        <w:t>utilizado</w:t>
+      </w:r>
+      <w:r>
+        <w:rPr>
+          <w:lang w:eastAsia="es-VE"/>
+        </w:rPr>
+        <w:t xml:space="preserve"> como preprocesamiento para otras técnicas como la regresión lineal, porque </w:t>
+      </w:r>
+      <w:r>
+        <w:rPr>
+          <w:lang w:eastAsia="es-VE"/>
+        </w:rPr>
+        <w:t>permite reducir</w:t>
+      </w:r>
+      <w:r>
+        <w:rPr>
+          <w:lang w:eastAsia="es-VE"/>
+        </w:rPr>
+        <w:t xml:space="preserve"> la dimensionalidad de las variables.</w:t>
+      </w:r>
+      <w:r>
+        <w:rPr>
+          <w:lang w:eastAsia="es-VE"/>
+        </w:rPr>
+        <w:t xml:space="preserve"> </w:t>
+      </w:r>
+      <w:r>
+        <w:rPr>
+          <w:lang w:eastAsia="es-VE"/>
+        </w:rPr>
+        <w:t xml:space="preserve">En el </w:t>
+      </w:r>
+      <w:r>
+        <w:rPr>
+          <w:b/>
+          <w:lang w:eastAsia="es-VE"/>
+        </w:rPr>
+        <w:t>Capítulo 8</w:t>
+      </w:r>
+      <w:r>
+        <w:rPr>
+          <w:lang w:eastAsia="es-VE"/>
+        </w:rPr>
+        <w:t>, investi</w:t>
+      </w:r>
+      <w:r>
+        <w:rPr>
+          <w:lang w:eastAsia="es-VE"/>
+        </w:rPr>
+        <w:t xml:space="preserve">gamos </w:t>
+      </w:r>
+      <w:r>
+        <w:rPr>
+          <w:lang w:eastAsia="es-VE"/>
+        </w:rPr>
+        <w:t xml:space="preserve">métodos </w:t>
+      </w:r>
+      <w:r>
+        <w:rPr>
+          <w:lang w:eastAsia="es-VE"/>
+        </w:rPr>
+        <w:t xml:space="preserve">básicos </w:t>
+      </w:r>
+      <w:r>
+        <w:rPr>
+          <w:lang w:eastAsia="es-VE"/>
+        </w:rPr>
+        <w:t>basados en árboles de decisión</w:t>
+      </w:r>
+      <w:r>
+        <w:rPr>
+          <w:lang w:eastAsia="es-VE"/>
+        </w:rPr>
+        <w:t xml:space="preserve"> incluyendo bosques aleatorios</w:t>
+      </w:r>
+      <w:r>
+        <w:rPr>
+          <w:lang w:eastAsia="es-VE"/>
+        </w:rPr>
+        <w:t>.</w:t>
+      </w:r>
+    </w:p>
+    <w:p>
+      <w:pPr>
+        <w:spacing w:after="0"/>
+        <w:rPr>
+          <w:lang w:eastAsia="es-VE"/>
+        </w:rPr>
+      </w:pPr>
+      <w:r>
+        <w:rPr>
+          <w:lang w:eastAsia="es-VE"/>
+        </w:rPr>
+        <w:lastRenderedPageBreak/>
+        <w:t xml:space="preserve">Como parte integrante del texto se anexan los códigos en R y Python de cada práctica, los cuales pueden descargarse en </w:t>
+      </w:r>
+      <w:r>
+        <w:rPr>
+          <w:color w:val="FF0000"/>
+          <w:lang w:eastAsia="es-VE"/>
+        </w:rPr>
+        <w:t>XXXXXX</w:t>
+      </w:r>
+    </w:p>
+    <w:p>
+      <w:pPr>
+        <w:spacing w:after="0"/>
+        <w:rPr>
+          <w:lang w:eastAsia="es-VE"/>
+        </w:rPr>
+      </w:pPr>
+    </w:p>
+    <w:p>
+      <w:pPr>
+        <w:spacing w:after="0"/>
+        <w:rPr>
+          <w:lang w:eastAsia="es-VE"/>
+        </w:rPr>
+      </w:pPr>
+      <w:r>
+        <w:rPr>
+          <w:lang w:eastAsia="es-VE"/>
+        </w:rPr>
+        <w:t xml:space="preserve">En </w:t>
+      </w:r>
+      <w:r>
+        <w:rPr>
+          <w:lang w:eastAsia="es-VE"/>
+        </w:rPr>
+        <w:t xml:space="preserve">el </w:t>
+      </w:r>
+      <w:r>
+        <w:rPr>
+          <w:b/>
+          <w:lang w:eastAsia="es-VE"/>
+        </w:rPr>
+        <w:t>A</w:t>
+      </w:r>
+      <w:r>
+        <w:rPr>
+          <w:b/>
+          <w:lang w:eastAsia="es-VE"/>
+        </w:rPr>
+        <w:t>péndice</w:t>
+      </w:r>
+      <w:r>
+        <w:rPr>
+          <w:lang w:eastAsia="es-VE"/>
+        </w:rPr>
+        <w:t xml:space="preserve"> se incluyen información adicional sobre los softwares utilizados y </w:t>
+      </w:r>
+      <w:r>
+        <w:rPr>
+          <w:lang w:eastAsia="es-VE"/>
+        </w:rPr>
+        <w:t>otros relacionados, mientras que</w:t>
+      </w:r>
+      <w:r>
+        <w:rPr>
+          <w:lang w:eastAsia="es-VE"/>
+        </w:rPr>
+        <w:t xml:space="preserve"> las </w:t>
+      </w:r>
+      <w:r>
+        <w:rPr>
+          <w:b/>
+          <w:lang w:eastAsia="es-VE"/>
+        </w:rPr>
+        <w:t>R</w:t>
+      </w:r>
+      <w:r>
+        <w:rPr>
+          <w:b/>
+          <w:lang w:eastAsia="es-VE"/>
+        </w:rPr>
+        <w:t>eferencias</w:t>
+      </w:r>
+      <w:r>
+        <w:rPr>
+          <w:lang w:eastAsia="es-VE"/>
+        </w:rPr>
+        <w:t xml:space="preserve"> se presentan otras fuentes para aquellos interesados en con</w:t>
+      </w:r>
+      <w:r>
+        <w:rPr>
+          <w:lang w:eastAsia="es-VE"/>
+        </w:rPr>
+        <w:t>tinuar profundizando en el tema, aunque se tiene previsto la elaboración de otros recursos para avanzar en el conocimiento de la Ciencia de</w:t>
+      </w:r>
+      <w:r>
+        <w:rPr>
+          <w:lang w:eastAsia="es-VE"/>
+        </w:rPr>
+        <w:t xml:space="preserve"> Datos</w:t>
+      </w:r>
       <w:bookmarkStart w:id="0" w:name="_GoBack"/>
       <w:bookmarkEnd w:id="0"/>
-      <w:r>
-        <w:rPr>
-          <w:lang w:eastAsia="es-VE"/>
-        </w:rPr>
-        <w:t xml:space="preserve"> combinación de los anteriores</w:t>
-      </w:r>
-      <w:r>
-        <w:rPr>
-          <w:lang w:eastAsia="es-VE"/>
-        </w:rPr>
-        <w:t xml:space="preserve">. </w:t>
-      </w:r>
-    </w:p>
-    <w:p>
-      <w:pPr>
-        <w:spacing w:after="0"/>
-        <w:rPr>
-          <w:lang w:eastAsia="es-VE"/>
-        </w:rPr>
-      </w:pPr>
-    </w:p>
-    <w:p>
-      <w:pPr>
-        <w:spacing w:after="0"/>
-        <w:rPr>
-          <w:lang w:eastAsia="es-VE"/>
-        </w:rPr>
-      </w:pPr>
-      <w:r>
-        <w:rPr>
-          <w:lang w:eastAsia="es-VE"/>
-        </w:rPr>
-        <w:t>El</w:t>
-      </w:r>
-      <w:r>
-        <w:rPr>
-          <w:lang w:eastAsia="es-VE"/>
-        </w:rPr>
-        <w:t xml:space="preserve"> </w:t>
-      </w:r>
-      <w:r>
-        <w:rPr>
-          <w:b/>
-          <w:lang w:eastAsia="es-VE"/>
-        </w:rPr>
-        <w:t>Capítulo</w:t>
-      </w:r>
-      <w:r>
-        <w:rPr>
-          <w:b/>
-          <w:lang w:eastAsia="es-VE"/>
-        </w:rPr>
-        <w:t xml:space="preserve"> 4</w:t>
-      </w:r>
-      <w:r>
-        <w:rPr>
-          <w:lang w:eastAsia="es-VE"/>
-        </w:rPr>
-        <w:t xml:space="preserve"> </w:t>
-      </w:r>
-      <w:r>
-        <w:rPr>
-          <w:lang w:eastAsia="es-VE"/>
-        </w:rPr>
-        <w:t>dedica</w:t>
-      </w:r>
-      <w:r>
-        <w:rPr>
-          <w:lang w:eastAsia="es-VE"/>
-        </w:rPr>
-        <w:t xml:space="preserve"> a la regresión lineal</w:t>
-      </w:r>
-      <w:r>
-        <w:rPr>
-          <w:lang w:eastAsia="es-VE"/>
-        </w:rPr>
-        <w:t xml:space="preserve">, inicio básico </w:t>
-      </w:r>
-      <w:r>
-        <w:rPr>
-          <w:lang w:eastAsia="es-VE"/>
-        </w:rPr>
-        <w:t>para todos los métodos de regresión</w:t>
-      </w:r>
-      <w:r>
-        <w:rPr>
-          <w:lang w:eastAsia="es-VE"/>
-        </w:rPr>
-        <w:t xml:space="preserve">. En el </w:t>
-      </w:r>
-      <w:r>
-        <w:rPr>
-          <w:b/>
-          <w:lang w:eastAsia="es-VE"/>
-        </w:rPr>
-        <w:t>Capítulo 5</w:t>
-      </w:r>
-      <w:r>
-        <w:rPr>
-          <w:lang w:eastAsia="es-VE"/>
-        </w:rPr>
-        <w:t xml:space="preserve"> analizamos la regresión logística, esencial en problemas con datos cualitativos o categóricos. </w:t>
-      </w:r>
-      <w:r>
-        <w:rPr>
-          <w:lang w:eastAsia="es-VE"/>
-        </w:rPr>
-        <w:t xml:space="preserve"> </w:t>
-      </w:r>
-      <w:r>
-        <w:rPr>
-          <w:lang w:eastAsia="es-VE"/>
-        </w:rPr>
-        <w:t xml:space="preserve">Ambas técnicas de regresión corresponden </w:t>
-      </w:r>
-      <w:r>
-        <w:rPr>
-          <w:lang w:eastAsia="es-VE"/>
-        </w:rPr>
-        <w:t>a aprendizajes supervisados.</w:t>
-      </w:r>
-      <w:r>
-        <w:rPr>
-          <w:lang w:eastAsia="es-VE"/>
-        </w:rPr>
-        <w:t xml:space="preserve"> Mientras que en el </w:t>
-      </w:r>
-      <w:r>
-        <w:rPr>
-          <w:b/>
-          <w:lang w:eastAsia="es-VE"/>
-        </w:rPr>
-        <w:t>Capítulo 6</w:t>
-      </w:r>
-      <w:r>
-        <w:rPr>
-          <w:lang w:eastAsia="es-VE"/>
-        </w:rPr>
-        <w:t xml:space="preserve"> veremos una de las técnicas más usadas de aprendizaje no supervisado como es el análisis de clúster.</w:t>
-      </w:r>
-      <w:r>
-        <w:rPr>
-          <w:lang w:eastAsia="es-VE"/>
-        </w:rPr>
-        <w:t xml:space="preserve"> Continuamos </w:t>
-      </w:r>
-      <w:r>
-        <w:rPr>
-          <w:lang w:eastAsia="es-VE"/>
-        </w:rPr>
-        <w:t>e</w:t>
-      </w:r>
-      <w:r>
-        <w:rPr>
-          <w:lang w:eastAsia="es-VE"/>
-        </w:rPr>
-        <w:t xml:space="preserve">n el </w:t>
-      </w:r>
-      <w:r>
-        <w:rPr>
-          <w:b/>
-          <w:lang w:eastAsia="es-VE"/>
-        </w:rPr>
-        <w:t>Capítulo</w:t>
-      </w:r>
-      <w:r>
-        <w:rPr>
-          <w:b/>
-          <w:lang w:eastAsia="es-VE"/>
-        </w:rPr>
-        <w:t xml:space="preserve"> 7</w:t>
-      </w:r>
-      <w:r>
-        <w:rPr>
-          <w:lang w:eastAsia="es-VE"/>
-        </w:rPr>
-        <w:t xml:space="preserve"> </w:t>
-      </w:r>
-      <w:r>
-        <w:rPr>
-          <w:lang w:eastAsia="es-VE"/>
-        </w:rPr>
-        <w:t>con e</w:t>
-      </w:r>
-      <w:r>
-        <w:rPr>
-          <w:lang w:eastAsia="es-VE"/>
-        </w:rPr>
-        <w:t>ste tipo de</w:t>
-      </w:r>
-      <w:r>
-        <w:rPr>
-          <w:lang w:eastAsia="es-VE"/>
-        </w:rPr>
-        <w:t xml:space="preserve"> aprendizaje, </w:t>
-      </w:r>
-      <w:r>
-        <w:rPr>
-          <w:lang w:eastAsia="es-VE"/>
-        </w:rPr>
-        <w:t>introduciendo</w:t>
-      </w:r>
-      <w:r>
-        <w:rPr>
-          <w:lang w:eastAsia="es-VE"/>
-        </w:rPr>
-        <w:t xml:space="preserve"> </w:t>
-      </w:r>
-      <w:r>
-        <w:rPr>
-          <w:lang w:eastAsia="es-VE"/>
-        </w:rPr>
-        <w:t>las bases d</w:t>
-      </w:r>
-      <w:r>
-        <w:rPr>
-          <w:lang w:eastAsia="es-VE"/>
-        </w:rPr>
-        <w:t>el</w:t>
-      </w:r>
-      <w:r>
-        <w:rPr>
-          <w:lang w:eastAsia="es-VE"/>
-        </w:rPr>
-        <w:t xml:space="preserve"> análisis de componentes principales (PCA)</w:t>
-      </w:r>
-      <w:r>
-        <w:rPr>
-          <w:lang w:eastAsia="es-VE"/>
-        </w:rPr>
-        <w:t>,</w:t>
-      </w:r>
-      <w:r>
-        <w:rPr>
-          <w:lang w:eastAsia="es-VE"/>
-        </w:rPr>
-        <w:t xml:space="preserve"> </w:t>
-      </w:r>
-      <w:r>
-        <w:rPr>
-          <w:lang w:eastAsia="es-VE"/>
-        </w:rPr>
-        <w:t>utilizado</w:t>
-      </w:r>
-      <w:r>
-        <w:rPr>
-          <w:lang w:eastAsia="es-VE"/>
-        </w:rPr>
-        <w:t xml:space="preserve"> como preprocesamiento para otras técnicas como la regresión lineal, porque </w:t>
-      </w:r>
-      <w:r>
-        <w:rPr>
-          <w:lang w:eastAsia="es-VE"/>
-        </w:rPr>
-        <w:t>permite reducir</w:t>
-      </w:r>
-      <w:r>
-        <w:rPr>
-          <w:lang w:eastAsia="es-VE"/>
-        </w:rPr>
-        <w:t xml:space="preserve"> la dimensionalidad de las variables.</w:t>
-      </w:r>
-      <w:r>
-        <w:rPr>
-          <w:lang w:eastAsia="es-VE"/>
-        </w:rPr>
-        <w:t xml:space="preserve"> </w:t>
-      </w:r>
-      <w:r>
-        <w:rPr>
-          <w:lang w:eastAsia="es-VE"/>
-        </w:rPr>
-        <w:t xml:space="preserve">En el </w:t>
-      </w:r>
-      <w:r>
-        <w:rPr>
-          <w:b/>
-          <w:lang w:eastAsia="es-VE"/>
-        </w:rPr>
-        <w:t>Capítulo 8</w:t>
-      </w:r>
-      <w:r>
-        <w:rPr>
-          <w:lang w:eastAsia="es-VE"/>
-        </w:rPr>
-        <w:t>, investi</w:t>
-      </w:r>
-      <w:r>
-        <w:rPr>
-          <w:lang w:eastAsia="es-VE"/>
-        </w:rPr>
-        <w:t xml:space="preserve">gamos </w:t>
-      </w:r>
-      <w:r>
-        <w:rPr>
-          <w:lang w:eastAsia="es-VE"/>
-        </w:rPr>
-        <w:t xml:space="preserve">métodos </w:t>
-      </w:r>
-      <w:r>
-        <w:rPr>
-          <w:lang w:eastAsia="es-VE"/>
-        </w:rPr>
-        <w:t xml:space="preserve">básicos </w:t>
-      </w:r>
-      <w:r>
-        <w:rPr>
-          <w:lang w:eastAsia="es-VE"/>
-        </w:rPr>
-        <w:t>basados en árboles de decisión</w:t>
-      </w:r>
-      <w:r>
-        <w:rPr>
-          <w:lang w:eastAsia="es-VE"/>
-        </w:rPr>
-        <w:t xml:space="preserve"> incluyendo bosques aleatorios</w:t>
-      </w:r>
-      <w:r>
-        <w:rPr>
-          <w:lang w:eastAsia="es-VE"/>
-        </w:rPr>
-        <w:t>.</w:t>
-      </w:r>
-    </w:p>
-    <w:p>
-      <w:pPr>
-        <w:spacing w:after="0"/>
-        <w:rPr>
-          <w:lang w:eastAsia="es-VE"/>
-        </w:rPr>
-      </w:pPr>
-      <w:r>
-        <w:rPr>
-          <w:lang w:eastAsia="es-VE"/>
-        </w:rPr>
-        <w:t xml:space="preserve">Como parte integrante del texto se anexan los códigos en R y Python de cada práctica, los cuales pueden descargarse en </w:t>
-      </w:r>
-      <w:r>
-        <w:rPr>
-          <w:color w:val="FF0000"/>
-          <w:lang w:eastAsia="es-VE"/>
-        </w:rPr>
-        <w:t>XXXXXX</w:t>
-      </w:r>
-    </w:p>
-    <w:p>
-      <w:pPr>
-        <w:spacing w:after="0"/>
-        <w:rPr>
-          <w:lang w:eastAsia="es-VE"/>
-        </w:rPr>
-      </w:pPr>
-    </w:p>
-    <w:p>
-      <w:pPr>
-        <w:spacing w:after="0"/>
-        <w:rPr>
-          <w:lang w:eastAsia="es-VE"/>
-        </w:rPr>
-      </w:pPr>
-      <w:r>
-        <w:rPr>
-          <w:lang w:eastAsia="es-VE"/>
-        </w:rPr>
-        <w:lastRenderedPageBreak/>
-        <w:t xml:space="preserve">En </w:t>
-      </w:r>
-      <w:r>
-        <w:rPr>
-          <w:lang w:eastAsia="es-VE"/>
-        </w:rPr>
-        <w:t xml:space="preserve">el </w:t>
-      </w:r>
-      <w:r>
-        <w:rPr>
-          <w:b/>
-          <w:lang w:eastAsia="es-VE"/>
-        </w:rPr>
-        <w:t>A</w:t>
-      </w:r>
-      <w:r>
-        <w:rPr>
-          <w:b/>
-          <w:lang w:eastAsia="es-VE"/>
-        </w:rPr>
-        <w:t>péndice</w:t>
-      </w:r>
-      <w:r>
-        <w:rPr>
-          <w:lang w:eastAsia="es-VE"/>
-        </w:rPr>
-        <w:t xml:space="preserve"> se incluyen información adicional sobre los softwares utilizados y </w:t>
-      </w:r>
-      <w:r>
-        <w:rPr>
-          <w:lang w:eastAsia="es-VE"/>
-        </w:rPr>
-        <w:t>otros relacionados, mientras que</w:t>
-      </w:r>
-      <w:r>
-        <w:rPr>
-          <w:lang w:eastAsia="es-VE"/>
-        </w:rPr>
-        <w:t xml:space="preserve"> las </w:t>
-      </w:r>
-      <w:r>
-        <w:rPr>
-          <w:b/>
-          <w:lang w:eastAsia="es-VE"/>
-        </w:rPr>
-        <w:t>R</w:t>
-      </w:r>
-      <w:r>
-        <w:rPr>
-          <w:b/>
-          <w:lang w:eastAsia="es-VE"/>
-        </w:rPr>
-        <w:t>eferencias</w:t>
-      </w:r>
-      <w:r>
-        <w:rPr>
-          <w:lang w:eastAsia="es-VE"/>
-        </w:rPr>
-        <w:t xml:space="preserve"> se presentan otras fuentes para aquellos interesados en con</w:t>
-      </w:r>
-      <w:r>
-        <w:rPr>
-          <w:lang w:eastAsia="es-VE"/>
-        </w:rPr>
-        <w:t xml:space="preserve">tinuar profundizando en el tema, aunque se tiene previsto la elaboración de otros recursos para avanzar en el conocimiento de la Ciencia de Datos o Data </w:t>
-      </w:r>
-      <w:proofErr w:type="spellStart"/>
-      <w:r>
-        <w:rPr>
-          <w:lang w:eastAsia="es-VE"/>
-        </w:rPr>
-        <w:t>Science</w:t>
-      </w:r>
-      <w:proofErr w:type="spellEnd"/>
       <w:r>
         <w:rPr>
           <w:lang w:eastAsia="es-VE"/>
@@ -4748,15 +4497,7 @@
                 <w:szCs w:val="18"/>
                 <w:lang w:eastAsia="es-VE"/>
               </w:rPr>
-              <w:t>.  Son datos</w:t>
-            </w:r>
-            <w:r>
-              <w:rPr>
-                <w:sz w:val="18"/>
-                <w:szCs w:val="18"/>
-                <w:lang w:eastAsia="es-VE"/>
-              </w:rPr>
-              <w:t xml:space="preserve"> extraídos de la revista Motor </w:t>
+              <w:t xml:space="preserve">.  Son datos extraídos de la revista Motor </w:t>
             </w:r>
             <w:proofErr w:type="spellStart"/>
             <w:r>
@@ -12426,6 +12167,7 @@
   <w:style w:type="character" w:default="1" w:styleId="Fuentedeprrafopredeter">
     <w:name w:val="Default Paragraph Font"/>
     <w:uiPriority w:val="1"/>
+    <w:semiHidden/>
     <w:unhideWhenUsed/>
   </w:style>
   <w:style w:type="table" w:default="1" w:styleId="Tablanormal">
@@ -13127,7 +12869,7 @@
 </file>
 
 <file path=customXml/itemProps1.xml><?xml version="1.0" encoding="utf-8"?>
-<ds:datastoreItem xmlns:ds="http://schemas.openxmlformats.org/officeDocument/2006/customXml" ds:itemID="{935BF6DC-DBB8-46FB-9143-02B1D4E80A61}">
+<ds:datastoreItem xmlns:ds="http://schemas.openxmlformats.org/officeDocument/2006/customXml" ds:itemID="{BE3CF703-C30C-40FE-A877-281E414D3C36}">
   <ds:schemaRefs>
     <ds:schemaRef ds:uri="http://schemas.openxmlformats.org/officeDocument/2006/bibliography"/>
   </ds:schemaRefs>

</xml_diff>

<commit_message>
Revisión global e Inclusión de materiales de referencia
</commit_message>
<xml_diff>
--- a/bookdown/Observaciones de Bernardo 17-6-19.docx
+++ b/bookdown/Observaciones de Bernardo 17-6-19.docx
@@ -30,126 +30,214 @@
     </w:p>
     <w:p>
       <w:pPr>
-        <w:pStyle w:val="Prrafodelista"/>
-        <w:numPr>
-          <w:ilvl w:val="0"/>
-          <w:numId w:val="1"/>
-        </w:numPr>
-        <w:rPr>
-          <w:color w:val="FF0000"/>
-        </w:rPr>
-      </w:pPr>
-      <w:r>
-        <w:rPr>
-          <w:color w:val="FF0000"/>
-        </w:rPr>
-        <w:t>Eliminar R</w:t>
-      </w:r>
-      <w:r>
-        <w:rPr>
-          <w:color w:val="FF0000"/>
-        </w:rPr>
-        <w:t>iesgo de crédito</w:t>
-      </w:r>
-      <w:r>
-        <w:rPr>
-          <w:color w:val="FF0000"/>
-        </w:rPr>
-        <w:t>.</w:t>
+        <w:keepNext/>
+        <w:shd w:val="clear" w:color="auto" w:fill="FFFFFF"/>
+        <w:spacing w:before="306" w:after="204" w:line="240" w:lineRule="auto"/>
+        <w:jc w:val="left"/>
+        <w:outlineLvl w:val="1"/>
+        <w:rPr>
+          <w:rFonts w:ascii="Helvetica" w:eastAsia="Times New Roman" w:hAnsi="Helvetica" w:cs="Helvetica"/>
+          <w:color w:val="333333"/>
+          <w:spacing w:val="3"/>
+          <w:sz w:val="42"/>
+          <w:szCs w:val="42"/>
+          <w:lang w:eastAsia="es-VE"/>
+        </w:rPr>
+      </w:pPr>
+      <w:r>
+        <w:rPr>
+          <w:rFonts w:ascii="Helvetica" w:eastAsia="Times New Roman" w:hAnsi="Helvetica" w:cs="Helvetica"/>
+          <w:color w:val="333333"/>
+          <w:spacing w:val="3"/>
+          <w:sz w:val="42"/>
+          <w:szCs w:val="42"/>
+          <w:lang w:eastAsia="es-VE"/>
+        </w:rPr>
+        <w:t>Estructura del libro</w:t>
       </w:r>
     </w:p>
     <w:p>
       <w:pPr>
-        <w:pStyle w:val="Prrafodelista"/>
-        <w:numPr>
-          <w:ilvl w:val="0"/>
-          <w:numId w:val="1"/>
-        </w:numPr>
-        <w:rPr>
-          <w:color w:val="FF0000"/>
-        </w:rPr>
-      </w:pPr>
-      <w:r>
-        <w:rPr>
-          <w:color w:val="FF0000"/>
-        </w:rPr>
-        <w:t xml:space="preserve">Fecha </w:t>
-      </w:r>
-      <w:r>
-        <w:rPr>
-          <w:color w:val="FF0000"/>
-        </w:rPr>
-        <w:t>: 06/06/2019</w:t>
+        <w:ind w:left="360"/>
+        <w:rPr>
+          <w:rFonts w:ascii="Helvetica" w:hAnsi="Helvetica" w:cs="Helvetica"/>
+          <w:color w:val="333333"/>
+          <w:spacing w:val="3"/>
+          <w:shd w:val="clear" w:color="auto" w:fill="FFFFFF"/>
+        </w:rPr>
+      </w:pPr>
+      <w:r>
+        <w:rPr>
+          <w:rFonts w:ascii="Helvetica" w:hAnsi="Helvetica" w:cs="Helvetica"/>
+          <w:color w:val="333333"/>
+          <w:spacing w:val="3"/>
+          <w:shd w:val="clear" w:color="auto" w:fill="FFFFFF"/>
+        </w:rPr>
+        <w:t xml:space="preserve">Este libro se divide en </w:t>
+      </w:r>
+      <w:r>
+        <w:rPr>
+          <w:rFonts w:ascii="Helvetica" w:hAnsi="Helvetica" w:cs="Helvetica"/>
+          <w:color w:val="333333"/>
+          <w:spacing w:val="3"/>
+          <w:highlight w:val="yellow"/>
+          <w:shd w:val="clear" w:color="auto" w:fill="FFFFFF"/>
+        </w:rPr>
+        <w:t>8</w:t>
+      </w:r>
+      <w:r>
+        <w:rPr>
+          <w:rFonts w:ascii="Helvetica" w:hAnsi="Helvetica" w:cs="Helvetica"/>
+          <w:color w:val="333333"/>
+          <w:spacing w:val="3"/>
+          <w:shd w:val="clear" w:color="auto" w:fill="FFFFFF"/>
+        </w:rPr>
+        <w:t xml:space="preserve"> capítulos</w:t>
       </w:r>
     </w:p>
     <w:p>
       <w:pPr>
-        <w:pStyle w:val="Prrafodelista"/>
-        <w:numPr>
-          <w:ilvl w:val="0"/>
-          <w:numId w:val="1"/>
-        </w:numPr>
-        <w:rPr>
-          <w:color w:val="FF0000"/>
-        </w:rPr>
-      </w:pPr>
-      <w:r>
-        <w:rPr>
-          <w:color w:val="FF0000"/>
-        </w:rPr>
-        <w:t>Pone</w:t>
-      </w:r>
-      <w:r>
-        <w:rPr>
-          <w:color w:val="FF0000"/>
-        </w:rPr>
-        <w:t>r una mujer morena en la imagen y e</w:t>
-      </w:r>
-      <w:r>
-        <w:rPr>
-          <w:color w:val="FF0000"/>
-        </w:rPr>
-        <w:t xml:space="preserve">liminar la restricción del </w:t>
-      </w:r>
-      <w:r>
-        <w:rPr>
-          <w:color w:val="FF0000"/>
-        </w:rPr>
-        <w:t>“riesgo de crédito” porque el texto trasciende ese tema.  Tal vez una imagen que refl</w:t>
-      </w:r>
-      <w:r>
-        <w:rPr>
-          <w:color w:val="FF0000"/>
-        </w:rPr>
-        <w:t>eje</w:t>
-      </w:r>
-      <w:r>
-        <w:rPr>
-          <w:color w:val="FF0000"/>
-        </w:rPr>
-        <w:t xml:space="preserve"> los </w:t>
-      </w:r>
-      <w:r>
-        <w:rPr>
-          <w:b/>
-          <w:color w:val="FF0000"/>
-        </w:rPr>
-        <w:t>problemas de empresas iberoamericanas</w:t>
-      </w:r>
-      <w:r>
-        <w:rPr>
-          <w:color w:val="FF0000"/>
-        </w:rPr>
-        <w:t>, especialmente pequeñas y medianas, para el manejo de datos sería más adecuado, por ejemplo: inventarios, control de producción, recursos humanos, logística, calidad de producto, quejas de clientes, etc…</w:t>
-      </w:r>
+        <w:ind w:left="360"/>
+        <w:rPr>
+          <w:rFonts w:ascii="Helvetica" w:hAnsi="Helvetica" w:cs="Helvetica"/>
+          <w:color w:val="333333"/>
+          <w:spacing w:val="3"/>
+          <w:shd w:val="clear" w:color="auto" w:fill="FFFFFF"/>
+        </w:rPr>
+      </w:pPr>
     </w:p>
     <w:p>
       <w:pPr>
         <w:ind w:left="360"/>
         <w:rPr>
-          <w:lang w:eastAsia="es-VE"/>
-        </w:rPr>
-      </w:pPr>
+          <w:rFonts w:ascii="Helvetica" w:hAnsi="Helvetica" w:cs="Helvetica"/>
+          <w:color w:val="333333"/>
+          <w:spacing w:val="3"/>
+          <w:shd w:val="clear" w:color="auto" w:fill="FFFFFF"/>
+        </w:rPr>
+      </w:pPr>
+      <w:r>
+        <w:rPr>
+          <w:rFonts w:ascii="Helvetica" w:hAnsi="Helvetica" w:cs="Helvetica"/>
+          <w:color w:val="333333"/>
+          <w:spacing w:val="3"/>
+          <w:shd w:val="clear" w:color="auto" w:fill="FFFFFF"/>
+        </w:rPr>
+        <w:t>La secuencia de ejemplos de uso de las herramientas siempre se presentará primero en R y luego en Phyton.</w:t>
+      </w:r>
+      <w:r>
+        <w:rPr>
+          <w:rFonts w:ascii="Helvetica" w:hAnsi="Helvetica" w:cs="Helvetica"/>
+          <w:color w:val="333333"/>
+          <w:spacing w:val="3"/>
+          <w:shd w:val="clear" w:color="auto" w:fill="FFFFFF"/>
+        </w:rPr>
+        <w:t xml:space="preserve"> </w:t>
+      </w:r>
+      <w:r>
+        <w:rPr>
+          <w:rFonts w:ascii="Helvetica" w:hAnsi="Helvetica" w:cs="Helvetica"/>
+          <w:color w:val="333333"/>
+          <w:spacing w:val="3"/>
+          <w:highlight w:val="yellow"/>
+          <w:shd w:val="clear" w:color="auto" w:fill="FFFFFF"/>
+        </w:rPr>
+        <w:t>Los resultados podrán diferir del presentado en las imágenes en vista de la constante actualización y liberación de nuevas versiones de estos programas y sus librerías.</w:t>
+      </w:r>
+    </w:p>
+    <w:p>
+      <w:pPr>
+        <w:ind w:left="360"/>
+        <w:rPr>
+          <w:rFonts w:ascii="Helvetica" w:hAnsi="Helvetica" w:cs="Helvetica"/>
+          <w:color w:val="333333"/>
+          <w:spacing w:val="3"/>
+          <w:shd w:val="clear" w:color="auto" w:fill="FFFFFF"/>
+        </w:rPr>
+      </w:pPr>
+    </w:p>
+    <w:p>
+      <w:pPr>
+        <w:pStyle w:val="Ttulo2"/>
+        <w:keepNext/>
+        <w:shd w:val="clear" w:color="auto" w:fill="FFFFFF"/>
+        <w:spacing w:before="306" w:beforeAutospacing="0" w:after="204" w:afterAutospacing="0"/>
+        <w:rPr>
+          <w:rFonts w:ascii="Helvetica" w:hAnsi="Helvetica" w:cs="Helvetica"/>
+          <w:b w:val="0"/>
+          <w:bCs w:val="0"/>
+          <w:color w:val="333333"/>
+          <w:spacing w:val="3"/>
+          <w:sz w:val="42"/>
+          <w:szCs w:val="42"/>
+        </w:rPr>
+      </w:pPr>
+      <w:r>
+        <w:rPr>
+          <w:rFonts w:ascii="Helvetica" w:hAnsi="Helvetica" w:cs="Helvetica"/>
+          <w:b w:val="0"/>
+          <w:bCs w:val="0"/>
+          <w:color w:val="333333"/>
+          <w:spacing w:val="3"/>
+          <w:sz w:val="42"/>
+          <w:szCs w:val="42"/>
+        </w:rPr>
+        <w:t>¿Por qué leer este libro?</w:t>
+      </w:r>
+    </w:p>
+    <w:p>
+      <w:pPr>
+        <w:ind w:left="360"/>
+        <w:rPr>
+          <w:lang w:eastAsia="es-VE"/>
+        </w:rPr>
+      </w:pPr>
+      <w:r>
+        <w:rPr>
+          <w:rFonts w:ascii="Helvetica" w:hAnsi="Helvetica" w:cs="Helvetica"/>
+          <w:color w:val="333333"/>
+          <w:spacing w:val="3"/>
+          <w:shd w:val="clear" w:color="auto" w:fill="FFFFFF"/>
+        </w:rPr>
+        <w:t>….</w:t>
+      </w:r>
+      <w:r>
+        <w:rPr>
+          <w:rFonts w:ascii="Helvetica" w:hAnsi="Helvetica" w:cs="Helvetica"/>
+          <w:color w:val="333333"/>
+          <w:spacing w:val="3"/>
+          <w:shd w:val="clear" w:color="auto" w:fill="FFFFFF"/>
+        </w:rPr>
+        <w:t>Para ello, el libro aportará con ejemplos muy diversos del mundo empresarial,</w:t>
+      </w:r>
+      <w:r>
+        <w:rPr>
+          <w:rFonts w:ascii="Helvetica" w:hAnsi="Helvetica" w:cs="Helvetica"/>
+          <w:color w:val="333333"/>
+          <w:spacing w:val="3"/>
+          <w:shd w:val="clear" w:color="auto" w:fill="FFFFFF"/>
+        </w:rPr>
+        <w:t xml:space="preserve"> </w:t>
+      </w:r>
+      <w:r>
+        <w:rPr>
+          <w:rFonts w:ascii="Helvetica" w:hAnsi="Helvetica" w:cs="Helvetica"/>
+          <w:color w:val="333333"/>
+          <w:spacing w:val="3"/>
+          <w:highlight w:val="yellow"/>
+          <w:shd w:val="clear" w:color="auto" w:fill="FFFFFF"/>
+        </w:rPr>
+        <w:t>científico y de la administración pública</w:t>
+      </w:r>
+      <w:r>
+        <w:rPr>
+          <w:rFonts w:ascii="Helvetica" w:hAnsi="Helvetica" w:cs="Helvetica"/>
+          <w:color w:val="333333"/>
+          <w:spacing w:val="3"/>
+          <w:shd w:val="clear" w:color="auto" w:fill="FFFFFF"/>
+        </w:rPr>
+        <w:t>,</w:t>
+      </w:r>
     </w:p>
     <w:p>
       <w:pPr>
@@ -470,13 +558,7 @@
         <w:rPr>
           <w:lang w:eastAsia="es-VE"/>
         </w:rPr>
-        <w:t>la tecnología clave para esta tarea</w:t>
-      </w:r>
-      <w:r>
-        <w:rPr>
-          <w:lang w:eastAsia="es-VE"/>
-        </w:rPr>
-        <w:t xml:space="preserve"> es </w:t>
+        <w:t xml:space="preserve">la tecnología clave para esta tarea es </w:t>
       </w:r>
       <w:r>
         <w:rPr>
@@ -761,6 +843,7 @@
         <w:rPr>
           <w:lang w:eastAsia="es-VE"/>
         </w:rPr>
+        <w:lastRenderedPageBreak/>
         <w:t>Los software</w:t>
       </w:r>
       <w:r>
@@ -859,7 +942,6 @@
         <w:rPr>
           <w:lang w:eastAsia="es-VE"/>
         </w:rPr>
-        <w:lastRenderedPageBreak/>
         <w:t>Aparte</w:t>
       </w:r>
       <w:r>
@@ -2169,6 +2251,7 @@
         <w:rPr>
           <w:lang w:eastAsia="es-VE"/>
         </w:rPr>
+        <w:lastRenderedPageBreak/>
         <w:t xml:space="preserve">El </w:t>
       </w:r>
       <w:r>
@@ -2414,14 +2497,7 @@
         <w:rPr>
           <w:lang w:eastAsia="es-VE"/>
         </w:rPr>
-        <w:t xml:space="preserve">análisis de redes </w:t>
-      </w:r>
-      <w:r>
-        <w:rPr>
-          <w:lang w:eastAsia="es-VE"/>
-        </w:rPr>
-        <w:lastRenderedPageBreak/>
-        <w:t xml:space="preserve">sociales. </w:t>
+        <w:t xml:space="preserve">análisis de redes sociales. </w:t>
       </w:r>
       <w:r>
         <w:rPr>
@@ -3510,7 +3586,14 @@
         <w:rPr>
           <w:lang w:eastAsia="es-VE"/>
         </w:rPr>
-        <w:t xml:space="preserve"> veremos una de las técnicas más usadas de aprendizaje no supervisado como es el análisis de clúster.</w:t>
+        <w:t xml:space="preserve"> veremos una de las técnicas más usadas de aprendizaje no supervisado como es el </w:t>
+      </w:r>
+      <w:r>
+        <w:rPr>
+          <w:lang w:eastAsia="es-VE"/>
+        </w:rPr>
+        <w:lastRenderedPageBreak/>
+        <w:t>análisis de clúster.</w:t>
       </w:r>
       <w:r>
         <w:rPr>
@@ -3682,7 +3765,6 @@
         <w:rPr>
           <w:lang w:eastAsia="es-VE"/>
         </w:rPr>
-        <w:lastRenderedPageBreak/>
         <w:t xml:space="preserve">Como parte integrante del texto se anexan los códigos en R y Python de cada práctica, los cuales pueden descargarse en </w:t>
       </w:r>
       <w:r>
@@ -3784,8 +3866,6 @@
         </w:rPr>
         <w:t xml:space="preserve"> Datos</w:t>
       </w:r>
-      <w:bookmarkStart w:id="0" w:name="_GoBack"/>
-      <w:bookmarkEnd w:id="0"/>
       <w:r>
         <w:rPr>
           <w:lang w:eastAsia="es-VE"/>
@@ -4700,6 +4780,398 @@
         </w:rPr>
       </w:pPr>
     </w:p>
+    <w:p>
+      <w:pPr>
+        <w:spacing w:after="0"/>
+        <w:rPr>
+          <w:lang w:eastAsia="es-VE"/>
+        </w:rPr>
+      </w:pPr>
+    </w:p>
+    <w:p>
+      <w:pPr>
+        <w:spacing w:after="0"/>
+        <w:rPr>
+          <w:lang w:eastAsia="es-VE"/>
+        </w:rPr>
+      </w:pPr>
+    </w:p>
+    <w:p>
+      <w:pPr>
+        <w:keepNext/>
+        <w:pBdr>
+          <w:bottom w:val="single" w:sz="6" w:space="0" w:color="auto"/>
+        </w:pBdr>
+        <w:shd w:val="clear" w:color="auto" w:fill="FFFFFF"/>
+        <w:spacing w:before="306" w:after="204" w:line="240" w:lineRule="auto"/>
+        <w:jc w:val="left"/>
+        <w:outlineLvl w:val="0"/>
+        <w:rPr>
+          <w:rFonts w:ascii="Helvetica" w:eastAsia="Times New Roman" w:hAnsi="Helvetica" w:cs="Helvetica"/>
+          <w:color w:val="333333"/>
+          <w:spacing w:val="3"/>
+          <w:kern w:val="36"/>
+          <w:sz w:val="48"/>
+          <w:szCs w:val="48"/>
+          <w:lang w:eastAsia="es-VE"/>
+        </w:rPr>
+      </w:pPr>
+      <w:r>
+        <w:rPr>
+          <w:rFonts w:ascii="Helvetica" w:eastAsia="Times New Roman" w:hAnsi="Helvetica" w:cs="Helvetica"/>
+          <w:color w:val="333333"/>
+          <w:spacing w:val="3"/>
+          <w:kern w:val="36"/>
+          <w:sz w:val="48"/>
+          <w:szCs w:val="48"/>
+          <w:lang w:eastAsia="es-VE"/>
+        </w:rPr>
+        <w:t>Referencias</w:t>
+      </w:r>
+    </w:p>
+    <w:p>
+      <w:pPr>
+        <w:spacing w:after="0"/>
+        <w:rPr>
+          <w:lang w:eastAsia="es-VE"/>
+        </w:rPr>
+      </w:pPr>
+      <w:sdt>
+        <w:sdtPr>
+          <w:rPr>
+            <w:lang w:eastAsia="es-VE"/>
+          </w:rPr>
+          <w:id w:val="-266851690"/>
+          <w:citation/>
+        </w:sdtPr>
+        <w:sdtContent>
+          <w:r>
+            <w:rPr>
+              <w:lang w:eastAsia="es-VE"/>
+            </w:rPr>
+            <w:fldChar w:fldCharType="begin"/>
+          </w:r>
+          <w:r>
+            <w:rPr>
+              <w:lang w:eastAsia="es-VE"/>
+            </w:rPr>
+            <w:instrText xml:space="preserve"> CITATION Med17 \l 8202 </w:instrText>
+          </w:r>
+          <w:r>
+            <w:rPr>
+              <w:lang w:eastAsia="es-VE"/>
+            </w:rPr>
+            <w:fldChar w:fldCharType="separate"/>
+          </w:r>
+          <w:r>
+            <w:rPr>
+              <w:noProof/>
+              <w:lang w:eastAsia="es-VE"/>
+            </w:rPr>
+            <w:t>(Medina Merino &amp; Ñique Chacón, 2017)</w:t>
+          </w:r>
+          <w:r>
+            <w:rPr>
+              <w:lang w:eastAsia="es-VE"/>
+            </w:rPr>
+            <w:fldChar w:fldCharType="end"/>
+          </w:r>
+        </w:sdtContent>
+      </w:sdt>
+    </w:p>
+    <w:p>
+      <w:pPr>
+        <w:spacing w:after="0"/>
+        <w:rPr>
+          <w:lang w:eastAsia="es-VE"/>
+        </w:rPr>
+      </w:pPr>
+      <w:sdt>
+        <w:sdtPr>
+          <w:rPr>
+            <w:lang w:eastAsia="es-VE"/>
+          </w:rPr>
+          <w:id w:val="1344901593"/>
+          <w:citation/>
+        </w:sdtPr>
+        <w:sdtContent>
+          <w:r>
+            <w:rPr>
+              <w:lang w:eastAsia="es-VE"/>
+            </w:rPr>
+            <w:fldChar w:fldCharType="begin"/>
+          </w:r>
+          <w:r>
+            <w:rPr>
+              <w:lang w:eastAsia="es-VE"/>
+            </w:rPr>
+            <w:instrText xml:space="preserve"> CITATION Sug16 \l 8202 </w:instrText>
+          </w:r>
+          <w:r>
+            <w:rPr>
+              <w:lang w:eastAsia="es-VE"/>
+            </w:rPr>
+            <w:fldChar w:fldCharType="separate"/>
+          </w:r>
+          <w:r>
+            <w:rPr>
+              <w:noProof/>
+              <w:lang w:eastAsia="es-VE"/>
+            </w:rPr>
+            <w:t>(Sugiyama, 2016)</w:t>
+          </w:r>
+          <w:r>
+            <w:rPr>
+              <w:lang w:eastAsia="es-VE"/>
+            </w:rPr>
+            <w:fldChar w:fldCharType="end"/>
+          </w:r>
+        </w:sdtContent>
+      </w:sdt>
+      <w:bookmarkStart w:id="0" w:name="_GoBack"/>
+      <w:bookmarkEnd w:id="0"/>
+    </w:p>
+    <w:p>
+      <w:pPr>
+        <w:spacing w:after="0"/>
+        <w:rPr>
+          <w:lang w:eastAsia="es-VE"/>
+        </w:rPr>
+      </w:pPr>
+      <w:sdt>
+        <w:sdtPr>
+          <w:rPr>
+            <w:lang w:eastAsia="es-VE"/>
+          </w:rPr>
+          <w:id w:val="828095186"/>
+          <w:citation/>
+        </w:sdtPr>
+        <w:sdtContent>
+          <w:r>
+            <w:rPr>
+              <w:lang w:eastAsia="es-VE"/>
+            </w:rPr>
+            <w:fldChar w:fldCharType="begin"/>
+          </w:r>
+          <w:r>
+            <w:rPr>
+              <w:lang w:eastAsia="es-VE"/>
+            </w:rPr>
+            <w:instrText xml:space="preserve"> CITATION Jam13 \l 8202 </w:instrText>
+          </w:r>
+          <w:r>
+            <w:rPr>
+              <w:lang w:eastAsia="es-VE"/>
+            </w:rPr>
+            <w:fldChar w:fldCharType="separate"/>
+          </w:r>
+          <w:r>
+            <w:rPr>
+              <w:noProof/>
+              <w:lang w:eastAsia="es-VE"/>
+            </w:rPr>
+            <w:t xml:space="preserve"> (James, Witten, Hastie, &amp; Tibshirani, 2013)</w:t>
+          </w:r>
+          <w:r>
+            <w:rPr>
+              <w:lang w:eastAsia="es-VE"/>
+            </w:rPr>
+            <w:fldChar w:fldCharType="end"/>
+          </w:r>
+        </w:sdtContent>
+      </w:sdt>
+    </w:p>
+    <w:p>
+      <w:pPr>
+        <w:spacing w:after="0"/>
+        <w:rPr>
+          <w:lang w:eastAsia="es-VE"/>
+        </w:rPr>
+      </w:pPr>
+    </w:p>
+    <w:sdt>
+      <w:sdtPr>
+        <w:rPr>
+          <w:lang w:val="es-ES"/>
+        </w:rPr>
+        <w:id w:val="1055891371"/>
+        <w:docPartObj>
+          <w:docPartGallery w:val="Bibliographies"/>
+          <w:docPartUnique/>
+        </w:docPartObj>
+      </w:sdtPr>
+      <w:sdtEndPr>
+        <w:rPr>
+          <w:rFonts w:asciiTheme="minorHAnsi" w:eastAsiaTheme="minorHAnsi" w:hAnsiTheme="minorHAnsi" w:cstheme="minorBidi"/>
+          <w:color w:val="auto"/>
+          <w:sz w:val="22"/>
+          <w:szCs w:val="22"/>
+          <w:lang w:val="es-VE"/>
+        </w:rPr>
+      </w:sdtEndPr>
+      <w:sdtContent>
+        <w:p>
+          <w:pPr>
+            <w:pStyle w:val="Ttulo1"/>
+          </w:pPr>
+          <w:r>
+            <w:rPr>
+              <w:lang w:val="es-ES"/>
+            </w:rPr>
+            <w:t>Bibliografía</w:t>
+          </w:r>
+        </w:p>
+        <w:sdt>
+          <w:sdtPr>
+            <w:id w:val="111145805"/>
+            <w:bibliography/>
+          </w:sdtPr>
+          <w:sdtContent>
+            <w:p>
+              <w:pPr>
+                <w:pStyle w:val="Bibliografa"/>
+                <w:ind w:left="720" w:hanging="720"/>
+                <w:rPr>
+                  <w:noProof/>
+                  <w:sz w:val="24"/>
+                  <w:szCs w:val="24"/>
+                  <w:highlight w:val="yellow"/>
+                  <w:lang w:val="es-ES"/>
+                </w:rPr>
+              </w:pPr>
+              <w:r>
+                <w:rPr>
+                  <w:highlight w:val="yellow"/>
+                </w:rPr>
+                <w:fldChar w:fldCharType="begin"/>
+              </w:r>
+              <w:r>
+                <w:rPr>
+                  <w:highlight w:val="yellow"/>
+                </w:rPr>
+                <w:instrText>BIBLIOGRAPHY</w:instrText>
+              </w:r>
+              <w:r>
+                <w:rPr>
+                  <w:highlight w:val="yellow"/>
+                </w:rPr>
+                <w:fldChar w:fldCharType="separate"/>
+              </w:r>
+              <w:r>
+                <w:rPr>
+                  <w:noProof/>
+                  <w:highlight w:val="yellow"/>
+                  <w:lang w:val="es-ES"/>
+                </w:rPr>
+                <w:t xml:space="preserve">James, G., Witten, D., Hastie, T., &amp; Tibshirani, R. (2013). </w:t>
+              </w:r>
+              <w:r>
+                <w:rPr>
+                  <w:i/>
+                  <w:iCs/>
+                  <w:noProof/>
+                  <w:highlight w:val="yellow"/>
+                  <w:lang w:val="es-ES"/>
+                </w:rPr>
+                <w:t>An introduction to statistical learning with applications in R.</w:t>
+              </w:r>
+              <w:r>
+                <w:rPr>
+                  <w:noProof/>
+                  <w:highlight w:val="yellow"/>
+                  <w:lang w:val="es-ES"/>
+                </w:rPr>
+                <w:t xml:space="preserve"> New York: Springer.</w:t>
+              </w:r>
+            </w:p>
+            <w:p>
+              <w:pPr>
+                <w:pStyle w:val="Bibliografa"/>
+                <w:ind w:left="720" w:hanging="720"/>
+                <w:rPr>
+                  <w:noProof/>
+                  <w:highlight w:val="yellow"/>
+                  <w:lang w:val="es-ES"/>
+                </w:rPr>
+              </w:pPr>
+              <w:r>
+                <w:rPr>
+                  <w:noProof/>
+                  <w:highlight w:val="yellow"/>
+                  <w:lang w:val="es-ES"/>
+                </w:rPr>
+                <w:t xml:space="preserve">Medina Merino, R. F., &amp; Ñique Chacón, C. I. (Enero-diciembre de 2017). Bosques aleatorios como extensión de los árboles de clasificación con los programas R y Python. </w:t>
+              </w:r>
+              <w:r>
+                <w:rPr>
+                  <w:i/>
+                  <w:iCs/>
+                  <w:noProof/>
+                  <w:highlight w:val="yellow"/>
+                  <w:lang w:val="es-ES"/>
+                </w:rPr>
+                <w:t>INTERFASES</w:t>
+              </w:r>
+              <w:r>
+                <w:rPr>
+                  <w:noProof/>
+                  <w:highlight w:val="yellow"/>
+                  <w:lang w:val="es-ES"/>
+                </w:rPr>
+                <w:t>, 165-189.</w:t>
+              </w:r>
+            </w:p>
+            <w:p>
+              <w:pPr>
+                <w:pStyle w:val="Bibliografa"/>
+                <w:ind w:left="720" w:hanging="720"/>
+                <w:rPr>
+                  <w:noProof/>
+                  <w:highlight w:val="yellow"/>
+                  <w:lang w:val="es-ES"/>
+                </w:rPr>
+              </w:pPr>
+              <w:r>
+                <w:rPr>
+                  <w:noProof/>
+                  <w:highlight w:val="yellow"/>
+                  <w:lang w:val="es-ES"/>
+                </w:rPr>
+                <w:t xml:space="preserve">Sugiyama, M. (2016). </w:t>
+              </w:r>
+              <w:r>
+                <w:rPr>
+                  <w:i/>
+                  <w:iCs/>
+                  <w:noProof/>
+                  <w:highlight w:val="yellow"/>
+                  <w:lang w:val="es-ES"/>
+                </w:rPr>
+                <w:t>Introduction to Statistical Machine Learning.</w:t>
+              </w:r>
+              <w:r>
+                <w:rPr>
+                  <w:noProof/>
+                  <w:highlight w:val="yellow"/>
+                  <w:lang w:val="es-ES"/>
+                </w:rPr>
+                <w:t xml:space="preserve"> Waltham, MA, USA: Elsevier.</w:t>
+              </w:r>
+            </w:p>
+            <w:p>
+              <w:r>
+                <w:rPr>
+                  <w:b/>
+                  <w:bCs/>
+                  <w:highlight w:val="yellow"/>
+                </w:rPr>
+                <w:fldChar w:fldCharType="end"/>
+              </w:r>
+            </w:p>
+          </w:sdtContent>
+        </w:sdt>
+      </w:sdtContent>
+    </w:sdt>
     <w:p>
       <w:pPr>
         <w:spacing w:after="0"/>
@@ -12600,6 +13072,14 @@
       <w:szCs w:val="18"/>
     </w:rPr>
   </w:style>
+  <w:style w:type="paragraph" w:styleId="Bibliografa">
+    <w:name w:val="Bibliography"/>
+    <w:basedOn w:val="Normal"/>
+    <w:next w:val="Normal"/>
+    <w:uiPriority w:val="37"/>
+    <w:unhideWhenUsed/>
+    <w:rsid w:val="008B5FC3"/>
+  </w:style>
 </w:styles>
 </file>
 
@@ -12865,11 +13345,91 @@
 </file>
 
 <file path=customXml/item1.xml><?xml version="1.0" encoding="utf-8"?>
-<b:Sources xmlns:b="http://schemas.openxmlformats.org/officeDocument/2006/bibliography" xmlns="http://schemas.openxmlformats.org/officeDocument/2006/bibliography" SelectedStyle="\APASixthEditionOfficeOnline.xsl" StyleName="APA" Version="6"/>
+<b:Sources xmlns:b="http://schemas.openxmlformats.org/officeDocument/2006/bibliography" xmlns="http://schemas.openxmlformats.org/officeDocument/2006/bibliography" SelectedStyle="\APASixthEditionOfficeOnline.xsl" StyleName="APA" Version="6">
+  <b:Source>
+    <b:Tag>Med17</b:Tag>
+    <b:SourceType>JournalArticle</b:SourceType>
+    <b:Guid>{E285F606-CECB-4B8D-BEC5-C5B964B42BFF}</b:Guid>
+    <b:Title>Bosques aleatorios como extensión de los árboles de clasificación con los programas R y Python</b:Title>
+    <b:Year>2017</b:Year>
+    <b:JournalName>INTERFASES</b:JournalName>
+    <b:Pages>165-189</b:Pages>
+    <b:Author>
+      <b:Author>
+        <b:NameList>
+          <b:Person>
+            <b:Last>Medina Merino</b:Last>
+            <b:Middle>Fátima</b:Middle>
+            <b:First>Rosa </b:First>
+          </b:Person>
+          <b:Person>
+            <b:Last>Ñique Chacón</b:Last>
+            <b:Middle>Ismelda</b:Middle>
+            <b:First>Carmen</b:First>
+          </b:Person>
+        </b:NameList>
+      </b:Author>
+    </b:Author>
+    <b:Month>Enero-diciembre</b:Month>
+    <b:RefOrder>1</b:RefOrder>
+  </b:Source>
+  <b:Source>
+    <b:Tag>Jam13</b:Tag>
+    <b:SourceType>Book</b:SourceType>
+    <b:Guid>{FE4D722C-3B83-4DD5-89FB-2CD5A9A10432}</b:Guid>
+    <b:Title>An introduction to statistical learning with applications in R</b:Title>
+    <b:Year>2013</b:Year>
+    <b:City>New York</b:City>
+    <b:Publisher>Springer</b:Publisher>
+    <b:Author>
+      <b:Author>
+        <b:NameList>
+          <b:Person>
+            <b:Last>James</b:Last>
+            <b:First>Gareth</b:First>
+          </b:Person>
+          <b:Person>
+            <b:Last>Witten</b:Last>
+            <b:First>Daniela</b:First>
+          </b:Person>
+          <b:Person>
+            <b:Last>Hastie</b:Last>
+            <b:First>Trevor</b:First>
+          </b:Person>
+          <b:Person>
+            <b:Last>Tibshirani</b:Last>
+            <b:First>Robert</b:First>
+          </b:Person>
+        </b:NameList>
+      </b:Author>
+    </b:Author>
+    <b:RefOrder>3</b:RefOrder>
+  </b:Source>
+  <b:Source>
+    <b:Tag>Sug16</b:Tag>
+    <b:SourceType>Book</b:SourceType>
+    <b:Guid>{BD07CAC0-147A-4E07-A290-8C6B7509DAD0}</b:Guid>
+    <b:Title>Introduction to Statistical Machine Learning</b:Title>
+    <b:Year>2016</b:Year>
+    <b:City>Waltham, MA, USA</b:City>
+    <b:Publisher>Elsevier</b:Publisher>
+    <b:Author>
+      <b:Author>
+        <b:NameList>
+          <b:Person>
+            <b:Last>Sugiyama</b:Last>
+            <b:First>Masashi</b:First>
+          </b:Person>
+        </b:NameList>
+      </b:Author>
+    </b:Author>
+    <b:RefOrder>2</b:RefOrder>
+  </b:Source>
+</b:Sources>
 </file>
 
 <file path=customXml/itemProps1.xml><?xml version="1.0" encoding="utf-8"?>
-<ds:datastoreItem xmlns:ds="http://schemas.openxmlformats.org/officeDocument/2006/customXml" ds:itemID="{BE3CF703-C30C-40FE-A877-281E414D3C36}">
+<ds:datastoreItem xmlns:ds="http://schemas.openxmlformats.org/officeDocument/2006/customXml" ds:itemID="{348E6A1F-8C6A-4685-98CE-299663E16324}">
   <ds:schemaRefs>
     <ds:schemaRef ds:uri="http://schemas.openxmlformats.org/officeDocument/2006/bibliography"/>
   </ds:schemaRefs>

</xml_diff>